<commit_message>
setup project introduction in paper
</commit_message>
<xml_diff>
--- a/source/MySEProject/Documentation/ML 24-25-03 Implement Anomaly Detection Sample.docx
+++ b/source/MySEProject/Documentation/ML 24-25-03 Implement Anomaly Detection Sample.docx
@@ -242,7 +242,21 @@
         <w:rPr>
           <w:highlight w:val="yellow"/>
         </w:rPr>
-        <w:t>This study demonstrates the application of hierarchical temporal memory (HTM) via the NeocortexAPI to detect anomalies in temporal sequences, leveraging the Multi</w:t>
+        <w:t xml:space="preserve">This study demonstrates the application of hierarchical temporal memory (HTM) via the </w:t>
+      </w:r>
+      <w:proofErr w:type="spellStart"/>
+      <w:r>
+        <w:rPr>
+          <w:highlight w:val="yellow"/>
+        </w:rPr>
+        <w:t>NeocortexAPI</w:t>
+      </w:r>
+      <w:proofErr w:type="spellEnd"/>
+      <w:r>
+        <w:rPr>
+          <w:highlight w:val="yellow"/>
+        </w:rPr>
+        <w:t xml:space="preserve"> to detect anomalies in temporal sequences, leveraging the Multi</w:t>
       </w:r>
       <w:r>
         <w:rPr>
@@ -382,6 +396,269 @@
       <w:r>
         <w:t>INTRODUCTION</w:t>
       </w:r>
+    </w:p>
+    <w:p>
+      <w:pPr>
+        <w:jc w:val="both"/>
+        <w:rPr>
+          <w:noProof/>
+          <w:lang w:eastAsia="x-none"/>
+        </w:rPr>
+      </w:pPr>
+      <w:r>
+        <w:rPr>
+          <w:b/>
+          <w:bCs/>
+          <w:lang w:eastAsia="x-none"/>
+        </w:rPr>
+        <w:t>Hierarchical Temporal Memory (HTM)</w:t>
+      </w:r>
+      <w:r>
+        <w:rPr>
+          <w:lang w:eastAsia="x-none"/>
+        </w:rPr>
+        <w:t> is a biologically inspired machine intelligence technology that mimics the architecture and processes of the neocortex. It can learn data patterns continuously without too much manual intervention.</w:t>
+      </w:r>
+      <w:r>
+        <w:rPr>
+          <w:noProof/>
+          <w:lang w:eastAsia="x-none"/>
+        </w:rPr>
+        <w:t xml:space="preserve"> [1]</w:t>
+      </w:r>
+    </w:p>
+    <w:p>
+      <w:pPr>
+        <w:jc w:val="both"/>
+        <w:rPr>
+          <w:lang w:eastAsia="x-none"/>
+        </w:rPr>
+      </w:pPr>
+    </w:p>
+    <w:p>
+      <w:pPr>
+        <w:jc w:val="both"/>
+        <w:rPr>
+          <w:lang w:eastAsia="x-none"/>
+        </w:rPr>
+      </w:pPr>
+      <w:r>
+        <w:rPr>
+          <w:b/>
+          <w:bCs/>
+          <w:lang w:eastAsia="x-none"/>
+        </w:rPr>
+        <w:t>HTM</w:t>
+      </w:r>
+      <w:r>
+        <w:rPr>
+          <w:lang w:eastAsia="x-none"/>
+        </w:rPr>
+        <w:t> implements a biologically inspired machine learning pipeline comprising three core components: encoders, a Spatial Pooler (SP), and Temporal Memory (TM). Raw numerical inputs (e.g., sensor data) are first encoded into </w:t>
+      </w:r>
+      <w:r>
+        <w:rPr>
+          <w:b/>
+          <w:bCs/>
+          <w:lang w:eastAsia="x-none"/>
+        </w:rPr>
+        <w:t>Sparse Distributed Representations (SDRs)</w:t>
+      </w:r>
+      <w:r>
+        <w:rPr>
+          <w:lang w:eastAsia="x-none"/>
+        </w:rPr>
+        <w:t xml:space="preserve"> – sparse binary arrays (Fig.1) that emulate neocortical neuron activation patterns. </w:t>
+      </w:r>
+    </w:p>
+    <w:p>
+      <w:pPr>
+        <w:jc w:val="left"/>
+        <w:rPr>
+          <w:lang w:eastAsia="x-none"/>
+        </w:rPr>
+      </w:pPr>
+      <w:r>
+        <w:rPr>
+          <w:noProof/>
+          <w:lang w:eastAsia="x-none"/>
+        </w:rPr>
+        <w:pict w14:anchorId="231CA9C1">
+          <v:shapetype id="_x0000_t202" coordsize="21600,21600" o:spt="202" path="m,l,21600r21600,l21600,xe">
+            <v:stroke joinstyle="miter"/>
+            <v:path gradientshapeok="t" o:connecttype="rect"/>
+          </v:shapetype>
+          <v:shape id="_x0000_s2062" type="#_x0000_t202" style="position:absolute;margin-left:-.35pt;margin-top:9.1pt;width:240pt;height:147.75pt;z-index:5">
+            <v:fill r:id="rId10" o:title="Screenshot 2025-03-09 210235" recolor="t" type="frame"/>
+            <v:textbox style="mso-next-textbox:#_x0000_s2062">
+              <w:txbxContent>
+                <w:p/>
+                <w:p/>
+                <w:p/>
+                <w:p/>
+              </w:txbxContent>
+            </v:textbox>
+          </v:shape>
+        </w:pict>
+      </w:r>
+    </w:p>
+    <w:p>
+      <w:pPr>
+        <w:jc w:val="left"/>
+        <w:rPr>
+          <w:lang w:eastAsia="x-none"/>
+        </w:rPr>
+      </w:pPr>
+    </w:p>
+    <w:p>
+      <w:pPr>
+        <w:jc w:val="left"/>
+        <w:rPr>
+          <w:lang w:eastAsia="x-none"/>
+        </w:rPr>
+      </w:pPr>
+    </w:p>
+    <w:p>
+      <w:pPr>
+        <w:jc w:val="left"/>
+        <w:rPr>
+          <w:lang w:eastAsia="x-none"/>
+        </w:rPr>
+      </w:pPr>
+    </w:p>
+    <w:p>
+      <w:pPr>
+        <w:jc w:val="left"/>
+        <w:rPr>
+          <w:lang w:eastAsia="x-none"/>
+        </w:rPr>
+      </w:pPr>
+    </w:p>
+    <w:p>
+      <w:pPr>
+        <w:jc w:val="left"/>
+        <w:rPr>
+          <w:lang w:eastAsia="x-none"/>
+        </w:rPr>
+      </w:pPr>
+    </w:p>
+    <w:p>
+      <w:pPr>
+        <w:jc w:val="left"/>
+        <w:rPr>
+          <w:lang w:eastAsia="x-none"/>
+        </w:rPr>
+      </w:pPr>
+    </w:p>
+    <w:p>
+      <w:pPr>
+        <w:jc w:val="left"/>
+        <w:rPr>
+          <w:lang w:eastAsia="x-none"/>
+        </w:rPr>
+      </w:pPr>
+    </w:p>
+    <w:p>
+      <w:pPr>
+        <w:jc w:val="left"/>
+        <w:rPr>
+          <w:lang w:eastAsia="x-none"/>
+        </w:rPr>
+      </w:pPr>
+    </w:p>
+    <w:p>
+      <w:pPr>
+        <w:jc w:val="left"/>
+        <w:rPr>
+          <w:lang w:eastAsia="x-none"/>
+        </w:rPr>
+      </w:pPr>
+    </w:p>
+    <w:p>
+      <w:pPr>
+        <w:jc w:val="left"/>
+        <w:rPr>
+          <w:lang w:eastAsia="x-none"/>
+        </w:rPr>
+      </w:pPr>
+    </w:p>
+    <w:p>
+      <w:pPr>
+        <w:jc w:val="both"/>
+        <w:rPr>
+          <w:lang w:eastAsia="x-none"/>
+        </w:rPr>
+      </w:pPr>
+      <w:r>
+        <w:rPr>
+          <w:lang w:eastAsia="x-none"/>
+        </w:rPr>
+        <w:t>The Spatial Pooler processes these SDRs using columns of simulated cortical neuron to learn spatial features via competitive learning and homeostatic plasticity, filtering noise while preserving semantic similarity. The Temporal Memory then identifies temporal sequences in these spatial patterns, predicting future states through dendritic segment activation. These components are chained in a hierarchical pipeline (Fig.2), where input data flows through an encoder → Spatial Pooler → Temporal Memory, iteratively refining spatial and temporal context over cycles. The system leverages configurable parameters (e.g., column density, inhibition radius) and multi-threaded computation for scalability, enabling continuous online learning of streaming data patterns. This architecture mirrors neocortical layered processing, making HTM particularly suited for real-time anomaly detection, predictive modeling, and temporal sequence learning tasks.</w:t>
+      </w:r>
+    </w:p>
+    <w:p>
+      <w:pPr>
+        <w:jc w:val="left"/>
+        <w:rPr>
+          <w:lang w:eastAsia="x-none"/>
+        </w:rPr>
+      </w:pPr>
+    </w:p>
+    <w:p>
+      <w:pPr>
+        <w:jc w:val="left"/>
+        <w:rPr>
+          <w:lang w:eastAsia="x-none"/>
+        </w:rPr>
+      </w:pPr>
+      <w:r>
+        <w:rPr>
+          <w:noProof/>
+          <w:lang w:eastAsia="x-none"/>
+        </w:rPr>
+        <w:pict w14:anchorId="1DA921E3">
+          <v:shape id="_x0000_s2061" type="#_x0000_t202" style="position:absolute;margin-left:.85pt;margin-top:10.8pt;width:242.25pt;height:52.25pt;z-index:4">
+            <v:fill r:id="rId11" o:title="HtmPipeline" recolor="t" type="frame"/>
+            <v:textbox style="mso-next-textbox:#_x0000_s2061">
+              <w:txbxContent>
+                <w:p/>
+              </w:txbxContent>
+            </v:textbox>
+          </v:shape>
+        </w:pict>
+      </w:r>
+    </w:p>
+    <w:p>
+      <w:pPr>
+        <w:jc w:val="left"/>
+        <w:rPr>
+          <w:lang w:eastAsia="x-none"/>
+        </w:rPr>
+      </w:pPr>
+    </w:p>
+    <w:p>
+      <w:pPr>
+        <w:jc w:val="left"/>
+        <w:rPr>
+          <w:lang w:eastAsia="x-none"/>
+        </w:rPr>
+      </w:pPr>
+    </w:p>
+    <w:p>
+      <w:pPr>
+        <w:jc w:val="left"/>
+        <w:rPr>
+          <w:lang w:eastAsia="x-none"/>
+        </w:rPr>
+      </w:pPr>
+    </w:p>
+    <w:p>
+      <w:pPr>
+        <w:jc w:val="left"/>
+        <w:rPr>
+          <w:lang w:eastAsia="x-none"/>
+        </w:rPr>
+      </w:pPr>
     </w:p>
     <w:p>
       <w:pPr>
@@ -392,53 +669,9 @@
         </w:numPr>
         <w:jc w:val="both"/>
         <w:rPr>
-          <w:smallCaps w:val="0"/>
-          <w:noProof w:val="0"/>
-          <w:spacing w:val="-1"/>
-          <w:lang w:eastAsia="x-none"/>
-        </w:rPr>
-      </w:pPr>
-      <w:r>
-        <w:rPr>
-          <w:smallCaps w:val="0"/>
-          <w:noProof w:val="0"/>
-          <w:spacing w:val="-1"/>
-          <w:lang w:eastAsia="x-none"/>
-        </w:rPr>
-        <w:t>Anomaly means something that deviates from what is standard, normal, or expected. Anomaly detection refers to the problem of finding anomaly patterns in data</w:t>
-      </w:r>
-      <w:r>
-        <w:rPr>
-          <w:smallCaps w:val="0"/>
-          <w:noProof w:val="0"/>
-          <w:spacing w:val="-1"/>
-          <w:highlight w:val="yellow"/>
-          <w:lang w:eastAsia="x-none"/>
-        </w:rPr>
-        <w:t xml:space="preserve">(will add reference here </w:t>
-      </w:r>
-      <w:hyperlink r:id="rId10" w:history="1">
-        <w:r>
-          <w:rPr>
-            <w:rStyle w:val="Hyperlink"/>
-            <w:smallCaps w:val="0"/>
-            <w:noProof w:val="0"/>
-            <w:spacing w:val="-1"/>
-            <w:highlight w:val="yellow"/>
-            <w:lang w:eastAsia="x-none"/>
-          </w:rPr>
-          <w:t>https://ieeexplore.ieee.org/document/7836799</w:t>
-        </w:r>
-      </w:hyperlink>
-      <w:r>
-        <w:rPr>
-          <w:smallCaps w:val="0"/>
-          <w:noProof w:val="0"/>
-          <w:spacing w:val="-1"/>
-          <w:lang w:eastAsia="x-none"/>
-        </w:rPr>
-        <w:t>.</w:t>
-      </w:r>
+          <w:lang w:eastAsia="x-none"/>
+        </w:rPr>
+      </w:pPr>
     </w:p>
     <w:p>
       <w:pPr>
@@ -447,22 +680,245 @@
           <w:lang w:eastAsia="x-none"/>
         </w:rPr>
       </w:pPr>
-      <w:r>
-        <w:rPr>
-          <w:lang w:eastAsia="x-none"/>
-        </w:rPr>
-        <w:t>Anomaly detection algorithms can be classified in respect to different criteria. We can roughly classify them into two categories: spatial data and sequential (temporal) data, based on whether data instances have sequential (temporal) components.</w:t>
-      </w:r>
-    </w:p>
+    </w:p>
+    <w:p>
+      <w:pPr>
+        <w:jc w:val="both"/>
+        <w:rPr>
+          <w:lang w:eastAsia="x-none"/>
+        </w:rPr>
+      </w:pPr>
+    </w:p>
+    <w:p>
+      <w:pPr>
+        <w:jc w:val="both"/>
+        <w:rPr>
+          <w:lang w:eastAsia="x-none"/>
+        </w:rPr>
+      </w:pPr>
+    </w:p>
+    <w:p>
+      <w:pPr>
+        <w:jc w:val="both"/>
+        <w:rPr>
+          <w:lang w:eastAsia="x-none"/>
+        </w:rPr>
+      </w:pPr>
+    </w:p>
+    <w:p>
+      <w:pPr>
+        <w:jc w:val="both"/>
+        <w:rPr>
+          <w:lang w:eastAsia="x-none"/>
+        </w:rPr>
+      </w:pPr>
+    </w:p>
+    <w:p>
+      <w:pPr>
+        <w:jc w:val="both"/>
+        <w:rPr>
+          <w:lang w:eastAsia="x-none"/>
+        </w:rPr>
+      </w:pPr>
+    </w:p>
+    <w:p>
+      <w:pPr>
+        <w:jc w:val="both"/>
+        <w:rPr>
+          <w:lang w:eastAsia="x-none"/>
+        </w:rPr>
+      </w:pPr>
+    </w:p>
+    <w:p>
+      <w:pPr>
+        <w:jc w:val="both"/>
+        <w:rPr>
+          <w:lang w:eastAsia="x-none"/>
+        </w:rPr>
+      </w:pPr>
+    </w:p>
+    <w:p>
+      <w:pPr>
+        <w:jc w:val="both"/>
+        <w:rPr>
+          <w:lang w:eastAsia="x-none"/>
+        </w:rPr>
+      </w:pPr>
+    </w:p>
+    <w:p>
+      <w:pPr>
+        <w:jc w:val="both"/>
+        <w:rPr>
+          <w:lang w:eastAsia="x-none"/>
+        </w:rPr>
+      </w:pPr>
+    </w:p>
+    <w:p>
+      <w:pPr>
+        <w:jc w:val="both"/>
+        <w:rPr>
+          <w:lang w:eastAsia="x-none"/>
+        </w:rPr>
+      </w:pPr>
+    </w:p>
+    <w:p>
+      <w:pPr>
+        <w:jc w:val="both"/>
+        <w:rPr>
+          <w:lang w:eastAsia="x-none"/>
+        </w:rPr>
+      </w:pPr>
+    </w:p>
+    <w:p>
+      <w:pPr>
+        <w:jc w:val="both"/>
+        <w:rPr>
+          <w:lang w:eastAsia="x-none"/>
+        </w:rPr>
+      </w:pPr>
+    </w:p>
+    <w:p>
+      <w:pPr>
+        <w:jc w:val="both"/>
+        <w:rPr>
+          <w:lang w:eastAsia="x-none"/>
+        </w:rPr>
+      </w:pPr>
+    </w:p>
+    <w:p>
+      <w:pPr>
+        <w:jc w:val="both"/>
+        <w:rPr>
+          <w:lang w:eastAsia="x-none"/>
+        </w:rPr>
+      </w:pPr>
+    </w:p>
+    <w:p>
+      <w:pPr>
+        <w:jc w:val="both"/>
+        <w:rPr>
+          <w:lang w:eastAsia="x-none"/>
+        </w:rPr>
+      </w:pPr>
+    </w:p>
+    <w:p>
+      <w:pPr>
+        <w:jc w:val="both"/>
+        <w:rPr>
+          <w:lang w:eastAsia="x-none"/>
+        </w:rPr>
+      </w:pPr>
+    </w:p>
+    <w:p>
+      <w:pPr>
+        <w:jc w:val="both"/>
+        <w:rPr>
+          <w:lang w:eastAsia="x-none"/>
+        </w:rPr>
+      </w:pPr>
+    </w:p>
+    <w:p>
+      <w:pPr>
+        <w:jc w:val="both"/>
+        <w:rPr>
+          <w:lang w:eastAsia="x-none"/>
+        </w:rPr>
+      </w:pPr>
+    </w:p>
+    <w:p>
+      <w:pPr>
+        <w:jc w:val="both"/>
+        <w:rPr>
+          <w:lang w:eastAsia="x-none"/>
+        </w:rPr>
+      </w:pPr>
+    </w:p>
+    <w:p>
+      <w:pPr>
+        <w:jc w:val="both"/>
+        <w:rPr>
+          <w:lang w:eastAsia="x-none"/>
+        </w:rPr>
+      </w:pPr>
+    </w:p>
+    <w:p>
+      <w:pPr>
+        <w:jc w:val="both"/>
+        <w:rPr>
+          <w:lang w:eastAsia="x-none"/>
+        </w:rPr>
+      </w:pPr>
+    </w:p>
+    <w:p>
+      <w:pPr>
+        <w:jc w:val="both"/>
+        <w:rPr>
+          <w:lang w:eastAsia="x-none"/>
+        </w:rPr>
+      </w:pPr>
+    </w:p>
+    <w:p>
+      <w:pPr>
+        <w:jc w:val="both"/>
+        <w:rPr>
+          <w:lang w:eastAsia="x-none"/>
+        </w:rPr>
+      </w:pPr>
+    </w:p>
+    <w:p>
+      <w:pPr>
+        <w:jc w:val="both"/>
+        <w:rPr>
+          <w:lang w:eastAsia="x-none"/>
+        </w:rPr>
+      </w:pPr>
+      <w:r>
+        <w:t>Method</w:t>
+      </w:r>
+      <w:r>
+        <w:t>s</w:t>
+      </w:r>
+    </w:p>
+    <w:p>
+      <w:pPr>
+        <w:pStyle w:val="Heading2"/>
+      </w:pPr>
+      <w:r>
+        <w:t>Data Collection and preprocessing</w:t>
+      </w:r>
+    </w:p>
+    <w:p>
+      <w:pPr>
+        <w:pStyle w:val="Heading2"/>
+      </w:pPr>
+      <w:r>
+        <w:t>MultiSequence Learning and Predictiony</w:t>
+      </w:r>
+    </w:p>
+    <w:p>
+      <w:pPr>
+        <w:pStyle w:val="Heading2"/>
+      </w:pPr>
+      <w:r>
+        <w:t>Implementation</w:t>
+      </w:r>
+    </w:p>
+    <w:p/>
     <w:p>
       <w:pPr>
         <w:pStyle w:val="Heading1"/>
       </w:pPr>
       <w:r>
-        <w:t>Method</w:t>
-      </w:r>
-      <w:r>
-        <w:t>s</w:t>
+        <w:t>ANOMALY PATTERN DETECTION</w:t>
+      </w:r>
+    </w:p>
+    <w:p/>
+    <w:p>
+      <w:pPr>
+        <w:pStyle w:val="Heading1"/>
+      </w:pPr>
+      <w:r>
+        <w:t>Results</w:t>
       </w:r>
     </w:p>
     <w:p>
@@ -470,7 +926,7 @@
         <w:pStyle w:val="Heading2"/>
       </w:pPr>
       <w:r>
-        <w:t>Data Collection and preprocessing</w:t>
+        <w:t xml:space="preserve">Anomaly Detection Performance </w:t>
       </w:r>
     </w:p>
     <w:p>
@@ -478,56 +934,14 @@
         <w:pStyle w:val="Heading2"/>
       </w:pPr>
       <w:r>
-        <w:t>MultiSequence Learning and Predictiony</w:t>
-      </w:r>
-    </w:p>
-    <w:p>
-      <w:pPr>
-        <w:pStyle w:val="Heading2"/>
-      </w:pPr>
-      <w:r>
-        <w:t>Implementation</w:t>
-      </w:r>
-    </w:p>
-    <w:p/>
+        <w:t>Graphical Representation</w:t>
+      </w:r>
+    </w:p>
     <w:p>
       <w:pPr>
         <w:pStyle w:val="Heading1"/>
       </w:pPr>
       <w:r>
-        <w:t>ANOMALY PATTERN DETECTION</w:t>
-      </w:r>
-    </w:p>
-    <w:p/>
-    <w:p>
-      <w:pPr>
-        <w:pStyle w:val="Heading1"/>
-      </w:pPr>
-      <w:r>
-        <w:t>Results</w:t>
-      </w:r>
-    </w:p>
-    <w:p>
-      <w:pPr>
-        <w:pStyle w:val="Heading2"/>
-      </w:pPr>
-      <w:r>
-        <w:t xml:space="preserve">Anomaly Detection Performance </w:t>
-      </w:r>
-    </w:p>
-    <w:p>
-      <w:pPr>
-        <w:pStyle w:val="Heading2"/>
-      </w:pPr>
-      <w:r>
-        <w:t>Graphical Representation</w:t>
-      </w:r>
-    </w:p>
-    <w:p>
-      <w:pPr>
-        <w:pStyle w:val="Heading1"/>
-      </w:pPr>
-      <w:r>
         <w:t>Discussion</w:t>
       </w:r>
     </w:p>
@@ -538,17 +952,39 @@
           <w:lang w:val="en-US"/>
         </w:rPr>
       </w:pPr>
+      <w:proofErr w:type="gramStart"/>
       <w:r>
         <w:rPr>
           <w:lang w:val="en-US"/>
         </w:rPr>
-        <w:t>Conclusion of your work</w:t>
-      </w:r>
+        <w:t>Conclusion</w:t>
+      </w:r>
+      <w:proofErr w:type="gramEnd"/>
       <w:r>
         <w:rPr>
           <w:lang w:val="en-US"/>
         </w:rPr>
-        <w:t xml:space="preserve"> should be precise and concise. How was the project, what is done, what is the result... There can be discussion on further work and direction.</w:t>
+        <w:t xml:space="preserve"> of your work</w:t>
+      </w:r>
+      <w:r>
+        <w:rPr>
+          <w:lang w:val="en-US"/>
+        </w:rPr>
+        <w:t xml:space="preserve"> should be precise and concise. How was the project, what </w:t>
+      </w:r>
+      <w:proofErr w:type="gramStart"/>
+      <w:r>
+        <w:rPr>
+          <w:lang w:val="en-US"/>
+        </w:rPr>
+        <w:t>is</w:t>
+      </w:r>
+      <w:proofErr w:type="gramEnd"/>
+      <w:r>
+        <w:rPr>
+          <w:lang w:val="en-US"/>
+        </w:rPr>
+        <w:t xml:space="preserve"> done, what is the result... There can be discussion on further work and direction.</w:t>
       </w:r>
     </w:p>
     <w:p>
@@ -675,7 +1111,15 @@
         <w:pStyle w:val="BodyText"/>
       </w:pPr>
       <w:r>
-        <w:t>Define abbreviations and acronyms the first time they are used in the text, even after they have been defined in the abstract. Abbreviations such as IEEE, SI, MKS, CGS, sc, dc, and rms do not have to be defined. Do not use abbreviations in the title or heads unless they are unavoidable.</w:t>
+        <w:t xml:space="preserve">Define abbreviations and acronyms the first time they are used in the text, even after they have been defined in the abstract. Abbreviations such as IEEE, SI, MKS, CGS, </w:t>
+      </w:r>
+      <w:proofErr w:type="spellStart"/>
+      <w:r>
+        <w:t>sc</w:t>
+      </w:r>
+      <w:proofErr w:type="spellEnd"/>
+      <w:r>
+        <w:t>, dc, and rms do not have to be defined. Do not use abbreviations in the title or heads unless they are unavoidable.</w:t>
       </w:r>
     </w:p>
     <w:p>
@@ -705,8 +1149,15 @@
         <w:pStyle w:val="bulletlist"/>
       </w:pPr>
       <w:r>
-        <w:lastRenderedPageBreak/>
-        <w:t>Avoid combining SI and CGS units, such as current in amperes and magnetic field in oersteds. This often leads to confusion because equations do not balance dimensionally. If you must use mixed units, clearly state the units for each quantity that you use in an equation.</w:t>
+        <w:t xml:space="preserve">Avoid combining SI and CGS units, such as current in amperes and magnetic field in </w:t>
+      </w:r>
+      <w:proofErr w:type="spellStart"/>
+      <w:r>
+        <w:t>oersteds</w:t>
+      </w:r>
+      <w:proofErr w:type="spellEnd"/>
+      <w:r>
+        <w:t>. This often leads to confusion because equations do not balance dimensionally. If you must use mixed units, clearly state the units for each quantity that you use in an equation.</w:t>
       </w:r>
     </w:p>
     <w:p>
@@ -714,7 +1165,31 @@
         <w:pStyle w:val="bulletlist"/>
       </w:pPr>
       <w:r>
-        <w:t>Do not mix complete spellings and abbreviations of units: “Wb/m2” or “webers per square meter”, not “webers/m2”.  Spell out units when they appear in text: “. . . a few henries”, not “. . . a few H”.</w:t>
+        <w:t>Do not mix complete spellings and abbreviations of units: “Wb/m2” or “</w:t>
+      </w:r>
+      <w:proofErr w:type="spellStart"/>
+      <w:r>
+        <w:t>webers</w:t>
+      </w:r>
+      <w:proofErr w:type="spellEnd"/>
+      <w:r>
+        <w:t xml:space="preserve"> per square meter”, not “</w:t>
+      </w:r>
+      <w:proofErr w:type="spellStart"/>
+      <w:r>
+        <w:t>webers</w:t>
+      </w:r>
+      <w:proofErr w:type="spellEnd"/>
+      <w:r>
+        <w:t xml:space="preserve">/m2”.  Spell out units when they appear in text: “. . . a few </w:t>
+      </w:r>
+      <w:proofErr w:type="spellStart"/>
+      <w:r>
+        <w:t>henries</w:t>
+      </w:r>
+      <w:proofErr w:type="spellEnd"/>
+      <w:r>
+        <w:t>”, not “. . . a few H”.</w:t>
       </w:r>
     </w:p>
     <w:p>
@@ -912,6 +1387,7 @@
         <w:pStyle w:val="bulletlist"/>
       </w:pPr>
       <w:r>
+        <w:lastRenderedPageBreak/>
         <w:t>There is no period after the “et” in the Latin abbreviation “et al.”.</w:t>
       </w:r>
     </w:p>
@@ -1314,7 +1790,6 @@
         <w:rPr>
           <w:i w:val="0"/>
         </w:rPr>
-        <w:lastRenderedPageBreak/>
         <w:t>figures and tables after they are cited in the text. Use the abbreviation “Fig. 1”, even at the beginning of a sentence.</w:t>
       </w:r>
     </w:p>
@@ -1605,8 +2080,8 @@
             <v:path o:extrusionok="f" gradientshapeok="t" o:connecttype="rect"/>
             <o:lock v:ext="edit" aspectratio="t"/>
           </v:shapetype>
-          <v:shape id="_x0000_i1026" type="#_x0000_t75" style="width:228.9pt;height:31.25pt" o:bordertopcolor="this" o:borderleftcolor="this" o:borderbottomcolor="this" o:borderrightcolor="this">
-            <v:imagedata r:id="rId11" o:title=""/>
+          <v:shape id="_x0000_i1026" type="#_x0000_t75" style="width:228.9pt;height:31.85pt" o:bordertopcolor="this" o:borderleftcolor="this" o:borderbottomcolor="this" o:borderrightcolor="this">
+            <v:imagedata r:id="rId12" o:title=""/>
             <w10:bordertop type="single" width="8"/>
             <w10:borderleft type="single" width="8"/>
             <w10:borderbottom type="single" width="8"/>
@@ -1671,7 +2146,15 @@
         <w:jc w:val="both"/>
       </w:pPr>
       <w:r>
-        <w:t xml:space="preserve">      Referencing Code in your text should be avoid</w:t>
+        <w:t xml:space="preserve">      Referencing </w:t>
+      </w:r>
+      <w:proofErr w:type="gramStart"/>
+      <w:r>
+        <w:t>Code</w:t>
+      </w:r>
+      <w:proofErr w:type="gramEnd"/>
+      <w:r>
+        <w:t xml:space="preserve"> in your text should be avoid</w:t>
       </w:r>
       <w:r>
         <w:t>ed</w:t>
@@ -1736,10 +2219,6 @@
       </w:pPr>
       <w:r>
         <w:pict w14:anchorId="60D73155">
-          <v:shapetype id="_x0000_t202" coordsize="21600,21600" o:spt="202" path="m,l,21600r21600,l21600,xe">
-            <v:stroke joinstyle="miter"/>
-            <v:path gradientshapeok="t" o:connecttype="rect"/>
-          </v:shapetype>
           <v:shape id="Text Box 2" o:spid="_x0000_s2058" type="#_x0000_t202" style="width:241.4pt;height:30.95pt;visibility:visible;mso-height-percent:200;mso-left-percent:-10001;mso-top-percent:-10001;mso-wrap-distance-left:9pt;mso-wrap-distance-top:3.6pt;mso-wrap-distance-right:9pt;mso-wrap-distance-bottom:3.6pt;mso-position-horizontal:absolute;mso-position-horizontal-relative:char;mso-position-vertical:absolute;mso-position-vertical-relative:line;mso-height-percent:200;mso-left-percent:-10001;mso-top-percent:-10001;mso-width-relative:margin;mso-height-relative:margin;v-text-anchor:top" filled="f">
             <v:textbox style="mso-next-textbox:#Text Box 2;mso-fit-shape-to-text:t">
               <w:txbxContent>
@@ -1747,9 +2226,19 @@
                   <w:pPr>
                     <w:jc w:val="left"/>
                   </w:pPr>
+                  <w:proofErr w:type="spellStart"/>
                   <w:r>
-                    <w:t>Console.WriteLine(“Referencing code”, var);</w:t>
+                    <w:t>Console.WriteLine</w:t>
                   </w:r>
+                  <w:proofErr w:type="spellEnd"/>
+                  <w:r>
+                    <w:t>(“Referencing code”, var</w:t>
+                  </w:r>
+                  <w:proofErr w:type="gramStart"/>
+                  <w:r>
+                    <w:t>);</w:t>
+                  </w:r>
+                  <w:proofErr w:type="gramEnd"/>
                 </w:p>
                 <w:p>
                   <w:pPr>
@@ -1776,7 +2265,15 @@
         <w:jc w:val="both"/>
       </w:pPr>
       <w:r>
-        <w:t xml:space="preserve">Do not pass code as image. When referring to variable in </w:t>
+        <w:t xml:space="preserve">Do not pass </w:t>
+      </w:r>
+      <w:proofErr w:type="gramStart"/>
+      <w:r>
+        <w:t>code</w:t>
+      </w:r>
+      <w:proofErr w:type="gramEnd"/>
+      <w:r>
+        <w:t xml:space="preserve"> as image. When referring to variable in </w:t>
       </w:r>
       <w:r>
         <w:fldChar w:fldCharType="begin"/>
@@ -1798,7 +2295,15 @@
         <w:fldChar w:fldCharType="end"/>
       </w:r>
       <w:r>
-        <w:t xml:space="preserve">, italics should be used </w:t>
+        <w:t xml:space="preserve">, italics should be </w:t>
+      </w:r>
+      <w:proofErr w:type="gramStart"/>
+      <w:r>
+        <w:t>used</w:t>
+      </w:r>
+      <w:proofErr w:type="gramEnd"/>
+      <w:r>
+        <w:t xml:space="preserve"> </w:t>
       </w:r>
       <w:r>
         <w:t xml:space="preserve">for example </w:t>
@@ -1870,7 +2375,7 @@
       <w:r>
         <w:t xml:space="preserve">Unit Test </w:t>
       </w:r>
-      <w:hyperlink r:id="rId12" w:anchor="L34-L49" w:history="1">
+      <w:hyperlink r:id="rId13" w:anchor="L34-L49" w:history="1">
         <w:r>
           <w:rPr>
             <w:rStyle w:val="Hyperlink"/>
@@ -1892,7 +2397,15 @@
                     <w:jc w:val="left"/>
                   </w:pPr>
                   <w:r>
-                    <w:t>public void EncodeDateTimeTest(int w, double r, …)</w:t>
+                    <w:t xml:space="preserve">public void </w:t>
+                  </w:r>
+                  <w:proofErr w:type="gramStart"/>
+                  <w:r>
+                    <w:t>EncodeDateTimeTest(</w:t>
+                  </w:r>
+                  <w:proofErr w:type="gramEnd"/>
+                  <w:r>
+                    <w:t>int w, double r, …)</w:t>
                   </w:r>
                 </w:p>
                 <w:p>
@@ -1916,7 +2429,15 @@
                     <w:jc w:val="left"/>
                   </w:pPr>
                   <w:r>
-                    <w:t xml:space="preserve">        DateTimeEncoderExperimental encoder = new…</w:t>
+                    <w:t xml:space="preserve">        </w:t>
+                  </w:r>
+                  <w:proofErr w:type="spellStart"/>
+                  <w:r>
+                    <w:t>DateTimeEncoderExperimental</w:t>
+                  </w:r>
+                  <w:proofErr w:type="spellEnd"/>
+                  <w:r>
+                    <w:t xml:space="preserve"> encoder = new…</w:t>
                   </w:r>
                 </w:p>
                 <w:p>
@@ -1924,7 +2445,17 @@
                     <w:jc w:val="left"/>
                   </w:pPr>
                   <w:r>
-                    <w:t xml:space="preserve">        var result = encoder.Encode(input);</w:t>
+                    <w:t xml:space="preserve">        var result = </w:t>
+                  </w:r>
+                  <w:proofErr w:type="spellStart"/>
+                  <w:proofErr w:type="gramStart"/>
+                  <w:r>
+                    <w:t>encoder.Encode</w:t>
+                  </w:r>
+                  <w:proofErr w:type="spellEnd"/>
+                  <w:proofErr w:type="gramEnd"/>
+                  <w:r>
+                    <w:t>(input);</w:t>
                   </w:r>
                 </w:p>
                 <w:p>
@@ -1940,7 +2471,25 @@
                     <w:jc w:val="left"/>
                   </w:pPr>
                   <w:r>
-                    <w:t xml:space="preserve">        Assert.IsTrue(result.SequenceEqual(expected…</w:t>
+                    <w:t xml:space="preserve">        </w:t>
+                  </w:r>
+                  <w:proofErr w:type="spellStart"/>
+                  <w:r>
+                    <w:t>Assert.IsTrue</w:t>
+                  </w:r>
+                  <w:proofErr w:type="spellEnd"/>
+                  <w:r>
+                    <w:t>(</w:t>
+                  </w:r>
+                  <w:proofErr w:type="spellStart"/>
+                  <w:proofErr w:type="gramStart"/>
+                  <w:r>
+                    <w:t>result.SequenceEqual</w:t>
+                  </w:r>
+                  <w:proofErr w:type="spellEnd"/>
+                  <w:proofErr w:type="gramEnd"/>
+                  <w:r>
+                    <w:t>(expected…</w:t>
                   </w:r>
                 </w:p>
                 <w:p>
@@ -2001,6 +2550,7 @@
       <w:r>
         <w:t>”. Avoid the stilted expression “</w:t>
       </w:r>
+      <w:proofErr w:type="spellStart"/>
       <w:r>
         <w:rPr>
           <w:lang w:val="en-US"/>
@@ -2008,7 +2558,11 @@
         <w:t>o</w:t>
       </w:r>
       <w:r>
-        <w:t xml:space="preserve">ne of us (R. B. G.) thanks </w:t>
+        <w:t>ne</w:t>
+      </w:r>
+      <w:proofErr w:type="spellEnd"/>
+      <w:r>
+        <w:t xml:space="preserve"> of us (R. B. G.) thanks </w:t>
       </w:r>
       <w:r>
         <w:t>...</w:t>
@@ -2057,7 +2611,11 @@
         <w:pStyle w:val="BodyText"/>
       </w:pPr>
       <w:r>
-        <w:t>The template will number citations consecutively within brackets [1]. The sentence punctuation follows the bracket [2]. Refer simply to the reference number, as in [3]—do not use “Ref. [3]” or “reference [3]” except at the beginning of a sentence: “Reference [3] was the first</w:t>
+        <w:t xml:space="preserve">The template will number citations consecutively within brackets [1]. The sentence punctuation follows the bracket [2]. Refer simply to the reference number, as in [3]—do not </w:t>
+      </w:r>
+      <w:r>
+        <w:lastRenderedPageBreak/>
+        <w:t>use “Ref. [3]” or “reference [3]” except at the beginning of a sentence: “Reference [3] was the first</w:t>
       </w:r>
       <w:r>
         <w:rPr>
@@ -2424,7 +2982,7 @@
     <w:p>
       <w:r>
         <w:pict w14:anchorId="4A67007D">
-          <v:shape id="_x0000_s2056" type="#_x0000_t202" style="position:absolute;left:0;text-align:left;margin-left:0;margin-top:19.8pt;width:252pt;height:90pt;z-index:-1;mso-wrap-edited:f;mso-position-horizontal:left;mso-position-horizontal-relative:margin" wrapcoords="-64 0 -64 21600 21664 21600 21664 0 -64 0">
+          <v:shape id="_x0000_s2056" type="#_x0000_t202" style="position:absolute;left:0;text-align:left;margin-left:0;margin-top:19.8pt;width:252pt;height:90pt;z-index:-3;mso-wrap-edited:f;mso-position-horizontal:left;mso-position-horizontal-relative:margin" wrapcoords="-64 0 -64 21600 21664 21600 21664 0 -64 0">
             <v:textbox style="mso-next-textbox:#_x0000_s2056">
               <w:txbxContent>
                 <w:p>
@@ -2623,7 +3181,7 @@
                 <v:path o:extrusionok="f" gradientshapeok="t" o:connecttype="rect"/>
                 <o:lock v:ext="edit" aspectratio="t"/>
               </v:shapetype>
-              <v:shape id="Grafik 4" o:spid="_x0000_i1025" type="#_x0000_t75" style="width:95.75pt;height:49.6pt;visibility:visible">
+              <v:shape id="Grafik 4" o:spid="_x0000_i1025" type="#_x0000_t75" style="width:95.5pt;height:49.25pt;visibility:visible">
                 <v:imagedata r:id="rId1" o:title=""/>
               </v:shape>
             </w:pict>
@@ -4107,7 +4665,7 @@
   </w:docDefaults>
   <w:latentStyles w:defLockedState="0" w:defUIPriority="0" w:defSemiHidden="0" w:defUnhideWhenUsed="0" w:defQFormat="0" w:count="376">
     <w:lsdException w:name="Normal" w:qFormat="1"/>
-    <w:lsdException w:name="heading 1" w:qFormat="1"/>
+    <w:lsdException w:name="heading 1" w:uiPriority="9" w:qFormat="1"/>
     <w:lsdException w:name="heading 2" w:qFormat="1"/>
     <w:lsdException w:name="heading 3" w:qFormat="1"/>
     <w:lsdException w:name="heading 4" w:qFormat="1"/>
@@ -4401,6 +4959,7 @@
     <w:name w:val="heading 1"/>
     <w:basedOn w:val="Normal"/>
     <w:next w:val="Normal"/>
+    <w:uiPriority w:val="9"/>
     <w:qFormat/>
     <w:rsid w:val="006B6B66"/>
     <w:pPr>

</xml_diff>

<commit_message>
Adding more details in Project INTRO
</commit_message>
<xml_diff>
--- a/source/MySEProject/Documentation/ML 24-25-03 Implement Anomaly Detection Sample.docx
+++ b/source/MySEProject/Documentation/ML 24-25-03 Implement Anomaly Detection Sample.docx
@@ -675,11 +675,43 @@
     </w:p>
     <w:p>
       <w:pPr>
+        <w:pStyle w:val="Heading1"/>
+        <w:numPr>
+          <w:ilvl w:val="0"/>
+          <w:numId w:val="0"/>
+        </w:numPr>
         <w:jc w:val="both"/>
         <w:rPr>
-          <w:lang w:eastAsia="x-none"/>
-        </w:rPr>
-      </w:pPr>
+          <w:smallCaps w:val="0"/>
+          <w:noProof w:val="0"/>
+          <w:spacing w:val="-1"/>
+          <w:lang w:eastAsia="x-none"/>
+        </w:rPr>
+      </w:pPr>
+      <w:r>
+        <w:rPr>
+          <w:smallCaps w:val="0"/>
+          <w:noProof w:val="0"/>
+          <w:spacing w:val="-1"/>
+          <w:lang w:eastAsia="x-none"/>
+        </w:rPr>
+        <w:t xml:space="preserve">Anomaly means something that deviates from what is standard, normal, or expected. Anomaly detection refers to the problem of finding anomaly patterns in data. </w:t>
+      </w:r>
+      <w:r>
+        <w:rPr>
+          <w:smallCaps w:val="0"/>
+          <w:spacing w:val="-1"/>
+          <w:lang w:eastAsia="x-none"/>
+        </w:rPr>
+        <w:t xml:space="preserve"> </w:t>
+      </w:r>
+      <w:r>
+        <w:rPr>
+          <w:spacing w:val="-1"/>
+          <w:lang w:eastAsia="x-none"/>
+        </w:rPr>
+        <w:t>[1]</w:t>
+      </w:r>
     </w:p>
     <w:p>
       <w:pPr>
@@ -688,6 +720,12 @@
           <w:lang w:eastAsia="x-none"/>
         </w:rPr>
       </w:pPr>
+      <w:r>
+        <w:rPr>
+          <w:lang w:eastAsia="x-none"/>
+        </w:rPr>
+        <w:t>Anomaly detection algorithms can be classified in respect to different criteria. We can roughly classify them into two categories: spatial data and sequential (temporal) data, based on whether data instances have sequential (temporal) components.</w:t>
+      </w:r>
     </w:p>
     <w:p>
       <w:pPr>
@@ -704,6 +742,12 @@
           <w:lang w:eastAsia="x-none"/>
         </w:rPr>
       </w:pPr>
+      <w:r>
+        <w:rPr>
+          <w:lang w:eastAsia="x-none"/>
+        </w:rPr>
+        <w:t>Anomaly detection in temporal data streams remains critical for industrial monitoring, cybersecurity, and IoT systems [1]. Traditional threshold-based methods struggle with complex temporal patterns, motivating the use of biologically inspired HTM models [2]. Our contribution includes:</w:t>
+      </w:r>
     </w:p>
     <w:p>
       <w:pPr>
@@ -720,6 +764,12 @@
           <w:lang w:eastAsia="x-none"/>
         </w:rPr>
       </w:pPr>
+      <w:r>
+        <w:rPr>
+          <w:lang w:eastAsia="x-none"/>
+        </w:rPr>
+        <w:t>- A complete HTM implementation pipeline</w:t>
+      </w:r>
     </w:p>
     <w:p>
       <w:pPr>
@@ -728,6 +778,12 @@
           <w:lang w:eastAsia="x-none"/>
         </w:rPr>
       </w:pPr>
+      <w:r>
+        <w:rPr>
+          <w:lang w:eastAsia="x-none"/>
+        </w:rPr>
+        <w:t>- Dual-threshold anomaly detection logic</w:t>
+      </w:r>
     </w:p>
     <w:p>
       <w:pPr>
@@ -736,6 +792,12 @@
           <w:lang w:eastAsia="x-none"/>
         </w:rPr>
       </w:pPr>
+      <w:r>
+        <w:rPr>
+          <w:lang w:eastAsia="x-none"/>
+        </w:rPr>
+        <w:t>- Automated CSV data handling</w:t>
+      </w:r>
     </w:p>
     <w:p>
       <w:pPr>
@@ -744,6 +806,12 @@
           <w:lang w:eastAsia="x-none"/>
         </w:rPr>
       </w:pPr>
+      <w:r>
+        <w:rPr>
+          <w:lang w:eastAsia="x-none"/>
+        </w:rPr>
+        <w:t>- Open-source modular architecture</w:t>
+      </w:r>
     </w:p>
     <w:p>
       <w:pPr>
@@ -872,6 +940,78 @@
           <w:lang w:eastAsia="x-none"/>
         </w:rPr>
       </w:pPr>
+    </w:p>
+    <w:p>
+      <w:pPr>
+        <w:jc w:val="both"/>
+        <w:rPr>
+          <w:lang w:eastAsia="x-none"/>
+        </w:rPr>
+      </w:pPr>
+    </w:p>
+    <w:p>
+      <w:pPr>
+        <w:jc w:val="both"/>
+        <w:rPr>
+          <w:lang w:eastAsia="x-none"/>
+        </w:rPr>
+      </w:pPr>
+    </w:p>
+    <w:p>
+      <w:pPr>
+        <w:jc w:val="both"/>
+        <w:rPr>
+          <w:lang w:eastAsia="x-none"/>
+        </w:rPr>
+      </w:pPr>
+    </w:p>
+    <w:p>
+      <w:pPr>
+        <w:jc w:val="both"/>
+        <w:rPr>
+          <w:lang w:eastAsia="x-none"/>
+        </w:rPr>
+      </w:pPr>
+    </w:p>
+    <w:p>
+      <w:pPr>
+        <w:jc w:val="both"/>
+        <w:rPr>
+          <w:lang w:eastAsia="x-none"/>
+        </w:rPr>
+      </w:pPr>
+    </w:p>
+    <w:p>
+      <w:pPr>
+        <w:jc w:val="both"/>
+        <w:rPr>
+          <w:lang w:eastAsia="x-none"/>
+        </w:rPr>
+      </w:pPr>
+    </w:p>
+    <w:p>
+      <w:pPr>
+        <w:jc w:val="both"/>
+        <w:rPr>
+          <w:lang w:eastAsia="x-none"/>
+        </w:rPr>
+      </w:pPr>
+    </w:p>
+    <w:p>
+      <w:pPr>
+        <w:jc w:val="both"/>
+        <w:rPr>
+          <w:lang w:eastAsia="x-none"/>
+        </w:rPr>
+      </w:pPr>
+    </w:p>
+    <w:p>
+      <w:pPr>
+        <w:jc w:val="both"/>
+        <w:rPr>
+          <w:lang w:eastAsia="x-none"/>
+        </w:rPr>
+      </w:pPr>
       <w:r>
         <w:t>Method</w:t>
       </w:r>
@@ -952,39 +1092,17 @@
           <w:lang w:val="en-US"/>
         </w:rPr>
       </w:pPr>
-      <w:proofErr w:type="gramStart"/>
       <w:r>
         <w:rPr>
           <w:lang w:val="en-US"/>
         </w:rPr>
-        <w:t>Conclusion</w:t>
-      </w:r>
-      <w:proofErr w:type="gramEnd"/>
+        <w:t>Conclusion of your work</w:t>
+      </w:r>
       <w:r>
         <w:rPr>
           <w:lang w:val="en-US"/>
         </w:rPr>
-        <w:t xml:space="preserve"> of your work</w:t>
-      </w:r>
-      <w:r>
-        <w:rPr>
-          <w:lang w:val="en-US"/>
-        </w:rPr>
-        <w:t xml:space="preserve"> should be precise and concise. How was the project, what </w:t>
-      </w:r>
-      <w:proofErr w:type="gramStart"/>
-      <w:r>
-        <w:rPr>
-          <w:lang w:val="en-US"/>
-        </w:rPr>
-        <w:t>is</w:t>
-      </w:r>
-      <w:proofErr w:type="gramEnd"/>
-      <w:r>
-        <w:rPr>
-          <w:lang w:val="en-US"/>
-        </w:rPr>
-        <w:t xml:space="preserve"> done, what is the result... There can be discussion on further work and direction.</w:t>
+        <w:t xml:space="preserve"> should be precise and concise. How was the project, what is done, what is the result... There can be discussion on further work and direction.</w:t>
       </w:r>
     </w:p>
     <w:p>
@@ -1078,7 +1196,10 @@
         <w:ind w:firstLine="0"/>
       </w:pPr>
       <w:r>
-        <w:t>peculiarities. For example, the head margin in this template measures proportionately more than is customary. This measurement and others are deliberate, using specifications that anticipate your paper as one part of the entire proceedings, and not as an independent document. Please do not revise any of the current designations.</w:t>
+        <w:t xml:space="preserve">peculiarities. For example, the head margin in this template measures proportionately more than is customary. This </w:t>
+      </w:r>
+      <w:r>
+        <w:t>measurement and others are deliberate, using specifications that anticipate your paper as one part of the entire proceedings, and not as an independent document. Please do not revise any of the current designations.</w:t>
       </w:r>
     </w:p>
     <w:p>
@@ -1339,6 +1460,7 @@
         <w:pStyle w:val="bulletlist"/>
       </w:pPr>
       <w:r>
+        <w:lastRenderedPageBreak/>
         <w:t>A graph within a graph is an “inset”, not an “insert”. The word alternatively is preferred to the word “alternately” (unless you really mean something that alternates).</w:t>
       </w:r>
     </w:p>
@@ -1387,7 +1509,6 @@
         <w:pStyle w:val="bulletlist"/>
       </w:pPr>
       <w:r>
-        <w:lastRenderedPageBreak/>
         <w:t>There is no period after the “et” in the Latin abbreviation “et al.”.</w:t>
       </w:r>
     </w:p>
@@ -1784,13 +1905,7 @@
         <w:rPr>
           <w:i w:val="0"/>
         </w:rPr>
-        <w:t xml:space="preserve">Place figures and tables at the top and bottom of columns. Avoid placing them in the middle of columns. Large figures and tables may span across both columns. Figure captions should be below the figures; table heads should appear above the tables. Insert </w:t>
-      </w:r>
-      <w:r>
-        <w:rPr>
-          <w:i w:val="0"/>
-        </w:rPr>
-        <w:t>figures and tables after they are cited in the text. Use the abbreviation “Fig. 1”, even at the beginning of a sentence.</w:t>
+        <w:t>Place figures and tables at the top and bottom of columns. Avoid placing them in the middle of columns. Large figures and tables may span across both columns. Figure captions should be below the figures; table heads should appear above the tables. Insert figures and tables after they are cited in the text. Use the abbreviation “Fig. 1”, even at the beginning of a sentence.</w:t>
       </w:r>
     </w:p>
     <w:p>
@@ -2146,15 +2261,7 @@
         <w:jc w:val="both"/>
       </w:pPr>
       <w:r>
-        <w:t xml:space="preserve">      Referencing </w:t>
-      </w:r>
-      <w:proofErr w:type="gramStart"/>
-      <w:r>
-        <w:t>Code</w:t>
-      </w:r>
-      <w:proofErr w:type="gramEnd"/>
-      <w:r>
-        <w:t xml:space="preserve"> in your text should be avoid</w:t>
+        <w:t xml:space="preserve">      Referencing Code in your text should be avoid</w:t>
       </w:r>
       <w:r>
         <w:t>ed</w:t>
@@ -2232,13 +2339,8 @@
                   </w:r>
                   <w:proofErr w:type="spellEnd"/>
                   <w:r>
-                    <w:t>(“Referencing code”, var</w:t>
+                    <w:t>(“Referencing code”, var);</w:t>
                   </w:r>
-                  <w:proofErr w:type="gramStart"/>
-                  <w:r>
-                    <w:t>);</w:t>
-                  </w:r>
-                  <w:proofErr w:type="gramEnd"/>
                 </w:p>
                 <w:p>
                   <w:pPr>
@@ -2265,15 +2367,7 @@
         <w:jc w:val="both"/>
       </w:pPr>
       <w:r>
-        <w:t xml:space="preserve">Do not pass </w:t>
-      </w:r>
-      <w:proofErr w:type="gramStart"/>
-      <w:r>
-        <w:t>code</w:t>
-      </w:r>
-      <w:proofErr w:type="gramEnd"/>
-      <w:r>
-        <w:t xml:space="preserve"> as image. When referring to variable in </w:t>
+        <w:t xml:space="preserve">Do not pass code as image. When referring to variable in </w:t>
       </w:r>
       <w:r>
         <w:fldChar w:fldCharType="begin"/>
@@ -2295,15 +2389,7 @@
         <w:fldChar w:fldCharType="end"/>
       </w:r>
       <w:r>
-        <w:t xml:space="preserve">, italics should be </w:t>
-      </w:r>
-      <w:proofErr w:type="gramStart"/>
-      <w:r>
-        <w:t>used</w:t>
-      </w:r>
-      <w:proofErr w:type="gramEnd"/>
-      <w:r>
-        <w:t xml:space="preserve"> </w:t>
+        <w:t xml:space="preserve">, italics should be used </w:t>
       </w:r>
       <w:r>
         <w:t xml:space="preserve">for example </w:t>
@@ -2397,15 +2483,7 @@
                     <w:jc w:val="left"/>
                   </w:pPr>
                   <w:r>
-                    <w:t xml:space="preserve">public void </w:t>
-                  </w:r>
-                  <w:proofErr w:type="gramStart"/>
-                  <w:r>
-                    <w:t>EncodeDateTimeTest(</w:t>
-                  </w:r>
-                  <w:proofErr w:type="gramEnd"/>
-                  <w:r>
-                    <w:t>int w, double r, …)</w:t>
+                    <w:t>public void EncodeDateTimeTest(int w, double r, …)</w:t>
                   </w:r>
                 </w:p>
                 <w:p>
@@ -2448,12 +2526,10 @@
                     <w:t xml:space="preserve">        var result = </w:t>
                   </w:r>
                   <w:proofErr w:type="spellStart"/>
-                  <w:proofErr w:type="gramStart"/>
                   <w:r>
                     <w:t>encoder.Encode</w:t>
                   </w:r>
                   <w:proofErr w:type="spellEnd"/>
-                  <w:proofErr w:type="gramEnd"/>
                   <w:r>
                     <w:t>(input);</w:t>
                   </w:r>
@@ -2482,12 +2558,10 @@
                     <w:t>(</w:t>
                   </w:r>
                   <w:proofErr w:type="spellStart"/>
-                  <w:proofErr w:type="gramStart"/>
                   <w:r>
                     <w:t>result.SequenceEqual</w:t>
                   </w:r>
                   <w:proofErr w:type="spellEnd"/>
-                  <w:proofErr w:type="gramEnd"/>
                   <w:r>
                     <w:t>(expected…</w:t>
                   </w:r>
@@ -2611,11 +2685,7 @@
         <w:pStyle w:val="BodyText"/>
       </w:pPr>
       <w:r>
-        <w:t xml:space="preserve">The template will number citations consecutively within brackets [1]. The sentence punctuation follows the bracket [2]. Refer simply to the reference number, as in [3]—do not </w:t>
-      </w:r>
-      <w:r>
-        <w:lastRenderedPageBreak/>
-        <w:t>use “Ref. [3]” or “reference [3]” except at the beginning of a sentence: “Reference [3] was the first</w:t>
+        <w:t>The template will number citations consecutively within brackets [1]. The sentence punctuation follows the bracket [2]. Refer simply to the reference number, as in [3]—do not use “Ref. [3]” or “reference [3]” except at the beginning of a sentence: “Reference [3] was the first</w:t>
       </w:r>
       <w:r>
         <w:rPr>

</xml_diff>

<commit_message>
setup project methodology for paper
</commit_message>
<xml_diff>
--- a/source/MySEProject/Documentation/ML 24-25-03 Implement Anomaly Detection Sample.docx
+++ b/source/MySEProject/Documentation/ML 24-25-03 Implement Anomaly Detection Sample.docx
@@ -815,6 +815,236 @@
     </w:p>
     <w:p>
       <w:pPr>
+        <w:pStyle w:val="Heading1"/>
+      </w:pPr>
+      <w:r>
+        <w:lastRenderedPageBreak/>
+        <w:t>Methods</w:t>
+      </w:r>
+    </w:p>
+    <w:p>
+      <w:pPr>
+        <w:pStyle w:val="Heading2"/>
+      </w:pPr>
+      <w:r>
+        <w:t>System Architecture</w:t>
+      </w:r>
+    </w:p>
+    <w:p>
+      <w:pPr>
+        <w:tabs>
+          <w:tab w:val="left" w:pos="916"/>
+          <w:tab w:val="left" w:pos="1832"/>
+          <w:tab w:val="left" w:pos="2748"/>
+          <w:tab w:val="left" w:pos="3664"/>
+          <w:tab w:val="left" w:pos="4580"/>
+          <w:tab w:val="left" w:pos="5496"/>
+          <w:tab w:val="left" w:pos="6412"/>
+          <w:tab w:val="left" w:pos="7328"/>
+          <w:tab w:val="left" w:pos="8244"/>
+          <w:tab w:val="left" w:pos="9160"/>
+          <w:tab w:val="left" w:pos="10076"/>
+          <w:tab w:val="left" w:pos="10992"/>
+          <w:tab w:val="left" w:pos="11908"/>
+          <w:tab w:val="left" w:pos="12824"/>
+          <w:tab w:val="left" w:pos="13740"/>
+          <w:tab w:val="left" w:pos="14656"/>
+        </w:tabs>
+        <w:wordWrap w:val="0"/>
+        <w:jc w:val="both"/>
+        <w:rPr>
+          <w:rFonts w:eastAsia="Times New Roman"/>
+          <w:sz w:val="19"/>
+          <w:szCs w:val="19"/>
+        </w:rPr>
+      </w:pPr>
+      <w:r>
+        <w:rPr>
+          <w:rFonts w:eastAsia="Times New Roman"/>
+          <w:sz w:val="19"/>
+          <w:szCs w:val="19"/>
+        </w:rPr>
+        <w:t xml:space="preserve">We utilize the </w:t>
+      </w:r>
+      <w:proofErr w:type="spellStart"/>
+      <w:r>
+        <w:rPr>
+          <w:rFonts w:eastAsia="Times New Roman"/>
+          <w:sz w:val="19"/>
+          <w:szCs w:val="19"/>
+        </w:rPr>
+        <w:t>NeoCortex</w:t>
+      </w:r>
+      <w:r>
+        <w:rPr>
+          <w:rFonts w:eastAsia="Times New Roman"/>
+          <w:sz w:val="19"/>
+          <w:szCs w:val="19"/>
+        </w:rPr>
+        <w:t>API</w:t>
+      </w:r>
+      <w:proofErr w:type="spellEnd"/>
+      <w:r>
+        <w:rPr>
+          <w:rFonts w:eastAsia="Times New Roman"/>
+          <w:sz w:val="19"/>
+          <w:szCs w:val="19"/>
+        </w:rPr>
+        <w:t>, a .NET implementation of Hierarchical Temporal Memory (HTM) Cortical Learning Algorithms (CLA), to build our anomaly detection system in C#/.NET. The project processes structured CSV datasets, with values normalized to integers between 0 and 100.</w:t>
+      </w:r>
+    </w:p>
+    <w:p>
+      <w:pPr>
+        <w:tabs>
+          <w:tab w:val="left" w:pos="916"/>
+          <w:tab w:val="left" w:pos="1832"/>
+          <w:tab w:val="left" w:pos="2748"/>
+          <w:tab w:val="left" w:pos="3664"/>
+          <w:tab w:val="left" w:pos="4580"/>
+          <w:tab w:val="left" w:pos="5496"/>
+          <w:tab w:val="left" w:pos="6412"/>
+          <w:tab w:val="left" w:pos="7328"/>
+          <w:tab w:val="left" w:pos="8244"/>
+          <w:tab w:val="left" w:pos="9160"/>
+          <w:tab w:val="left" w:pos="10076"/>
+          <w:tab w:val="left" w:pos="10992"/>
+          <w:tab w:val="left" w:pos="11908"/>
+          <w:tab w:val="left" w:pos="12824"/>
+          <w:tab w:val="left" w:pos="13740"/>
+          <w:tab w:val="left" w:pos="14656"/>
+        </w:tabs>
+        <w:wordWrap w:val="0"/>
+        <w:jc w:val="both"/>
+        <w:rPr>
+          <w:rFonts w:eastAsia="Times New Roman"/>
+          <w:sz w:val="19"/>
+          <w:szCs w:val="19"/>
+        </w:rPr>
+      </w:pPr>
+      <w:r>
+        <w:rPr>
+          <w:rFonts w:eastAsia="Times New Roman"/>
+          <w:sz w:val="19"/>
+          <w:szCs w:val="19"/>
+        </w:rPr>
+        <w:t>The</w:t>
+      </w:r>
+      <w:r>
+        <w:rPr>
+          <w:rFonts w:eastAsia="Times New Roman"/>
+          <w:sz w:val="19"/>
+          <w:szCs w:val="19"/>
+        </w:rPr>
+        <w:t xml:space="preserve"> </w:t>
+      </w:r>
+      <w:r>
+        <w:rPr>
+          <w:rFonts w:eastAsia="Times New Roman"/>
+          <w:sz w:val="19"/>
+          <w:szCs w:val="19"/>
+        </w:rPr>
+        <w:t>system comprises seven core components</w:t>
+      </w:r>
+      <w:r>
+        <w:rPr>
+          <w:rFonts w:eastAsia="Times New Roman"/>
+          <w:sz w:val="19"/>
+          <w:szCs w:val="19"/>
+        </w:rPr>
+        <w:t xml:space="preserve"> as follows:</w:t>
+      </w:r>
+    </w:p>
+    <w:p>
+      <w:pPr>
+        <w:tabs>
+          <w:tab w:val="left" w:pos="916"/>
+          <w:tab w:val="left" w:pos="1832"/>
+          <w:tab w:val="left" w:pos="2748"/>
+          <w:tab w:val="left" w:pos="3664"/>
+          <w:tab w:val="left" w:pos="4580"/>
+          <w:tab w:val="left" w:pos="5496"/>
+          <w:tab w:val="left" w:pos="6412"/>
+          <w:tab w:val="left" w:pos="7328"/>
+          <w:tab w:val="left" w:pos="8244"/>
+          <w:tab w:val="left" w:pos="9160"/>
+          <w:tab w:val="left" w:pos="10076"/>
+          <w:tab w:val="left" w:pos="10992"/>
+          <w:tab w:val="left" w:pos="11908"/>
+          <w:tab w:val="left" w:pos="12824"/>
+          <w:tab w:val="left" w:pos="13740"/>
+          <w:tab w:val="left" w:pos="14656"/>
+        </w:tabs>
+        <w:wordWrap w:val="0"/>
+        <w:jc w:val="left"/>
+        <w:rPr>
+          <w:rFonts w:eastAsia="Times New Roman"/>
+          <w:sz w:val="19"/>
+          <w:szCs w:val="19"/>
+        </w:rPr>
+      </w:pPr>
+    </w:p>
+    <w:p>
+      <w:pPr>
+        <w:pStyle w:val="Heading2"/>
+        <w:rPr>
+          <w:i w:val="0"/>
+          <w:iCs w:val="0"/>
+        </w:rPr>
+      </w:pPr>
+      <w:r>
+        <w:t>Console Arguments Handler</w:t>
+      </w:r>
+      <w:r>
+        <w:rPr>
+          <w:i w:val="0"/>
+          <w:iCs w:val="0"/>
+          <w:noProof w:val="0"/>
+          <w:color w:val="404040"/>
+        </w:rPr>
+        <w:t xml:space="preserve"> </w:t>
+      </w:r>
+      <w:r>
+        <w:rPr>
+          <w:i w:val="0"/>
+          <w:iCs w:val="0"/>
+        </w:rPr>
+        <w:t>The ConsoleArgumentsHandler class parses and manages </w:t>
+      </w:r>
+      <w:r>
+        <w:rPr>
+          <w:b/>
+          <w:bCs/>
+          <w:i w:val="0"/>
+          <w:iCs w:val="0"/>
+        </w:rPr>
+        <w:t>command-line arguments</w:t>
+      </w:r>
+      <w:r>
+        <w:rPr>
+          <w:i w:val="0"/>
+          <w:iCs w:val="0"/>
+        </w:rPr>
+        <w:t> for configuring the anomaly detection system. It acts as a bridge between user input and system configuration. This class forms the </w:t>
+      </w:r>
+      <w:r>
+        <w:rPr>
+          <w:b/>
+          <w:bCs/>
+          <w:i w:val="0"/>
+          <w:iCs w:val="0"/>
+        </w:rPr>
+        <w:t>configuration backbone</w:t>
+      </w:r>
+      <w:r>
+        <w:rPr>
+          <w:i w:val="0"/>
+          <w:iCs w:val="0"/>
+        </w:rPr>
+        <w:t> of the system, translating user inputs into structured parameters that drive data processing and machine learning behavior.</w:t>
+      </w:r>
+    </w:p>
+    <w:p>
+      <w:pPr>
         <w:jc w:val="both"/>
         <w:rPr>
           <w:lang w:eastAsia="x-none"/>
@@ -1196,10 +1426,7 @@
         <w:ind w:firstLine="0"/>
       </w:pPr>
       <w:r>
-        <w:t xml:space="preserve">peculiarities. For example, the head margin in this template measures proportionately more than is customary. This </w:t>
-      </w:r>
-      <w:r>
-        <w:t>measurement and others are deliberate, using specifications that anticipate your paper as one part of the entire proceedings, and not as an independent document. Please do not revise any of the current designations.</w:t>
+        <w:t>peculiarities. For example, the head margin in this template measures proportionately more than is customary. This measurement and others are deliberate, using specifications that anticipate your paper as one part of the entire proceedings, and not as an independent document. Please do not revise any of the current designations.</w:t>
       </w:r>
     </w:p>
     <w:p>
@@ -1321,7 +1548,11 @@
         </w:rPr>
       </w:pPr>
       <w:r>
-        <w:t>may use the solidus ( / ), the exp function, or appropriate exponents. Italicize Roman symbols for quantities and variables, but not Greek symbols. Use a long dash rather than a hyphen for a minus sign. Punctuate equations with commas or periods when they are part of a sentence, as in</w:t>
+        <w:t xml:space="preserve">may use the solidus ( / ), the exp function, or appropriate exponents. Italicize Roman symbols for quantities and variables, but not Greek symbols. Use a long dash rather than </w:t>
+      </w:r>
+      <w:r>
+        <w:lastRenderedPageBreak/>
+        <w:t>a hyphen for a minus sign. Punctuate equations with commas or periods when they are part of a sentence, as in</w:t>
       </w:r>
       <w:r>
         <w:rPr>
@@ -1460,7 +1691,6 @@
         <w:pStyle w:val="bulletlist"/>
       </w:pPr>
       <w:r>
-        <w:lastRenderedPageBreak/>
         <w:t>A graph within a graph is an “inset”, not an “insert”. The word alternatively is preferred to the word “alternately” (unless you really mean something that alternates).</w:t>
       </w:r>
     </w:p>
@@ -1544,7 +1774,10 @@
         <w:pStyle w:val="BodyText"/>
       </w:pPr>
       <w:r>
-        <w:t>After the text edit has been completed, the paper is ready for the template. Duplicate the template file by using the Save As command, and use the naming convention prescribed by your conference for the name of your paper. In this newly created file, highlight all of the contents and import your prepared text file. You are now ready to style your paper; use the scroll down window on the left of the MS Word Formatting toolbar.</w:t>
+        <w:t xml:space="preserve">After the text edit has been completed, the paper is ready for the template. Duplicate the template file by using the Save As command, and use the naming convention prescribed by your conference for the name of your paper. In this newly created file, highlight all of the contents and import your prepared text file. You are now ready to style </w:t>
+      </w:r>
+      <w:r>
+        <w:t>your paper; use the scroll down window on the left of the MS Word Formatting toolbar.</w:t>
       </w:r>
     </w:p>
     <w:p>
@@ -2175,6 +2408,7 @@
         <w:jc w:val="left"/>
       </w:pPr>
       <w:r>
+        <w:lastRenderedPageBreak/>
         <w:pict w14:anchorId="4C2ECEC5">
           <v:shapetype id="_x0000_t75" coordsize="21600,21600" o:spt="75" o:preferrelative="t" path="m@4@5l@4@11@9@11@9@5xe" filled="f" stroked="f">
             <v:stroke joinstyle="miter"/>
@@ -2622,7 +2856,10 @@
         <w:t>The preferred spelling of the word “acknowledgment” in America is without an “e” after the “g</w:t>
       </w:r>
       <w:r>
-        <w:t>”. Avoid the stilted expression “</w:t>
+        <w:t xml:space="preserve">”. Avoid the stilted </w:t>
+      </w:r>
+      <w:r>
+        <w:t>expression “</w:t>
       </w:r>
       <w:proofErr w:type="spellStart"/>
       <w:r>

</xml_diff>

<commit_message>
workng on project method for data ingestion
</commit_message>
<xml_diff>
--- a/source/MySEProject/Documentation/ML 24-25-03 Implement Anomaly Detection Sample.docx
+++ b/source/MySEProject/Documentation/ML 24-25-03 Implement Anomaly Detection Sample.docx
@@ -1045,6 +1045,678 @@
     </w:p>
     <w:p>
       <w:pPr>
+        <w:jc w:val="left"/>
+        <w:rPr>
+          <w:i/>
+          <w:iCs/>
+          <w:noProof/>
+        </w:rPr>
+      </w:pPr>
+      <w:r>
+        <w:rPr>
+          <w:i/>
+          <w:iCs/>
+          <w:noProof/>
+        </w:rPr>
+        <w:t xml:space="preserve">C File Handler </w:t>
+      </w:r>
+    </w:p>
+    <w:p>
+      <w:pPr>
+        <w:jc w:val="left"/>
+      </w:pPr>
+      <w:r>
+        <w:t>The </w:t>
+      </w:r>
+      <w:proofErr w:type="spellStart"/>
+      <w:r>
+        <w:t>FileHandler</w:t>
+      </w:r>
+      <w:proofErr w:type="spellEnd"/>
+      <w:r>
+        <w:t> class manages </w:t>
+      </w:r>
+      <w:r>
+        <w:rPr>
+          <w:b/>
+          <w:bCs/>
+        </w:rPr>
+        <w:t>data file collection and validation</w:t>
+      </w:r>
+      <w:r>
+        <w:t> for training and inference phases.</w:t>
+      </w:r>
+    </w:p>
+    <w:p>
+      <w:pPr>
+        <w:tabs>
+          <w:tab w:val="left" w:pos="916"/>
+          <w:tab w:val="left" w:pos="1832"/>
+          <w:tab w:val="left" w:pos="2748"/>
+          <w:tab w:val="left" w:pos="3664"/>
+          <w:tab w:val="left" w:pos="4580"/>
+          <w:tab w:val="left" w:pos="5496"/>
+          <w:tab w:val="left" w:pos="6412"/>
+          <w:tab w:val="left" w:pos="7328"/>
+          <w:tab w:val="left" w:pos="8244"/>
+          <w:tab w:val="left" w:pos="9160"/>
+          <w:tab w:val="left" w:pos="10076"/>
+          <w:tab w:val="left" w:pos="10992"/>
+          <w:tab w:val="left" w:pos="11908"/>
+          <w:tab w:val="left" w:pos="12824"/>
+          <w:tab w:val="left" w:pos="13740"/>
+          <w:tab w:val="left" w:pos="14656"/>
+        </w:tabs>
+        <w:wordWrap w:val="0"/>
+        <w:jc w:val="left"/>
+        <w:rPr>
+          <w:rFonts w:eastAsia="Times New Roman"/>
+          <w:sz w:val="19"/>
+          <w:szCs w:val="19"/>
+        </w:rPr>
+      </w:pPr>
+    </w:p>
+    <w:p>
+      <w:pPr>
+        <w:jc w:val="left"/>
+        <w:rPr>
+          <w:i/>
+          <w:iCs/>
+          <w:noProof/>
+        </w:rPr>
+      </w:pPr>
+      <w:r>
+        <w:rPr>
+          <w:i/>
+          <w:iCs/>
+          <w:noProof/>
+        </w:rPr>
+        <w:t xml:space="preserve">D CSV Handler </w:t>
+      </w:r>
+    </w:p>
+    <w:p>
+      <w:pPr>
+        <w:tabs>
+          <w:tab w:val="left" w:pos="916"/>
+          <w:tab w:val="left" w:pos="1832"/>
+          <w:tab w:val="left" w:pos="2748"/>
+          <w:tab w:val="left" w:pos="3664"/>
+          <w:tab w:val="left" w:pos="4580"/>
+          <w:tab w:val="left" w:pos="5496"/>
+          <w:tab w:val="left" w:pos="6412"/>
+          <w:tab w:val="left" w:pos="7328"/>
+          <w:tab w:val="left" w:pos="8244"/>
+          <w:tab w:val="left" w:pos="9160"/>
+          <w:tab w:val="left" w:pos="10076"/>
+          <w:tab w:val="left" w:pos="10992"/>
+          <w:tab w:val="left" w:pos="11908"/>
+          <w:tab w:val="left" w:pos="12824"/>
+          <w:tab w:val="left" w:pos="13740"/>
+          <w:tab w:val="left" w:pos="14656"/>
+        </w:tabs>
+        <w:wordWrap w:val="0"/>
+        <w:jc w:val="left"/>
+        <w:rPr>
+          <w:rFonts w:eastAsia="Times New Roman"/>
+          <w:sz w:val="19"/>
+          <w:szCs w:val="19"/>
+        </w:rPr>
+      </w:pPr>
+      <w:r>
+        <w:rPr>
+          <w:rFonts w:eastAsia="Times New Roman"/>
+          <w:sz w:val="19"/>
+          <w:szCs w:val="19"/>
+        </w:rPr>
+        <w:t>The </w:t>
+      </w:r>
+      <w:proofErr w:type="spellStart"/>
+      <w:r>
+        <w:rPr>
+          <w:rFonts w:eastAsia="Times New Roman"/>
+          <w:sz w:val="19"/>
+          <w:szCs w:val="19"/>
+        </w:rPr>
+        <w:t>CSVHandler</w:t>
+      </w:r>
+      <w:proofErr w:type="spellEnd"/>
+      <w:r>
+        <w:rPr>
+          <w:rFonts w:eastAsia="Times New Roman"/>
+          <w:sz w:val="19"/>
+          <w:szCs w:val="19"/>
+        </w:rPr>
+        <w:t> class handles </w:t>
+      </w:r>
+      <w:r>
+        <w:rPr>
+          <w:rFonts w:eastAsia="Times New Roman"/>
+          <w:b/>
+          <w:bCs/>
+          <w:sz w:val="19"/>
+          <w:szCs w:val="19"/>
+        </w:rPr>
+        <w:t>CSV data ingestion, preprocessing, and output</w:t>
+      </w:r>
+      <w:r>
+        <w:rPr>
+          <w:rFonts w:eastAsia="Times New Roman"/>
+          <w:sz w:val="19"/>
+          <w:szCs w:val="19"/>
+        </w:rPr>
+        <w:t> for the HTM-based anomaly detection system. Key responsibilities:</w:t>
+      </w:r>
+    </w:p>
+    <w:p>
+      <w:pPr>
+        <w:numPr>
+          <w:ilvl w:val="0"/>
+          <w:numId w:val="25"/>
+        </w:numPr>
+        <w:tabs>
+          <w:tab w:val="left" w:pos="916"/>
+          <w:tab w:val="left" w:pos="1832"/>
+          <w:tab w:val="left" w:pos="2748"/>
+          <w:tab w:val="left" w:pos="3664"/>
+          <w:tab w:val="left" w:pos="4580"/>
+          <w:tab w:val="left" w:pos="5496"/>
+          <w:tab w:val="left" w:pos="6412"/>
+          <w:tab w:val="left" w:pos="7328"/>
+          <w:tab w:val="left" w:pos="8244"/>
+          <w:tab w:val="left" w:pos="9160"/>
+          <w:tab w:val="left" w:pos="10076"/>
+          <w:tab w:val="left" w:pos="10992"/>
+          <w:tab w:val="left" w:pos="11908"/>
+          <w:tab w:val="left" w:pos="12824"/>
+          <w:tab w:val="left" w:pos="13740"/>
+          <w:tab w:val="left" w:pos="14656"/>
+        </w:tabs>
+        <w:wordWrap w:val="0"/>
+        <w:jc w:val="left"/>
+        <w:rPr>
+          <w:rFonts w:eastAsia="Times New Roman"/>
+          <w:sz w:val="19"/>
+          <w:szCs w:val="19"/>
+        </w:rPr>
+      </w:pPr>
+      <w:r>
+        <w:rPr>
+          <w:rFonts w:eastAsia="Times New Roman"/>
+          <w:sz w:val="19"/>
+          <w:szCs w:val="19"/>
+        </w:rPr>
+        <w:t>Read and parse time-series sequences from CSV files</w:t>
+      </w:r>
+    </w:p>
+    <w:p>
+      <w:pPr>
+        <w:numPr>
+          <w:ilvl w:val="0"/>
+          <w:numId w:val="25"/>
+        </w:numPr>
+        <w:tabs>
+          <w:tab w:val="left" w:pos="916"/>
+          <w:tab w:val="left" w:pos="1832"/>
+          <w:tab w:val="left" w:pos="2748"/>
+          <w:tab w:val="left" w:pos="3664"/>
+          <w:tab w:val="left" w:pos="4580"/>
+          <w:tab w:val="left" w:pos="5496"/>
+          <w:tab w:val="left" w:pos="6412"/>
+          <w:tab w:val="left" w:pos="7328"/>
+          <w:tab w:val="left" w:pos="8244"/>
+          <w:tab w:val="left" w:pos="9160"/>
+          <w:tab w:val="left" w:pos="10076"/>
+          <w:tab w:val="left" w:pos="10992"/>
+          <w:tab w:val="left" w:pos="11908"/>
+          <w:tab w:val="left" w:pos="12824"/>
+          <w:tab w:val="left" w:pos="13740"/>
+          <w:tab w:val="left" w:pos="14656"/>
+        </w:tabs>
+        <w:wordWrap w:val="0"/>
+        <w:jc w:val="left"/>
+        <w:rPr>
+          <w:rFonts w:eastAsia="Times New Roman"/>
+          <w:sz w:val="19"/>
+          <w:szCs w:val="19"/>
+        </w:rPr>
+      </w:pPr>
+      <w:r>
+        <w:rPr>
+          <w:rFonts w:eastAsia="Times New Roman"/>
+          <w:sz w:val="19"/>
+          <w:szCs w:val="19"/>
+        </w:rPr>
+        <w:t>Trim sequences to remove leading elements</w:t>
+      </w:r>
+    </w:p>
+    <w:p>
+      <w:pPr>
+        <w:numPr>
+          <w:ilvl w:val="0"/>
+          <w:numId w:val="25"/>
+        </w:numPr>
+        <w:tabs>
+          <w:tab w:val="left" w:pos="916"/>
+          <w:tab w:val="left" w:pos="1832"/>
+          <w:tab w:val="left" w:pos="2748"/>
+          <w:tab w:val="left" w:pos="3664"/>
+          <w:tab w:val="left" w:pos="4580"/>
+          <w:tab w:val="left" w:pos="5496"/>
+          <w:tab w:val="left" w:pos="6412"/>
+          <w:tab w:val="left" w:pos="7328"/>
+          <w:tab w:val="left" w:pos="8244"/>
+          <w:tab w:val="left" w:pos="9160"/>
+          <w:tab w:val="left" w:pos="10076"/>
+          <w:tab w:val="left" w:pos="10992"/>
+          <w:tab w:val="left" w:pos="11908"/>
+          <w:tab w:val="left" w:pos="12824"/>
+          <w:tab w:val="left" w:pos="13740"/>
+          <w:tab w:val="left" w:pos="14656"/>
+        </w:tabs>
+        <w:wordWrap w:val="0"/>
+        <w:jc w:val="left"/>
+        <w:rPr>
+          <w:rFonts w:eastAsia="Times New Roman"/>
+          <w:sz w:val="19"/>
+          <w:szCs w:val="19"/>
+        </w:rPr>
+      </w:pPr>
+      <w:r>
+        <w:rPr>
+          <w:rFonts w:eastAsia="Times New Roman"/>
+          <w:sz w:val="19"/>
+          <w:szCs w:val="19"/>
+        </w:rPr>
+        <w:t>Display parsed data for debugging</w:t>
+      </w:r>
+    </w:p>
+    <w:p>
+      <w:pPr>
+        <w:numPr>
+          <w:ilvl w:val="0"/>
+          <w:numId w:val="25"/>
+        </w:numPr>
+        <w:tabs>
+          <w:tab w:val="left" w:pos="916"/>
+          <w:tab w:val="left" w:pos="1832"/>
+          <w:tab w:val="left" w:pos="2748"/>
+          <w:tab w:val="left" w:pos="3664"/>
+          <w:tab w:val="left" w:pos="4580"/>
+          <w:tab w:val="left" w:pos="5496"/>
+          <w:tab w:val="left" w:pos="6412"/>
+          <w:tab w:val="left" w:pos="7328"/>
+          <w:tab w:val="left" w:pos="8244"/>
+          <w:tab w:val="left" w:pos="9160"/>
+          <w:tab w:val="left" w:pos="10076"/>
+          <w:tab w:val="left" w:pos="10992"/>
+          <w:tab w:val="left" w:pos="11908"/>
+          <w:tab w:val="left" w:pos="12824"/>
+          <w:tab w:val="left" w:pos="13740"/>
+          <w:tab w:val="left" w:pos="14656"/>
+        </w:tabs>
+        <w:wordWrap w:val="0"/>
+        <w:jc w:val="left"/>
+        <w:rPr>
+          <w:rFonts w:eastAsia="Times New Roman"/>
+          <w:sz w:val="19"/>
+          <w:szCs w:val="19"/>
+        </w:rPr>
+      </w:pPr>
+      <w:r>
+        <w:rPr>
+          <w:rFonts w:eastAsia="Times New Roman"/>
+          <w:sz w:val="19"/>
+          <w:szCs w:val="19"/>
+        </w:rPr>
+        <w:t>Save prediction results to new CSV files</w:t>
+      </w:r>
+    </w:p>
+    <w:p>
+      <w:pPr>
+        <w:tabs>
+          <w:tab w:val="left" w:pos="916"/>
+          <w:tab w:val="left" w:pos="1832"/>
+          <w:tab w:val="left" w:pos="2748"/>
+          <w:tab w:val="left" w:pos="3664"/>
+          <w:tab w:val="left" w:pos="4580"/>
+          <w:tab w:val="left" w:pos="5496"/>
+          <w:tab w:val="left" w:pos="6412"/>
+          <w:tab w:val="left" w:pos="7328"/>
+          <w:tab w:val="left" w:pos="8244"/>
+          <w:tab w:val="left" w:pos="9160"/>
+          <w:tab w:val="left" w:pos="10076"/>
+          <w:tab w:val="left" w:pos="10992"/>
+          <w:tab w:val="left" w:pos="11908"/>
+          <w:tab w:val="left" w:pos="12824"/>
+          <w:tab w:val="left" w:pos="13740"/>
+          <w:tab w:val="left" w:pos="14656"/>
+        </w:tabs>
+        <w:wordWrap w:val="0"/>
+        <w:jc w:val="left"/>
+        <w:rPr>
+          <w:rFonts w:eastAsia="Times New Roman"/>
+          <w:sz w:val="19"/>
+          <w:szCs w:val="19"/>
+        </w:rPr>
+      </w:pPr>
+      <w:r>
+        <w:rPr>
+          <w:rFonts w:eastAsia="Times New Roman"/>
+          <w:noProof/>
+          <w:sz w:val="19"/>
+          <w:szCs w:val="19"/>
+        </w:rPr>
+        <w:pict w14:anchorId="44F3BB9E">
+          <v:shape id="_x0000_s2063" type="#_x0000_t202" style="position:absolute;margin-left:-3.35pt;margin-top:11.7pt;width:235.5pt;height:163.5pt;z-index:6">
+            <v:textbox style="mso-next-textbox:#_x0000_s2063">
+              <w:txbxContent>
+                <w:p>
+                  <w:pPr>
+                    <w:jc w:val="left"/>
+                  </w:pPr>
+                  <w:r>
+                    <w:t xml:space="preserve">var </w:t>
+                  </w:r>
+                  <w:proofErr w:type="spellStart"/>
+                  <w:r>
+                    <w:t>csvHandler</w:t>
+                  </w:r>
+                  <w:proofErr w:type="spellEnd"/>
+                  <w:r>
+                    <w:t xml:space="preserve"> = new </w:t>
+                  </w:r>
+                  <w:proofErr w:type="spellStart"/>
+                  <w:proofErr w:type="gramStart"/>
+                  <w:r>
+                    <w:t>CSVHandler</w:t>
+                  </w:r>
+                  <w:proofErr w:type="spellEnd"/>
+                  <w:r>
+                    <w:t>(</w:t>
+                  </w:r>
+                  <w:proofErr w:type="gramEnd"/>
+                  <w:r>
+                    <w:t>);</w:t>
+                  </w:r>
+                </w:p>
+                <w:p>
+                  <w:pPr>
+                    <w:jc w:val="left"/>
+                  </w:pPr>
+                </w:p>
+                <w:p>
+                  <w:pPr>
+                    <w:jc w:val="left"/>
+                  </w:pPr>
+                  <w:r>
+                    <w:t>// Parse data</w:t>
+                  </w:r>
+                </w:p>
+                <w:p>
+                  <w:pPr>
+                    <w:jc w:val="left"/>
+                  </w:pPr>
+                  <w:r>
+                    <w:t xml:space="preserve">var sequences = </w:t>
+                  </w:r>
+                  <w:proofErr w:type="spellStart"/>
+                  <w:r>
+                    <w:t>csvHandler.ParseSequencesFromCSV</w:t>
+                  </w:r>
+                  <w:proofErr w:type="spellEnd"/>
+                  <w:r>
+                    <w:t>("data.csv"</w:t>
+                  </w:r>
+                  <w:proofErr w:type="gramStart"/>
+                  <w:r>
+                    <w:t>);</w:t>
+                  </w:r>
+                  <w:proofErr w:type="gramEnd"/>
+                </w:p>
+                <w:p>
+                  <w:pPr>
+                    <w:jc w:val="left"/>
+                  </w:pPr>
+                </w:p>
+                <w:p>
+                  <w:pPr>
+                    <w:jc w:val="left"/>
+                  </w:pPr>
+                  <w:r>
+                    <w:t>// Trim first 100 elements</w:t>
+                  </w:r>
+                </w:p>
+                <w:p>
+                  <w:pPr>
+                    <w:jc w:val="left"/>
+                  </w:pPr>
+                  <w:r>
+                    <w:t xml:space="preserve">var trimmed = </w:t>
+                  </w:r>
+                  <w:proofErr w:type="spellStart"/>
+                  <w:r>
+                    <w:t>csvHandler.TrimSequences</w:t>
+                  </w:r>
+                  <w:proofErr w:type="spellEnd"/>
+                  <w:r>
+                    <w:t>(sequences, 100</w:t>
+                  </w:r>
+                  <w:proofErr w:type="gramStart"/>
+                  <w:r>
+                    <w:t>);</w:t>
+                  </w:r>
+                  <w:proofErr w:type="gramEnd"/>
+                </w:p>
+                <w:p>
+                  <w:pPr>
+                    <w:jc w:val="left"/>
+                  </w:pPr>
+                </w:p>
+                <w:p>
+                  <w:pPr>
+                    <w:jc w:val="left"/>
+                  </w:pPr>
+                  <w:r>
+                    <w:t>// Save results</w:t>
+                  </w:r>
+                </w:p>
+                <w:p>
+                  <w:pPr>
+                    <w:jc w:val="left"/>
+                  </w:pPr>
+                  <w:proofErr w:type="spellStart"/>
+                  <w:r>
+                    <w:t>csvHandler.SaveToCsv</w:t>
+                  </w:r>
+                  <w:proofErr w:type="spellEnd"/>
+                  <w:r>
+                    <w:t xml:space="preserve">("predictions.csv", </w:t>
+                  </w:r>
+                </w:p>
+                <w:p>
+                  <w:pPr>
+                    <w:jc w:val="left"/>
+                  </w:pPr>
+                  <w:r>
+                    <w:t xml:space="preserve">    </w:t>
+                  </w:r>
+                  <w:proofErr w:type="spellStart"/>
+                  <w:r>
+                    <w:t>actualValues</w:t>
+                  </w:r>
+                  <w:proofErr w:type="spellEnd"/>
+                  <w:r>
+                    <w:t xml:space="preserve">, </w:t>
+                  </w:r>
+                  <w:proofErr w:type="spellStart"/>
+                  <w:r>
+                    <w:t>predictedValues</w:t>
+                  </w:r>
+                  <w:proofErr w:type="spellEnd"/>
+                  <w:proofErr w:type="gramStart"/>
+                  <w:r>
+                    <w:t>);</w:t>
+                  </w:r>
+                  <w:proofErr w:type="gramEnd"/>
+                </w:p>
+              </w:txbxContent>
+            </v:textbox>
+          </v:shape>
+        </w:pict>
+      </w:r>
+    </w:p>
+    <w:p>
+      <w:pPr>
+        <w:tabs>
+          <w:tab w:val="left" w:pos="916"/>
+          <w:tab w:val="left" w:pos="1832"/>
+          <w:tab w:val="left" w:pos="2748"/>
+          <w:tab w:val="left" w:pos="3664"/>
+          <w:tab w:val="left" w:pos="4580"/>
+          <w:tab w:val="left" w:pos="5496"/>
+          <w:tab w:val="left" w:pos="6412"/>
+          <w:tab w:val="left" w:pos="7328"/>
+          <w:tab w:val="left" w:pos="8244"/>
+          <w:tab w:val="left" w:pos="9160"/>
+          <w:tab w:val="left" w:pos="10076"/>
+          <w:tab w:val="left" w:pos="10992"/>
+          <w:tab w:val="left" w:pos="11908"/>
+          <w:tab w:val="left" w:pos="12824"/>
+          <w:tab w:val="left" w:pos="13740"/>
+          <w:tab w:val="left" w:pos="14656"/>
+        </w:tabs>
+        <w:wordWrap w:val="0"/>
+        <w:jc w:val="left"/>
+        <w:rPr>
+          <w:rFonts w:eastAsia="Times New Roman"/>
+          <w:color w:val="FFFFFF"/>
+          <w:sz w:val="19"/>
+          <w:szCs w:val="19"/>
+        </w:rPr>
+      </w:pPr>
+    </w:p>
+    <w:p>
+      <w:pPr>
+        <w:tabs>
+          <w:tab w:val="left" w:pos="916"/>
+          <w:tab w:val="left" w:pos="1832"/>
+          <w:tab w:val="left" w:pos="2748"/>
+          <w:tab w:val="left" w:pos="3664"/>
+          <w:tab w:val="left" w:pos="4580"/>
+          <w:tab w:val="left" w:pos="5496"/>
+          <w:tab w:val="left" w:pos="6412"/>
+          <w:tab w:val="left" w:pos="7328"/>
+          <w:tab w:val="left" w:pos="8244"/>
+          <w:tab w:val="left" w:pos="9160"/>
+          <w:tab w:val="left" w:pos="10076"/>
+          <w:tab w:val="left" w:pos="10992"/>
+          <w:tab w:val="left" w:pos="11908"/>
+          <w:tab w:val="left" w:pos="12824"/>
+          <w:tab w:val="left" w:pos="13740"/>
+          <w:tab w:val="left" w:pos="14656"/>
+        </w:tabs>
+        <w:wordWrap w:val="0"/>
+        <w:jc w:val="left"/>
+        <w:rPr>
+          <w:rFonts w:eastAsia="Times New Roman"/>
+          <w:color w:val="FFFFFF"/>
+          <w:sz w:val="19"/>
+          <w:szCs w:val="19"/>
+        </w:rPr>
+      </w:pPr>
+    </w:p>
+    <w:p>
+      <w:pPr>
+        <w:tabs>
+          <w:tab w:val="left" w:pos="916"/>
+          <w:tab w:val="left" w:pos="1832"/>
+          <w:tab w:val="left" w:pos="2748"/>
+          <w:tab w:val="left" w:pos="3664"/>
+          <w:tab w:val="left" w:pos="4580"/>
+          <w:tab w:val="left" w:pos="5496"/>
+          <w:tab w:val="left" w:pos="6412"/>
+          <w:tab w:val="left" w:pos="7328"/>
+          <w:tab w:val="left" w:pos="8244"/>
+          <w:tab w:val="left" w:pos="9160"/>
+          <w:tab w:val="left" w:pos="10076"/>
+          <w:tab w:val="left" w:pos="10992"/>
+          <w:tab w:val="left" w:pos="11908"/>
+          <w:tab w:val="left" w:pos="12824"/>
+          <w:tab w:val="left" w:pos="13740"/>
+          <w:tab w:val="left" w:pos="14656"/>
+        </w:tabs>
+        <w:wordWrap w:val="0"/>
+        <w:jc w:val="left"/>
+        <w:rPr>
+          <w:rFonts w:eastAsia="Times New Roman"/>
+          <w:color w:val="FFFFFF"/>
+          <w:sz w:val="19"/>
+          <w:szCs w:val="19"/>
+        </w:rPr>
+      </w:pPr>
+    </w:p>
+    <w:p>
+      <w:pPr>
+        <w:tabs>
+          <w:tab w:val="left" w:pos="916"/>
+          <w:tab w:val="left" w:pos="1832"/>
+          <w:tab w:val="left" w:pos="2748"/>
+          <w:tab w:val="left" w:pos="3664"/>
+          <w:tab w:val="left" w:pos="4580"/>
+          <w:tab w:val="left" w:pos="5496"/>
+          <w:tab w:val="left" w:pos="6412"/>
+          <w:tab w:val="left" w:pos="7328"/>
+          <w:tab w:val="left" w:pos="8244"/>
+          <w:tab w:val="left" w:pos="9160"/>
+          <w:tab w:val="left" w:pos="10076"/>
+          <w:tab w:val="left" w:pos="10992"/>
+          <w:tab w:val="left" w:pos="11908"/>
+          <w:tab w:val="left" w:pos="12824"/>
+          <w:tab w:val="left" w:pos="13740"/>
+          <w:tab w:val="left" w:pos="14656"/>
+        </w:tabs>
+        <w:wordWrap w:val="0"/>
+        <w:jc w:val="left"/>
+        <w:rPr>
+          <w:rFonts w:eastAsia="Times New Roman"/>
+          <w:color w:val="FFFFFF"/>
+          <w:sz w:val="19"/>
+          <w:szCs w:val="19"/>
+        </w:rPr>
+      </w:pPr>
+    </w:p>
+    <w:p>
+      <w:pPr>
+        <w:tabs>
+          <w:tab w:val="left" w:pos="916"/>
+          <w:tab w:val="left" w:pos="1832"/>
+          <w:tab w:val="left" w:pos="2748"/>
+          <w:tab w:val="left" w:pos="3664"/>
+          <w:tab w:val="left" w:pos="4580"/>
+          <w:tab w:val="left" w:pos="5496"/>
+          <w:tab w:val="left" w:pos="6412"/>
+          <w:tab w:val="left" w:pos="7328"/>
+          <w:tab w:val="left" w:pos="8244"/>
+          <w:tab w:val="left" w:pos="9160"/>
+          <w:tab w:val="left" w:pos="10076"/>
+          <w:tab w:val="left" w:pos="10992"/>
+          <w:tab w:val="left" w:pos="11908"/>
+          <w:tab w:val="left" w:pos="12824"/>
+          <w:tab w:val="left" w:pos="13740"/>
+          <w:tab w:val="left" w:pos="14656"/>
+        </w:tabs>
+        <w:wordWrap w:val="0"/>
+        <w:jc w:val="left"/>
+        <w:rPr>
+          <w:rFonts w:eastAsia="Times New Roman"/>
+          <w:color w:val="FFFFFF"/>
+          <w:sz w:val="19"/>
+          <w:szCs w:val="19"/>
+        </w:rPr>
+      </w:pPr>
+    </w:p>
+    <w:p>
+      <w:pPr>
         <w:jc w:val="both"/>
         <w:rPr>
           <w:lang w:eastAsia="x-none"/>
@@ -1322,17 +1994,39 @@
           <w:lang w:val="en-US"/>
         </w:rPr>
       </w:pPr>
+      <w:proofErr w:type="gramStart"/>
       <w:r>
         <w:rPr>
           <w:lang w:val="en-US"/>
         </w:rPr>
-        <w:t>Conclusion of your work</w:t>
-      </w:r>
+        <w:t>Conclusion</w:t>
+      </w:r>
+      <w:proofErr w:type="gramEnd"/>
       <w:r>
         <w:rPr>
           <w:lang w:val="en-US"/>
         </w:rPr>
-        <w:t xml:space="preserve"> should be precise and concise. How was the project, what is done, what is the result... There can be discussion on further work and direction.</w:t>
+        <w:t xml:space="preserve"> of your work</w:t>
+      </w:r>
+      <w:r>
+        <w:rPr>
+          <w:lang w:val="en-US"/>
+        </w:rPr>
+        <w:t xml:space="preserve"> should be precise and concise. How was the project, what </w:t>
+      </w:r>
+      <w:proofErr w:type="gramStart"/>
+      <w:r>
+        <w:rPr>
+          <w:lang w:val="en-US"/>
+        </w:rPr>
+        <w:t>is</w:t>
+      </w:r>
+      <w:proofErr w:type="gramEnd"/>
+      <w:r>
+        <w:rPr>
+          <w:lang w:val="en-US"/>
+        </w:rPr>
+        <w:t xml:space="preserve"> done, what is the result... There can be discussion on further work and direction.</w:t>
       </w:r>
     </w:p>
     <w:p>
@@ -1505,7 +2199,11 @@
       </w:r>
       <w:proofErr w:type="spellEnd"/>
       <w:r>
-        <w:t>. This often leads to confusion because equations do not balance dimensionally. If you must use mixed units, clearly state the units for each quantity that you use in an equation.</w:t>
+        <w:t xml:space="preserve">. This often leads to confusion because equations do not balance dimensionally. If you must use mixed units, clearly </w:t>
+      </w:r>
+      <w:r>
+        <w:lastRenderedPageBreak/>
+        <w:t>state the units for each quantity that you use in an equation.</w:t>
       </w:r>
     </w:p>
     <w:p>
@@ -1548,11 +2246,7 @@
         </w:rPr>
       </w:pPr>
       <w:r>
-        <w:t xml:space="preserve">may use the solidus ( / ), the exp function, or appropriate exponents. Italicize Roman symbols for quantities and variables, but not Greek symbols. Use a long dash rather than </w:t>
-      </w:r>
-      <w:r>
-        <w:lastRenderedPageBreak/>
-        <w:t>a hyphen for a minus sign. Punctuate equations with commas or periods when they are part of a sentence, as in</w:t>
+        <w:t>may use the solidus ( / ), the exp function, or appropriate exponents. Italicize Roman symbols for quantities and variables, but not Greek symbols. Use a long dash rather than a hyphen for a minus sign. Punctuate equations with commas or periods when they are part of a sentence, as in</w:t>
       </w:r>
       <w:r>
         <w:rPr>
@@ -1774,10 +2468,7 @@
         <w:pStyle w:val="BodyText"/>
       </w:pPr>
       <w:r>
-        <w:t xml:space="preserve">After the text edit has been completed, the paper is ready for the template. Duplicate the template file by using the Save As command, and use the naming convention prescribed by your conference for the name of your paper. In this newly created file, highlight all of the contents and import your prepared text file. You are now ready to style </w:t>
-      </w:r>
-      <w:r>
-        <w:t>your paper; use the scroll down window on the left of the MS Word Formatting toolbar.</w:t>
+        <w:t>After the text edit has been completed, the paper is ready for the template. Duplicate the template file by using the Save As command, and use the naming convention prescribed by your conference for the name of your paper. In this newly created file, highlight all of the contents and import your prepared text file. You are now ready to style your paper; use the scroll down window on the left of the MS Word Formatting toolbar.</w:t>
       </w:r>
     </w:p>
     <w:p>
@@ -2188,6 +2879,7 @@
               <w:pStyle w:val="tablecolhead"/>
             </w:pPr>
             <w:r>
+              <w:lastRenderedPageBreak/>
               <w:t>Table Head</w:t>
             </w:r>
           </w:p>
@@ -2408,7 +3100,6 @@
         <w:jc w:val="left"/>
       </w:pPr>
       <w:r>
-        <w:lastRenderedPageBreak/>
         <w:pict w14:anchorId="4C2ECEC5">
           <v:shapetype id="_x0000_t75" coordsize="21600,21600" o:spt="75" o:preferrelative="t" path="m@4@5l@4@11@9@11@9@5xe" filled="f" stroked="f">
             <v:stroke joinstyle="miter"/>
@@ -2495,7 +3186,15 @@
         <w:jc w:val="both"/>
       </w:pPr>
       <w:r>
-        <w:t xml:space="preserve">      Referencing Code in your text should be avoid</w:t>
+        <w:t xml:space="preserve">      Referencing </w:t>
+      </w:r>
+      <w:proofErr w:type="gramStart"/>
+      <w:r>
+        <w:t>Code</w:t>
+      </w:r>
+      <w:proofErr w:type="gramEnd"/>
+      <w:r>
+        <w:t xml:space="preserve"> in your text should be avoid</w:t>
       </w:r>
       <w:r>
         <w:t>ed</w:t>
@@ -2573,8 +3272,13 @@
                   </w:r>
                   <w:proofErr w:type="spellEnd"/>
                   <w:r>
-                    <w:t>(“Referencing code”, var);</w:t>
+                    <w:t>(“Referencing code”, var</w:t>
                   </w:r>
+                  <w:proofErr w:type="gramStart"/>
+                  <w:r>
+                    <w:t>);</w:t>
+                  </w:r>
+                  <w:proofErr w:type="gramEnd"/>
                 </w:p>
                 <w:p>
                   <w:pPr>
@@ -2601,7 +3305,15 @@
         <w:jc w:val="both"/>
       </w:pPr>
       <w:r>
-        <w:t xml:space="preserve">Do not pass code as image. When referring to variable in </w:t>
+        <w:t xml:space="preserve">Do not pass </w:t>
+      </w:r>
+      <w:proofErr w:type="gramStart"/>
+      <w:r>
+        <w:t>code</w:t>
+      </w:r>
+      <w:proofErr w:type="gramEnd"/>
+      <w:r>
+        <w:t xml:space="preserve"> as image. When referring to variable in </w:t>
       </w:r>
       <w:r>
         <w:fldChar w:fldCharType="begin"/>
@@ -2623,7 +3335,15 @@
         <w:fldChar w:fldCharType="end"/>
       </w:r>
       <w:r>
-        <w:t xml:space="preserve">, italics should be used </w:t>
+        <w:t xml:space="preserve">, italics should be </w:t>
+      </w:r>
+      <w:proofErr w:type="gramStart"/>
+      <w:r>
+        <w:t>used</w:t>
+      </w:r>
+      <w:proofErr w:type="gramEnd"/>
+      <w:r>
+        <w:t xml:space="preserve"> </w:t>
       </w:r>
       <w:r>
         <w:t xml:space="preserve">for example </w:t>
@@ -2717,7 +3437,15 @@
                     <w:jc w:val="left"/>
                   </w:pPr>
                   <w:r>
-                    <w:t>public void EncodeDateTimeTest(int w, double r, …)</w:t>
+                    <w:t xml:space="preserve">public void </w:t>
+                  </w:r>
+                  <w:proofErr w:type="gramStart"/>
+                  <w:r>
+                    <w:t>EncodeDateTimeTest(</w:t>
+                  </w:r>
+                  <w:proofErr w:type="gramEnd"/>
+                  <w:r>
+                    <w:t>int w, double r, …)</w:t>
                   </w:r>
                 </w:p>
                 <w:p>
@@ -2760,10 +3488,12 @@
                     <w:t xml:space="preserve">        var result = </w:t>
                   </w:r>
                   <w:proofErr w:type="spellStart"/>
+                  <w:proofErr w:type="gramStart"/>
                   <w:r>
                     <w:t>encoder.Encode</w:t>
                   </w:r>
                   <w:proofErr w:type="spellEnd"/>
+                  <w:proofErr w:type="gramEnd"/>
                   <w:r>
                     <w:t>(input);</w:t>
                   </w:r>
@@ -2792,10 +3522,12 @@
                     <w:t>(</w:t>
                   </w:r>
                   <w:proofErr w:type="spellStart"/>
+                  <w:proofErr w:type="gramStart"/>
                   <w:r>
                     <w:t>result.SequenceEqual</w:t>
                   </w:r>
                   <w:proofErr w:type="spellEnd"/>
+                  <w:proofErr w:type="gramEnd"/>
                   <w:r>
                     <w:t>(expected…</w:t>
                   </w:r>
@@ -2856,10 +3588,7 @@
         <w:t>The preferred spelling of the word “acknowledgment” in America is without an “e” after the “g</w:t>
       </w:r>
       <w:r>
-        <w:t xml:space="preserve">”. Avoid the stilted </w:t>
-      </w:r>
-      <w:r>
-        <w:t>expression “</w:t>
+        <w:t>”. Avoid the stilted expression “</w:t>
       </w:r>
       <w:proofErr w:type="spellStart"/>
       <w:r>
@@ -3289,7 +4018,7 @@
     <w:p>
       <w:r>
         <w:pict w14:anchorId="4A67007D">
-          <v:shape id="_x0000_s2056" type="#_x0000_t202" style="position:absolute;left:0;text-align:left;margin-left:0;margin-top:19.8pt;width:252pt;height:90pt;z-index:-3;mso-wrap-edited:f;mso-position-horizontal:left;mso-position-horizontal-relative:margin" wrapcoords="-64 0 -64 21600 21664 21600 21664 0 -64 0">
+          <v:shape id="_x0000_s2056" type="#_x0000_t202" style="position:absolute;left:0;text-align:left;margin-left:0;margin-top:19.8pt;width:252pt;height:90pt;z-index:-4;mso-wrap-edited:f;mso-position-horizontal:left;mso-position-horizontal-relative:margin" wrapcoords="-64 0 -64 21600 21664 21600 21664 0 -64 0">
             <v:textbox style="mso-next-textbox:#_x0000_s2056">
               <w:txbxContent>
                 <w:p>
@@ -3926,6 +4655,155 @@
     </w:lvl>
   </w:abstractNum>
   <w:abstractNum w:abstractNumId="12" w15:restartNumberingAfterBreak="0">
+    <w:nsid w:val="20687739"/>
+    <w:multiLevelType w:val="multilevel"/>
+    <w:tmpl w:val="4524E17C"/>
+    <w:lvl w:ilvl="0">
+      <w:start w:val="1"/>
+      <w:numFmt w:val="bullet"/>
+      <w:lvlText w:val=""/>
+      <w:lvlJc w:val="left"/>
+      <w:pPr>
+        <w:tabs>
+          <w:tab w:val="num" w:pos="720"/>
+        </w:tabs>
+        <w:ind w:left="720" w:hanging="360"/>
+      </w:pPr>
+      <w:rPr>
+        <w:rFonts w:ascii="Symbol" w:hAnsi="Symbol" w:hint="default"/>
+        <w:sz w:val="20"/>
+      </w:rPr>
+    </w:lvl>
+    <w:lvl w:ilvl="1" w:tentative="1">
+      <w:start w:val="1"/>
+      <w:numFmt w:val="bullet"/>
+      <w:lvlText w:val="o"/>
+      <w:lvlJc w:val="left"/>
+      <w:pPr>
+        <w:tabs>
+          <w:tab w:val="num" w:pos="1440"/>
+        </w:tabs>
+        <w:ind w:left="1440" w:hanging="360"/>
+      </w:pPr>
+      <w:rPr>
+        <w:rFonts w:ascii="Courier New" w:hAnsi="Courier New" w:hint="default"/>
+        <w:sz w:val="20"/>
+      </w:rPr>
+    </w:lvl>
+    <w:lvl w:ilvl="2" w:tentative="1">
+      <w:start w:val="1"/>
+      <w:numFmt w:val="bullet"/>
+      <w:lvlText w:val=""/>
+      <w:lvlJc w:val="left"/>
+      <w:pPr>
+        <w:tabs>
+          <w:tab w:val="num" w:pos="2160"/>
+        </w:tabs>
+        <w:ind w:left="2160" w:hanging="360"/>
+      </w:pPr>
+      <w:rPr>
+        <w:rFonts w:ascii="Wingdings" w:hAnsi="Wingdings" w:hint="default"/>
+        <w:sz w:val="20"/>
+      </w:rPr>
+    </w:lvl>
+    <w:lvl w:ilvl="3" w:tentative="1">
+      <w:start w:val="1"/>
+      <w:numFmt w:val="bullet"/>
+      <w:lvlText w:val=""/>
+      <w:lvlJc w:val="left"/>
+      <w:pPr>
+        <w:tabs>
+          <w:tab w:val="num" w:pos="2880"/>
+        </w:tabs>
+        <w:ind w:left="2880" w:hanging="360"/>
+      </w:pPr>
+      <w:rPr>
+        <w:rFonts w:ascii="Wingdings" w:hAnsi="Wingdings" w:hint="default"/>
+        <w:sz w:val="20"/>
+      </w:rPr>
+    </w:lvl>
+    <w:lvl w:ilvl="4" w:tentative="1">
+      <w:start w:val="1"/>
+      <w:numFmt w:val="bullet"/>
+      <w:lvlText w:val=""/>
+      <w:lvlJc w:val="left"/>
+      <w:pPr>
+        <w:tabs>
+          <w:tab w:val="num" w:pos="3600"/>
+        </w:tabs>
+        <w:ind w:left="3600" w:hanging="360"/>
+      </w:pPr>
+      <w:rPr>
+        <w:rFonts w:ascii="Wingdings" w:hAnsi="Wingdings" w:hint="default"/>
+        <w:sz w:val="20"/>
+      </w:rPr>
+    </w:lvl>
+    <w:lvl w:ilvl="5" w:tentative="1">
+      <w:start w:val="1"/>
+      <w:numFmt w:val="bullet"/>
+      <w:lvlText w:val=""/>
+      <w:lvlJc w:val="left"/>
+      <w:pPr>
+        <w:tabs>
+          <w:tab w:val="num" w:pos="4320"/>
+        </w:tabs>
+        <w:ind w:left="4320" w:hanging="360"/>
+      </w:pPr>
+      <w:rPr>
+        <w:rFonts w:ascii="Wingdings" w:hAnsi="Wingdings" w:hint="default"/>
+        <w:sz w:val="20"/>
+      </w:rPr>
+    </w:lvl>
+    <w:lvl w:ilvl="6" w:tentative="1">
+      <w:start w:val="1"/>
+      <w:numFmt w:val="bullet"/>
+      <w:lvlText w:val=""/>
+      <w:lvlJc w:val="left"/>
+      <w:pPr>
+        <w:tabs>
+          <w:tab w:val="num" w:pos="5040"/>
+        </w:tabs>
+        <w:ind w:left="5040" w:hanging="360"/>
+      </w:pPr>
+      <w:rPr>
+        <w:rFonts w:ascii="Wingdings" w:hAnsi="Wingdings" w:hint="default"/>
+        <w:sz w:val="20"/>
+      </w:rPr>
+    </w:lvl>
+    <w:lvl w:ilvl="7" w:tentative="1">
+      <w:start w:val="1"/>
+      <w:numFmt w:val="bullet"/>
+      <w:lvlText w:val=""/>
+      <w:lvlJc w:val="left"/>
+      <w:pPr>
+        <w:tabs>
+          <w:tab w:val="num" w:pos="5760"/>
+        </w:tabs>
+        <w:ind w:left="5760" w:hanging="360"/>
+      </w:pPr>
+      <w:rPr>
+        <w:rFonts w:ascii="Wingdings" w:hAnsi="Wingdings" w:hint="default"/>
+        <w:sz w:val="20"/>
+      </w:rPr>
+    </w:lvl>
+    <w:lvl w:ilvl="8" w:tentative="1">
+      <w:start w:val="1"/>
+      <w:numFmt w:val="bullet"/>
+      <w:lvlText w:val=""/>
+      <w:lvlJc w:val="left"/>
+      <w:pPr>
+        <w:tabs>
+          <w:tab w:val="num" w:pos="6480"/>
+        </w:tabs>
+        <w:ind w:left="6480" w:hanging="360"/>
+      </w:pPr>
+      <w:rPr>
+        <w:rFonts w:ascii="Wingdings" w:hAnsi="Wingdings" w:hint="default"/>
+        <w:sz w:val="20"/>
+      </w:rPr>
+    </w:lvl>
+  </w:abstractNum>
+  <w:abstractNum w:abstractNumId="13" w15:restartNumberingAfterBreak="0">
     <w:nsid w:val="20AF0333"/>
     <w:multiLevelType w:val="hybridMultilevel"/>
     <w:tmpl w:val="CB0E7F4E"/>
@@ -4067,7 +4945,7 @@
       </w:rPr>
     </w:lvl>
   </w:abstractNum>
-  <w:abstractNum w:abstractNumId="13" w15:restartNumberingAfterBreak="0">
+  <w:abstractNum w:abstractNumId="14" w15:restartNumberingAfterBreak="0">
     <w:nsid w:val="26FE1FCF"/>
     <w:multiLevelType w:val="hybridMultilevel"/>
     <w:tmpl w:val="33826962"/>
@@ -4223,7 +5101,7 @@
       </w:rPr>
     </w:lvl>
   </w:abstractNum>
-  <w:abstractNum w:abstractNumId="14" w15:restartNumberingAfterBreak="0">
+  <w:abstractNum w:abstractNumId="15" w15:restartNumberingAfterBreak="0">
     <w:nsid w:val="37660336"/>
     <w:multiLevelType w:val="hybridMultilevel"/>
     <w:tmpl w:val="754EAC84"/>
@@ -4364,7 +5242,7 @@
       </w:rPr>
     </w:lvl>
   </w:abstractNum>
-  <w:abstractNum w:abstractNumId="15" w15:restartNumberingAfterBreak="0">
+  <w:abstractNum w:abstractNumId="16" w15:restartNumberingAfterBreak="0">
     <w:nsid w:val="39E54FC6"/>
     <w:multiLevelType w:val="singleLevel"/>
     <w:tmpl w:val="5B7288D4"/>
@@ -4384,7 +5262,7 @@
       </w:rPr>
     </w:lvl>
   </w:abstractNum>
-  <w:abstractNum w:abstractNumId="16" w15:restartNumberingAfterBreak="0">
+  <w:abstractNum w:abstractNumId="17" w15:restartNumberingAfterBreak="0">
     <w:nsid w:val="4189603E"/>
     <w:multiLevelType w:val="multilevel"/>
     <w:tmpl w:val="0AB06E12"/>
@@ -4579,7 +5457,7 @@
       </w:rPr>
     </w:lvl>
   </w:abstractNum>
-  <w:abstractNum w:abstractNumId="17" w15:restartNumberingAfterBreak="0">
+  <w:abstractNum w:abstractNumId="18" w15:restartNumberingAfterBreak="0">
     <w:nsid w:val="493C3F76"/>
     <w:multiLevelType w:val="hybridMultilevel"/>
     <w:tmpl w:val="9A9E418C"/>
@@ -4686,7 +5564,7 @@
       </w:pPr>
     </w:lvl>
   </w:abstractNum>
-  <w:abstractNum w:abstractNumId="18" w15:restartNumberingAfterBreak="0">
+  <w:abstractNum w:abstractNumId="19" w15:restartNumberingAfterBreak="0">
     <w:nsid w:val="52CA544A"/>
     <w:multiLevelType w:val="singleLevel"/>
     <w:tmpl w:val="AED6D67E"/>
@@ -4713,7 +5591,7 @@
       </w:rPr>
     </w:lvl>
   </w:abstractNum>
-  <w:abstractNum w:abstractNumId="19" w15:restartNumberingAfterBreak="0">
+  <w:abstractNum w:abstractNumId="20" w15:restartNumberingAfterBreak="0">
     <w:nsid w:val="6C402C58"/>
     <w:multiLevelType w:val="hybridMultilevel"/>
     <w:tmpl w:val="9A1CA078"/>
@@ -4858,7 +5736,7 @@
       </w:rPr>
     </w:lvl>
   </w:abstractNum>
-  <w:abstractNum w:abstractNumId="20" w15:restartNumberingAfterBreak="0">
+  <w:abstractNum w:abstractNumId="21" w15:restartNumberingAfterBreak="0">
     <w:nsid w:val="6CD32DA8"/>
     <w:multiLevelType w:val="singleLevel"/>
     <w:tmpl w:val="166470C2"/>
@@ -4885,37 +5763,37 @@
     </w:lvl>
   </w:abstractNum>
   <w:num w:numId="1" w16cid:durableId="1201210240">
+    <w:abstractNumId w:val="15"/>
+  </w:num>
+  <w:num w:numId="2" w16cid:durableId="744106382">
+    <w:abstractNumId w:val="20"/>
+  </w:num>
+  <w:num w:numId="3" w16cid:durableId="405542283">
     <w:abstractNumId w:val="14"/>
   </w:num>
-  <w:num w:numId="2" w16cid:durableId="744106382">
+  <w:num w:numId="4" w16cid:durableId="58528485">
+    <w:abstractNumId w:val="17"/>
+  </w:num>
+  <w:num w:numId="5" w16cid:durableId="158690621">
+    <w:abstractNumId w:val="17"/>
+  </w:num>
+  <w:num w:numId="6" w16cid:durableId="1725248462">
+    <w:abstractNumId w:val="17"/>
+  </w:num>
+  <w:num w:numId="7" w16cid:durableId="941455226">
+    <w:abstractNumId w:val="17"/>
+  </w:num>
+  <w:num w:numId="8" w16cid:durableId="1785659599">
     <w:abstractNumId w:val="19"/>
   </w:num>
-  <w:num w:numId="3" w16cid:durableId="405542283">
-    <w:abstractNumId w:val="13"/>
+  <w:num w:numId="9" w16cid:durableId="1933902280">
+    <w:abstractNumId w:val="21"/>
   </w:num>
-  <w:num w:numId="4" w16cid:durableId="58528485">
+  <w:num w:numId="10" w16cid:durableId="1495225212">
     <w:abstractNumId w:val="16"/>
   </w:num>
-  <w:num w:numId="5" w16cid:durableId="158690621">
-    <w:abstractNumId w:val="16"/>
-  </w:num>
-  <w:num w:numId="6" w16cid:durableId="1725248462">
-    <w:abstractNumId w:val="16"/>
-  </w:num>
-  <w:num w:numId="7" w16cid:durableId="941455226">
-    <w:abstractNumId w:val="16"/>
-  </w:num>
-  <w:num w:numId="8" w16cid:durableId="1785659599">
-    <w:abstractNumId w:val="18"/>
-  </w:num>
-  <w:num w:numId="9" w16cid:durableId="1933902280">
-    <w:abstractNumId w:val="20"/>
-  </w:num>
-  <w:num w:numId="10" w16cid:durableId="1495225212">
-    <w:abstractNumId w:val="15"/>
-  </w:num>
   <w:num w:numId="11" w16cid:durableId="275407238">
-    <w:abstractNumId w:val="12"/>
+    <w:abstractNumId w:val="13"/>
   </w:num>
   <w:num w:numId="12" w16cid:durableId="979460043">
     <w:abstractNumId w:val="11"/>
@@ -4954,7 +5832,10 @@
     <w:abstractNumId w:val="1"/>
   </w:num>
   <w:num w:numId="24" w16cid:durableId="841047741">
-    <w:abstractNumId w:val="17"/>
+    <w:abstractNumId w:val="18"/>
+  </w:num>
+  <w:num w:numId="25" w16cid:durableId="1846700602">
+    <w:abstractNumId w:val="12"/>
   </w:num>
 </w:numbering>
 </file>

</xml_diff>

<commit_message>
Adding method for sequence processing
</commit_message>
<xml_diff>
--- a/source/MySEProject/Documentation/ML 24-25-03 Implement Anomaly Detection Sample.docx
+++ b/source/MySEProject/Documentation/ML 24-25-03 Implement Anomaly Detection Sample.docx
@@ -1813,8 +1813,1119 @@
     </w:p>
     <w:p>
       <w:pPr>
+        <w:tabs>
+          <w:tab w:val="left" w:pos="916"/>
+          <w:tab w:val="left" w:pos="1832"/>
+          <w:tab w:val="left" w:pos="2748"/>
+          <w:tab w:val="left" w:pos="3664"/>
+          <w:tab w:val="left" w:pos="4580"/>
+          <w:tab w:val="left" w:pos="5496"/>
+          <w:tab w:val="left" w:pos="6412"/>
+          <w:tab w:val="left" w:pos="7328"/>
+          <w:tab w:val="left" w:pos="8244"/>
+          <w:tab w:val="left" w:pos="9160"/>
+          <w:tab w:val="left" w:pos="10076"/>
+          <w:tab w:val="left" w:pos="10992"/>
+          <w:tab w:val="left" w:pos="11908"/>
+          <w:tab w:val="left" w:pos="12824"/>
+          <w:tab w:val="left" w:pos="13740"/>
+          <w:tab w:val="left" w:pos="14656"/>
+        </w:tabs>
+        <w:wordWrap w:val="0"/>
+        <w:jc w:val="left"/>
+      </w:pPr>
+      <w:r>
+        <w:t>CSV to HTM Inputs</w:t>
+      </w:r>
+    </w:p>
+    <w:p>
+      <w:pPr>
+        <w:tabs>
+          <w:tab w:val="left" w:pos="916"/>
+          <w:tab w:val="left" w:pos="1832"/>
+          <w:tab w:val="left" w:pos="2748"/>
+          <w:tab w:val="left" w:pos="3664"/>
+          <w:tab w:val="left" w:pos="4580"/>
+          <w:tab w:val="left" w:pos="5496"/>
+          <w:tab w:val="left" w:pos="6412"/>
+          <w:tab w:val="left" w:pos="7328"/>
+          <w:tab w:val="left" w:pos="8244"/>
+          <w:tab w:val="left" w:pos="9160"/>
+          <w:tab w:val="left" w:pos="10076"/>
+          <w:tab w:val="left" w:pos="10992"/>
+          <w:tab w:val="left" w:pos="11908"/>
+          <w:tab w:val="left" w:pos="12824"/>
+          <w:tab w:val="left" w:pos="13740"/>
+          <w:tab w:val="left" w:pos="14656"/>
+        </w:tabs>
+        <w:wordWrap w:val="0"/>
+        <w:jc w:val="left"/>
+        <w:rPr>
+          <w:rFonts w:eastAsia="Times New Roman"/>
+          <w:sz w:val="19"/>
+          <w:szCs w:val="19"/>
+        </w:rPr>
+      </w:pPr>
+    </w:p>
+    <w:p>
+      <w:pPr>
+        <w:tabs>
+          <w:tab w:val="left" w:pos="916"/>
+          <w:tab w:val="left" w:pos="1832"/>
+          <w:tab w:val="left" w:pos="2748"/>
+          <w:tab w:val="left" w:pos="3664"/>
+          <w:tab w:val="left" w:pos="4580"/>
+          <w:tab w:val="left" w:pos="5496"/>
+          <w:tab w:val="left" w:pos="6412"/>
+          <w:tab w:val="left" w:pos="7328"/>
+          <w:tab w:val="left" w:pos="8244"/>
+          <w:tab w:val="left" w:pos="9160"/>
+          <w:tab w:val="left" w:pos="10076"/>
+          <w:tab w:val="left" w:pos="10992"/>
+          <w:tab w:val="left" w:pos="11908"/>
+          <w:tab w:val="left" w:pos="12824"/>
+          <w:tab w:val="left" w:pos="13740"/>
+          <w:tab w:val="left" w:pos="14656"/>
+        </w:tabs>
+        <w:wordWrap w:val="0"/>
+        <w:jc w:val="left"/>
+        <w:rPr>
+          <w:rFonts w:eastAsia="Times New Roman"/>
+          <w:sz w:val="19"/>
+          <w:szCs w:val="19"/>
+        </w:rPr>
+      </w:pPr>
+    </w:p>
+    <w:p>
+      <w:pPr>
+        <w:tabs>
+          <w:tab w:val="left" w:pos="916"/>
+          <w:tab w:val="left" w:pos="1832"/>
+          <w:tab w:val="left" w:pos="2748"/>
+          <w:tab w:val="left" w:pos="3664"/>
+          <w:tab w:val="left" w:pos="4580"/>
+          <w:tab w:val="left" w:pos="5496"/>
+          <w:tab w:val="left" w:pos="6412"/>
+          <w:tab w:val="left" w:pos="7328"/>
+          <w:tab w:val="left" w:pos="8244"/>
+          <w:tab w:val="left" w:pos="9160"/>
+          <w:tab w:val="left" w:pos="10076"/>
+          <w:tab w:val="left" w:pos="10992"/>
+          <w:tab w:val="left" w:pos="11908"/>
+          <w:tab w:val="left" w:pos="12824"/>
+          <w:tab w:val="left" w:pos="13740"/>
+          <w:tab w:val="left" w:pos="14656"/>
+        </w:tabs>
+        <w:wordWrap w:val="0"/>
+        <w:jc w:val="left"/>
+        <w:rPr>
+          <w:rFonts w:eastAsia="Times New Roman"/>
+          <w:sz w:val="19"/>
+          <w:szCs w:val="19"/>
+        </w:rPr>
+      </w:pPr>
+      <w:r>
+        <w:rPr>
+          <w:rFonts w:eastAsia="Times New Roman"/>
+          <w:sz w:val="19"/>
+          <w:szCs w:val="19"/>
+        </w:rPr>
+        <w:t>The </w:t>
+      </w:r>
+      <w:proofErr w:type="spellStart"/>
+      <w:r>
+        <w:rPr>
+          <w:rFonts w:eastAsia="Times New Roman"/>
+          <w:sz w:val="19"/>
+          <w:szCs w:val="19"/>
+        </w:rPr>
+        <w:t>CSVToHTMInput</w:t>
+      </w:r>
+      <w:proofErr w:type="spellEnd"/>
+      <w:r>
+        <w:rPr>
+          <w:rFonts w:eastAsia="Times New Roman"/>
+          <w:sz w:val="19"/>
+          <w:szCs w:val="19"/>
+        </w:rPr>
+        <w:t> class acts as a </w:t>
+      </w:r>
+      <w:r>
+        <w:rPr>
+          <w:rFonts w:eastAsia="Times New Roman"/>
+          <w:b/>
+          <w:bCs/>
+          <w:sz w:val="19"/>
+          <w:szCs w:val="19"/>
+        </w:rPr>
+        <w:t>data adapter</w:t>
+      </w:r>
+      <w:r>
+        <w:rPr>
+          <w:rFonts w:eastAsia="Times New Roman"/>
+          <w:sz w:val="19"/>
+          <w:szCs w:val="19"/>
+        </w:rPr>
+        <w:t> to format time-series sequences into a structure compatible with the HTM engine. Its key responsibilities:</w:t>
+      </w:r>
+    </w:p>
+    <w:p>
+      <w:pPr>
+        <w:numPr>
+          <w:ilvl w:val="0"/>
+          <w:numId w:val="26"/>
+        </w:numPr>
+        <w:tabs>
+          <w:tab w:val="left" w:pos="916"/>
+          <w:tab w:val="left" w:pos="1832"/>
+          <w:tab w:val="left" w:pos="2748"/>
+          <w:tab w:val="left" w:pos="3664"/>
+          <w:tab w:val="left" w:pos="4580"/>
+          <w:tab w:val="left" w:pos="5496"/>
+          <w:tab w:val="left" w:pos="6412"/>
+          <w:tab w:val="left" w:pos="7328"/>
+          <w:tab w:val="left" w:pos="8244"/>
+          <w:tab w:val="left" w:pos="9160"/>
+          <w:tab w:val="left" w:pos="10076"/>
+          <w:tab w:val="left" w:pos="10992"/>
+          <w:tab w:val="left" w:pos="11908"/>
+          <w:tab w:val="left" w:pos="12824"/>
+          <w:tab w:val="left" w:pos="13740"/>
+          <w:tab w:val="left" w:pos="14656"/>
+        </w:tabs>
+        <w:wordWrap w:val="0"/>
+        <w:jc w:val="left"/>
+        <w:rPr>
+          <w:rFonts w:eastAsia="Times New Roman"/>
+          <w:sz w:val="19"/>
+          <w:szCs w:val="19"/>
+        </w:rPr>
+      </w:pPr>
+      <w:r>
+        <w:rPr>
+          <w:rFonts w:eastAsia="Times New Roman"/>
+          <w:sz w:val="19"/>
+          <w:szCs w:val="19"/>
+        </w:rPr>
+        <w:t>Convert raw sequences (from CSV files) into a dictionary with unique identifiers</w:t>
+      </w:r>
+    </w:p>
+    <w:p>
+      <w:pPr>
+        <w:numPr>
+          <w:ilvl w:val="0"/>
+          <w:numId w:val="26"/>
+        </w:numPr>
+        <w:tabs>
+          <w:tab w:val="left" w:pos="916"/>
+          <w:tab w:val="left" w:pos="1832"/>
+          <w:tab w:val="left" w:pos="2748"/>
+          <w:tab w:val="left" w:pos="3664"/>
+          <w:tab w:val="left" w:pos="4580"/>
+          <w:tab w:val="left" w:pos="5496"/>
+          <w:tab w:val="left" w:pos="6412"/>
+          <w:tab w:val="left" w:pos="7328"/>
+          <w:tab w:val="left" w:pos="8244"/>
+          <w:tab w:val="left" w:pos="9160"/>
+          <w:tab w:val="left" w:pos="10076"/>
+          <w:tab w:val="left" w:pos="10992"/>
+          <w:tab w:val="left" w:pos="11908"/>
+          <w:tab w:val="left" w:pos="12824"/>
+          <w:tab w:val="left" w:pos="13740"/>
+          <w:tab w:val="left" w:pos="14656"/>
+        </w:tabs>
+        <w:wordWrap w:val="0"/>
+        <w:jc w:val="left"/>
+        <w:rPr>
+          <w:rFonts w:eastAsia="Times New Roman"/>
+          <w:sz w:val="19"/>
+          <w:szCs w:val="19"/>
+        </w:rPr>
+      </w:pPr>
+      <w:r>
+        <w:rPr>
+          <w:rFonts w:eastAsia="Times New Roman"/>
+          <w:sz w:val="19"/>
+          <w:szCs w:val="19"/>
+        </w:rPr>
+        <w:t>Prepare data for the HTM classifier to track sequences during training/prediction</w:t>
+      </w:r>
+    </w:p>
+    <w:p>
+      <w:pPr>
+        <w:tabs>
+          <w:tab w:val="left" w:pos="916"/>
+          <w:tab w:val="left" w:pos="1832"/>
+          <w:tab w:val="left" w:pos="2748"/>
+          <w:tab w:val="left" w:pos="3664"/>
+          <w:tab w:val="left" w:pos="4580"/>
+          <w:tab w:val="left" w:pos="5496"/>
+          <w:tab w:val="left" w:pos="6412"/>
+          <w:tab w:val="left" w:pos="7328"/>
+          <w:tab w:val="left" w:pos="8244"/>
+          <w:tab w:val="left" w:pos="9160"/>
+          <w:tab w:val="left" w:pos="10076"/>
+          <w:tab w:val="left" w:pos="10992"/>
+          <w:tab w:val="left" w:pos="11908"/>
+          <w:tab w:val="left" w:pos="12824"/>
+          <w:tab w:val="left" w:pos="13740"/>
+          <w:tab w:val="left" w:pos="14656"/>
+        </w:tabs>
+        <w:wordWrap w:val="0"/>
+        <w:jc w:val="left"/>
+        <w:rPr>
+          <w:rFonts w:eastAsia="Times New Roman"/>
+          <w:sz w:val="19"/>
+          <w:szCs w:val="19"/>
+        </w:rPr>
+      </w:pPr>
+      <w:r>
+        <w:rPr>
+          <w:rFonts w:eastAsia="Times New Roman"/>
+          <w:sz w:val="19"/>
+          <w:szCs w:val="19"/>
+        </w:rPr>
+        <w:t xml:space="preserve"> </w:t>
+      </w:r>
+    </w:p>
+    <w:p>
+      <w:pPr>
+        <w:tabs>
+          <w:tab w:val="left" w:pos="916"/>
+          <w:tab w:val="left" w:pos="1832"/>
+          <w:tab w:val="left" w:pos="2748"/>
+          <w:tab w:val="left" w:pos="3664"/>
+          <w:tab w:val="left" w:pos="4580"/>
+          <w:tab w:val="left" w:pos="5496"/>
+          <w:tab w:val="left" w:pos="6412"/>
+          <w:tab w:val="left" w:pos="7328"/>
+          <w:tab w:val="left" w:pos="8244"/>
+          <w:tab w:val="left" w:pos="9160"/>
+          <w:tab w:val="left" w:pos="10076"/>
+          <w:tab w:val="left" w:pos="10992"/>
+          <w:tab w:val="left" w:pos="11908"/>
+          <w:tab w:val="left" w:pos="12824"/>
+          <w:tab w:val="left" w:pos="13740"/>
+          <w:tab w:val="left" w:pos="14656"/>
+        </w:tabs>
+        <w:wordWrap w:val="0"/>
+        <w:jc w:val="left"/>
+        <w:rPr>
+          <w:rFonts w:eastAsia="Times New Roman"/>
+          <w:sz w:val="19"/>
+          <w:szCs w:val="19"/>
+        </w:rPr>
+      </w:pPr>
+    </w:p>
+    <w:p>
+      <w:pPr>
+        <w:tabs>
+          <w:tab w:val="left" w:pos="916"/>
+          <w:tab w:val="left" w:pos="1832"/>
+          <w:tab w:val="left" w:pos="2748"/>
+          <w:tab w:val="left" w:pos="3664"/>
+          <w:tab w:val="left" w:pos="4580"/>
+          <w:tab w:val="left" w:pos="5496"/>
+          <w:tab w:val="left" w:pos="6412"/>
+          <w:tab w:val="left" w:pos="7328"/>
+          <w:tab w:val="left" w:pos="8244"/>
+          <w:tab w:val="left" w:pos="9160"/>
+          <w:tab w:val="left" w:pos="10076"/>
+          <w:tab w:val="left" w:pos="10992"/>
+          <w:tab w:val="left" w:pos="11908"/>
+          <w:tab w:val="left" w:pos="12824"/>
+          <w:tab w:val="left" w:pos="13740"/>
+          <w:tab w:val="left" w:pos="14656"/>
+        </w:tabs>
+        <w:wordWrap w:val="0"/>
+        <w:jc w:val="left"/>
+        <w:rPr>
+          <w:rFonts w:eastAsia="Times New Roman"/>
+          <w:sz w:val="19"/>
+          <w:szCs w:val="19"/>
+        </w:rPr>
+      </w:pPr>
+    </w:p>
+    <w:p>
+      <w:pPr>
+        <w:tabs>
+          <w:tab w:val="left" w:pos="916"/>
+          <w:tab w:val="left" w:pos="1832"/>
+          <w:tab w:val="left" w:pos="2748"/>
+          <w:tab w:val="left" w:pos="3664"/>
+          <w:tab w:val="left" w:pos="4580"/>
+          <w:tab w:val="left" w:pos="5496"/>
+          <w:tab w:val="left" w:pos="6412"/>
+          <w:tab w:val="left" w:pos="7328"/>
+          <w:tab w:val="left" w:pos="8244"/>
+          <w:tab w:val="left" w:pos="9160"/>
+          <w:tab w:val="left" w:pos="10076"/>
+          <w:tab w:val="left" w:pos="10992"/>
+          <w:tab w:val="left" w:pos="11908"/>
+          <w:tab w:val="left" w:pos="12824"/>
+          <w:tab w:val="left" w:pos="13740"/>
+          <w:tab w:val="left" w:pos="14656"/>
+        </w:tabs>
+        <w:wordWrap w:val="0"/>
+        <w:jc w:val="left"/>
+        <w:rPr>
+          <w:rFonts w:eastAsia="Times New Roman"/>
+          <w:sz w:val="19"/>
+          <w:szCs w:val="19"/>
+        </w:rPr>
+      </w:pPr>
+    </w:p>
+    <w:p>
+      <w:pPr>
+        <w:tabs>
+          <w:tab w:val="left" w:pos="916"/>
+          <w:tab w:val="left" w:pos="1832"/>
+          <w:tab w:val="left" w:pos="2748"/>
+          <w:tab w:val="left" w:pos="3664"/>
+          <w:tab w:val="left" w:pos="4580"/>
+          <w:tab w:val="left" w:pos="5496"/>
+          <w:tab w:val="left" w:pos="6412"/>
+          <w:tab w:val="left" w:pos="7328"/>
+          <w:tab w:val="left" w:pos="8244"/>
+          <w:tab w:val="left" w:pos="9160"/>
+          <w:tab w:val="left" w:pos="10076"/>
+          <w:tab w:val="left" w:pos="10992"/>
+          <w:tab w:val="left" w:pos="11908"/>
+          <w:tab w:val="left" w:pos="12824"/>
+          <w:tab w:val="left" w:pos="13740"/>
+          <w:tab w:val="left" w:pos="14656"/>
+        </w:tabs>
+        <w:wordWrap w:val="0"/>
+        <w:jc w:val="left"/>
+        <w:rPr>
+          <w:rFonts w:eastAsia="Times New Roman"/>
+          <w:sz w:val="19"/>
+          <w:szCs w:val="19"/>
+        </w:rPr>
+      </w:pPr>
+    </w:p>
+    <w:p>
+      <w:pPr>
+        <w:tabs>
+          <w:tab w:val="left" w:pos="916"/>
+          <w:tab w:val="left" w:pos="1832"/>
+          <w:tab w:val="left" w:pos="2748"/>
+          <w:tab w:val="left" w:pos="3664"/>
+          <w:tab w:val="left" w:pos="4580"/>
+          <w:tab w:val="left" w:pos="5496"/>
+          <w:tab w:val="left" w:pos="6412"/>
+          <w:tab w:val="left" w:pos="7328"/>
+          <w:tab w:val="left" w:pos="8244"/>
+          <w:tab w:val="left" w:pos="9160"/>
+          <w:tab w:val="left" w:pos="10076"/>
+          <w:tab w:val="left" w:pos="10992"/>
+          <w:tab w:val="left" w:pos="11908"/>
+          <w:tab w:val="left" w:pos="12824"/>
+          <w:tab w:val="left" w:pos="13740"/>
+          <w:tab w:val="left" w:pos="14656"/>
+        </w:tabs>
+        <w:wordWrap w:val="0"/>
+        <w:jc w:val="left"/>
+        <w:rPr>
+          <w:b/>
+          <w:bCs/>
+        </w:rPr>
+      </w:pPr>
+      <w:proofErr w:type="spellStart"/>
+      <w:r>
+        <w:rPr>
+          <w:b/>
+          <w:bCs/>
+        </w:rPr>
+        <w:t>MultiSequence</w:t>
+      </w:r>
+      <w:proofErr w:type="spellEnd"/>
+      <w:r>
+        <w:rPr>
+          <w:b/>
+          <w:bCs/>
+        </w:rPr>
+        <w:t xml:space="preserve"> Learning</w:t>
+      </w:r>
+    </w:p>
+    <w:p>
+      <w:pPr>
+        <w:tabs>
+          <w:tab w:val="left" w:pos="916"/>
+          <w:tab w:val="left" w:pos="1832"/>
+          <w:tab w:val="left" w:pos="2748"/>
+          <w:tab w:val="left" w:pos="3664"/>
+          <w:tab w:val="left" w:pos="4580"/>
+          <w:tab w:val="left" w:pos="5496"/>
+          <w:tab w:val="left" w:pos="6412"/>
+          <w:tab w:val="left" w:pos="7328"/>
+          <w:tab w:val="left" w:pos="8244"/>
+          <w:tab w:val="left" w:pos="9160"/>
+          <w:tab w:val="left" w:pos="10076"/>
+          <w:tab w:val="left" w:pos="10992"/>
+          <w:tab w:val="left" w:pos="11908"/>
+          <w:tab w:val="left" w:pos="12824"/>
+          <w:tab w:val="left" w:pos="13740"/>
+          <w:tab w:val="left" w:pos="14656"/>
+        </w:tabs>
+        <w:wordWrap w:val="0"/>
+        <w:jc w:val="left"/>
+      </w:pPr>
+    </w:p>
+    <w:p>
+      <w:pPr>
+        <w:tabs>
+          <w:tab w:val="left" w:pos="916"/>
+          <w:tab w:val="left" w:pos="1832"/>
+          <w:tab w:val="left" w:pos="2748"/>
+          <w:tab w:val="left" w:pos="3664"/>
+          <w:tab w:val="left" w:pos="4580"/>
+          <w:tab w:val="left" w:pos="5496"/>
+          <w:tab w:val="left" w:pos="6412"/>
+          <w:tab w:val="left" w:pos="7328"/>
+          <w:tab w:val="left" w:pos="8244"/>
+          <w:tab w:val="left" w:pos="9160"/>
+          <w:tab w:val="left" w:pos="10076"/>
+          <w:tab w:val="left" w:pos="10992"/>
+          <w:tab w:val="left" w:pos="11908"/>
+          <w:tab w:val="left" w:pos="12824"/>
+          <w:tab w:val="left" w:pos="13740"/>
+          <w:tab w:val="left" w:pos="14656"/>
+        </w:tabs>
+        <w:wordWrap w:val="0"/>
+        <w:jc w:val="left"/>
+      </w:pPr>
+      <w:r>
+        <w:t>The </w:t>
+      </w:r>
+      <w:proofErr w:type="spellStart"/>
+      <w:r>
+        <w:t>MultiSequenceLearning</w:t>
+      </w:r>
+      <w:proofErr w:type="spellEnd"/>
+      <w:r>
+        <w:t> class implements </w:t>
+      </w:r>
+      <w:r>
+        <w:rPr>
+          <w:b/>
+          <w:bCs/>
+        </w:rPr>
+        <w:t>Hierarchical Temporal Memory (HTM)</w:t>
+      </w:r>
+      <w:r>
+        <w:t> to learn patterns in time-series data. Its key responsibilities:</w:t>
+      </w:r>
+    </w:p>
+    <w:p>
+      <w:pPr>
+        <w:numPr>
+          <w:ilvl w:val="0"/>
+          <w:numId w:val="27"/>
+        </w:numPr>
+        <w:tabs>
+          <w:tab w:val="left" w:pos="916"/>
+          <w:tab w:val="left" w:pos="1832"/>
+          <w:tab w:val="left" w:pos="2748"/>
+          <w:tab w:val="left" w:pos="3664"/>
+          <w:tab w:val="left" w:pos="4580"/>
+          <w:tab w:val="left" w:pos="5496"/>
+          <w:tab w:val="left" w:pos="6412"/>
+          <w:tab w:val="left" w:pos="7328"/>
+          <w:tab w:val="left" w:pos="8244"/>
+          <w:tab w:val="left" w:pos="9160"/>
+          <w:tab w:val="left" w:pos="10076"/>
+          <w:tab w:val="left" w:pos="10992"/>
+          <w:tab w:val="left" w:pos="11908"/>
+          <w:tab w:val="left" w:pos="12824"/>
+          <w:tab w:val="left" w:pos="13740"/>
+          <w:tab w:val="left" w:pos="14656"/>
+        </w:tabs>
+        <w:wordWrap w:val="0"/>
+        <w:jc w:val="left"/>
+      </w:pPr>
+      <w:r>
+        <w:t>Train an HTM model on sequential data using Spatial Pooling (SP) and Temporal Memory (TM)</w:t>
+      </w:r>
+    </w:p>
+    <w:p>
+      <w:pPr>
+        <w:numPr>
+          <w:ilvl w:val="0"/>
+          <w:numId w:val="27"/>
+        </w:numPr>
+        <w:tabs>
+          <w:tab w:val="left" w:pos="916"/>
+          <w:tab w:val="left" w:pos="1832"/>
+          <w:tab w:val="left" w:pos="2748"/>
+          <w:tab w:val="left" w:pos="3664"/>
+          <w:tab w:val="left" w:pos="4580"/>
+          <w:tab w:val="left" w:pos="5496"/>
+          <w:tab w:val="left" w:pos="6412"/>
+          <w:tab w:val="left" w:pos="7328"/>
+          <w:tab w:val="left" w:pos="8244"/>
+          <w:tab w:val="left" w:pos="9160"/>
+          <w:tab w:val="left" w:pos="10076"/>
+          <w:tab w:val="left" w:pos="10992"/>
+          <w:tab w:val="left" w:pos="11908"/>
+          <w:tab w:val="left" w:pos="12824"/>
+          <w:tab w:val="left" w:pos="13740"/>
+          <w:tab w:val="left" w:pos="14656"/>
+        </w:tabs>
+        <w:wordWrap w:val="0"/>
+        <w:jc w:val="left"/>
+      </w:pPr>
+      <w:r>
+        <w:t>Generate a Predictor object used for future anomaly detection</w:t>
+      </w:r>
+    </w:p>
+    <w:p>
+      <w:pPr>
+        <w:numPr>
+          <w:ilvl w:val="0"/>
+          <w:numId w:val="27"/>
+        </w:numPr>
+        <w:tabs>
+          <w:tab w:val="left" w:pos="916"/>
+          <w:tab w:val="left" w:pos="1832"/>
+          <w:tab w:val="left" w:pos="2748"/>
+          <w:tab w:val="left" w:pos="3664"/>
+          <w:tab w:val="left" w:pos="4580"/>
+          <w:tab w:val="left" w:pos="5496"/>
+          <w:tab w:val="left" w:pos="6412"/>
+          <w:tab w:val="left" w:pos="7328"/>
+          <w:tab w:val="left" w:pos="8244"/>
+          <w:tab w:val="left" w:pos="9160"/>
+          <w:tab w:val="left" w:pos="10076"/>
+          <w:tab w:val="left" w:pos="10992"/>
+          <w:tab w:val="left" w:pos="11908"/>
+          <w:tab w:val="left" w:pos="12824"/>
+          <w:tab w:val="left" w:pos="13740"/>
+          <w:tab w:val="left" w:pos="14656"/>
+        </w:tabs>
+        <w:wordWrap w:val="0"/>
+        <w:jc w:val="left"/>
+      </w:pPr>
+      <w:r>
+        <w:t>Handle sequence learning stability and accuracy tracking</w:t>
+      </w:r>
+    </w:p>
+    <w:p>
+      <w:pPr>
+        <w:tabs>
+          <w:tab w:val="left" w:pos="916"/>
+          <w:tab w:val="left" w:pos="1832"/>
+          <w:tab w:val="left" w:pos="2748"/>
+          <w:tab w:val="left" w:pos="3664"/>
+          <w:tab w:val="left" w:pos="4580"/>
+          <w:tab w:val="left" w:pos="5496"/>
+          <w:tab w:val="left" w:pos="6412"/>
+          <w:tab w:val="left" w:pos="7328"/>
+          <w:tab w:val="left" w:pos="8244"/>
+          <w:tab w:val="left" w:pos="9160"/>
+          <w:tab w:val="left" w:pos="10076"/>
+          <w:tab w:val="left" w:pos="10992"/>
+          <w:tab w:val="left" w:pos="11908"/>
+          <w:tab w:val="left" w:pos="12824"/>
+          <w:tab w:val="left" w:pos="13740"/>
+          <w:tab w:val="left" w:pos="14656"/>
+        </w:tabs>
+        <w:wordWrap w:val="0"/>
+        <w:jc w:val="left"/>
+      </w:pPr>
+      <w:r>
+        <w:t xml:space="preserve">This HTM Model works in two </w:t>
+      </w:r>
+      <w:proofErr w:type="gramStart"/>
+      <w:r>
+        <w:t>stages</w:t>
+      </w:r>
+      <w:proofErr w:type="gramEnd"/>
+      <w:r>
+        <w:t xml:space="preserve"> as The </w:t>
+      </w:r>
+      <w:proofErr w:type="gramStart"/>
+      <w:r>
+        <w:t>new born</w:t>
+      </w:r>
+      <w:proofErr w:type="gramEnd"/>
+      <w:r>
+        <w:t xml:space="preserve"> stage (SP Training) and Full Learning (SP + TM)</w:t>
+      </w:r>
+    </w:p>
+    <w:p>
+      <w:pPr>
+        <w:tabs>
+          <w:tab w:val="left" w:pos="916"/>
+          <w:tab w:val="left" w:pos="1832"/>
+          <w:tab w:val="left" w:pos="2748"/>
+          <w:tab w:val="left" w:pos="3664"/>
+          <w:tab w:val="left" w:pos="4580"/>
+          <w:tab w:val="left" w:pos="5496"/>
+          <w:tab w:val="left" w:pos="6412"/>
+          <w:tab w:val="left" w:pos="7328"/>
+          <w:tab w:val="left" w:pos="8244"/>
+          <w:tab w:val="left" w:pos="9160"/>
+          <w:tab w:val="left" w:pos="10076"/>
+          <w:tab w:val="left" w:pos="10992"/>
+          <w:tab w:val="left" w:pos="11908"/>
+          <w:tab w:val="left" w:pos="12824"/>
+          <w:tab w:val="left" w:pos="13740"/>
+          <w:tab w:val="left" w:pos="14656"/>
+        </w:tabs>
+        <w:wordWrap w:val="0"/>
+        <w:jc w:val="left"/>
+      </w:pPr>
+      <w:r>
+        <w:rPr>
+          <w:b/>
+          <w:bCs/>
+        </w:rPr>
+        <w:t>Phase 1</w:t>
+      </w:r>
+      <w:r>
+        <w:t xml:space="preserve">: </w:t>
+      </w:r>
+      <w:r>
+        <w:t>Trains </w:t>
+      </w:r>
+      <w:r>
+        <w:rPr>
+          <w:b/>
+          <w:bCs/>
+        </w:rPr>
+        <w:t>Spatial Pooler</w:t>
+      </w:r>
+      <w:r>
+        <w:t> without Temporal Memory</w:t>
+      </w:r>
+    </w:p>
+    <w:p>
+      <w:pPr>
+        <w:tabs>
+          <w:tab w:val="left" w:pos="916"/>
+          <w:tab w:val="left" w:pos="1832"/>
+          <w:tab w:val="left" w:pos="2748"/>
+          <w:tab w:val="left" w:pos="3664"/>
+          <w:tab w:val="left" w:pos="4580"/>
+          <w:tab w:val="left" w:pos="5496"/>
+          <w:tab w:val="left" w:pos="6412"/>
+          <w:tab w:val="left" w:pos="7328"/>
+          <w:tab w:val="left" w:pos="8244"/>
+          <w:tab w:val="left" w:pos="9160"/>
+          <w:tab w:val="left" w:pos="10076"/>
+          <w:tab w:val="left" w:pos="10992"/>
+          <w:tab w:val="left" w:pos="11908"/>
+          <w:tab w:val="left" w:pos="12824"/>
+          <w:tab w:val="left" w:pos="13740"/>
+          <w:tab w:val="left" w:pos="14656"/>
+        </w:tabs>
+        <w:wordWrap w:val="0"/>
+        <w:jc w:val="left"/>
+      </w:pPr>
+      <w:r>
+        <w:t xml:space="preserve"> </w:t>
+      </w:r>
+      <w:r>
+        <w:t xml:space="preserve"> And </w:t>
+      </w:r>
+      <w:proofErr w:type="gramStart"/>
+      <w:r>
+        <w:t>Reach</w:t>
+      </w:r>
+      <w:proofErr w:type="gramEnd"/>
+      <w:r>
+        <w:t xml:space="preserve"> stable column activation patterns</w:t>
+      </w:r>
+      <w:r>
+        <w:t xml:space="preserve"> and use</w:t>
+      </w:r>
+      <w:r>
+        <w:t xml:space="preserve"> homeostatic plasticity to prevent "column starvation"</w:t>
+      </w:r>
+    </w:p>
+    <w:p>
+      <w:pPr>
+        <w:tabs>
+          <w:tab w:val="left" w:pos="916"/>
+          <w:tab w:val="left" w:pos="1832"/>
+          <w:tab w:val="left" w:pos="2748"/>
+          <w:tab w:val="left" w:pos="3664"/>
+          <w:tab w:val="left" w:pos="4580"/>
+          <w:tab w:val="left" w:pos="5496"/>
+          <w:tab w:val="left" w:pos="6412"/>
+          <w:tab w:val="left" w:pos="7328"/>
+          <w:tab w:val="left" w:pos="8244"/>
+          <w:tab w:val="left" w:pos="9160"/>
+          <w:tab w:val="left" w:pos="10076"/>
+          <w:tab w:val="left" w:pos="10992"/>
+          <w:tab w:val="left" w:pos="11908"/>
+          <w:tab w:val="left" w:pos="12824"/>
+          <w:tab w:val="left" w:pos="13740"/>
+          <w:tab w:val="left" w:pos="14656"/>
+        </w:tabs>
+        <w:wordWrap w:val="0"/>
+        <w:jc w:val="left"/>
+      </w:pPr>
+      <w:r>
+        <w:rPr>
+          <w:noProof/>
+        </w:rPr>
+        <w:pict w14:anchorId="250DEC21">
+          <v:shape id="_x0000_s2064" type="#_x0000_t202" style="position:absolute;margin-left:1.9pt;margin-top:8.55pt;width:241.2pt;height:28.5pt;z-index:7">
+            <v:textbox style="mso-next-textbox:#_x0000_s2064">
+              <w:txbxContent>
+                <w:p>
+                  <w:pPr>
+                    <w:jc w:val="left"/>
+                  </w:pPr>
+                  <w:r>
+                    <w:t xml:space="preserve">for (int </w:t>
+                  </w:r>
+                  <w:proofErr w:type="spellStart"/>
+                  <w:r>
+                    <w:t>i</w:t>
+                  </w:r>
+                  <w:proofErr w:type="spellEnd"/>
+                  <w:r>
+                    <w:t xml:space="preserve"> = 0; </w:t>
+                  </w:r>
+                  <w:proofErr w:type="spellStart"/>
+                  <w:r>
+                    <w:t>i</w:t>
+                  </w:r>
+                  <w:proofErr w:type="spellEnd"/>
+                  <w:r>
+                    <w:t xml:space="preserve"> &lt; </w:t>
+                  </w:r>
+                  <w:proofErr w:type="spellStart"/>
+                  <w:r>
+                    <w:t>maxCycles</w:t>
+                  </w:r>
+                  <w:proofErr w:type="spellEnd"/>
+                  <w:r>
+                    <w:t xml:space="preserve"> &amp;</w:t>
+                  </w:r>
+                  <w:proofErr w:type="gramStart"/>
+                  <w:r>
+                    <w:t>&amp; !</w:t>
+                  </w:r>
+                  <w:proofErr w:type="spellStart"/>
+                  <w:r>
+                    <w:t>isInStableState</w:t>
+                  </w:r>
+                  <w:proofErr w:type="spellEnd"/>
+                  <w:proofErr w:type="gramEnd"/>
+                  <w:r>
+                    <w:t xml:space="preserve">; </w:t>
+                  </w:r>
+                  <w:proofErr w:type="spellStart"/>
+                  <w:r>
+                    <w:t>i</w:t>
+                  </w:r>
+                  <w:proofErr w:type="spellEnd"/>
+                  <w:r>
+                    <w:t>++)</w:t>
+                  </w:r>
+                </w:p>
+              </w:txbxContent>
+            </v:textbox>
+          </v:shape>
+        </w:pict>
+      </w:r>
+    </w:p>
+    <w:p>
+      <w:pPr>
+        <w:tabs>
+          <w:tab w:val="left" w:pos="916"/>
+          <w:tab w:val="left" w:pos="1832"/>
+          <w:tab w:val="left" w:pos="2748"/>
+          <w:tab w:val="left" w:pos="3664"/>
+          <w:tab w:val="left" w:pos="4580"/>
+          <w:tab w:val="left" w:pos="5496"/>
+          <w:tab w:val="left" w:pos="6412"/>
+          <w:tab w:val="left" w:pos="7328"/>
+          <w:tab w:val="left" w:pos="8244"/>
+          <w:tab w:val="left" w:pos="9160"/>
+          <w:tab w:val="left" w:pos="10076"/>
+          <w:tab w:val="left" w:pos="10992"/>
+          <w:tab w:val="left" w:pos="11908"/>
+          <w:tab w:val="left" w:pos="12824"/>
+          <w:tab w:val="left" w:pos="13740"/>
+          <w:tab w:val="left" w:pos="14656"/>
+        </w:tabs>
+        <w:wordWrap w:val="0"/>
+        <w:jc w:val="left"/>
+      </w:pPr>
+    </w:p>
+    <w:p>
+      <w:pPr>
+        <w:tabs>
+          <w:tab w:val="left" w:pos="916"/>
+          <w:tab w:val="left" w:pos="1832"/>
+          <w:tab w:val="left" w:pos="2748"/>
+          <w:tab w:val="left" w:pos="3664"/>
+          <w:tab w:val="left" w:pos="4580"/>
+          <w:tab w:val="left" w:pos="5496"/>
+          <w:tab w:val="left" w:pos="6412"/>
+          <w:tab w:val="left" w:pos="7328"/>
+          <w:tab w:val="left" w:pos="8244"/>
+          <w:tab w:val="left" w:pos="9160"/>
+          <w:tab w:val="left" w:pos="10076"/>
+          <w:tab w:val="left" w:pos="10992"/>
+          <w:tab w:val="left" w:pos="11908"/>
+          <w:tab w:val="left" w:pos="12824"/>
+          <w:tab w:val="left" w:pos="13740"/>
+          <w:tab w:val="left" w:pos="14656"/>
+        </w:tabs>
+        <w:wordWrap w:val="0"/>
+        <w:jc w:val="left"/>
+      </w:pPr>
+    </w:p>
+    <w:p>
+      <w:pPr>
+        <w:tabs>
+          <w:tab w:val="left" w:pos="916"/>
+          <w:tab w:val="left" w:pos="1832"/>
+          <w:tab w:val="left" w:pos="2748"/>
+          <w:tab w:val="left" w:pos="3664"/>
+          <w:tab w:val="left" w:pos="4580"/>
+          <w:tab w:val="left" w:pos="5496"/>
+          <w:tab w:val="left" w:pos="6412"/>
+          <w:tab w:val="left" w:pos="7328"/>
+          <w:tab w:val="left" w:pos="8244"/>
+          <w:tab w:val="left" w:pos="9160"/>
+          <w:tab w:val="left" w:pos="10076"/>
+          <w:tab w:val="left" w:pos="10992"/>
+          <w:tab w:val="left" w:pos="11908"/>
+          <w:tab w:val="left" w:pos="12824"/>
+          <w:tab w:val="left" w:pos="13740"/>
+          <w:tab w:val="left" w:pos="14656"/>
+        </w:tabs>
+        <w:wordWrap w:val="0"/>
+        <w:jc w:val="left"/>
+      </w:pPr>
+    </w:p>
+    <w:p>
+      <w:pPr>
+        <w:tabs>
+          <w:tab w:val="left" w:pos="916"/>
+          <w:tab w:val="left" w:pos="1832"/>
+          <w:tab w:val="left" w:pos="2748"/>
+          <w:tab w:val="left" w:pos="3664"/>
+          <w:tab w:val="left" w:pos="4580"/>
+          <w:tab w:val="left" w:pos="5496"/>
+          <w:tab w:val="left" w:pos="6412"/>
+          <w:tab w:val="left" w:pos="7328"/>
+          <w:tab w:val="left" w:pos="8244"/>
+          <w:tab w:val="left" w:pos="9160"/>
+          <w:tab w:val="left" w:pos="10076"/>
+          <w:tab w:val="left" w:pos="10992"/>
+          <w:tab w:val="left" w:pos="11908"/>
+          <w:tab w:val="left" w:pos="12824"/>
+          <w:tab w:val="left" w:pos="13740"/>
+          <w:tab w:val="left" w:pos="14656"/>
+        </w:tabs>
+        <w:wordWrap w:val="0"/>
         <w:jc w:val="both"/>
         <w:rPr>
+          <w:b/>
+          <w:bCs/>
+        </w:rPr>
+      </w:pPr>
+      <w:r>
+        <w:rPr>
+          <w:b/>
+          <w:bCs/>
+        </w:rPr>
+        <w:t xml:space="preserve">Phase </w:t>
+      </w:r>
+      <w:proofErr w:type="gramStart"/>
+      <w:r>
+        <w:rPr>
+          <w:b/>
+          <w:bCs/>
+        </w:rPr>
+        <w:t>2 :</w:t>
+      </w:r>
+      <w:proofErr w:type="gramEnd"/>
+      <w:r>
+        <w:rPr>
+          <w:b/>
+          <w:bCs/>
+        </w:rPr>
+        <w:t xml:space="preserve"> T</w:t>
+      </w:r>
+      <w:r>
+        <w:t xml:space="preserve">rains both Spatial Pooler and Temporal Memory and </w:t>
+      </w:r>
+      <w:r>
+        <w:t>Uses </w:t>
+      </w:r>
+      <w:proofErr w:type="spellStart"/>
+      <w:r>
+        <w:t>HtmClassifier</w:t>
+      </w:r>
+      <w:proofErr w:type="spellEnd"/>
+      <w:r>
+        <w:t> to associate SDRs with sequence elements</w:t>
+      </w:r>
+      <w:r>
+        <w:t xml:space="preserve"> and </w:t>
+      </w:r>
+      <w:r>
+        <w:t>Tracks prediction accuracy across cycles</w:t>
+      </w:r>
+    </w:p>
+    <w:p>
+      <w:pPr>
+        <w:tabs>
+          <w:tab w:val="left" w:pos="916"/>
+          <w:tab w:val="left" w:pos="1832"/>
+          <w:tab w:val="left" w:pos="2748"/>
+          <w:tab w:val="left" w:pos="3664"/>
+          <w:tab w:val="left" w:pos="4580"/>
+          <w:tab w:val="left" w:pos="5496"/>
+          <w:tab w:val="left" w:pos="6412"/>
+          <w:tab w:val="left" w:pos="7328"/>
+          <w:tab w:val="left" w:pos="8244"/>
+          <w:tab w:val="left" w:pos="9160"/>
+          <w:tab w:val="left" w:pos="10076"/>
+          <w:tab w:val="left" w:pos="10992"/>
+          <w:tab w:val="left" w:pos="11908"/>
+          <w:tab w:val="left" w:pos="12824"/>
+          <w:tab w:val="left" w:pos="13740"/>
+          <w:tab w:val="left" w:pos="14656"/>
+        </w:tabs>
+        <w:wordWrap w:val="0"/>
+        <w:jc w:val="left"/>
+        <w:rPr>
+          <w:b/>
+          <w:bCs/>
+        </w:rPr>
+      </w:pPr>
+      <w:r>
+        <w:rPr>
+          <w:b/>
+          <w:bCs/>
+          <w:noProof/>
+        </w:rPr>
+        <w:pict w14:anchorId="22288009">
+          <v:shape id="_x0000_s2065" type="#_x0000_t202" style="position:absolute;margin-left:1.9pt;margin-top:4.55pt;width:241.2pt;height:39.75pt;z-index:8">
+            <v:textbox style="mso-next-textbox:#_x0000_s2065">
+              <w:txbxContent>
+                <w:p>
+                  <w:pPr>
+                    <w:jc w:val="left"/>
+                  </w:pPr>
+                  <w:proofErr w:type="gramStart"/>
+                  <w:r>
+                    <w:t>layer1.HtmModules.Add</w:t>
+                  </w:r>
+                  <w:proofErr w:type="gramEnd"/>
+                  <w:r>
+                    <w:t>("tm", tm);</w:t>
+                  </w:r>
+                </w:p>
+                <w:p>
+                  <w:pPr>
+                    <w:ind w:left="720"/>
+                    <w:jc w:val="left"/>
+                  </w:pPr>
+                  <w:r>
+                    <w:t xml:space="preserve">foreach (var </w:t>
+                  </w:r>
+                  <w:proofErr w:type="spellStart"/>
+                  <w:r>
+                    <w:t>sequenceKeyPair</w:t>
+                  </w:r>
+                  <w:proofErr w:type="spellEnd"/>
+                  <w:r>
+                    <w:t xml:space="preserve"> in sequences)</w:t>
+                  </w:r>
+                </w:p>
+              </w:txbxContent>
+            </v:textbox>
+          </v:shape>
+        </w:pict>
+      </w:r>
+    </w:p>
+    <w:p>
+      <w:pPr>
+        <w:tabs>
+          <w:tab w:val="left" w:pos="916"/>
+          <w:tab w:val="left" w:pos="1832"/>
+          <w:tab w:val="left" w:pos="2748"/>
+          <w:tab w:val="left" w:pos="3664"/>
+          <w:tab w:val="left" w:pos="4580"/>
+          <w:tab w:val="left" w:pos="5496"/>
+          <w:tab w:val="left" w:pos="6412"/>
+          <w:tab w:val="left" w:pos="7328"/>
+          <w:tab w:val="left" w:pos="8244"/>
+          <w:tab w:val="left" w:pos="9160"/>
+          <w:tab w:val="left" w:pos="10076"/>
+          <w:tab w:val="left" w:pos="10992"/>
+          <w:tab w:val="left" w:pos="11908"/>
+          <w:tab w:val="left" w:pos="12824"/>
+          <w:tab w:val="left" w:pos="13740"/>
+          <w:tab w:val="left" w:pos="14656"/>
+        </w:tabs>
+        <w:wordWrap w:val="0"/>
+        <w:jc w:val="left"/>
+      </w:pPr>
+    </w:p>
+    <w:p>
+      <w:pPr>
+        <w:tabs>
+          <w:tab w:val="left" w:pos="916"/>
+          <w:tab w:val="left" w:pos="1832"/>
+          <w:tab w:val="left" w:pos="2748"/>
+          <w:tab w:val="left" w:pos="3664"/>
+          <w:tab w:val="left" w:pos="4580"/>
+          <w:tab w:val="left" w:pos="5496"/>
+          <w:tab w:val="left" w:pos="6412"/>
+          <w:tab w:val="left" w:pos="7328"/>
+          <w:tab w:val="left" w:pos="8244"/>
+          <w:tab w:val="left" w:pos="9160"/>
+          <w:tab w:val="left" w:pos="10076"/>
+          <w:tab w:val="left" w:pos="10992"/>
+          <w:tab w:val="left" w:pos="11908"/>
+          <w:tab w:val="left" w:pos="12824"/>
+          <w:tab w:val="left" w:pos="13740"/>
+          <w:tab w:val="left" w:pos="14656"/>
+        </w:tabs>
+        <w:wordWrap w:val="0"/>
+        <w:jc w:val="left"/>
+      </w:pPr>
+    </w:p>
+    <w:p>
+      <w:pPr>
+        <w:tabs>
+          <w:tab w:val="left" w:pos="916"/>
+          <w:tab w:val="left" w:pos="1832"/>
+          <w:tab w:val="left" w:pos="2748"/>
+          <w:tab w:val="left" w:pos="3664"/>
+          <w:tab w:val="left" w:pos="4580"/>
+          <w:tab w:val="left" w:pos="5496"/>
+          <w:tab w:val="left" w:pos="6412"/>
+          <w:tab w:val="left" w:pos="7328"/>
+          <w:tab w:val="left" w:pos="8244"/>
+          <w:tab w:val="left" w:pos="9160"/>
+          <w:tab w:val="left" w:pos="10076"/>
+          <w:tab w:val="left" w:pos="10992"/>
+          <w:tab w:val="left" w:pos="11908"/>
+          <w:tab w:val="left" w:pos="12824"/>
+          <w:tab w:val="left" w:pos="13740"/>
+          <w:tab w:val="left" w:pos="14656"/>
+        </w:tabs>
+        <w:wordWrap w:val="0"/>
+        <w:jc w:val="left"/>
+      </w:pPr>
+    </w:p>
+    <w:p>
+      <w:pPr>
+        <w:jc w:val="both"/>
+        <w:rPr>
           <w:lang w:eastAsia="x-none"/>
         </w:rPr>
       </w:pPr>
@@ -2034,6 +3145,7 @@
         <w:pStyle w:val="Heading1"/>
       </w:pPr>
       <w:r>
+        <w:lastRenderedPageBreak/>
         <w:t>Ease of Use</w:t>
       </w:r>
     </w:p>
@@ -2199,11 +3311,7 @@
       </w:r>
       <w:proofErr w:type="spellEnd"/>
       <w:r>
-        <w:t xml:space="preserve">. This often leads to confusion because equations do not balance dimensionally. If you must use mixed units, clearly </w:t>
-      </w:r>
-      <w:r>
-        <w:lastRenderedPageBreak/>
-        <w:t>state the units for each quantity that you use in an equation.</w:t>
+        <w:t>. This often leads to confusion because equations do not balance dimensionally. If you must use mixed units, clearly state the units for each quantity that you use in an equation.</w:t>
       </w:r>
     </w:p>
     <w:p>
@@ -2579,7 +3687,11 @@
         <w:t xml:space="preserve"> </w:t>
       </w:r>
       <w:r>
-        <w:t>Please keep your affiliations as succinct as possible (for example, do not differentiate among departments of the same organization).</w:t>
+        <w:t xml:space="preserve">Please keep your affiliations as succinct </w:t>
+      </w:r>
+      <w:r>
+        <w:lastRenderedPageBreak/>
+        <w:t>as possible (for example, do not differentiate among departments of the same organization).</w:t>
       </w:r>
     </w:p>
     <w:p>
@@ -2879,7 +3991,6 @@
               <w:pStyle w:val="tablecolhead"/>
             </w:pPr>
             <w:r>
-              <w:lastRenderedPageBreak/>
               <w:t>Table Head</w:t>
             </w:r>
           </w:p>
@@ -3120,7 +4231,7 @@
             <v:path o:extrusionok="f" gradientshapeok="t" o:connecttype="rect"/>
             <o:lock v:ext="edit" aspectratio="t"/>
           </v:shapetype>
-          <v:shape id="_x0000_i1026" type="#_x0000_t75" style="width:228.9pt;height:31.85pt" o:bordertopcolor="this" o:borderleftcolor="this" o:borderbottomcolor="this" o:borderrightcolor="this">
+          <v:shape id="_x0000_i1026" type="#_x0000_t75" style="width:228.75pt;height:31.5pt" o:bordertopcolor="this" o:borderleftcolor="this" o:borderbottomcolor="this" o:borderrightcolor="this">
             <v:imagedata r:id="rId12" o:title=""/>
             <w10:bordertop type="single" width="8"/>
             <w10:borderleft type="single" width="8"/>
@@ -3764,6 +4875,7 @@
         <w:ind w:left="354" w:hanging="354"/>
       </w:pPr>
       <w:r>
+        <w:lastRenderedPageBreak/>
         <w:t>Y. Yorozu, M. Hirano, K. Oka, and Y. Tagawa, “Electron spectroscopy studies on magneto-optical media and plastic substrate interface,” IEEE Transl. J. Magn. Japan, vol. 2, pp. 740–741, August 1987 [Digests 9th Annual Conf. Magnetics Japan, p. 301, 1982].</w:t>
       </w:r>
     </w:p>
@@ -4018,7 +5130,7 @@
     <w:p>
       <w:r>
         <w:pict w14:anchorId="4A67007D">
-          <v:shape id="_x0000_s2056" type="#_x0000_t202" style="position:absolute;left:0;text-align:left;margin-left:0;margin-top:19.8pt;width:252pt;height:90pt;z-index:-4;mso-wrap-edited:f;mso-position-horizontal:left;mso-position-horizontal-relative:margin" wrapcoords="-64 0 -64 21600 21664 21600 21664 0 -64 0">
+          <v:shape id="_x0000_s2056" type="#_x0000_t202" style="position:absolute;left:0;text-align:left;margin-left:0;margin-top:19.8pt;width:252pt;height:90pt;z-index:-6;mso-wrap-edited:f;mso-position-horizontal:left;mso-position-horizontal-relative:margin" wrapcoords="-64 0 -64 21600 21664 21600 21664 0 -64 0">
             <v:textbox style="mso-next-textbox:#_x0000_s2056">
               <w:txbxContent>
                 <w:p>
@@ -4217,7 +5329,7 @@
                 <v:path o:extrusionok="f" gradientshapeok="t" o:connecttype="rect"/>
                 <o:lock v:ext="edit" aspectratio="t"/>
               </v:shapetype>
-              <v:shape id="Grafik 4" o:spid="_x0000_i1025" type="#_x0000_t75" style="width:95.5pt;height:49.25pt;visibility:visible">
+              <v:shape id="Grafik 4" o:spid="_x0000_i1025" type="#_x0000_t75" style="width:96pt;height:49.5pt;visibility:visible">
                 <v:imagedata r:id="rId1" o:title=""/>
               </v:shape>
             </w:pict>
@@ -5102,6 +6214,155 @@
     </w:lvl>
   </w:abstractNum>
   <w:abstractNum w:abstractNumId="15" w15:restartNumberingAfterBreak="0">
+    <w:nsid w:val="2BAC2ED4"/>
+    <w:multiLevelType w:val="multilevel"/>
+    <w:tmpl w:val="73283E58"/>
+    <w:lvl w:ilvl="0">
+      <w:start w:val="1"/>
+      <w:numFmt w:val="bullet"/>
+      <w:lvlText w:val=""/>
+      <w:lvlJc w:val="left"/>
+      <w:pPr>
+        <w:tabs>
+          <w:tab w:val="num" w:pos="720"/>
+        </w:tabs>
+        <w:ind w:left="720" w:hanging="360"/>
+      </w:pPr>
+      <w:rPr>
+        <w:rFonts w:ascii="Symbol" w:hAnsi="Symbol" w:hint="default"/>
+        <w:sz w:val="20"/>
+      </w:rPr>
+    </w:lvl>
+    <w:lvl w:ilvl="1" w:tentative="1">
+      <w:start w:val="1"/>
+      <w:numFmt w:val="bullet"/>
+      <w:lvlText w:val="o"/>
+      <w:lvlJc w:val="left"/>
+      <w:pPr>
+        <w:tabs>
+          <w:tab w:val="num" w:pos="1440"/>
+        </w:tabs>
+        <w:ind w:left="1440" w:hanging="360"/>
+      </w:pPr>
+      <w:rPr>
+        <w:rFonts w:ascii="Courier New" w:hAnsi="Courier New" w:hint="default"/>
+        <w:sz w:val="20"/>
+      </w:rPr>
+    </w:lvl>
+    <w:lvl w:ilvl="2" w:tentative="1">
+      <w:start w:val="1"/>
+      <w:numFmt w:val="bullet"/>
+      <w:lvlText w:val=""/>
+      <w:lvlJc w:val="left"/>
+      <w:pPr>
+        <w:tabs>
+          <w:tab w:val="num" w:pos="2160"/>
+        </w:tabs>
+        <w:ind w:left="2160" w:hanging="360"/>
+      </w:pPr>
+      <w:rPr>
+        <w:rFonts w:ascii="Wingdings" w:hAnsi="Wingdings" w:hint="default"/>
+        <w:sz w:val="20"/>
+      </w:rPr>
+    </w:lvl>
+    <w:lvl w:ilvl="3" w:tentative="1">
+      <w:start w:val="1"/>
+      <w:numFmt w:val="bullet"/>
+      <w:lvlText w:val=""/>
+      <w:lvlJc w:val="left"/>
+      <w:pPr>
+        <w:tabs>
+          <w:tab w:val="num" w:pos="2880"/>
+        </w:tabs>
+        <w:ind w:left="2880" w:hanging="360"/>
+      </w:pPr>
+      <w:rPr>
+        <w:rFonts w:ascii="Wingdings" w:hAnsi="Wingdings" w:hint="default"/>
+        <w:sz w:val="20"/>
+      </w:rPr>
+    </w:lvl>
+    <w:lvl w:ilvl="4" w:tentative="1">
+      <w:start w:val="1"/>
+      <w:numFmt w:val="bullet"/>
+      <w:lvlText w:val=""/>
+      <w:lvlJc w:val="left"/>
+      <w:pPr>
+        <w:tabs>
+          <w:tab w:val="num" w:pos="3600"/>
+        </w:tabs>
+        <w:ind w:left="3600" w:hanging="360"/>
+      </w:pPr>
+      <w:rPr>
+        <w:rFonts w:ascii="Wingdings" w:hAnsi="Wingdings" w:hint="default"/>
+        <w:sz w:val="20"/>
+      </w:rPr>
+    </w:lvl>
+    <w:lvl w:ilvl="5" w:tentative="1">
+      <w:start w:val="1"/>
+      <w:numFmt w:val="bullet"/>
+      <w:lvlText w:val=""/>
+      <w:lvlJc w:val="left"/>
+      <w:pPr>
+        <w:tabs>
+          <w:tab w:val="num" w:pos="4320"/>
+        </w:tabs>
+        <w:ind w:left="4320" w:hanging="360"/>
+      </w:pPr>
+      <w:rPr>
+        <w:rFonts w:ascii="Wingdings" w:hAnsi="Wingdings" w:hint="default"/>
+        <w:sz w:val="20"/>
+      </w:rPr>
+    </w:lvl>
+    <w:lvl w:ilvl="6" w:tentative="1">
+      <w:start w:val="1"/>
+      <w:numFmt w:val="bullet"/>
+      <w:lvlText w:val=""/>
+      <w:lvlJc w:val="left"/>
+      <w:pPr>
+        <w:tabs>
+          <w:tab w:val="num" w:pos="5040"/>
+        </w:tabs>
+        <w:ind w:left="5040" w:hanging="360"/>
+      </w:pPr>
+      <w:rPr>
+        <w:rFonts w:ascii="Wingdings" w:hAnsi="Wingdings" w:hint="default"/>
+        <w:sz w:val="20"/>
+      </w:rPr>
+    </w:lvl>
+    <w:lvl w:ilvl="7" w:tentative="1">
+      <w:start w:val="1"/>
+      <w:numFmt w:val="bullet"/>
+      <w:lvlText w:val=""/>
+      <w:lvlJc w:val="left"/>
+      <w:pPr>
+        <w:tabs>
+          <w:tab w:val="num" w:pos="5760"/>
+        </w:tabs>
+        <w:ind w:left="5760" w:hanging="360"/>
+      </w:pPr>
+      <w:rPr>
+        <w:rFonts w:ascii="Wingdings" w:hAnsi="Wingdings" w:hint="default"/>
+        <w:sz w:val="20"/>
+      </w:rPr>
+    </w:lvl>
+    <w:lvl w:ilvl="8" w:tentative="1">
+      <w:start w:val="1"/>
+      <w:numFmt w:val="bullet"/>
+      <w:lvlText w:val=""/>
+      <w:lvlJc w:val="left"/>
+      <w:pPr>
+        <w:tabs>
+          <w:tab w:val="num" w:pos="6480"/>
+        </w:tabs>
+        <w:ind w:left="6480" w:hanging="360"/>
+      </w:pPr>
+      <w:rPr>
+        <w:rFonts w:ascii="Wingdings" w:hAnsi="Wingdings" w:hint="default"/>
+        <w:sz w:val="20"/>
+      </w:rPr>
+    </w:lvl>
+  </w:abstractNum>
+  <w:abstractNum w:abstractNumId="16" w15:restartNumberingAfterBreak="0">
     <w:nsid w:val="37660336"/>
     <w:multiLevelType w:val="hybridMultilevel"/>
     <w:tmpl w:val="754EAC84"/>
@@ -5242,7 +6503,7 @@
       </w:rPr>
     </w:lvl>
   </w:abstractNum>
-  <w:abstractNum w:abstractNumId="16" w15:restartNumberingAfterBreak="0">
+  <w:abstractNum w:abstractNumId="17" w15:restartNumberingAfterBreak="0">
     <w:nsid w:val="39E54FC6"/>
     <w:multiLevelType w:val="singleLevel"/>
     <w:tmpl w:val="5B7288D4"/>
@@ -5262,7 +6523,156 @@
       </w:rPr>
     </w:lvl>
   </w:abstractNum>
-  <w:abstractNum w:abstractNumId="17" w15:restartNumberingAfterBreak="0">
+  <w:abstractNum w:abstractNumId="18" w15:restartNumberingAfterBreak="0">
+    <w:nsid w:val="3EC66250"/>
+    <w:multiLevelType w:val="multilevel"/>
+    <w:tmpl w:val="D4C07676"/>
+    <w:lvl w:ilvl="0">
+      <w:start w:val="1"/>
+      <w:numFmt w:val="bullet"/>
+      <w:lvlText w:val=""/>
+      <w:lvlJc w:val="left"/>
+      <w:pPr>
+        <w:tabs>
+          <w:tab w:val="num" w:pos="720"/>
+        </w:tabs>
+        <w:ind w:left="720" w:hanging="360"/>
+      </w:pPr>
+      <w:rPr>
+        <w:rFonts w:ascii="Symbol" w:hAnsi="Symbol" w:hint="default"/>
+        <w:sz w:val="20"/>
+      </w:rPr>
+    </w:lvl>
+    <w:lvl w:ilvl="1" w:tentative="1">
+      <w:start w:val="1"/>
+      <w:numFmt w:val="bullet"/>
+      <w:lvlText w:val="o"/>
+      <w:lvlJc w:val="left"/>
+      <w:pPr>
+        <w:tabs>
+          <w:tab w:val="num" w:pos="1440"/>
+        </w:tabs>
+        <w:ind w:left="1440" w:hanging="360"/>
+      </w:pPr>
+      <w:rPr>
+        <w:rFonts w:ascii="Courier New" w:hAnsi="Courier New" w:hint="default"/>
+        <w:sz w:val="20"/>
+      </w:rPr>
+    </w:lvl>
+    <w:lvl w:ilvl="2" w:tentative="1">
+      <w:start w:val="1"/>
+      <w:numFmt w:val="bullet"/>
+      <w:lvlText w:val=""/>
+      <w:lvlJc w:val="left"/>
+      <w:pPr>
+        <w:tabs>
+          <w:tab w:val="num" w:pos="2160"/>
+        </w:tabs>
+        <w:ind w:left="2160" w:hanging="360"/>
+      </w:pPr>
+      <w:rPr>
+        <w:rFonts w:ascii="Wingdings" w:hAnsi="Wingdings" w:hint="default"/>
+        <w:sz w:val="20"/>
+      </w:rPr>
+    </w:lvl>
+    <w:lvl w:ilvl="3" w:tentative="1">
+      <w:start w:val="1"/>
+      <w:numFmt w:val="bullet"/>
+      <w:lvlText w:val=""/>
+      <w:lvlJc w:val="left"/>
+      <w:pPr>
+        <w:tabs>
+          <w:tab w:val="num" w:pos="2880"/>
+        </w:tabs>
+        <w:ind w:left="2880" w:hanging="360"/>
+      </w:pPr>
+      <w:rPr>
+        <w:rFonts w:ascii="Wingdings" w:hAnsi="Wingdings" w:hint="default"/>
+        <w:sz w:val="20"/>
+      </w:rPr>
+    </w:lvl>
+    <w:lvl w:ilvl="4" w:tentative="1">
+      <w:start w:val="1"/>
+      <w:numFmt w:val="bullet"/>
+      <w:lvlText w:val=""/>
+      <w:lvlJc w:val="left"/>
+      <w:pPr>
+        <w:tabs>
+          <w:tab w:val="num" w:pos="3600"/>
+        </w:tabs>
+        <w:ind w:left="3600" w:hanging="360"/>
+      </w:pPr>
+      <w:rPr>
+        <w:rFonts w:ascii="Wingdings" w:hAnsi="Wingdings" w:hint="default"/>
+        <w:sz w:val="20"/>
+      </w:rPr>
+    </w:lvl>
+    <w:lvl w:ilvl="5" w:tentative="1">
+      <w:start w:val="1"/>
+      <w:numFmt w:val="bullet"/>
+      <w:lvlText w:val=""/>
+      <w:lvlJc w:val="left"/>
+      <w:pPr>
+        <w:tabs>
+          <w:tab w:val="num" w:pos="4320"/>
+        </w:tabs>
+        <w:ind w:left="4320" w:hanging="360"/>
+      </w:pPr>
+      <w:rPr>
+        <w:rFonts w:ascii="Wingdings" w:hAnsi="Wingdings" w:hint="default"/>
+        <w:sz w:val="20"/>
+      </w:rPr>
+    </w:lvl>
+    <w:lvl w:ilvl="6" w:tentative="1">
+      <w:start w:val="1"/>
+      <w:numFmt w:val="bullet"/>
+      <w:lvlText w:val=""/>
+      <w:lvlJc w:val="left"/>
+      <w:pPr>
+        <w:tabs>
+          <w:tab w:val="num" w:pos="5040"/>
+        </w:tabs>
+        <w:ind w:left="5040" w:hanging="360"/>
+      </w:pPr>
+      <w:rPr>
+        <w:rFonts w:ascii="Wingdings" w:hAnsi="Wingdings" w:hint="default"/>
+        <w:sz w:val="20"/>
+      </w:rPr>
+    </w:lvl>
+    <w:lvl w:ilvl="7" w:tentative="1">
+      <w:start w:val="1"/>
+      <w:numFmt w:val="bullet"/>
+      <w:lvlText w:val=""/>
+      <w:lvlJc w:val="left"/>
+      <w:pPr>
+        <w:tabs>
+          <w:tab w:val="num" w:pos="5760"/>
+        </w:tabs>
+        <w:ind w:left="5760" w:hanging="360"/>
+      </w:pPr>
+      <w:rPr>
+        <w:rFonts w:ascii="Wingdings" w:hAnsi="Wingdings" w:hint="default"/>
+        <w:sz w:val="20"/>
+      </w:rPr>
+    </w:lvl>
+    <w:lvl w:ilvl="8" w:tentative="1">
+      <w:start w:val="1"/>
+      <w:numFmt w:val="bullet"/>
+      <w:lvlText w:val=""/>
+      <w:lvlJc w:val="left"/>
+      <w:pPr>
+        <w:tabs>
+          <w:tab w:val="num" w:pos="6480"/>
+        </w:tabs>
+        <w:ind w:left="6480" w:hanging="360"/>
+      </w:pPr>
+      <w:rPr>
+        <w:rFonts w:ascii="Wingdings" w:hAnsi="Wingdings" w:hint="default"/>
+        <w:sz w:val="20"/>
+      </w:rPr>
+    </w:lvl>
+  </w:abstractNum>
+  <w:abstractNum w:abstractNumId="19" w15:restartNumberingAfterBreak="0">
     <w:nsid w:val="4189603E"/>
     <w:multiLevelType w:val="multilevel"/>
     <w:tmpl w:val="0AB06E12"/>
@@ -5457,7 +6867,7 @@
       </w:rPr>
     </w:lvl>
   </w:abstractNum>
-  <w:abstractNum w:abstractNumId="18" w15:restartNumberingAfterBreak="0">
+  <w:abstractNum w:abstractNumId="20" w15:restartNumberingAfterBreak="0">
     <w:nsid w:val="493C3F76"/>
     <w:multiLevelType w:val="hybridMultilevel"/>
     <w:tmpl w:val="9A9E418C"/>
@@ -5564,7 +6974,7 @@
       </w:pPr>
     </w:lvl>
   </w:abstractNum>
-  <w:abstractNum w:abstractNumId="19" w15:restartNumberingAfterBreak="0">
+  <w:abstractNum w:abstractNumId="21" w15:restartNumberingAfterBreak="0">
     <w:nsid w:val="52CA544A"/>
     <w:multiLevelType w:val="singleLevel"/>
     <w:tmpl w:val="AED6D67E"/>
@@ -5591,7 +7001,7 @@
       </w:rPr>
     </w:lvl>
   </w:abstractNum>
-  <w:abstractNum w:abstractNumId="20" w15:restartNumberingAfterBreak="0">
+  <w:abstractNum w:abstractNumId="22" w15:restartNumberingAfterBreak="0">
     <w:nsid w:val="6C402C58"/>
     <w:multiLevelType w:val="hybridMultilevel"/>
     <w:tmpl w:val="9A1CA078"/>
@@ -5736,7 +7146,7 @@
       </w:rPr>
     </w:lvl>
   </w:abstractNum>
-  <w:abstractNum w:abstractNumId="21" w15:restartNumberingAfterBreak="0">
+  <w:abstractNum w:abstractNumId="23" w15:restartNumberingAfterBreak="0">
     <w:nsid w:val="6CD32DA8"/>
     <w:multiLevelType w:val="singleLevel"/>
     <w:tmpl w:val="166470C2"/>
@@ -5763,34 +7173,34 @@
     </w:lvl>
   </w:abstractNum>
   <w:num w:numId="1" w16cid:durableId="1201210240">
-    <w:abstractNumId w:val="15"/>
+    <w:abstractNumId w:val="16"/>
   </w:num>
   <w:num w:numId="2" w16cid:durableId="744106382">
-    <w:abstractNumId w:val="20"/>
+    <w:abstractNumId w:val="22"/>
   </w:num>
   <w:num w:numId="3" w16cid:durableId="405542283">
     <w:abstractNumId w:val="14"/>
   </w:num>
   <w:num w:numId="4" w16cid:durableId="58528485">
-    <w:abstractNumId w:val="17"/>
+    <w:abstractNumId w:val="19"/>
   </w:num>
   <w:num w:numId="5" w16cid:durableId="158690621">
-    <w:abstractNumId w:val="17"/>
+    <w:abstractNumId w:val="19"/>
   </w:num>
   <w:num w:numId="6" w16cid:durableId="1725248462">
-    <w:abstractNumId w:val="17"/>
+    <w:abstractNumId w:val="19"/>
   </w:num>
   <w:num w:numId="7" w16cid:durableId="941455226">
-    <w:abstractNumId w:val="17"/>
+    <w:abstractNumId w:val="19"/>
   </w:num>
   <w:num w:numId="8" w16cid:durableId="1785659599">
-    <w:abstractNumId w:val="19"/>
+    <w:abstractNumId w:val="21"/>
   </w:num>
   <w:num w:numId="9" w16cid:durableId="1933902280">
-    <w:abstractNumId w:val="21"/>
+    <w:abstractNumId w:val="23"/>
   </w:num>
   <w:num w:numId="10" w16cid:durableId="1495225212">
-    <w:abstractNumId w:val="16"/>
+    <w:abstractNumId w:val="17"/>
   </w:num>
   <w:num w:numId="11" w16cid:durableId="275407238">
     <w:abstractNumId w:val="13"/>
@@ -5832,10 +7242,16 @@
     <w:abstractNumId w:val="1"/>
   </w:num>
   <w:num w:numId="24" w16cid:durableId="841047741">
-    <w:abstractNumId w:val="18"/>
+    <w:abstractNumId w:val="20"/>
   </w:num>
   <w:num w:numId="25" w16cid:durableId="1846700602">
     <w:abstractNumId w:val="12"/>
+  </w:num>
+  <w:num w:numId="26" w16cid:durableId="2075734801">
+    <w:abstractNumId w:val="18"/>
+  </w:num>
+  <w:num w:numId="27" w16cid:durableId="372577414">
+    <w:abstractNumId w:val="15"/>
   </w:num>
 </w:numbering>
 </file>

</xml_diff>

<commit_message>
Working on HTM Training method for paper
</commit_message>
<xml_diff>
--- a/source/MySEProject/Documentation/ML 24-25-03 Implement Anomaly Detection Sample.docx
+++ b/source/MySEProject/Documentation/ML 24-25-03 Implement Anomaly Detection Sample.docx
@@ -2940,6 +2940,1599 @@
     </w:p>
     <w:p>
       <w:pPr>
+        <w:tabs>
+          <w:tab w:val="left" w:pos="916"/>
+          <w:tab w:val="left" w:pos="1832"/>
+          <w:tab w:val="left" w:pos="2748"/>
+          <w:tab w:val="left" w:pos="3664"/>
+          <w:tab w:val="left" w:pos="4580"/>
+          <w:tab w:val="left" w:pos="5496"/>
+          <w:tab w:val="left" w:pos="6412"/>
+          <w:tab w:val="left" w:pos="7328"/>
+          <w:tab w:val="left" w:pos="8244"/>
+          <w:tab w:val="left" w:pos="9160"/>
+          <w:tab w:val="left" w:pos="10076"/>
+          <w:tab w:val="left" w:pos="10992"/>
+          <w:tab w:val="left" w:pos="11908"/>
+          <w:tab w:val="left" w:pos="12824"/>
+          <w:tab w:val="left" w:pos="13740"/>
+          <w:tab w:val="left" w:pos="14656"/>
+        </w:tabs>
+        <w:wordWrap w:val="0"/>
+        <w:jc w:val="left"/>
+      </w:pPr>
+      <w:r>
+        <w:t xml:space="preserve">Anomaly Detection </w:t>
+      </w:r>
+    </w:p>
+    <w:p>
+      <w:pPr>
+        <w:tabs>
+          <w:tab w:val="left" w:pos="916"/>
+          <w:tab w:val="left" w:pos="1832"/>
+          <w:tab w:val="left" w:pos="2748"/>
+          <w:tab w:val="left" w:pos="3664"/>
+          <w:tab w:val="left" w:pos="4580"/>
+          <w:tab w:val="left" w:pos="5496"/>
+          <w:tab w:val="left" w:pos="6412"/>
+          <w:tab w:val="left" w:pos="7328"/>
+          <w:tab w:val="left" w:pos="8244"/>
+          <w:tab w:val="left" w:pos="9160"/>
+          <w:tab w:val="left" w:pos="10076"/>
+          <w:tab w:val="left" w:pos="10992"/>
+          <w:tab w:val="left" w:pos="11908"/>
+          <w:tab w:val="left" w:pos="12824"/>
+          <w:tab w:val="left" w:pos="13740"/>
+          <w:tab w:val="left" w:pos="14656"/>
+        </w:tabs>
+        <w:wordWrap w:val="0"/>
+        <w:jc w:val="left"/>
+      </w:pPr>
+      <w:r>
+        <w:t>The </w:t>
+      </w:r>
+      <w:proofErr w:type="spellStart"/>
+      <w:r>
+        <w:t>AnomalyDetection</w:t>
+      </w:r>
+      <w:proofErr w:type="spellEnd"/>
+      <w:r>
+        <w:t> class detects anomalies in time-series data using predictions from a trained HTM model. It:</w:t>
+      </w:r>
+    </w:p>
+    <w:p>
+      <w:pPr>
+        <w:numPr>
+          <w:ilvl w:val="0"/>
+          <w:numId w:val="29"/>
+        </w:numPr>
+        <w:tabs>
+          <w:tab w:val="left" w:pos="916"/>
+          <w:tab w:val="left" w:pos="1832"/>
+          <w:tab w:val="left" w:pos="2748"/>
+          <w:tab w:val="left" w:pos="3664"/>
+          <w:tab w:val="left" w:pos="4580"/>
+          <w:tab w:val="left" w:pos="5496"/>
+          <w:tab w:val="left" w:pos="6412"/>
+          <w:tab w:val="left" w:pos="7328"/>
+          <w:tab w:val="left" w:pos="8244"/>
+          <w:tab w:val="left" w:pos="9160"/>
+          <w:tab w:val="left" w:pos="10076"/>
+          <w:tab w:val="left" w:pos="10992"/>
+          <w:tab w:val="left" w:pos="11908"/>
+          <w:tab w:val="left" w:pos="12824"/>
+          <w:tab w:val="left" w:pos="13740"/>
+          <w:tab w:val="left" w:pos="14656"/>
+        </w:tabs>
+        <w:wordWrap w:val="0"/>
+        <w:jc w:val="left"/>
+      </w:pPr>
+      <w:r>
+        <w:t>Compares predicted vs. actual values using </w:t>
+      </w:r>
+      <w:r>
+        <w:rPr>
+          <w:b/>
+          <w:bCs/>
+        </w:rPr>
+        <w:t>absolute and relative thresholds</w:t>
+      </w:r>
+      <w:r>
+        <w:t>.</w:t>
+      </w:r>
+    </w:p>
+    <w:p>
+      <w:pPr>
+        <w:numPr>
+          <w:ilvl w:val="0"/>
+          <w:numId w:val="29"/>
+        </w:numPr>
+        <w:tabs>
+          <w:tab w:val="left" w:pos="916"/>
+          <w:tab w:val="left" w:pos="1832"/>
+          <w:tab w:val="left" w:pos="2748"/>
+          <w:tab w:val="left" w:pos="3664"/>
+          <w:tab w:val="left" w:pos="4580"/>
+          <w:tab w:val="left" w:pos="5496"/>
+          <w:tab w:val="left" w:pos="6412"/>
+          <w:tab w:val="left" w:pos="7328"/>
+          <w:tab w:val="left" w:pos="8244"/>
+          <w:tab w:val="left" w:pos="9160"/>
+          <w:tab w:val="left" w:pos="10076"/>
+          <w:tab w:val="left" w:pos="10992"/>
+          <w:tab w:val="left" w:pos="11908"/>
+          <w:tab w:val="left" w:pos="12824"/>
+          <w:tab w:val="left" w:pos="13740"/>
+          <w:tab w:val="left" w:pos="14656"/>
+        </w:tabs>
+        <w:wordWrap w:val="0"/>
+        <w:jc w:val="left"/>
+      </w:pPr>
+      <w:r>
+        <w:t xml:space="preserve">Logs results and </w:t>
+      </w:r>
+      <w:proofErr w:type="gramStart"/>
+      <w:r>
+        <w:t>saves</w:t>
+      </w:r>
+      <w:proofErr w:type="gramEnd"/>
+      <w:r>
+        <w:t xml:space="preserve"> them to a CSV file.</w:t>
+      </w:r>
+    </w:p>
+    <w:p>
+      <w:pPr>
+        <w:numPr>
+          <w:ilvl w:val="0"/>
+          <w:numId w:val="29"/>
+        </w:numPr>
+        <w:tabs>
+          <w:tab w:val="left" w:pos="916"/>
+          <w:tab w:val="left" w:pos="1832"/>
+          <w:tab w:val="left" w:pos="2748"/>
+          <w:tab w:val="left" w:pos="3664"/>
+          <w:tab w:val="left" w:pos="4580"/>
+          <w:tab w:val="left" w:pos="5496"/>
+          <w:tab w:val="left" w:pos="6412"/>
+          <w:tab w:val="left" w:pos="7328"/>
+          <w:tab w:val="left" w:pos="8244"/>
+          <w:tab w:val="left" w:pos="9160"/>
+          <w:tab w:val="left" w:pos="10076"/>
+          <w:tab w:val="left" w:pos="10992"/>
+          <w:tab w:val="left" w:pos="11908"/>
+          <w:tab w:val="left" w:pos="12824"/>
+          <w:tab w:val="left" w:pos="13740"/>
+          <w:tab w:val="left" w:pos="14656"/>
+        </w:tabs>
+        <w:wordWrap w:val="0"/>
+        <w:jc w:val="left"/>
+      </w:pPr>
+      <w:r>
+        <w:t>Skips elements after detecting anomalies (controversial logic).</w:t>
+      </w:r>
+    </w:p>
+    <w:p>
+      <w:pPr>
+        <w:tabs>
+          <w:tab w:val="left" w:pos="916"/>
+          <w:tab w:val="left" w:pos="1832"/>
+          <w:tab w:val="left" w:pos="2748"/>
+          <w:tab w:val="left" w:pos="3664"/>
+          <w:tab w:val="left" w:pos="4580"/>
+          <w:tab w:val="left" w:pos="5496"/>
+          <w:tab w:val="left" w:pos="6412"/>
+          <w:tab w:val="left" w:pos="7328"/>
+          <w:tab w:val="left" w:pos="8244"/>
+          <w:tab w:val="left" w:pos="9160"/>
+          <w:tab w:val="left" w:pos="10076"/>
+          <w:tab w:val="left" w:pos="10992"/>
+          <w:tab w:val="left" w:pos="11908"/>
+          <w:tab w:val="left" w:pos="12824"/>
+          <w:tab w:val="left" w:pos="13740"/>
+          <w:tab w:val="left" w:pos="14656"/>
+        </w:tabs>
+        <w:wordWrap w:val="0"/>
+        <w:jc w:val="left"/>
+      </w:pPr>
+    </w:p>
+    <w:p>
+      <w:pPr>
+        <w:tabs>
+          <w:tab w:val="left" w:pos="916"/>
+          <w:tab w:val="left" w:pos="1832"/>
+          <w:tab w:val="left" w:pos="2748"/>
+          <w:tab w:val="left" w:pos="3664"/>
+          <w:tab w:val="left" w:pos="4580"/>
+          <w:tab w:val="left" w:pos="5496"/>
+          <w:tab w:val="left" w:pos="6412"/>
+          <w:tab w:val="left" w:pos="7328"/>
+          <w:tab w:val="left" w:pos="8244"/>
+          <w:tab w:val="left" w:pos="9160"/>
+          <w:tab w:val="left" w:pos="10076"/>
+          <w:tab w:val="left" w:pos="10992"/>
+          <w:tab w:val="left" w:pos="11908"/>
+          <w:tab w:val="left" w:pos="12824"/>
+          <w:tab w:val="left" w:pos="13740"/>
+          <w:tab w:val="left" w:pos="14656"/>
+        </w:tabs>
+        <w:wordWrap w:val="0"/>
+        <w:jc w:val="left"/>
+      </w:pPr>
+      <w:r>
+        <w:rPr>
+          <w:noProof/>
+        </w:rPr>
+        <w:pict w14:anchorId="4B834485">
+          <v:shape id="_x0000_s2066" type="#_x0000_t202" style="position:absolute;margin-left:.85pt;margin-top:5.45pt;width:242.25pt;height:121.5pt;z-index:9">
+            <v:textbox style="mso-next-textbox:#_x0000_s2066">
+              <w:txbxContent>
+                <w:p>
+                  <w:pPr>
+                    <w:jc w:val="left"/>
+                  </w:pPr>
+                  <w:r>
+                    <w:t>Input Sequence: [1, 2, 3, 4, 5]</w:t>
+                  </w:r>
+                </w:p>
+                <w:p>
+                  <w:pPr>
+                    <w:jc w:val="left"/>
+                  </w:pPr>
+                  <w:r>
+                    <w:t>Loop:</w:t>
+                  </w:r>
+                </w:p>
+                <w:p>
+                  <w:pPr>
+                    <w:jc w:val="left"/>
+                    <w:rPr>
+                      <w:rFonts w:hint="eastAsia"/>
+                    </w:rPr>
+                  </w:pPr>
+                  <w:r>
+                    <w:rPr>
+                      <w:rFonts w:hint="eastAsia"/>
+                    </w:rPr>
+                    <w:t xml:space="preserve">  </w:t>
+                  </w:r>
+                  <w:proofErr w:type="spellStart"/>
+                  <w:r>
+                    <w:rPr>
+                      <w:rFonts w:hint="eastAsia"/>
+                    </w:rPr>
+                    <w:t>i</w:t>
+                  </w:r>
+                  <w:proofErr w:type="spellEnd"/>
+                  <w:r>
+                    <w:rPr>
+                      <w:rFonts w:hint="eastAsia"/>
+                    </w:rPr>
+                    <w:t xml:space="preserve">=0 </w:t>
+                  </w:r>
+                  <w:r>
+                    <w:rPr>
+                      <w:rFonts w:hint="eastAsia"/>
+                    </w:rPr>
+                    <w:t>→</w:t>
+                  </w:r>
+                  <w:r>
+                    <w:rPr>
+                      <w:rFonts w:hint="eastAsia"/>
+                    </w:rPr>
+                    <w:t xml:space="preserve"> </w:t>
+                  </w:r>
+                  <w:proofErr w:type="gramStart"/>
+                  <w:r>
+                    <w:rPr>
+                      <w:rFonts w:hint="eastAsia"/>
+                    </w:rPr>
+                    <w:t>Predict(</w:t>
+                  </w:r>
+                  <w:proofErr w:type="gramEnd"/>
+                  <w:r>
+                    <w:rPr>
+                      <w:rFonts w:hint="eastAsia"/>
+                    </w:rPr>
+                    <w:t xml:space="preserve">1) </w:t>
+                  </w:r>
+                  <w:r>
+                    <w:rPr>
+                      <w:rFonts w:hint="eastAsia"/>
+                    </w:rPr>
+                    <w:t>→</w:t>
+                  </w:r>
+                  <w:r>
+                    <w:rPr>
+                      <w:rFonts w:hint="eastAsia"/>
+                    </w:rPr>
+                    <w:t xml:space="preserve"> Compare to 2</w:t>
+                  </w:r>
+                </w:p>
+                <w:p>
+                  <w:pPr>
+                    <w:jc w:val="left"/>
+                    <w:rPr>
+                      <w:rFonts w:hint="eastAsia"/>
+                    </w:rPr>
+                  </w:pPr>
+                  <w:r>
+                    <w:rPr>
+                      <w:rFonts w:hint="eastAsia"/>
+                    </w:rPr>
+                    <w:t xml:space="preserve">  </w:t>
+                  </w:r>
+                  <w:proofErr w:type="spellStart"/>
+                  <w:r>
+                    <w:rPr>
+                      <w:rFonts w:hint="eastAsia"/>
+                    </w:rPr>
+                    <w:t>i</w:t>
+                  </w:r>
+                  <w:proofErr w:type="spellEnd"/>
+                  <w:r>
+                    <w:rPr>
+                      <w:rFonts w:hint="eastAsia"/>
+                    </w:rPr>
+                    <w:t xml:space="preserve">=1 </w:t>
+                  </w:r>
+                  <w:r>
+                    <w:rPr>
+                      <w:rFonts w:hint="eastAsia"/>
+                    </w:rPr>
+                    <w:t>→</w:t>
+                  </w:r>
+                  <w:r>
+                    <w:rPr>
+                      <w:rFonts w:hint="eastAsia"/>
+                    </w:rPr>
+                    <w:t xml:space="preserve"> </w:t>
+                  </w:r>
+                  <w:proofErr w:type="gramStart"/>
+                  <w:r>
+                    <w:rPr>
+                      <w:rFonts w:hint="eastAsia"/>
+                    </w:rPr>
+                    <w:t>Predict(</w:t>
+                  </w:r>
+                  <w:proofErr w:type="gramEnd"/>
+                  <w:r>
+                    <w:rPr>
+                      <w:rFonts w:hint="eastAsia"/>
+                    </w:rPr>
+                    <w:t xml:space="preserve">2) </w:t>
+                  </w:r>
+                  <w:r>
+                    <w:rPr>
+                      <w:rFonts w:hint="eastAsia"/>
+                    </w:rPr>
+                    <w:t>→</w:t>
+                  </w:r>
+                  <w:r>
+                    <w:rPr>
+                      <w:rFonts w:hint="eastAsia"/>
+                    </w:rPr>
+                    <w:t xml:space="preserve"> Compare to 3</w:t>
+                  </w:r>
+                </w:p>
+                <w:p>
+                  <w:pPr>
+                    <w:jc w:val="left"/>
+                  </w:pPr>
+                  <w:r>
+                    <w:t xml:space="preserve">  ...</w:t>
+                  </w:r>
+                </w:p>
+                <w:p>
+                  <w:pPr>
+                    <w:jc w:val="left"/>
+                  </w:pPr>
+                  <w:r>
+                    <w:t>Output CSV:</w:t>
+                  </w:r>
+                </w:p>
+                <w:p>
+                  <w:pPr>
+                    <w:jc w:val="left"/>
+                  </w:pPr>
+                  <w:r>
+                    <w:t xml:space="preserve">  Actual | Predicted</w:t>
+                  </w:r>
+                </w:p>
+                <w:p>
+                  <w:pPr>
+                    <w:jc w:val="left"/>
+                  </w:pPr>
+                  <w:r>
+                    <w:t xml:space="preserve">  1      | 2</w:t>
+                  </w:r>
+                </w:p>
+                <w:p>
+                  <w:pPr>
+                    <w:jc w:val="left"/>
+                  </w:pPr>
+                  <w:r>
+                    <w:t xml:space="preserve">  2      | 3</w:t>
+                  </w:r>
+                </w:p>
+                <w:p>
+                  <w:pPr>
+                    <w:jc w:val="left"/>
+                  </w:pPr>
+                  <w:r>
+                    <w:t xml:space="preserve">  ...</w:t>
+                  </w:r>
+                </w:p>
+              </w:txbxContent>
+            </v:textbox>
+          </v:shape>
+        </w:pict>
+      </w:r>
+    </w:p>
+    <w:p>
+      <w:pPr>
+        <w:tabs>
+          <w:tab w:val="left" w:pos="916"/>
+          <w:tab w:val="left" w:pos="1832"/>
+          <w:tab w:val="left" w:pos="2748"/>
+          <w:tab w:val="left" w:pos="3664"/>
+          <w:tab w:val="left" w:pos="4580"/>
+          <w:tab w:val="left" w:pos="5496"/>
+          <w:tab w:val="left" w:pos="6412"/>
+          <w:tab w:val="left" w:pos="7328"/>
+          <w:tab w:val="left" w:pos="8244"/>
+          <w:tab w:val="left" w:pos="9160"/>
+          <w:tab w:val="left" w:pos="10076"/>
+          <w:tab w:val="left" w:pos="10992"/>
+          <w:tab w:val="left" w:pos="11908"/>
+          <w:tab w:val="left" w:pos="12824"/>
+          <w:tab w:val="left" w:pos="13740"/>
+          <w:tab w:val="left" w:pos="14656"/>
+        </w:tabs>
+        <w:wordWrap w:val="0"/>
+        <w:jc w:val="left"/>
+      </w:pPr>
+    </w:p>
+    <w:p>
+      <w:pPr>
+        <w:tabs>
+          <w:tab w:val="left" w:pos="916"/>
+          <w:tab w:val="left" w:pos="1832"/>
+          <w:tab w:val="left" w:pos="2748"/>
+          <w:tab w:val="left" w:pos="3664"/>
+          <w:tab w:val="left" w:pos="4580"/>
+          <w:tab w:val="left" w:pos="5496"/>
+          <w:tab w:val="left" w:pos="6412"/>
+          <w:tab w:val="left" w:pos="7328"/>
+          <w:tab w:val="left" w:pos="8244"/>
+          <w:tab w:val="left" w:pos="9160"/>
+          <w:tab w:val="left" w:pos="10076"/>
+          <w:tab w:val="left" w:pos="10992"/>
+          <w:tab w:val="left" w:pos="11908"/>
+          <w:tab w:val="left" w:pos="12824"/>
+          <w:tab w:val="left" w:pos="13740"/>
+          <w:tab w:val="left" w:pos="14656"/>
+        </w:tabs>
+        <w:wordWrap w:val="0"/>
+        <w:jc w:val="left"/>
+      </w:pPr>
+    </w:p>
+    <w:p>
+      <w:pPr>
+        <w:tabs>
+          <w:tab w:val="left" w:pos="916"/>
+          <w:tab w:val="left" w:pos="1832"/>
+          <w:tab w:val="left" w:pos="2748"/>
+          <w:tab w:val="left" w:pos="3664"/>
+          <w:tab w:val="left" w:pos="4580"/>
+          <w:tab w:val="left" w:pos="5496"/>
+          <w:tab w:val="left" w:pos="6412"/>
+          <w:tab w:val="left" w:pos="7328"/>
+          <w:tab w:val="left" w:pos="8244"/>
+          <w:tab w:val="left" w:pos="9160"/>
+          <w:tab w:val="left" w:pos="10076"/>
+          <w:tab w:val="left" w:pos="10992"/>
+          <w:tab w:val="left" w:pos="11908"/>
+          <w:tab w:val="left" w:pos="12824"/>
+          <w:tab w:val="left" w:pos="13740"/>
+          <w:tab w:val="left" w:pos="14656"/>
+        </w:tabs>
+        <w:wordWrap w:val="0"/>
+        <w:jc w:val="left"/>
+      </w:pPr>
+    </w:p>
+    <w:p>
+      <w:pPr>
+        <w:tabs>
+          <w:tab w:val="left" w:pos="916"/>
+          <w:tab w:val="left" w:pos="1832"/>
+          <w:tab w:val="left" w:pos="2748"/>
+          <w:tab w:val="left" w:pos="3664"/>
+          <w:tab w:val="left" w:pos="4580"/>
+          <w:tab w:val="left" w:pos="5496"/>
+          <w:tab w:val="left" w:pos="6412"/>
+          <w:tab w:val="left" w:pos="7328"/>
+          <w:tab w:val="left" w:pos="8244"/>
+          <w:tab w:val="left" w:pos="9160"/>
+          <w:tab w:val="left" w:pos="10076"/>
+          <w:tab w:val="left" w:pos="10992"/>
+          <w:tab w:val="left" w:pos="11908"/>
+          <w:tab w:val="left" w:pos="12824"/>
+          <w:tab w:val="left" w:pos="13740"/>
+          <w:tab w:val="left" w:pos="14656"/>
+        </w:tabs>
+        <w:wordWrap w:val="0"/>
+        <w:jc w:val="left"/>
+      </w:pPr>
+    </w:p>
+    <w:p>
+      <w:pPr>
+        <w:tabs>
+          <w:tab w:val="left" w:pos="916"/>
+          <w:tab w:val="left" w:pos="1832"/>
+          <w:tab w:val="left" w:pos="2748"/>
+          <w:tab w:val="left" w:pos="3664"/>
+          <w:tab w:val="left" w:pos="4580"/>
+          <w:tab w:val="left" w:pos="5496"/>
+          <w:tab w:val="left" w:pos="6412"/>
+          <w:tab w:val="left" w:pos="7328"/>
+          <w:tab w:val="left" w:pos="8244"/>
+          <w:tab w:val="left" w:pos="9160"/>
+          <w:tab w:val="left" w:pos="10076"/>
+          <w:tab w:val="left" w:pos="10992"/>
+          <w:tab w:val="left" w:pos="11908"/>
+          <w:tab w:val="left" w:pos="12824"/>
+          <w:tab w:val="left" w:pos="13740"/>
+          <w:tab w:val="left" w:pos="14656"/>
+        </w:tabs>
+        <w:wordWrap w:val="0"/>
+        <w:jc w:val="left"/>
+      </w:pPr>
+    </w:p>
+    <w:p>
+      <w:pPr>
+        <w:tabs>
+          <w:tab w:val="left" w:pos="916"/>
+          <w:tab w:val="left" w:pos="1832"/>
+          <w:tab w:val="left" w:pos="2748"/>
+          <w:tab w:val="left" w:pos="3664"/>
+          <w:tab w:val="left" w:pos="4580"/>
+          <w:tab w:val="left" w:pos="5496"/>
+          <w:tab w:val="left" w:pos="6412"/>
+          <w:tab w:val="left" w:pos="7328"/>
+          <w:tab w:val="left" w:pos="8244"/>
+          <w:tab w:val="left" w:pos="9160"/>
+          <w:tab w:val="left" w:pos="10076"/>
+          <w:tab w:val="left" w:pos="10992"/>
+          <w:tab w:val="left" w:pos="11908"/>
+          <w:tab w:val="left" w:pos="12824"/>
+          <w:tab w:val="left" w:pos="13740"/>
+          <w:tab w:val="left" w:pos="14656"/>
+        </w:tabs>
+        <w:wordWrap w:val="0"/>
+        <w:jc w:val="left"/>
+      </w:pPr>
+    </w:p>
+    <w:p>
+      <w:pPr>
+        <w:tabs>
+          <w:tab w:val="left" w:pos="916"/>
+          <w:tab w:val="left" w:pos="1832"/>
+          <w:tab w:val="left" w:pos="2748"/>
+          <w:tab w:val="left" w:pos="3664"/>
+          <w:tab w:val="left" w:pos="4580"/>
+          <w:tab w:val="left" w:pos="5496"/>
+          <w:tab w:val="left" w:pos="6412"/>
+          <w:tab w:val="left" w:pos="7328"/>
+          <w:tab w:val="left" w:pos="8244"/>
+          <w:tab w:val="left" w:pos="9160"/>
+          <w:tab w:val="left" w:pos="10076"/>
+          <w:tab w:val="left" w:pos="10992"/>
+          <w:tab w:val="left" w:pos="11908"/>
+          <w:tab w:val="left" w:pos="12824"/>
+          <w:tab w:val="left" w:pos="13740"/>
+          <w:tab w:val="left" w:pos="14656"/>
+        </w:tabs>
+        <w:wordWrap w:val="0"/>
+        <w:jc w:val="left"/>
+      </w:pPr>
+    </w:p>
+    <w:p>
+      <w:pPr>
+        <w:tabs>
+          <w:tab w:val="left" w:pos="916"/>
+          <w:tab w:val="left" w:pos="1832"/>
+          <w:tab w:val="left" w:pos="2748"/>
+          <w:tab w:val="left" w:pos="3664"/>
+          <w:tab w:val="left" w:pos="4580"/>
+          <w:tab w:val="left" w:pos="5496"/>
+          <w:tab w:val="left" w:pos="6412"/>
+          <w:tab w:val="left" w:pos="7328"/>
+          <w:tab w:val="left" w:pos="8244"/>
+          <w:tab w:val="left" w:pos="9160"/>
+          <w:tab w:val="left" w:pos="10076"/>
+          <w:tab w:val="left" w:pos="10992"/>
+          <w:tab w:val="left" w:pos="11908"/>
+          <w:tab w:val="left" w:pos="12824"/>
+          <w:tab w:val="left" w:pos="13740"/>
+          <w:tab w:val="left" w:pos="14656"/>
+        </w:tabs>
+        <w:wordWrap w:val="0"/>
+        <w:jc w:val="left"/>
+      </w:pPr>
+    </w:p>
+    <w:p>
+      <w:pPr>
+        <w:tabs>
+          <w:tab w:val="left" w:pos="916"/>
+          <w:tab w:val="left" w:pos="1832"/>
+          <w:tab w:val="left" w:pos="2748"/>
+          <w:tab w:val="left" w:pos="3664"/>
+          <w:tab w:val="left" w:pos="4580"/>
+          <w:tab w:val="left" w:pos="5496"/>
+          <w:tab w:val="left" w:pos="6412"/>
+          <w:tab w:val="left" w:pos="7328"/>
+          <w:tab w:val="left" w:pos="8244"/>
+          <w:tab w:val="left" w:pos="9160"/>
+          <w:tab w:val="left" w:pos="10076"/>
+          <w:tab w:val="left" w:pos="10992"/>
+          <w:tab w:val="left" w:pos="11908"/>
+          <w:tab w:val="left" w:pos="12824"/>
+          <w:tab w:val="left" w:pos="13740"/>
+          <w:tab w:val="left" w:pos="14656"/>
+        </w:tabs>
+        <w:wordWrap w:val="0"/>
+        <w:jc w:val="left"/>
+      </w:pPr>
+    </w:p>
+    <w:p>
+      <w:pPr>
+        <w:tabs>
+          <w:tab w:val="left" w:pos="916"/>
+          <w:tab w:val="left" w:pos="1832"/>
+          <w:tab w:val="left" w:pos="2748"/>
+          <w:tab w:val="left" w:pos="3664"/>
+          <w:tab w:val="left" w:pos="4580"/>
+          <w:tab w:val="left" w:pos="5496"/>
+          <w:tab w:val="left" w:pos="6412"/>
+          <w:tab w:val="left" w:pos="7328"/>
+          <w:tab w:val="left" w:pos="8244"/>
+          <w:tab w:val="left" w:pos="9160"/>
+          <w:tab w:val="left" w:pos="10076"/>
+          <w:tab w:val="left" w:pos="10992"/>
+          <w:tab w:val="left" w:pos="11908"/>
+          <w:tab w:val="left" w:pos="12824"/>
+          <w:tab w:val="left" w:pos="13740"/>
+          <w:tab w:val="left" w:pos="14656"/>
+        </w:tabs>
+        <w:wordWrap w:val="0"/>
+        <w:jc w:val="left"/>
+      </w:pPr>
+    </w:p>
+    <w:p>
+      <w:pPr>
+        <w:tabs>
+          <w:tab w:val="left" w:pos="916"/>
+          <w:tab w:val="left" w:pos="1832"/>
+          <w:tab w:val="left" w:pos="2748"/>
+          <w:tab w:val="left" w:pos="3664"/>
+          <w:tab w:val="left" w:pos="4580"/>
+          <w:tab w:val="left" w:pos="5496"/>
+          <w:tab w:val="left" w:pos="6412"/>
+          <w:tab w:val="left" w:pos="7328"/>
+          <w:tab w:val="left" w:pos="8244"/>
+          <w:tab w:val="left" w:pos="9160"/>
+          <w:tab w:val="left" w:pos="10076"/>
+          <w:tab w:val="left" w:pos="10992"/>
+          <w:tab w:val="left" w:pos="11908"/>
+          <w:tab w:val="left" w:pos="12824"/>
+          <w:tab w:val="left" w:pos="13740"/>
+          <w:tab w:val="left" w:pos="14656"/>
+        </w:tabs>
+        <w:wordWrap w:val="0"/>
+        <w:jc w:val="left"/>
+      </w:pPr>
+    </w:p>
+    <w:p>
+      <w:pPr>
+        <w:tabs>
+          <w:tab w:val="left" w:pos="916"/>
+          <w:tab w:val="left" w:pos="1832"/>
+          <w:tab w:val="left" w:pos="2748"/>
+          <w:tab w:val="left" w:pos="3664"/>
+          <w:tab w:val="left" w:pos="4580"/>
+          <w:tab w:val="left" w:pos="5496"/>
+          <w:tab w:val="left" w:pos="6412"/>
+          <w:tab w:val="left" w:pos="7328"/>
+          <w:tab w:val="left" w:pos="8244"/>
+          <w:tab w:val="left" w:pos="9160"/>
+          <w:tab w:val="left" w:pos="10076"/>
+          <w:tab w:val="left" w:pos="10992"/>
+          <w:tab w:val="left" w:pos="11908"/>
+          <w:tab w:val="left" w:pos="12824"/>
+          <w:tab w:val="left" w:pos="13740"/>
+          <w:tab w:val="left" w:pos="14656"/>
+        </w:tabs>
+        <w:wordWrap w:val="0"/>
+        <w:jc w:val="left"/>
+      </w:pPr>
+    </w:p>
+    <w:p>
+      <w:pPr>
+        <w:tabs>
+          <w:tab w:val="left" w:pos="916"/>
+          <w:tab w:val="left" w:pos="1832"/>
+          <w:tab w:val="left" w:pos="2748"/>
+          <w:tab w:val="left" w:pos="3664"/>
+          <w:tab w:val="left" w:pos="4580"/>
+          <w:tab w:val="left" w:pos="5496"/>
+          <w:tab w:val="left" w:pos="6412"/>
+          <w:tab w:val="left" w:pos="7328"/>
+          <w:tab w:val="left" w:pos="8244"/>
+          <w:tab w:val="left" w:pos="9160"/>
+          <w:tab w:val="left" w:pos="10076"/>
+          <w:tab w:val="left" w:pos="10992"/>
+          <w:tab w:val="left" w:pos="11908"/>
+          <w:tab w:val="left" w:pos="12824"/>
+          <w:tab w:val="left" w:pos="13740"/>
+          <w:tab w:val="left" w:pos="14656"/>
+        </w:tabs>
+        <w:wordWrap w:val="0"/>
+        <w:jc w:val="left"/>
+      </w:pPr>
+    </w:p>
+    <w:p>
+      <w:pPr>
+        <w:jc w:val="left"/>
+      </w:pPr>
+      <w:r>
+        <w:t>Combines absolute and relative thresholds:</w:t>
+      </w:r>
+    </w:p>
+    <w:p>
+      <w:pPr>
+        <w:jc w:val="left"/>
+      </w:pPr>
+      <w:r>
+        <w:t>Anomaly</w:t>
+      </w:r>
+      <w:proofErr w:type="gramStart"/>
+      <w:r>
+        <w:t>={</w:t>
+      </w:r>
+      <w:proofErr w:type="gramEnd"/>
+      <w:r>
+        <w:t>1if </w:t>
+      </w:r>
+      <w:r>
+        <w:rPr>
+          <w:rFonts w:ascii="Cambria Math" w:hAnsi="Cambria Math" w:cs="Cambria Math"/>
+        </w:rPr>
+        <w:t>∣</w:t>
+      </w:r>
+      <w:r>
+        <w:t>P−A</w:t>
+      </w:r>
+      <w:r>
+        <w:rPr>
+          <w:rFonts w:ascii="Cambria Math" w:hAnsi="Cambria Math" w:cs="Cambria Math"/>
+        </w:rPr>
+        <w:t>∣</w:t>
+      </w:r>
+      <w:r>
+        <w:t>&gt;Tabs</w:t>
+      </w:r>
+      <w:r>
+        <w:rPr>
+          <w:rFonts w:ascii="Cambria Math" w:hAnsi="Cambria Math" w:cs="Cambria Math"/>
+        </w:rPr>
+        <w:t>∧∣</w:t>
+      </w:r>
+      <w:r>
+        <w:t>P−A</w:t>
+      </w:r>
+      <w:r>
+        <w:rPr>
+          <w:rFonts w:ascii="Cambria Math" w:hAnsi="Cambria Math" w:cs="Cambria Math"/>
+        </w:rPr>
+        <w:t>∣</w:t>
+      </w:r>
+      <w:r>
+        <w:t>A&gt;Trel0otherwiseAnomaly={10​if </w:t>
+      </w:r>
+      <w:r>
+        <w:rPr>
+          <w:rFonts w:ascii="Cambria Math" w:hAnsi="Cambria Math" w:cs="Cambria Math"/>
+        </w:rPr>
+        <w:t>∣</w:t>
+      </w:r>
+      <w:r>
+        <w:rPr>
+          <w:i/>
+          <w:iCs/>
+        </w:rPr>
+        <w:t>P</w:t>
+      </w:r>
+      <w:r>
+        <w:t>−</w:t>
+      </w:r>
+      <w:r>
+        <w:rPr>
+          <w:i/>
+          <w:iCs/>
+        </w:rPr>
+        <w:t>A</w:t>
+      </w:r>
+      <w:r>
+        <w:rPr>
+          <w:rFonts w:ascii="Cambria Math" w:hAnsi="Cambria Math" w:cs="Cambria Math"/>
+        </w:rPr>
+        <w:t>∣</w:t>
+      </w:r>
+      <w:r>
+        <w:t>&gt;</w:t>
+      </w:r>
+      <w:r>
+        <w:rPr>
+          <w:i/>
+          <w:iCs/>
+        </w:rPr>
+        <w:t>Tabs</w:t>
+      </w:r>
+      <w:r>
+        <w:t>​</w:t>
+      </w:r>
+      <w:r>
+        <w:rPr>
+          <w:rFonts w:ascii="Cambria Math" w:hAnsi="Cambria Math" w:cs="Cambria Math"/>
+        </w:rPr>
+        <w:t>∧</w:t>
+      </w:r>
+      <w:r>
+        <w:rPr>
+          <w:i/>
+          <w:iCs/>
+        </w:rPr>
+        <w:t>A</w:t>
+      </w:r>
+      <w:r>
+        <w:rPr>
+          <w:rFonts w:ascii="Cambria Math" w:hAnsi="Cambria Math" w:cs="Cambria Math"/>
+        </w:rPr>
+        <w:t>∣</w:t>
+      </w:r>
+      <w:r>
+        <w:rPr>
+          <w:i/>
+          <w:iCs/>
+        </w:rPr>
+        <w:t>P</w:t>
+      </w:r>
+      <w:r>
+        <w:t>−</w:t>
+      </w:r>
+      <w:r>
+        <w:rPr>
+          <w:i/>
+          <w:iCs/>
+        </w:rPr>
+        <w:t>A</w:t>
+      </w:r>
+      <w:r>
+        <w:rPr>
+          <w:rFonts w:ascii="Cambria Math" w:hAnsi="Cambria Math" w:cs="Cambria Math"/>
+        </w:rPr>
+        <w:t>∣</w:t>
+      </w:r>
+      <w:r>
+        <w:t>​&gt;</w:t>
+      </w:r>
+      <w:r>
+        <w:rPr>
+          <w:i/>
+          <w:iCs/>
+        </w:rPr>
+        <w:t>Trel</w:t>
+      </w:r>
+      <w:r>
+        <w:t>​otherwise​</w:t>
+      </w:r>
+    </w:p>
+    <w:p>
+      <w:pPr>
+        <w:jc w:val="left"/>
+      </w:pPr>
+      <w:r>
+        <w:t>Where:</w:t>
+      </w:r>
+    </w:p>
+    <w:p>
+      <w:pPr>
+        <w:numPr>
+          <w:ilvl w:val="0"/>
+          <w:numId w:val="28"/>
+        </w:numPr>
+        <w:jc w:val="left"/>
+      </w:pPr>
+      <w:r>
+        <w:t>P</w:t>
+      </w:r>
+      <w:r>
+        <w:rPr>
+          <w:i/>
+          <w:iCs/>
+        </w:rPr>
+        <w:t>P</w:t>
+      </w:r>
+      <w:r>
+        <w:t>: Predicted value</w:t>
+      </w:r>
+    </w:p>
+    <w:p>
+      <w:pPr>
+        <w:numPr>
+          <w:ilvl w:val="0"/>
+          <w:numId w:val="28"/>
+        </w:numPr>
+        <w:jc w:val="left"/>
+      </w:pPr>
+      <w:r>
+        <w:t>A</w:t>
+      </w:r>
+      <w:r>
+        <w:rPr>
+          <w:i/>
+          <w:iCs/>
+        </w:rPr>
+        <w:t>A</w:t>
+      </w:r>
+      <w:r>
+        <w:t>: Actual value</w:t>
+      </w:r>
+    </w:p>
+    <w:p>
+      <w:pPr>
+        <w:numPr>
+          <w:ilvl w:val="0"/>
+          <w:numId w:val="28"/>
+        </w:numPr>
+        <w:jc w:val="left"/>
+      </w:pPr>
+      <w:proofErr w:type="spellStart"/>
+      <w:r>
+        <w:t>Tabs</w:t>
+      </w:r>
+      <w:r>
+        <w:rPr>
+          <w:i/>
+          <w:iCs/>
+        </w:rPr>
+        <w:t>Tabs</w:t>
+      </w:r>
+      <w:proofErr w:type="spellEnd"/>
+      <w:r>
+        <w:t>​: Absolute threshold (default=1)</w:t>
+      </w:r>
+    </w:p>
+    <w:p>
+      <w:pPr>
+        <w:numPr>
+          <w:ilvl w:val="0"/>
+          <w:numId w:val="28"/>
+        </w:numPr>
+        <w:jc w:val="left"/>
+      </w:pPr>
+      <w:proofErr w:type="spellStart"/>
+      <w:r>
+        <w:t>Trel</w:t>
+      </w:r>
+      <w:r>
+        <w:rPr>
+          <w:i/>
+          <w:iCs/>
+        </w:rPr>
+        <w:t>Trel</w:t>
+      </w:r>
+      <w:proofErr w:type="spellEnd"/>
+      <w:r>
+        <w:t>​: Relative threshold (default=0.1)</w:t>
+      </w:r>
+    </w:p>
+    <w:p>
+      <w:pPr>
+        <w:tabs>
+          <w:tab w:val="left" w:pos="916"/>
+          <w:tab w:val="left" w:pos="1832"/>
+          <w:tab w:val="left" w:pos="2748"/>
+          <w:tab w:val="left" w:pos="3664"/>
+          <w:tab w:val="left" w:pos="4580"/>
+          <w:tab w:val="left" w:pos="5496"/>
+          <w:tab w:val="left" w:pos="6412"/>
+          <w:tab w:val="left" w:pos="7328"/>
+          <w:tab w:val="left" w:pos="8244"/>
+          <w:tab w:val="left" w:pos="9160"/>
+          <w:tab w:val="left" w:pos="10076"/>
+          <w:tab w:val="left" w:pos="10992"/>
+          <w:tab w:val="left" w:pos="11908"/>
+          <w:tab w:val="left" w:pos="12824"/>
+          <w:tab w:val="left" w:pos="13740"/>
+          <w:tab w:val="left" w:pos="14656"/>
+        </w:tabs>
+        <w:wordWrap w:val="0"/>
+        <w:jc w:val="left"/>
+      </w:pPr>
+    </w:p>
+    <w:p>
+      <w:pPr>
+        <w:tabs>
+          <w:tab w:val="left" w:pos="916"/>
+          <w:tab w:val="left" w:pos="1832"/>
+          <w:tab w:val="left" w:pos="2748"/>
+          <w:tab w:val="left" w:pos="3664"/>
+          <w:tab w:val="left" w:pos="4580"/>
+          <w:tab w:val="left" w:pos="5496"/>
+          <w:tab w:val="left" w:pos="6412"/>
+          <w:tab w:val="left" w:pos="7328"/>
+          <w:tab w:val="left" w:pos="8244"/>
+          <w:tab w:val="left" w:pos="9160"/>
+          <w:tab w:val="left" w:pos="10076"/>
+          <w:tab w:val="left" w:pos="10992"/>
+          <w:tab w:val="left" w:pos="11908"/>
+          <w:tab w:val="left" w:pos="12824"/>
+          <w:tab w:val="left" w:pos="13740"/>
+          <w:tab w:val="left" w:pos="14656"/>
+        </w:tabs>
+        <w:wordWrap w:val="0"/>
+        <w:jc w:val="left"/>
+      </w:pPr>
+    </w:p>
+    <w:p>
+      <w:pPr>
+        <w:tabs>
+          <w:tab w:val="left" w:pos="916"/>
+          <w:tab w:val="left" w:pos="1832"/>
+          <w:tab w:val="left" w:pos="2748"/>
+          <w:tab w:val="left" w:pos="3664"/>
+          <w:tab w:val="left" w:pos="4580"/>
+          <w:tab w:val="left" w:pos="5496"/>
+          <w:tab w:val="left" w:pos="6412"/>
+          <w:tab w:val="left" w:pos="7328"/>
+          <w:tab w:val="left" w:pos="8244"/>
+          <w:tab w:val="left" w:pos="9160"/>
+          <w:tab w:val="left" w:pos="10076"/>
+          <w:tab w:val="left" w:pos="10992"/>
+          <w:tab w:val="left" w:pos="11908"/>
+          <w:tab w:val="left" w:pos="12824"/>
+          <w:tab w:val="left" w:pos="13740"/>
+          <w:tab w:val="left" w:pos="14656"/>
+        </w:tabs>
+        <w:wordWrap w:val="0"/>
+        <w:jc w:val="left"/>
+      </w:pPr>
+    </w:p>
+    <w:p>
+      <w:pPr>
+        <w:tabs>
+          <w:tab w:val="left" w:pos="916"/>
+          <w:tab w:val="left" w:pos="1832"/>
+          <w:tab w:val="left" w:pos="2748"/>
+          <w:tab w:val="left" w:pos="3664"/>
+          <w:tab w:val="left" w:pos="4580"/>
+          <w:tab w:val="left" w:pos="5496"/>
+          <w:tab w:val="left" w:pos="6412"/>
+          <w:tab w:val="left" w:pos="7328"/>
+          <w:tab w:val="left" w:pos="8244"/>
+          <w:tab w:val="left" w:pos="9160"/>
+          <w:tab w:val="left" w:pos="10076"/>
+          <w:tab w:val="left" w:pos="10992"/>
+          <w:tab w:val="left" w:pos="11908"/>
+          <w:tab w:val="left" w:pos="12824"/>
+          <w:tab w:val="left" w:pos="13740"/>
+          <w:tab w:val="left" w:pos="14656"/>
+        </w:tabs>
+        <w:wordWrap w:val="0"/>
+        <w:jc w:val="left"/>
+      </w:pPr>
+    </w:p>
+    <w:p>
+      <w:pPr>
+        <w:tabs>
+          <w:tab w:val="left" w:pos="916"/>
+          <w:tab w:val="left" w:pos="1832"/>
+          <w:tab w:val="left" w:pos="2748"/>
+          <w:tab w:val="left" w:pos="3664"/>
+          <w:tab w:val="left" w:pos="4580"/>
+          <w:tab w:val="left" w:pos="5496"/>
+          <w:tab w:val="left" w:pos="6412"/>
+          <w:tab w:val="left" w:pos="7328"/>
+          <w:tab w:val="left" w:pos="8244"/>
+          <w:tab w:val="left" w:pos="9160"/>
+          <w:tab w:val="left" w:pos="10076"/>
+          <w:tab w:val="left" w:pos="10992"/>
+          <w:tab w:val="left" w:pos="11908"/>
+          <w:tab w:val="left" w:pos="12824"/>
+          <w:tab w:val="left" w:pos="13740"/>
+          <w:tab w:val="left" w:pos="14656"/>
+        </w:tabs>
+        <w:wordWrap w:val="0"/>
+        <w:jc w:val="left"/>
+      </w:pPr>
+    </w:p>
+    <w:p>
+      <w:pPr>
+        <w:tabs>
+          <w:tab w:val="left" w:pos="916"/>
+          <w:tab w:val="left" w:pos="1832"/>
+          <w:tab w:val="left" w:pos="2748"/>
+          <w:tab w:val="left" w:pos="3664"/>
+          <w:tab w:val="left" w:pos="4580"/>
+          <w:tab w:val="left" w:pos="5496"/>
+          <w:tab w:val="left" w:pos="6412"/>
+          <w:tab w:val="left" w:pos="7328"/>
+          <w:tab w:val="left" w:pos="8244"/>
+          <w:tab w:val="left" w:pos="9160"/>
+          <w:tab w:val="left" w:pos="10076"/>
+          <w:tab w:val="left" w:pos="10992"/>
+          <w:tab w:val="left" w:pos="11908"/>
+          <w:tab w:val="left" w:pos="12824"/>
+          <w:tab w:val="left" w:pos="13740"/>
+          <w:tab w:val="left" w:pos="14656"/>
+        </w:tabs>
+        <w:wordWrap w:val="0"/>
+        <w:jc w:val="left"/>
+      </w:pPr>
+      <w:r>
+        <w:rPr>
+          <w:noProof/>
+        </w:rPr>
+        <w:pict w14:anchorId="05E8859A">
+          <v:shape id="_x0000_s2067" type="#_x0000_t202" style="position:absolute;margin-left:-1.1pt;margin-top:-.75pt;width:243.75pt;height:171.25pt;z-index:10">
+            <v:fill r:id="rId12" o:title="WhatsApp Image 2025-03-05 at 8.39" recolor="t" type="frame"/>
+            <v:textbox style="mso-next-textbox:#_x0000_s2067">
+              <w:txbxContent>
+                <w:p/>
+              </w:txbxContent>
+            </v:textbox>
+          </v:shape>
+        </w:pict>
+      </w:r>
+    </w:p>
+    <w:p>
+      <w:pPr>
+        <w:tabs>
+          <w:tab w:val="left" w:pos="916"/>
+          <w:tab w:val="left" w:pos="1832"/>
+          <w:tab w:val="left" w:pos="2748"/>
+          <w:tab w:val="left" w:pos="3664"/>
+          <w:tab w:val="left" w:pos="4580"/>
+          <w:tab w:val="left" w:pos="5496"/>
+          <w:tab w:val="left" w:pos="6412"/>
+          <w:tab w:val="left" w:pos="7328"/>
+          <w:tab w:val="left" w:pos="8244"/>
+          <w:tab w:val="left" w:pos="9160"/>
+          <w:tab w:val="left" w:pos="10076"/>
+          <w:tab w:val="left" w:pos="10992"/>
+          <w:tab w:val="left" w:pos="11908"/>
+          <w:tab w:val="left" w:pos="12824"/>
+          <w:tab w:val="left" w:pos="13740"/>
+          <w:tab w:val="left" w:pos="14656"/>
+        </w:tabs>
+        <w:wordWrap w:val="0"/>
+        <w:jc w:val="left"/>
+        <w:rPr>
+          <w:rFonts w:eastAsia="Times New Roman"/>
+          <w:sz w:val="19"/>
+          <w:szCs w:val="19"/>
+        </w:rPr>
+      </w:pPr>
+    </w:p>
+    <w:p>
+      <w:pPr>
+        <w:tabs>
+          <w:tab w:val="left" w:pos="916"/>
+          <w:tab w:val="left" w:pos="1832"/>
+          <w:tab w:val="left" w:pos="2748"/>
+          <w:tab w:val="left" w:pos="3664"/>
+          <w:tab w:val="left" w:pos="4580"/>
+          <w:tab w:val="left" w:pos="5496"/>
+          <w:tab w:val="left" w:pos="6412"/>
+          <w:tab w:val="left" w:pos="7328"/>
+          <w:tab w:val="left" w:pos="8244"/>
+          <w:tab w:val="left" w:pos="9160"/>
+          <w:tab w:val="left" w:pos="10076"/>
+          <w:tab w:val="left" w:pos="10992"/>
+          <w:tab w:val="left" w:pos="11908"/>
+          <w:tab w:val="left" w:pos="12824"/>
+          <w:tab w:val="left" w:pos="13740"/>
+          <w:tab w:val="left" w:pos="14656"/>
+        </w:tabs>
+        <w:wordWrap w:val="0"/>
+        <w:jc w:val="left"/>
+        <w:rPr>
+          <w:rFonts w:eastAsia="Times New Roman"/>
+          <w:sz w:val="19"/>
+          <w:szCs w:val="19"/>
+        </w:rPr>
+      </w:pPr>
+    </w:p>
+    <w:p>
+      <w:pPr>
+        <w:tabs>
+          <w:tab w:val="left" w:pos="916"/>
+          <w:tab w:val="left" w:pos="1832"/>
+          <w:tab w:val="left" w:pos="2748"/>
+          <w:tab w:val="left" w:pos="3664"/>
+          <w:tab w:val="left" w:pos="4580"/>
+          <w:tab w:val="left" w:pos="5496"/>
+          <w:tab w:val="left" w:pos="6412"/>
+          <w:tab w:val="left" w:pos="7328"/>
+          <w:tab w:val="left" w:pos="8244"/>
+          <w:tab w:val="left" w:pos="9160"/>
+          <w:tab w:val="left" w:pos="10076"/>
+          <w:tab w:val="left" w:pos="10992"/>
+          <w:tab w:val="left" w:pos="11908"/>
+          <w:tab w:val="left" w:pos="12824"/>
+          <w:tab w:val="left" w:pos="13740"/>
+          <w:tab w:val="left" w:pos="14656"/>
+        </w:tabs>
+        <w:wordWrap w:val="0"/>
+        <w:jc w:val="left"/>
+        <w:rPr>
+          <w:rFonts w:eastAsia="Times New Roman"/>
+          <w:sz w:val="19"/>
+          <w:szCs w:val="19"/>
+        </w:rPr>
+      </w:pPr>
+    </w:p>
+    <w:p>
+      <w:pPr>
+        <w:tabs>
+          <w:tab w:val="left" w:pos="916"/>
+          <w:tab w:val="left" w:pos="1832"/>
+          <w:tab w:val="left" w:pos="2748"/>
+          <w:tab w:val="left" w:pos="3664"/>
+          <w:tab w:val="left" w:pos="4580"/>
+          <w:tab w:val="left" w:pos="5496"/>
+          <w:tab w:val="left" w:pos="6412"/>
+          <w:tab w:val="left" w:pos="7328"/>
+          <w:tab w:val="left" w:pos="8244"/>
+          <w:tab w:val="left" w:pos="9160"/>
+          <w:tab w:val="left" w:pos="10076"/>
+          <w:tab w:val="left" w:pos="10992"/>
+          <w:tab w:val="left" w:pos="11908"/>
+          <w:tab w:val="left" w:pos="12824"/>
+          <w:tab w:val="left" w:pos="13740"/>
+          <w:tab w:val="left" w:pos="14656"/>
+        </w:tabs>
+        <w:wordWrap w:val="0"/>
+        <w:jc w:val="left"/>
+        <w:rPr>
+          <w:rFonts w:eastAsia="Times New Roman"/>
+          <w:sz w:val="19"/>
+          <w:szCs w:val="19"/>
+        </w:rPr>
+      </w:pPr>
+    </w:p>
+    <w:p>
+      <w:pPr>
+        <w:tabs>
+          <w:tab w:val="left" w:pos="916"/>
+          <w:tab w:val="left" w:pos="1832"/>
+          <w:tab w:val="left" w:pos="2748"/>
+          <w:tab w:val="left" w:pos="3664"/>
+          <w:tab w:val="left" w:pos="4580"/>
+          <w:tab w:val="left" w:pos="5496"/>
+          <w:tab w:val="left" w:pos="6412"/>
+          <w:tab w:val="left" w:pos="7328"/>
+          <w:tab w:val="left" w:pos="8244"/>
+          <w:tab w:val="left" w:pos="9160"/>
+          <w:tab w:val="left" w:pos="10076"/>
+          <w:tab w:val="left" w:pos="10992"/>
+          <w:tab w:val="left" w:pos="11908"/>
+          <w:tab w:val="left" w:pos="12824"/>
+          <w:tab w:val="left" w:pos="13740"/>
+          <w:tab w:val="left" w:pos="14656"/>
+        </w:tabs>
+        <w:wordWrap w:val="0"/>
+        <w:jc w:val="left"/>
+        <w:rPr>
+          <w:rFonts w:eastAsia="Times New Roman"/>
+          <w:sz w:val="19"/>
+          <w:szCs w:val="19"/>
+        </w:rPr>
+      </w:pPr>
+    </w:p>
+    <w:p>
+      <w:pPr>
+        <w:tabs>
+          <w:tab w:val="left" w:pos="916"/>
+          <w:tab w:val="left" w:pos="1832"/>
+          <w:tab w:val="left" w:pos="2748"/>
+          <w:tab w:val="left" w:pos="3664"/>
+          <w:tab w:val="left" w:pos="4580"/>
+          <w:tab w:val="left" w:pos="5496"/>
+          <w:tab w:val="left" w:pos="6412"/>
+          <w:tab w:val="left" w:pos="7328"/>
+          <w:tab w:val="left" w:pos="8244"/>
+          <w:tab w:val="left" w:pos="9160"/>
+          <w:tab w:val="left" w:pos="10076"/>
+          <w:tab w:val="left" w:pos="10992"/>
+          <w:tab w:val="left" w:pos="11908"/>
+          <w:tab w:val="left" w:pos="12824"/>
+          <w:tab w:val="left" w:pos="13740"/>
+          <w:tab w:val="left" w:pos="14656"/>
+        </w:tabs>
+        <w:wordWrap w:val="0"/>
+        <w:jc w:val="left"/>
+        <w:rPr>
+          <w:rFonts w:eastAsia="Times New Roman"/>
+          <w:sz w:val="19"/>
+          <w:szCs w:val="19"/>
+        </w:rPr>
+      </w:pPr>
+    </w:p>
+    <w:p>
+      <w:pPr>
+        <w:tabs>
+          <w:tab w:val="left" w:pos="916"/>
+          <w:tab w:val="left" w:pos="1832"/>
+          <w:tab w:val="left" w:pos="2748"/>
+          <w:tab w:val="left" w:pos="3664"/>
+          <w:tab w:val="left" w:pos="4580"/>
+          <w:tab w:val="left" w:pos="5496"/>
+          <w:tab w:val="left" w:pos="6412"/>
+          <w:tab w:val="left" w:pos="7328"/>
+          <w:tab w:val="left" w:pos="8244"/>
+          <w:tab w:val="left" w:pos="9160"/>
+          <w:tab w:val="left" w:pos="10076"/>
+          <w:tab w:val="left" w:pos="10992"/>
+          <w:tab w:val="left" w:pos="11908"/>
+          <w:tab w:val="left" w:pos="12824"/>
+          <w:tab w:val="left" w:pos="13740"/>
+          <w:tab w:val="left" w:pos="14656"/>
+        </w:tabs>
+        <w:wordWrap w:val="0"/>
+        <w:jc w:val="left"/>
+        <w:rPr>
+          <w:rFonts w:eastAsia="Times New Roman"/>
+          <w:sz w:val="19"/>
+          <w:szCs w:val="19"/>
+        </w:rPr>
+      </w:pPr>
+    </w:p>
+    <w:p>
+      <w:pPr>
+        <w:tabs>
+          <w:tab w:val="left" w:pos="916"/>
+          <w:tab w:val="left" w:pos="1832"/>
+          <w:tab w:val="left" w:pos="2748"/>
+          <w:tab w:val="left" w:pos="3664"/>
+          <w:tab w:val="left" w:pos="4580"/>
+          <w:tab w:val="left" w:pos="5496"/>
+          <w:tab w:val="left" w:pos="6412"/>
+          <w:tab w:val="left" w:pos="7328"/>
+          <w:tab w:val="left" w:pos="8244"/>
+          <w:tab w:val="left" w:pos="9160"/>
+          <w:tab w:val="left" w:pos="10076"/>
+          <w:tab w:val="left" w:pos="10992"/>
+          <w:tab w:val="left" w:pos="11908"/>
+          <w:tab w:val="left" w:pos="12824"/>
+          <w:tab w:val="left" w:pos="13740"/>
+          <w:tab w:val="left" w:pos="14656"/>
+        </w:tabs>
+        <w:wordWrap w:val="0"/>
+        <w:jc w:val="left"/>
+        <w:rPr>
+          <w:rFonts w:eastAsia="Times New Roman"/>
+          <w:sz w:val="19"/>
+          <w:szCs w:val="19"/>
+        </w:rPr>
+      </w:pPr>
+    </w:p>
+    <w:p>
+      <w:pPr>
+        <w:tabs>
+          <w:tab w:val="left" w:pos="916"/>
+          <w:tab w:val="left" w:pos="1832"/>
+          <w:tab w:val="left" w:pos="2748"/>
+          <w:tab w:val="left" w:pos="3664"/>
+          <w:tab w:val="left" w:pos="4580"/>
+          <w:tab w:val="left" w:pos="5496"/>
+          <w:tab w:val="left" w:pos="6412"/>
+          <w:tab w:val="left" w:pos="7328"/>
+          <w:tab w:val="left" w:pos="8244"/>
+          <w:tab w:val="left" w:pos="9160"/>
+          <w:tab w:val="left" w:pos="10076"/>
+          <w:tab w:val="left" w:pos="10992"/>
+          <w:tab w:val="left" w:pos="11908"/>
+          <w:tab w:val="left" w:pos="12824"/>
+          <w:tab w:val="left" w:pos="13740"/>
+          <w:tab w:val="left" w:pos="14656"/>
+        </w:tabs>
+        <w:wordWrap w:val="0"/>
+        <w:jc w:val="left"/>
+        <w:rPr>
+          <w:rFonts w:eastAsia="Times New Roman"/>
+          <w:sz w:val="19"/>
+          <w:szCs w:val="19"/>
+        </w:rPr>
+      </w:pPr>
+    </w:p>
+    <w:p>
+      <w:pPr>
+        <w:tabs>
+          <w:tab w:val="left" w:pos="916"/>
+          <w:tab w:val="left" w:pos="1832"/>
+          <w:tab w:val="left" w:pos="2748"/>
+          <w:tab w:val="left" w:pos="3664"/>
+          <w:tab w:val="left" w:pos="4580"/>
+          <w:tab w:val="left" w:pos="5496"/>
+          <w:tab w:val="left" w:pos="6412"/>
+          <w:tab w:val="left" w:pos="7328"/>
+          <w:tab w:val="left" w:pos="8244"/>
+          <w:tab w:val="left" w:pos="9160"/>
+          <w:tab w:val="left" w:pos="10076"/>
+          <w:tab w:val="left" w:pos="10992"/>
+          <w:tab w:val="left" w:pos="11908"/>
+          <w:tab w:val="left" w:pos="12824"/>
+          <w:tab w:val="left" w:pos="13740"/>
+          <w:tab w:val="left" w:pos="14656"/>
+        </w:tabs>
+        <w:wordWrap w:val="0"/>
+        <w:jc w:val="left"/>
+        <w:rPr>
+          <w:rFonts w:eastAsia="Times New Roman"/>
+          <w:sz w:val="19"/>
+          <w:szCs w:val="19"/>
+        </w:rPr>
+      </w:pPr>
+    </w:p>
+    <w:p>
+      <w:pPr>
+        <w:tabs>
+          <w:tab w:val="left" w:pos="916"/>
+          <w:tab w:val="left" w:pos="1832"/>
+          <w:tab w:val="left" w:pos="2748"/>
+          <w:tab w:val="left" w:pos="3664"/>
+          <w:tab w:val="left" w:pos="4580"/>
+          <w:tab w:val="left" w:pos="5496"/>
+          <w:tab w:val="left" w:pos="6412"/>
+          <w:tab w:val="left" w:pos="7328"/>
+          <w:tab w:val="left" w:pos="8244"/>
+          <w:tab w:val="left" w:pos="9160"/>
+          <w:tab w:val="left" w:pos="10076"/>
+          <w:tab w:val="left" w:pos="10992"/>
+          <w:tab w:val="left" w:pos="11908"/>
+          <w:tab w:val="left" w:pos="12824"/>
+          <w:tab w:val="left" w:pos="13740"/>
+          <w:tab w:val="left" w:pos="14656"/>
+        </w:tabs>
+        <w:wordWrap w:val="0"/>
+        <w:jc w:val="left"/>
+        <w:rPr>
+          <w:rFonts w:eastAsia="Times New Roman"/>
+          <w:sz w:val="19"/>
+          <w:szCs w:val="19"/>
+        </w:rPr>
+      </w:pPr>
+    </w:p>
+    <w:p>
+      <w:pPr>
+        <w:tabs>
+          <w:tab w:val="left" w:pos="916"/>
+          <w:tab w:val="left" w:pos="1832"/>
+          <w:tab w:val="left" w:pos="2748"/>
+          <w:tab w:val="left" w:pos="3664"/>
+          <w:tab w:val="left" w:pos="4580"/>
+          <w:tab w:val="left" w:pos="5496"/>
+          <w:tab w:val="left" w:pos="6412"/>
+          <w:tab w:val="left" w:pos="7328"/>
+          <w:tab w:val="left" w:pos="8244"/>
+          <w:tab w:val="left" w:pos="9160"/>
+          <w:tab w:val="left" w:pos="10076"/>
+          <w:tab w:val="left" w:pos="10992"/>
+          <w:tab w:val="left" w:pos="11908"/>
+          <w:tab w:val="left" w:pos="12824"/>
+          <w:tab w:val="left" w:pos="13740"/>
+          <w:tab w:val="left" w:pos="14656"/>
+        </w:tabs>
+        <w:wordWrap w:val="0"/>
+        <w:jc w:val="left"/>
+        <w:rPr>
+          <w:rFonts w:eastAsia="Times New Roman"/>
+          <w:sz w:val="19"/>
+          <w:szCs w:val="19"/>
+        </w:rPr>
+      </w:pPr>
+    </w:p>
+    <w:p>
+      <w:pPr>
+        <w:tabs>
+          <w:tab w:val="left" w:pos="916"/>
+          <w:tab w:val="left" w:pos="1832"/>
+          <w:tab w:val="left" w:pos="2748"/>
+          <w:tab w:val="left" w:pos="3664"/>
+          <w:tab w:val="left" w:pos="4580"/>
+          <w:tab w:val="left" w:pos="5496"/>
+          <w:tab w:val="left" w:pos="6412"/>
+          <w:tab w:val="left" w:pos="7328"/>
+          <w:tab w:val="left" w:pos="8244"/>
+          <w:tab w:val="left" w:pos="9160"/>
+          <w:tab w:val="left" w:pos="10076"/>
+          <w:tab w:val="left" w:pos="10992"/>
+          <w:tab w:val="left" w:pos="11908"/>
+          <w:tab w:val="left" w:pos="12824"/>
+          <w:tab w:val="left" w:pos="13740"/>
+          <w:tab w:val="left" w:pos="14656"/>
+        </w:tabs>
+        <w:wordWrap w:val="0"/>
+        <w:jc w:val="left"/>
+        <w:rPr>
+          <w:rFonts w:eastAsia="Times New Roman"/>
+          <w:sz w:val="19"/>
+          <w:szCs w:val="19"/>
+        </w:rPr>
+      </w:pPr>
+    </w:p>
+    <w:p>
+      <w:pPr>
+        <w:tabs>
+          <w:tab w:val="left" w:pos="916"/>
+          <w:tab w:val="left" w:pos="1832"/>
+          <w:tab w:val="left" w:pos="2748"/>
+          <w:tab w:val="left" w:pos="3664"/>
+          <w:tab w:val="left" w:pos="4580"/>
+          <w:tab w:val="left" w:pos="5496"/>
+          <w:tab w:val="left" w:pos="6412"/>
+          <w:tab w:val="left" w:pos="7328"/>
+          <w:tab w:val="left" w:pos="8244"/>
+          <w:tab w:val="left" w:pos="9160"/>
+          <w:tab w:val="left" w:pos="10076"/>
+          <w:tab w:val="left" w:pos="10992"/>
+          <w:tab w:val="left" w:pos="11908"/>
+          <w:tab w:val="left" w:pos="12824"/>
+          <w:tab w:val="left" w:pos="13740"/>
+          <w:tab w:val="left" w:pos="14656"/>
+        </w:tabs>
+        <w:wordWrap w:val="0"/>
+        <w:jc w:val="left"/>
+        <w:rPr>
+          <w:rFonts w:eastAsia="Times New Roman"/>
+          <w:sz w:val="19"/>
+          <w:szCs w:val="19"/>
+        </w:rPr>
+      </w:pPr>
+    </w:p>
+    <w:p>
+      <w:pPr>
+        <w:tabs>
+          <w:tab w:val="left" w:pos="916"/>
+          <w:tab w:val="left" w:pos="1832"/>
+          <w:tab w:val="left" w:pos="2748"/>
+          <w:tab w:val="left" w:pos="3664"/>
+          <w:tab w:val="left" w:pos="4580"/>
+          <w:tab w:val="left" w:pos="5496"/>
+          <w:tab w:val="left" w:pos="6412"/>
+          <w:tab w:val="left" w:pos="7328"/>
+          <w:tab w:val="left" w:pos="8244"/>
+          <w:tab w:val="left" w:pos="9160"/>
+          <w:tab w:val="left" w:pos="10076"/>
+          <w:tab w:val="left" w:pos="10992"/>
+          <w:tab w:val="left" w:pos="11908"/>
+          <w:tab w:val="left" w:pos="12824"/>
+          <w:tab w:val="left" w:pos="13740"/>
+          <w:tab w:val="left" w:pos="14656"/>
+        </w:tabs>
+        <w:wordWrap w:val="0"/>
+        <w:jc w:val="left"/>
+        <w:rPr>
+          <w:rFonts w:eastAsia="Times New Roman"/>
+          <w:sz w:val="19"/>
+          <w:szCs w:val="19"/>
+        </w:rPr>
+      </w:pPr>
+    </w:p>
+    <w:p>
+      <w:pPr>
         <w:jc w:val="both"/>
         <w:rPr>
           <w:lang w:eastAsia="x-none"/>
@@ -3145,7 +4738,6 @@
         <w:pStyle w:val="Heading1"/>
       </w:pPr>
       <w:r>
-        <w:lastRenderedPageBreak/>
         <w:t>Ease of Use</w:t>
       </w:r>
     </w:p>
@@ -3485,7 +5077,11 @@
         <w:t>English, commas, semi</w:t>
       </w:r>
       <w:r>
-        <w:t>colons, periods, question and exclamation marks are located within quotation marks only when a complete thought or name is cited, such as a title or full quotation. When quotation marks are used, instead of a bold or italic typeface, to highlight a word or phrase, punctuation should appear outside of the quotation marks. A parenthetical phrase or statement at the end of a sentence is punctuated outside of the closing parenthesis (like this). (A parenthetical sentence is punctuated within the parentheses.)</w:t>
+        <w:t xml:space="preserve">colons, periods, question and exclamation marks are located within </w:t>
+      </w:r>
+      <w:r>
+        <w:lastRenderedPageBreak/>
+        <w:t>quotation marks only when a complete thought or name is cited, such as a title or full quotation. When quotation marks are used, instead of a bold or italic typeface, to highlight a word or phrase, punctuation should appear outside of the quotation marks. A parenthetical phrase or statement at the end of a sentence is punctuated outside of the closing parenthesis (like this). (A parenthetical sentence is punctuated within the parentheses.)</w:t>
       </w:r>
     </w:p>
     <w:p>
@@ -3687,11 +5283,7 @@
         <w:t xml:space="preserve"> </w:t>
       </w:r>
       <w:r>
-        <w:t xml:space="preserve">Please keep your affiliations as succinct </w:t>
-      </w:r>
-      <w:r>
-        <w:lastRenderedPageBreak/>
-        <w:t>as possible (for example, do not differentiate among departments of the same organization).</w:t>
+        <w:t>Please keep your affiliations as succinct as possible (for example, do not differentiate among departments of the same organization).</w:t>
       </w:r>
     </w:p>
     <w:p>
@@ -4231,8 +5823,8 @@
             <v:path o:extrusionok="f" gradientshapeok="t" o:connecttype="rect"/>
             <o:lock v:ext="edit" aspectratio="t"/>
           </v:shapetype>
-          <v:shape id="_x0000_i1026" type="#_x0000_t75" style="width:228.75pt;height:31.5pt" o:bordertopcolor="this" o:borderleftcolor="this" o:borderbottomcolor="this" o:borderrightcolor="this">
-            <v:imagedata r:id="rId12" o:title=""/>
+          <v:shape id="_x0000_i1026" type="#_x0000_t75" style="width:228.9pt;height:31.85pt" o:bordertopcolor="this" o:borderleftcolor="this" o:borderbottomcolor="this" o:borderrightcolor="this">
+            <v:imagedata r:id="rId13" o:title=""/>
             <w10:bordertop type="single" width="8"/>
             <w10:borderleft type="single" width="8"/>
             <w10:borderbottom type="single" width="8"/>
@@ -4526,7 +6118,7 @@
       <w:r>
         <w:t xml:space="preserve">Unit Test </w:t>
       </w:r>
-      <w:hyperlink r:id="rId13" w:anchor="L34-L49" w:history="1">
+      <w:hyperlink r:id="rId14" w:anchor="L34-L49" w:history="1">
         <w:r>
           <w:rPr>
             <w:rStyle w:val="Hyperlink"/>
@@ -4875,7 +6467,6 @@
         <w:ind w:left="354" w:hanging="354"/>
       </w:pPr>
       <w:r>
-        <w:lastRenderedPageBreak/>
         <w:t>Y. Yorozu, M. Hirano, K. Oka, and Y. Tagawa, “Electron spectroscopy studies on magneto-optical media and plastic substrate interface,” IEEE Transl. J. Magn. Japan, vol. 2, pp. 740–741, August 1987 [Digests 9th Annual Conf. Magnetics Japan, p. 301, 1982].</w:t>
       </w:r>
     </w:p>
@@ -5130,7 +6721,7 @@
     <w:p>
       <w:r>
         <w:pict w14:anchorId="4A67007D">
-          <v:shape id="_x0000_s2056" type="#_x0000_t202" style="position:absolute;left:0;text-align:left;margin-left:0;margin-top:19.8pt;width:252pt;height:90pt;z-index:-6;mso-wrap-edited:f;mso-position-horizontal:left;mso-position-horizontal-relative:margin" wrapcoords="-64 0 -64 21600 21664 21600 21664 0 -64 0">
+          <v:shape id="_x0000_s2056" type="#_x0000_t202" style="position:absolute;left:0;text-align:left;margin-left:0;margin-top:19.8pt;width:252pt;height:90pt;z-index:-8;mso-wrap-edited:f;mso-position-horizontal:left;mso-position-horizontal-relative:margin" wrapcoords="-64 0 -64 21600 21664 21600 21664 0 -64 0">
             <v:textbox style="mso-next-textbox:#_x0000_s2056">
               <w:txbxContent>
                 <w:p>
@@ -5329,7 +6920,7 @@
                 <v:path o:extrusionok="f" gradientshapeok="t" o:connecttype="rect"/>
                 <o:lock v:ext="edit" aspectratio="t"/>
               </v:shapetype>
-              <v:shape id="Grafik 4" o:spid="_x0000_i1025" type="#_x0000_t75" style="width:96pt;height:49.5pt;visibility:visible">
+              <v:shape id="Grafik 4" o:spid="_x0000_i1025" type="#_x0000_t75" style="width:95.5pt;height:49.25pt;visibility:visible">
                 <v:imagedata r:id="rId1" o:title=""/>
               </v:shape>
             </w:pict>
@@ -6524,6 +8115,155 @@
     </w:lvl>
   </w:abstractNum>
   <w:abstractNum w:abstractNumId="18" w15:restartNumberingAfterBreak="0">
+    <w:nsid w:val="3DFA67E4"/>
+    <w:multiLevelType w:val="multilevel"/>
+    <w:tmpl w:val="E3746392"/>
+    <w:lvl w:ilvl="0">
+      <w:start w:val="1"/>
+      <w:numFmt w:val="bullet"/>
+      <w:lvlText w:val=""/>
+      <w:lvlJc w:val="left"/>
+      <w:pPr>
+        <w:tabs>
+          <w:tab w:val="num" w:pos="720"/>
+        </w:tabs>
+        <w:ind w:left="720" w:hanging="360"/>
+      </w:pPr>
+      <w:rPr>
+        <w:rFonts w:ascii="Symbol" w:hAnsi="Symbol" w:hint="default"/>
+        <w:sz w:val="20"/>
+      </w:rPr>
+    </w:lvl>
+    <w:lvl w:ilvl="1" w:tentative="1">
+      <w:start w:val="1"/>
+      <w:numFmt w:val="bullet"/>
+      <w:lvlText w:val="o"/>
+      <w:lvlJc w:val="left"/>
+      <w:pPr>
+        <w:tabs>
+          <w:tab w:val="num" w:pos="1440"/>
+        </w:tabs>
+        <w:ind w:left="1440" w:hanging="360"/>
+      </w:pPr>
+      <w:rPr>
+        <w:rFonts w:ascii="Courier New" w:hAnsi="Courier New" w:hint="default"/>
+        <w:sz w:val="20"/>
+      </w:rPr>
+    </w:lvl>
+    <w:lvl w:ilvl="2" w:tentative="1">
+      <w:start w:val="1"/>
+      <w:numFmt w:val="bullet"/>
+      <w:lvlText w:val=""/>
+      <w:lvlJc w:val="left"/>
+      <w:pPr>
+        <w:tabs>
+          <w:tab w:val="num" w:pos="2160"/>
+        </w:tabs>
+        <w:ind w:left="2160" w:hanging="360"/>
+      </w:pPr>
+      <w:rPr>
+        <w:rFonts w:ascii="Wingdings" w:hAnsi="Wingdings" w:hint="default"/>
+        <w:sz w:val="20"/>
+      </w:rPr>
+    </w:lvl>
+    <w:lvl w:ilvl="3" w:tentative="1">
+      <w:start w:val="1"/>
+      <w:numFmt w:val="bullet"/>
+      <w:lvlText w:val=""/>
+      <w:lvlJc w:val="left"/>
+      <w:pPr>
+        <w:tabs>
+          <w:tab w:val="num" w:pos="2880"/>
+        </w:tabs>
+        <w:ind w:left="2880" w:hanging="360"/>
+      </w:pPr>
+      <w:rPr>
+        <w:rFonts w:ascii="Wingdings" w:hAnsi="Wingdings" w:hint="default"/>
+        <w:sz w:val="20"/>
+      </w:rPr>
+    </w:lvl>
+    <w:lvl w:ilvl="4" w:tentative="1">
+      <w:start w:val="1"/>
+      <w:numFmt w:val="bullet"/>
+      <w:lvlText w:val=""/>
+      <w:lvlJc w:val="left"/>
+      <w:pPr>
+        <w:tabs>
+          <w:tab w:val="num" w:pos="3600"/>
+        </w:tabs>
+        <w:ind w:left="3600" w:hanging="360"/>
+      </w:pPr>
+      <w:rPr>
+        <w:rFonts w:ascii="Wingdings" w:hAnsi="Wingdings" w:hint="default"/>
+        <w:sz w:val="20"/>
+      </w:rPr>
+    </w:lvl>
+    <w:lvl w:ilvl="5" w:tentative="1">
+      <w:start w:val="1"/>
+      <w:numFmt w:val="bullet"/>
+      <w:lvlText w:val=""/>
+      <w:lvlJc w:val="left"/>
+      <w:pPr>
+        <w:tabs>
+          <w:tab w:val="num" w:pos="4320"/>
+        </w:tabs>
+        <w:ind w:left="4320" w:hanging="360"/>
+      </w:pPr>
+      <w:rPr>
+        <w:rFonts w:ascii="Wingdings" w:hAnsi="Wingdings" w:hint="default"/>
+        <w:sz w:val="20"/>
+      </w:rPr>
+    </w:lvl>
+    <w:lvl w:ilvl="6" w:tentative="1">
+      <w:start w:val="1"/>
+      <w:numFmt w:val="bullet"/>
+      <w:lvlText w:val=""/>
+      <w:lvlJc w:val="left"/>
+      <w:pPr>
+        <w:tabs>
+          <w:tab w:val="num" w:pos="5040"/>
+        </w:tabs>
+        <w:ind w:left="5040" w:hanging="360"/>
+      </w:pPr>
+      <w:rPr>
+        <w:rFonts w:ascii="Wingdings" w:hAnsi="Wingdings" w:hint="default"/>
+        <w:sz w:val="20"/>
+      </w:rPr>
+    </w:lvl>
+    <w:lvl w:ilvl="7" w:tentative="1">
+      <w:start w:val="1"/>
+      <w:numFmt w:val="bullet"/>
+      <w:lvlText w:val=""/>
+      <w:lvlJc w:val="left"/>
+      <w:pPr>
+        <w:tabs>
+          <w:tab w:val="num" w:pos="5760"/>
+        </w:tabs>
+        <w:ind w:left="5760" w:hanging="360"/>
+      </w:pPr>
+      <w:rPr>
+        <w:rFonts w:ascii="Wingdings" w:hAnsi="Wingdings" w:hint="default"/>
+        <w:sz w:val="20"/>
+      </w:rPr>
+    </w:lvl>
+    <w:lvl w:ilvl="8" w:tentative="1">
+      <w:start w:val="1"/>
+      <w:numFmt w:val="bullet"/>
+      <w:lvlText w:val=""/>
+      <w:lvlJc w:val="left"/>
+      <w:pPr>
+        <w:tabs>
+          <w:tab w:val="num" w:pos="6480"/>
+        </w:tabs>
+        <w:ind w:left="6480" w:hanging="360"/>
+      </w:pPr>
+      <w:rPr>
+        <w:rFonts w:ascii="Wingdings" w:hAnsi="Wingdings" w:hint="default"/>
+        <w:sz w:val="20"/>
+      </w:rPr>
+    </w:lvl>
+  </w:abstractNum>
+  <w:abstractNum w:abstractNumId="19" w15:restartNumberingAfterBreak="0">
     <w:nsid w:val="3EC66250"/>
     <w:multiLevelType w:val="multilevel"/>
     <w:tmpl w:val="D4C07676"/>
@@ -6672,7 +8412,7 @@
       </w:rPr>
     </w:lvl>
   </w:abstractNum>
-  <w:abstractNum w:abstractNumId="19" w15:restartNumberingAfterBreak="0">
+  <w:abstractNum w:abstractNumId="20" w15:restartNumberingAfterBreak="0">
     <w:nsid w:val="4189603E"/>
     <w:multiLevelType w:val="multilevel"/>
     <w:tmpl w:val="0AB06E12"/>
@@ -6867,7 +8607,7 @@
       </w:rPr>
     </w:lvl>
   </w:abstractNum>
-  <w:abstractNum w:abstractNumId="20" w15:restartNumberingAfterBreak="0">
+  <w:abstractNum w:abstractNumId="21" w15:restartNumberingAfterBreak="0">
     <w:nsid w:val="493C3F76"/>
     <w:multiLevelType w:val="hybridMultilevel"/>
     <w:tmpl w:val="9A9E418C"/>
@@ -6974,7 +8714,156 @@
       </w:pPr>
     </w:lvl>
   </w:abstractNum>
-  <w:abstractNum w:abstractNumId="21" w15:restartNumberingAfterBreak="0">
+  <w:abstractNum w:abstractNumId="22" w15:restartNumberingAfterBreak="0">
+    <w:nsid w:val="4F3B51B7"/>
+    <w:multiLevelType w:val="multilevel"/>
+    <w:tmpl w:val="648CB60E"/>
+    <w:lvl w:ilvl="0">
+      <w:start w:val="1"/>
+      <w:numFmt w:val="bullet"/>
+      <w:lvlText w:val=""/>
+      <w:lvlJc w:val="left"/>
+      <w:pPr>
+        <w:tabs>
+          <w:tab w:val="num" w:pos="720"/>
+        </w:tabs>
+        <w:ind w:left="720" w:hanging="360"/>
+      </w:pPr>
+      <w:rPr>
+        <w:rFonts w:ascii="Symbol" w:hAnsi="Symbol" w:hint="default"/>
+        <w:sz w:val="20"/>
+      </w:rPr>
+    </w:lvl>
+    <w:lvl w:ilvl="1" w:tentative="1">
+      <w:start w:val="1"/>
+      <w:numFmt w:val="bullet"/>
+      <w:lvlText w:val="o"/>
+      <w:lvlJc w:val="left"/>
+      <w:pPr>
+        <w:tabs>
+          <w:tab w:val="num" w:pos="1440"/>
+        </w:tabs>
+        <w:ind w:left="1440" w:hanging="360"/>
+      </w:pPr>
+      <w:rPr>
+        <w:rFonts w:ascii="Courier New" w:hAnsi="Courier New" w:hint="default"/>
+        <w:sz w:val="20"/>
+      </w:rPr>
+    </w:lvl>
+    <w:lvl w:ilvl="2" w:tentative="1">
+      <w:start w:val="1"/>
+      <w:numFmt w:val="bullet"/>
+      <w:lvlText w:val=""/>
+      <w:lvlJc w:val="left"/>
+      <w:pPr>
+        <w:tabs>
+          <w:tab w:val="num" w:pos="2160"/>
+        </w:tabs>
+        <w:ind w:left="2160" w:hanging="360"/>
+      </w:pPr>
+      <w:rPr>
+        <w:rFonts w:ascii="Wingdings" w:hAnsi="Wingdings" w:hint="default"/>
+        <w:sz w:val="20"/>
+      </w:rPr>
+    </w:lvl>
+    <w:lvl w:ilvl="3" w:tentative="1">
+      <w:start w:val="1"/>
+      <w:numFmt w:val="bullet"/>
+      <w:lvlText w:val=""/>
+      <w:lvlJc w:val="left"/>
+      <w:pPr>
+        <w:tabs>
+          <w:tab w:val="num" w:pos="2880"/>
+        </w:tabs>
+        <w:ind w:left="2880" w:hanging="360"/>
+      </w:pPr>
+      <w:rPr>
+        <w:rFonts w:ascii="Wingdings" w:hAnsi="Wingdings" w:hint="default"/>
+        <w:sz w:val="20"/>
+      </w:rPr>
+    </w:lvl>
+    <w:lvl w:ilvl="4" w:tentative="1">
+      <w:start w:val="1"/>
+      <w:numFmt w:val="bullet"/>
+      <w:lvlText w:val=""/>
+      <w:lvlJc w:val="left"/>
+      <w:pPr>
+        <w:tabs>
+          <w:tab w:val="num" w:pos="3600"/>
+        </w:tabs>
+        <w:ind w:left="3600" w:hanging="360"/>
+      </w:pPr>
+      <w:rPr>
+        <w:rFonts w:ascii="Wingdings" w:hAnsi="Wingdings" w:hint="default"/>
+        <w:sz w:val="20"/>
+      </w:rPr>
+    </w:lvl>
+    <w:lvl w:ilvl="5" w:tentative="1">
+      <w:start w:val="1"/>
+      <w:numFmt w:val="bullet"/>
+      <w:lvlText w:val=""/>
+      <w:lvlJc w:val="left"/>
+      <w:pPr>
+        <w:tabs>
+          <w:tab w:val="num" w:pos="4320"/>
+        </w:tabs>
+        <w:ind w:left="4320" w:hanging="360"/>
+      </w:pPr>
+      <w:rPr>
+        <w:rFonts w:ascii="Wingdings" w:hAnsi="Wingdings" w:hint="default"/>
+        <w:sz w:val="20"/>
+      </w:rPr>
+    </w:lvl>
+    <w:lvl w:ilvl="6" w:tentative="1">
+      <w:start w:val="1"/>
+      <w:numFmt w:val="bullet"/>
+      <w:lvlText w:val=""/>
+      <w:lvlJc w:val="left"/>
+      <w:pPr>
+        <w:tabs>
+          <w:tab w:val="num" w:pos="5040"/>
+        </w:tabs>
+        <w:ind w:left="5040" w:hanging="360"/>
+      </w:pPr>
+      <w:rPr>
+        <w:rFonts w:ascii="Wingdings" w:hAnsi="Wingdings" w:hint="default"/>
+        <w:sz w:val="20"/>
+      </w:rPr>
+    </w:lvl>
+    <w:lvl w:ilvl="7" w:tentative="1">
+      <w:start w:val="1"/>
+      <w:numFmt w:val="bullet"/>
+      <w:lvlText w:val=""/>
+      <w:lvlJc w:val="left"/>
+      <w:pPr>
+        <w:tabs>
+          <w:tab w:val="num" w:pos="5760"/>
+        </w:tabs>
+        <w:ind w:left="5760" w:hanging="360"/>
+      </w:pPr>
+      <w:rPr>
+        <w:rFonts w:ascii="Wingdings" w:hAnsi="Wingdings" w:hint="default"/>
+        <w:sz w:val="20"/>
+      </w:rPr>
+    </w:lvl>
+    <w:lvl w:ilvl="8" w:tentative="1">
+      <w:start w:val="1"/>
+      <w:numFmt w:val="bullet"/>
+      <w:lvlText w:val=""/>
+      <w:lvlJc w:val="left"/>
+      <w:pPr>
+        <w:tabs>
+          <w:tab w:val="num" w:pos="6480"/>
+        </w:tabs>
+        <w:ind w:left="6480" w:hanging="360"/>
+      </w:pPr>
+      <w:rPr>
+        <w:rFonts w:ascii="Wingdings" w:hAnsi="Wingdings" w:hint="default"/>
+        <w:sz w:val="20"/>
+      </w:rPr>
+    </w:lvl>
+  </w:abstractNum>
+  <w:abstractNum w:abstractNumId="23" w15:restartNumberingAfterBreak="0">
     <w:nsid w:val="52CA544A"/>
     <w:multiLevelType w:val="singleLevel"/>
     <w:tmpl w:val="AED6D67E"/>
@@ -7001,7 +8890,7 @@
       </w:rPr>
     </w:lvl>
   </w:abstractNum>
-  <w:abstractNum w:abstractNumId="22" w15:restartNumberingAfterBreak="0">
+  <w:abstractNum w:abstractNumId="24" w15:restartNumberingAfterBreak="0">
     <w:nsid w:val="6C402C58"/>
     <w:multiLevelType w:val="hybridMultilevel"/>
     <w:tmpl w:val="9A1CA078"/>
@@ -7146,7 +9035,7 @@
       </w:rPr>
     </w:lvl>
   </w:abstractNum>
-  <w:abstractNum w:abstractNumId="23" w15:restartNumberingAfterBreak="0">
+  <w:abstractNum w:abstractNumId="25" w15:restartNumberingAfterBreak="0">
     <w:nsid w:val="6CD32DA8"/>
     <w:multiLevelType w:val="singleLevel"/>
     <w:tmpl w:val="166470C2"/>
@@ -7176,28 +9065,28 @@
     <w:abstractNumId w:val="16"/>
   </w:num>
   <w:num w:numId="2" w16cid:durableId="744106382">
-    <w:abstractNumId w:val="22"/>
+    <w:abstractNumId w:val="24"/>
   </w:num>
   <w:num w:numId="3" w16cid:durableId="405542283">
     <w:abstractNumId w:val="14"/>
   </w:num>
   <w:num w:numId="4" w16cid:durableId="58528485">
-    <w:abstractNumId w:val="19"/>
+    <w:abstractNumId w:val="20"/>
   </w:num>
   <w:num w:numId="5" w16cid:durableId="158690621">
-    <w:abstractNumId w:val="19"/>
+    <w:abstractNumId w:val="20"/>
   </w:num>
   <w:num w:numId="6" w16cid:durableId="1725248462">
-    <w:abstractNumId w:val="19"/>
+    <w:abstractNumId w:val="20"/>
   </w:num>
   <w:num w:numId="7" w16cid:durableId="941455226">
-    <w:abstractNumId w:val="19"/>
+    <w:abstractNumId w:val="20"/>
   </w:num>
   <w:num w:numId="8" w16cid:durableId="1785659599">
-    <w:abstractNumId w:val="21"/>
+    <w:abstractNumId w:val="23"/>
   </w:num>
   <w:num w:numId="9" w16cid:durableId="1933902280">
-    <w:abstractNumId w:val="23"/>
+    <w:abstractNumId w:val="25"/>
   </w:num>
   <w:num w:numId="10" w16cid:durableId="1495225212">
     <w:abstractNumId w:val="17"/>
@@ -7242,16 +9131,22 @@
     <w:abstractNumId w:val="1"/>
   </w:num>
   <w:num w:numId="24" w16cid:durableId="841047741">
-    <w:abstractNumId w:val="20"/>
+    <w:abstractNumId w:val="21"/>
   </w:num>
   <w:num w:numId="25" w16cid:durableId="1846700602">
     <w:abstractNumId w:val="12"/>
   </w:num>
   <w:num w:numId="26" w16cid:durableId="2075734801">
-    <w:abstractNumId w:val="18"/>
+    <w:abstractNumId w:val="19"/>
   </w:num>
   <w:num w:numId="27" w16cid:durableId="372577414">
     <w:abstractNumId w:val="15"/>
+  </w:num>
+  <w:num w:numId="28" w16cid:durableId="500002219">
+    <w:abstractNumId w:val="18"/>
+  </w:num>
+  <w:num w:numId="29" w16cid:durableId="1753428773">
+    <w:abstractNumId w:val="22"/>
   </w:num>
 </w:numbering>
 </file>

</xml_diff>

<commit_message>
Adding method for anomaly detection
</commit_message>
<xml_diff>
--- a/source/MySEProject/Documentation/ML 24-25-03 Implement Anomaly Detection Sample.docx
+++ b/source/MySEProject/Documentation/ML 24-25-03 Implement Anomaly Detection Sample.docx
@@ -4530,6 +4530,14 @@
           <w:szCs w:val="19"/>
         </w:rPr>
       </w:pPr>
+    </w:p>
+    <w:p>
+      <w:pPr>
+        <w:pStyle w:val="Heading1"/>
+      </w:pPr>
+      <w:r>
+        <w:t>Results</w:t>
+      </w:r>
     </w:p>
     <w:p>
       <w:pPr>

</xml_diff>

<commit_message>
Analyzed project results in paper
</commit_message>
<xml_diff>
--- a/source/MySEProject/Documentation/ML 24-25-03 Implement Anomaly Detection Sample.docx
+++ b/source/MySEProject/Documentation/ML 24-25-03 Implement Anomaly Detection Sample.docx
@@ -4557,6 +4557,875 @@
     </w:p>
     <w:p>
       <w:pPr>
+        <w:tabs>
+          <w:tab w:val="left" w:pos="916"/>
+          <w:tab w:val="left" w:pos="1832"/>
+          <w:tab w:val="left" w:pos="2748"/>
+          <w:tab w:val="left" w:pos="3664"/>
+          <w:tab w:val="left" w:pos="4580"/>
+          <w:tab w:val="left" w:pos="5496"/>
+          <w:tab w:val="left" w:pos="6412"/>
+          <w:tab w:val="left" w:pos="7328"/>
+          <w:tab w:val="left" w:pos="8244"/>
+          <w:tab w:val="left" w:pos="9160"/>
+          <w:tab w:val="left" w:pos="10076"/>
+          <w:tab w:val="left" w:pos="10992"/>
+          <w:tab w:val="left" w:pos="11908"/>
+          <w:tab w:val="left" w:pos="12824"/>
+          <w:tab w:val="left" w:pos="13740"/>
+          <w:tab w:val="left" w:pos="14656"/>
+        </w:tabs>
+        <w:wordWrap w:val="0"/>
+        <w:jc w:val="left"/>
+        <w:rPr>
+          <w:rFonts w:eastAsia="Times New Roman"/>
+          <w:sz w:val="19"/>
+          <w:szCs w:val="19"/>
+        </w:rPr>
+      </w:pPr>
+      <w:r>
+        <w:rPr>
+          <w:rFonts w:eastAsia="Times New Roman"/>
+          <w:sz w:val="19"/>
+          <w:szCs w:val="19"/>
+        </w:rPr>
+        <w:t xml:space="preserve">The implemented system leverages Hierarchical Temporal Memory (HTM) via the </w:t>
+      </w:r>
+      <w:proofErr w:type="spellStart"/>
+      <w:r>
+        <w:rPr>
+          <w:rFonts w:eastAsia="Times New Roman"/>
+          <w:sz w:val="19"/>
+          <w:szCs w:val="19"/>
+        </w:rPr>
+        <w:t>NeoCortexApi</w:t>
+      </w:r>
+      <w:proofErr w:type="spellEnd"/>
+      <w:r>
+        <w:rPr>
+          <w:rFonts w:eastAsia="Times New Roman"/>
+          <w:sz w:val="19"/>
+          <w:szCs w:val="19"/>
+        </w:rPr>
+        <w:t xml:space="preserve"> to detect anomalies in network traffic load sequences. Training data (CSV files in /</w:t>
+      </w:r>
+      <w:proofErr w:type="spellStart"/>
+      <w:r>
+        <w:rPr>
+          <w:rFonts w:eastAsia="Times New Roman"/>
+          <w:sz w:val="19"/>
+          <w:szCs w:val="19"/>
+        </w:rPr>
+        <w:t>TrainingData</w:t>
+      </w:r>
+      <w:proofErr w:type="spellEnd"/>
+      <w:r>
+        <w:rPr>
+          <w:rFonts w:eastAsia="Times New Roman"/>
+          <w:sz w:val="19"/>
+          <w:szCs w:val="19"/>
+        </w:rPr>
+        <w:t>) contains normal traffic percentages within the range [</w:t>
+      </w:r>
+      <w:r>
+        <w:rPr>
+          <w:rFonts w:eastAsia="Times New Roman"/>
+          <w:color w:val="92D050"/>
+          <w:sz w:val="19"/>
+          <w:szCs w:val="19"/>
+        </w:rPr>
+        <w:t>45, 55</w:t>
+      </w:r>
+      <w:r>
+        <w:rPr>
+          <w:rFonts w:eastAsia="Times New Roman"/>
+          <w:sz w:val="19"/>
+          <w:szCs w:val="19"/>
+        </w:rPr>
+        <w:t>], while inferring data (CSV files in /</w:t>
+      </w:r>
+      <w:proofErr w:type="spellStart"/>
+      <w:r>
+        <w:rPr>
+          <w:rFonts w:eastAsia="Times New Roman"/>
+          <w:sz w:val="19"/>
+          <w:szCs w:val="19"/>
+        </w:rPr>
+        <w:t>InferringData</w:t>
+      </w:r>
+      <w:proofErr w:type="spellEnd"/>
+      <w:r>
+        <w:rPr>
+          <w:rFonts w:eastAsia="Times New Roman"/>
+          <w:sz w:val="19"/>
+          <w:szCs w:val="19"/>
+        </w:rPr>
+        <w:t>) includes injected anomalies (values outside [</w:t>
+      </w:r>
+      <w:r>
+        <w:rPr>
+          <w:rFonts w:eastAsia="Times New Roman"/>
+          <w:color w:val="92D050"/>
+          <w:sz w:val="19"/>
+          <w:szCs w:val="19"/>
+        </w:rPr>
+        <w:t>45, 55</w:t>
+      </w:r>
+      <w:r>
+        <w:rPr>
+          <w:rFonts w:eastAsia="Times New Roman"/>
+          <w:sz w:val="19"/>
+          <w:szCs w:val="19"/>
+        </w:rPr>
+        <w:t>]). The pipeline automates data ingestion using </w:t>
+      </w:r>
+      <w:proofErr w:type="spellStart"/>
+      <w:r>
+        <w:rPr>
+          <w:rFonts w:eastAsia="Times New Roman"/>
+          <w:sz w:val="19"/>
+          <w:szCs w:val="19"/>
+        </w:rPr>
+        <w:t>FileHandler</w:t>
+      </w:r>
+      <w:proofErr w:type="spellEnd"/>
+      <w:r>
+        <w:rPr>
+          <w:rFonts w:eastAsia="Times New Roman"/>
+          <w:sz w:val="19"/>
+          <w:szCs w:val="19"/>
+        </w:rPr>
+        <w:t>, trims sequences via </w:t>
+      </w:r>
+      <w:proofErr w:type="spellStart"/>
+      <w:r>
+        <w:rPr>
+          <w:rFonts w:eastAsia="Times New Roman"/>
+          <w:sz w:val="19"/>
+          <w:szCs w:val="19"/>
+        </w:rPr>
+        <w:t>CSVHandler</w:t>
+      </w:r>
+      <w:proofErr w:type="spellEnd"/>
+      <w:r>
+        <w:rPr>
+          <w:rFonts w:eastAsia="Times New Roman"/>
+          <w:sz w:val="19"/>
+          <w:szCs w:val="19"/>
+        </w:rPr>
+        <w:t>, trains an HTM model (</w:t>
+      </w:r>
+      <w:proofErr w:type="spellStart"/>
+      <w:r>
+        <w:rPr>
+          <w:rFonts w:eastAsia="Times New Roman"/>
+          <w:sz w:val="19"/>
+          <w:szCs w:val="19"/>
+        </w:rPr>
+        <w:t>MultiSequenceLearning</w:t>
+      </w:r>
+      <w:proofErr w:type="spellEnd"/>
+      <w:r>
+        <w:rPr>
+          <w:rFonts w:eastAsia="Times New Roman"/>
+          <w:sz w:val="19"/>
+          <w:szCs w:val="19"/>
+        </w:rPr>
+        <w:t>), and detects deviations using dual thresholds (absolute: 1.0, relative: 10%) in </w:t>
+      </w:r>
+      <w:proofErr w:type="spellStart"/>
+      <w:r>
+        <w:rPr>
+          <w:rFonts w:eastAsia="Times New Roman"/>
+          <w:sz w:val="19"/>
+          <w:szCs w:val="19"/>
+        </w:rPr>
+        <w:t>AnomalyDetection</w:t>
+      </w:r>
+      <w:proofErr w:type="spellEnd"/>
+      <w:r>
+        <w:rPr>
+          <w:rFonts w:eastAsia="Times New Roman"/>
+          <w:sz w:val="19"/>
+          <w:szCs w:val="19"/>
+        </w:rPr>
+        <w:t>. The system processes sequences non-interactively, flagging anomalies by comparing predicted and actual values</w:t>
+      </w:r>
+    </w:p>
+    <w:p>
+      <w:pPr>
+        <w:tabs>
+          <w:tab w:val="left" w:pos="916"/>
+          <w:tab w:val="left" w:pos="1832"/>
+          <w:tab w:val="left" w:pos="2748"/>
+          <w:tab w:val="left" w:pos="3664"/>
+          <w:tab w:val="left" w:pos="4580"/>
+          <w:tab w:val="left" w:pos="5496"/>
+          <w:tab w:val="left" w:pos="6412"/>
+          <w:tab w:val="left" w:pos="7328"/>
+          <w:tab w:val="left" w:pos="8244"/>
+          <w:tab w:val="left" w:pos="9160"/>
+          <w:tab w:val="left" w:pos="10076"/>
+          <w:tab w:val="left" w:pos="10992"/>
+          <w:tab w:val="left" w:pos="11908"/>
+          <w:tab w:val="left" w:pos="12824"/>
+          <w:tab w:val="left" w:pos="13740"/>
+          <w:tab w:val="left" w:pos="14656"/>
+        </w:tabs>
+        <w:wordWrap w:val="0"/>
+        <w:jc w:val="left"/>
+        <w:rPr>
+          <w:rFonts w:eastAsia="Times New Roman"/>
+          <w:sz w:val="19"/>
+          <w:szCs w:val="19"/>
+        </w:rPr>
+      </w:pPr>
+    </w:p>
+    <w:p>
+      <w:pPr>
+        <w:tabs>
+          <w:tab w:val="left" w:pos="916"/>
+          <w:tab w:val="left" w:pos="1832"/>
+          <w:tab w:val="left" w:pos="2748"/>
+          <w:tab w:val="left" w:pos="3664"/>
+          <w:tab w:val="left" w:pos="4580"/>
+          <w:tab w:val="left" w:pos="5496"/>
+          <w:tab w:val="left" w:pos="6412"/>
+          <w:tab w:val="left" w:pos="7328"/>
+          <w:tab w:val="left" w:pos="8244"/>
+          <w:tab w:val="left" w:pos="9160"/>
+          <w:tab w:val="left" w:pos="10076"/>
+          <w:tab w:val="left" w:pos="10992"/>
+          <w:tab w:val="left" w:pos="11908"/>
+          <w:tab w:val="left" w:pos="12824"/>
+          <w:tab w:val="left" w:pos="13740"/>
+          <w:tab w:val="left" w:pos="14656"/>
+        </w:tabs>
+        <w:wordWrap w:val="0"/>
+        <w:jc w:val="left"/>
+        <w:rPr>
+          <w:rFonts w:eastAsia="Times New Roman"/>
+          <w:sz w:val="19"/>
+          <w:szCs w:val="19"/>
+        </w:rPr>
+      </w:pPr>
+    </w:p>
+    <w:p>
+      <w:pPr>
+        <w:pStyle w:val="BodyText"/>
+        <w:ind w:firstLine="0"/>
+        <w:jc w:val="left"/>
+        <w:rPr>
+          <w:lang w:val="en-US"/>
+        </w:rPr>
+      </w:pPr>
+      <w:r>
+        <w:rPr>
+          <w:lang w:val="en-US"/>
+        </w:rPr>
+        <w:t xml:space="preserve">False negative </w:t>
+      </w:r>
+      <w:proofErr w:type="gramStart"/>
+      <w:r>
+        <w:rPr>
+          <w:lang w:val="en-US"/>
+        </w:rPr>
+        <w:t>rate</w:t>
+      </w:r>
+      <w:proofErr w:type="gramEnd"/>
+      <w:r>
+        <w:rPr>
+          <w:lang w:val="en-US"/>
+        </w:rPr>
+        <w:t xml:space="preserve"> and false positive rates are important metrics used for judging how well a model can perform anomaly detection. </w:t>
+      </w:r>
+    </w:p>
+    <w:p>
+      <w:pPr>
+        <w:pStyle w:val="BodyText"/>
+        <w:ind w:firstLine="0"/>
+        <w:jc w:val="left"/>
+        <w:rPr>
+          <w:b/>
+          <w:bCs/>
+        </w:rPr>
+      </w:pPr>
+      <w:r>
+        <w:rPr>
+          <w:b/>
+          <w:bCs/>
+          <w:lang w:val="en-US"/>
+        </w:rPr>
+        <w:t xml:space="preserve">False Negative rate, </w:t>
+      </w:r>
+      <w:proofErr w:type="gramStart"/>
+      <w:r>
+        <w:rPr>
+          <w:b/>
+          <w:bCs/>
+          <w:lang w:val="en-US"/>
+        </w:rPr>
+        <w:t>or,</w:t>
+      </w:r>
+      <w:proofErr w:type="gramEnd"/>
+      <w:r>
+        <w:rPr>
+          <w:b/>
+          <w:bCs/>
+          <w:lang w:val="en-US"/>
+        </w:rPr>
+        <w:t xml:space="preserve"> </w:t>
+      </w:r>
+      <w:r>
+        <w:rPr>
+          <w:b/>
+          <w:bCs/>
+        </w:rPr>
+        <w:t>FNR = FN / (FN + TP)</w:t>
+      </w:r>
+    </w:p>
+    <w:p>
+      <w:pPr>
+        <w:pStyle w:val="BodyText"/>
+        <w:ind w:firstLine="0"/>
+        <w:jc w:val="left"/>
+        <w:rPr>
+          <w:lang w:val="en-US"/>
+        </w:rPr>
+      </w:pPr>
+      <w:r>
+        <w:t xml:space="preserve">where </w:t>
+      </w:r>
+      <w:r>
+        <w:rPr>
+          <w:b/>
+          <w:bCs/>
+        </w:rPr>
+        <w:t>FN</w:t>
+      </w:r>
+      <w:r>
+        <w:t xml:space="preserve"> is the number of false negatives (i.e., the number of true anomalies incorrectly identified as normal), and </w:t>
+      </w:r>
+      <w:r>
+        <w:rPr>
+          <w:b/>
+          <w:bCs/>
+        </w:rPr>
+        <w:t>TP</w:t>
+      </w:r>
+      <w:r>
+        <w:t xml:space="preserve"> is the number of true positives (i.e., the number of true anomalies correctly identified as anomalies).</w:t>
+      </w:r>
+    </w:p>
+    <w:p>
+      <w:pPr>
+        <w:pStyle w:val="BodyText"/>
+        <w:ind w:firstLine="0"/>
+        <w:jc w:val="left"/>
+        <w:rPr>
+          <w:b/>
+          <w:bCs/>
+        </w:rPr>
+      </w:pPr>
+      <w:r>
+        <w:rPr>
+          <w:b/>
+          <w:bCs/>
+        </w:rPr>
+        <w:t>False Positive rate, or, FPR = FP / (FP + TN)</w:t>
+      </w:r>
+    </w:p>
+    <w:p>
+      <w:pPr>
+        <w:pStyle w:val="BodyText"/>
+        <w:ind w:firstLine="0"/>
+        <w:jc w:val="left"/>
+        <w:rPr>
+          <w:lang w:val="en-US"/>
+        </w:rPr>
+      </w:pPr>
+      <w:r>
+        <w:t xml:space="preserve">where </w:t>
+      </w:r>
+      <w:r>
+        <w:rPr>
+          <w:b/>
+          <w:bCs/>
+        </w:rPr>
+        <w:t>FP</w:t>
+      </w:r>
+      <w:r>
+        <w:t xml:space="preserve"> is the number of false positives (i.e., the number of normal observations incorrectly identified as anomalies) and </w:t>
+      </w:r>
+      <w:r>
+        <w:rPr>
+          <w:b/>
+          <w:bCs/>
+        </w:rPr>
+        <w:t>TN</w:t>
+      </w:r>
+      <w:r>
+        <w:t xml:space="preserve"> is the number of true negatives (i.e., the number of normal observations correctly identified as normal). </w:t>
+      </w:r>
+    </w:p>
+    <w:p>
+      <w:pPr>
+        <w:pStyle w:val="BodyText"/>
+        <w:ind w:firstLine="0"/>
+        <w:jc w:val="left"/>
+        <w:rPr>
+          <w:lang w:val="en-US"/>
+        </w:rPr>
+      </w:pPr>
+      <w:r>
+        <w:t>Let us discuss the output of this experiment. For a brief analysis, we are going to discuss a part of our output next. If the sequence passed to our trained HTM engine is [52, 55, 48, 52, 47, 46, 99, 52, 47], we get the following output with respective accuracies.</w:t>
+      </w:r>
+    </w:p>
+    <w:p>
+      <w:pPr>
+        <w:pStyle w:val="BodyText"/>
+        <w:ind w:firstLine="0"/>
+        <w:jc w:val="left"/>
+      </w:pPr>
+      <w:r>
+        <w:t xml:space="preserve">.   </w:t>
+      </w:r>
+    </w:p>
+    <w:p>
+      <w:pPr>
+        <w:pStyle w:val="BodyText"/>
+        <w:ind w:firstLine="0"/>
+        <w:jc w:val="left"/>
+      </w:pPr>
+    </w:p>
+    <w:p>
+      <w:pPr>
+        <w:pStyle w:val="BodyText"/>
+        <w:ind w:firstLine="0"/>
+        <w:jc w:val="left"/>
+        <w:rPr>
+          <w:lang w:val="en-US"/>
+        </w:rPr>
+      </w:pPr>
+      <w:r>
+        <w:rPr>
+          <w:lang w:val="en-US"/>
+        </w:rPr>
+        <w:t>The hierarchical temporal memory (HTM) model demonstrated robust anomaly detection capabilities, achieving a </w:t>
+      </w:r>
+      <w:r>
+        <w:rPr>
+          <w:b/>
+          <w:bCs/>
+          <w:lang w:val="en-US"/>
+        </w:rPr>
+        <w:t>0% false negative rate (FNR)</w:t>
+      </w:r>
+      <w:r>
+        <w:rPr>
+          <w:lang w:val="en-US"/>
+        </w:rPr>
+        <w:t> and </w:t>
+      </w:r>
+      <w:r>
+        <w:rPr>
+          <w:b/>
+          <w:bCs/>
+          <w:lang w:val="en-US"/>
+        </w:rPr>
+        <w:t>25% false positive rate (FPR)</w:t>
+      </w:r>
+      <w:r>
+        <w:rPr>
+          <w:lang w:val="en-US"/>
+        </w:rPr>
+        <w:t> on the test sequence [52, 55, 48, 52, 47, 46, 99, 52, 47]. Using thresholds of 1.0 (absolute) and 0.1 (relative), the system correctly identified the injected anomaly at </w:t>
+      </w:r>
+      <w:r>
+        <w:rPr>
+          <w:b/>
+          <w:bCs/>
+          <w:lang w:val="en-US"/>
+        </w:rPr>
+        <w:t>99</w:t>
+      </w:r>
+      <w:r>
+        <w:rPr>
+          <w:lang w:val="en-US"/>
+        </w:rPr>
+        <w:t> (TP = 1) while missing no true anomalies (FN = 0). However, two normal values (</w:t>
+      </w:r>
+      <w:r>
+        <w:rPr>
+          <w:b/>
+          <w:bCs/>
+          <w:lang w:val="en-US"/>
+        </w:rPr>
+        <w:t>55</w:t>
+      </w:r>
+      <w:r>
+        <w:rPr>
+          <w:lang w:val="en-US"/>
+        </w:rPr>
+        <w:t> and </w:t>
+      </w:r>
+      <w:r>
+        <w:rPr>
+          <w:b/>
+          <w:bCs/>
+          <w:lang w:val="en-US"/>
+        </w:rPr>
+        <w:t>52</w:t>
+      </w:r>
+      <w:r>
+        <w:rPr>
+          <w:lang w:val="en-US"/>
+        </w:rPr>
+        <w:t>) were incorrectly flagged as anomalies (FP = 2), resulting in an FPR of 25% (FP / (FP + TN) = 2</w:t>
+      </w:r>
+      <w:proofErr w:type="gramStart"/>
+      <w:r>
+        <w:rPr>
+          <w:lang w:val="en-US"/>
+        </w:rPr>
+        <w:t>/(</w:t>
+      </w:r>
+      <w:proofErr w:type="gramEnd"/>
+      <w:r>
+        <w:rPr>
+          <w:lang w:val="en-US"/>
+        </w:rPr>
+        <w:t>2+6)). The model exhibited high sensitivity to deviations, as evidenced by its ability to detect abrupt spikes (e.g., </w:t>
+      </w:r>
+      <w:r>
+        <w:rPr>
+          <w:b/>
+          <w:bCs/>
+          <w:lang w:val="en-US"/>
+        </w:rPr>
+        <w:t>99</w:t>
+      </w:r>
+      <w:r>
+        <w:rPr>
+          <w:lang w:val="en-US"/>
+        </w:rPr>
+        <w:t> vs. the normal range [45, 55]) with </w:t>
+      </w:r>
+      <w:r>
+        <w:rPr>
+          <w:b/>
+          <w:bCs/>
+          <w:lang w:val="en-US"/>
+        </w:rPr>
+        <w:t>100% recall</w:t>
+      </w:r>
+      <w:r>
+        <w:rPr>
+          <w:lang w:val="en-US"/>
+        </w:rPr>
+        <w:t> in this sequence. However, the elevated FPR suggests potential over-sensitivity to minor fluctuations within the normal range, highlighting the need for threshold calibration. These results underscore the HTM model’s effectiveness in identifying extreme anomalies while emphasizing the trade-off between precision and recall in unsupervised anomaly detection systems.</w:t>
+      </w:r>
+      <w:r>
+        <w:t xml:space="preserve">  </w:t>
+      </w:r>
+    </w:p>
+    <w:p>
+      <w:pPr>
+        <w:tabs>
+          <w:tab w:val="left" w:pos="916"/>
+          <w:tab w:val="left" w:pos="1832"/>
+          <w:tab w:val="left" w:pos="2748"/>
+          <w:tab w:val="left" w:pos="3664"/>
+          <w:tab w:val="left" w:pos="4580"/>
+          <w:tab w:val="left" w:pos="5496"/>
+          <w:tab w:val="left" w:pos="6412"/>
+          <w:tab w:val="left" w:pos="7328"/>
+          <w:tab w:val="left" w:pos="8244"/>
+          <w:tab w:val="left" w:pos="9160"/>
+          <w:tab w:val="left" w:pos="10076"/>
+          <w:tab w:val="left" w:pos="10992"/>
+          <w:tab w:val="left" w:pos="11908"/>
+          <w:tab w:val="left" w:pos="12824"/>
+          <w:tab w:val="left" w:pos="13740"/>
+          <w:tab w:val="left" w:pos="14656"/>
+        </w:tabs>
+        <w:wordWrap w:val="0"/>
+        <w:jc w:val="left"/>
+        <w:rPr>
+          <w:rFonts w:eastAsia="Times New Roman"/>
+          <w:sz w:val="19"/>
+          <w:szCs w:val="19"/>
+        </w:rPr>
+      </w:pPr>
+    </w:p>
+    <w:p>
+      <w:pPr>
+        <w:tabs>
+          <w:tab w:val="left" w:pos="916"/>
+          <w:tab w:val="left" w:pos="1832"/>
+          <w:tab w:val="left" w:pos="2748"/>
+          <w:tab w:val="left" w:pos="3664"/>
+          <w:tab w:val="left" w:pos="4580"/>
+          <w:tab w:val="left" w:pos="5496"/>
+          <w:tab w:val="left" w:pos="6412"/>
+          <w:tab w:val="left" w:pos="7328"/>
+          <w:tab w:val="left" w:pos="8244"/>
+          <w:tab w:val="left" w:pos="9160"/>
+          <w:tab w:val="left" w:pos="10076"/>
+          <w:tab w:val="left" w:pos="10992"/>
+          <w:tab w:val="left" w:pos="11908"/>
+          <w:tab w:val="left" w:pos="12824"/>
+          <w:tab w:val="left" w:pos="13740"/>
+          <w:tab w:val="left" w:pos="14656"/>
+        </w:tabs>
+        <w:wordWrap w:val="0"/>
+        <w:jc w:val="left"/>
+        <w:rPr>
+          <w:rFonts w:eastAsia="Times New Roman"/>
+          <w:sz w:val="19"/>
+          <w:szCs w:val="19"/>
+        </w:rPr>
+      </w:pPr>
+      <w:r>
+        <w:rPr>
+          <w:rFonts w:eastAsia="Times New Roman"/>
+          <w:sz w:val="19"/>
+          <w:szCs w:val="19"/>
+        </w:rPr>
+        <w:t xml:space="preserve">The program first gathers all the training files and inferring files from their respective folders. First reading data from training_data_1.csv and </w:t>
+      </w:r>
+      <w:proofErr w:type="gramStart"/>
+      <w:r>
+        <w:rPr>
+          <w:rFonts w:eastAsia="Times New Roman"/>
+          <w:sz w:val="19"/>
+          <w:szCs w:val="19"/>
+        </w:rPr>
+        <w:t>read</w:t>
+      </w:r>
+      <w:proofErr w:type="gramEnd"/>
+      <w:r>
+        <w:rPr>
+          <w:rFonts w:eastAsia="Times New Roman"/>
+          <w:sz w:val="19"/>
+          <w:szCs w:val="19"/>
+        </w:rPr>
+        <w:t xml:space="preserve"> all the following sequences </w:t>
+      </w:r>
+      <w:proofErr w:type="spellStart"/>
+      <w:r>
+        <w:rPr>
+          <w:rFonts w:eastAsia="Times New Roman"/>
+          <w:sz w:val="19"/>
+          <w:szCs w:val="19"/>
+        </w:rPr>
+        <w:t>sequences</w:t>
+      </w:r>
+      <w:proofErr w:type="spellEnd"/>
+      <w:r>
+        <w:rPr>
+          <w:rFonts w:eastAsia="Times New Roman"/>
+          <w:sz w:val="19"/>
+          <w:szCs w:val="19"/>
+        </w:rPr>
+        <w:t xml:space="preserve"> </w:t>
+      </w:r>
+    </w:p>
+    <w:p>
+      <w:pPr>
+        <w:tabs>
+          <w:tab w:val="left" w:pos="916"/>
+          <w:tab w:val="left" w:pos="1832"/>
+          <w:tab w:val="left" w:pos="2748"/>
+          <w:tab w:val="left" w:pos="3664"/>
+          <w:tab w:val="left" w:pos="4580"/>
+          <w:tab w:val="left" w:pos="5496"/>
+          <w:tab w:val="left" w:pos="6412"/>
+          <w:tab w:val="left" w:pos="7328"/>
+          <w:tab w:val="left" w:pos="8244"/>
+          <w:tab w:val="left" w:pos="9160"/>
+          <w:tab w:val="left" w:pos="10076"/>
+          <w:tab w:val="left" w:pos="10992"/>
+          <w:tab w:val="left" w:pos="11908"/>
+          <w:tab w:val="left" w:pos="12824"/>
+          <w:tab w:val="left" w:pos="13740"/>
+          <w:tab w:val="left" w:pos="14656"/>
+        </w:tabs>
+        <w:wordWrap w:val="0"/>
+        <w:jc w:val="left"/>
+        <w:rPr>
+          <w:rFonts w:eastAsia="Times New Roman"/>
+          <w:sz w:val="19"/>
+          <w:szCs w:val="19"/>
+        </w:rPr>
+      </w:pPr>
+    </w:p>
+    <w:p>
+      <w:pPr>
+        <w:tabs>
+          <w:tab w:val="left" w:pos="916"/>
+          <w:tab w:val="left" w:pos="1832"/>
+          <w:tab w:val="left" w:pos="2748"/>
+          <w:tab w:val="left" w:pos="3664"/>
+          <w:tab w:val="left" w:pos="4580"/>
+          <w:tab w:val="left" w:pos="5496"/>
+          <w:tab w:val="left" w:pos="6412"/>
+          <w:tab w:val="left" w:pos="7328"/>
+          <w:tab w:val="left" w:pos="8244"/>
+          <w:tab w:val="left" w:pos="9160"/>
+          <w:tab w:val="left" w:pos="10076"/>
+          <w:tab w:val="left" w:pos="10992"/>
+          <w:tab w:val="left" w:pos="11908"/>
+          <w:tab w:val="left" w:pos="12824"/>
+          <w:tab w:val="left" w:pos="13740"/>
+          <w:tab w:val="left" w:pos="14656"/>
+        </w:tabs>
+        <w:wordWrap w:val="0"/>
+        <w:jc w:val="left"/>
+        <w:rPr>
+          <w:rFonts w:eastAsia="Times New Roman"/>
+          <w:sz w:val="19"/>
+          <w:szCs w:val="19"/>
+        </w:rPr>
+      </w:pPr>
+      <w:r>
+        <w:rPr>
+          <w:rFonts w:eastAsia="Times New Roman"/>
+          <w:noProof/>
+          <w:sz w:val="19"/>
+          <w:szCs w:val="19"/>
+        </w:rPr>
+        <w:pict w14:anchorId="5D2B0A10">
+          <v:shape id="_x0000_s2068" type="#_x0000_t202" style="position:absolute;margin-left:.85pt;margin-top:.8pt;width:241.8pt;height:73.4pt;z-index:11">
+            <v:textbox style="mso-next-textbox:#_x0000_s2068">
+              <w:txbxContent>
+                <w:p>
+                  <w:pPr>
+                    <w:jc w:val="left"/>
+                  </w:pPr>
+                  <w:r>
+                    <w:t>Sequence 1: 9, 2, 5, 8, 2, 4, 3, 5, 4, 3</w:t>
+                  </w:r>
+                </w:p>
+                <w:p>
+                  <w:pPr>
+                    <w:jc w:val="left"/>
+                  </w:pPr>
+                  <w:r>
+                    <w:t>Sequence 2: 9, 2, 6, 7, 2, 4, 3, 6, 4, 3</w:t>
+                  </w:r>
+                </w:p>
+                <w:p>
+                  <w:pPr>
+                    <w:jc w:val="left"/>
+                  </w:pPr>
+                  <w:r>
+                    <w:t>Sequence 3: 9, 3, 5, 8, 2, 4, 3, 5, 5, 3</w:t>
+                  </w:r>
+                </w:p>
+                <w:p>
+                  <w:pPr>
+                    <w:jc w:val="left"/>
+                  </w:pPr>
+                  <w:r>
+                    <w:t>Sequence 1: 9, 2, 5, 15, 2, 4, 3, 12, 4, 3</w:t>
+                  </w:r>
+                </w:p>
+              </w:txbxContent>
+            </v:textbox>
+          </v:shape>
+        </w:pict>
+      </w:r>
+    </w:p>
+    <w:p>
+      <w:pPr>
+        <w:tabs>
+          <w:tab w:val="left" w:pos="916"/>
+          <w:tab w:val="left" w:pos="1832"/>
+          <w:tab w:val="left" w:pos="2748"/>
+          <w:tab w:val="left" w:pos="3664"/>
+          <w:tab w:val="left" w:pos="4580"/>
+          <w:tab w:val="left" w:pos="5496"/>
+          <w:tab w:val="left" w:pos="6412"/>
+          <w:tab w:val="left" w:pos="7328"/>
+          <w:tab w:val="left" w:pos="8244"/>
+          <w:tab w:val="left" w:pos="9160"/>
+          <w:tab w:val="left" w:pos="10076"/>
+          <w:tab w:val="left" w:pos="10992"/>
+          <w:tab w:val="left" w:pos="11908"/>
+          <w:tab w:val="left" w:pos="12824"/>
+          <w:tab w:val="left" w:pos="13740"/>
+          <w:tab w:val="left" w:pos="14656"/>
+        </w:tabs>
+        <w:wordWrap w:val="0"/>
+        <w:jc w:val="left"/>
+        <w:rPr>
+          <w:rFonts w:eastAsia="Times New Roman"/>
+          <w:sz w:val="19"/>
+          <w:szCs w:val="19"/>
+        </w:rPr>
+      </w:pPr>
+    </w:p>
+    <w:p>
+      <w:pPr>
+        <w:tabs>
+          <w:tab w:val="left" w:pos="916"/>
+          <w:tab w:val="left" w:pos="1832"/>
+          <w:tab w:val="left" w:pos="2748"/>
+          <w:tab w:val="left" w:pos="3664"/>
+          <w:tab w:val="left" w:pos="4580"/>
+          <w:tab w:val="left" w:pos="5496"/>
+          <w:tab w:val="left" w:pos="6412"/>
+          <w:tab w:val="left" w:pos="7328"/>
+          <w:tab w:val="left" w:pos="8244"/>
+          <w:tab w:val="left" w:pos="9160"/>
+          <w:tab w:val="left" w:pos="10076"/>
+          <w:tab w:val="left" w:pos="10992"/>
+          <w:tab w:val="left" w:pos="11908"/>
+          <w:tab w:val="left" w:pos="12824"/>
+          <w:tab w:val="left" w:pos="13740"/>
+          <w:tab w:val="left" w:pos="14656"/>
+        </w:tabs>
+        <w:wordWrap w:val="0"/>
+        <w:jc w:val="left"/>
+        <w:rPr>
+          <w:rFonts w:eastAsia="Times New Roman"/>
+          <w:sz w:val="19"/>
+          <w:szCs w:val="19"/>
+        </w:rPr>
+      </w:pPr>
+    </w:p>
+    <w:p>
+      <w:pPr>
+        <w:tabs>
+          <w:tab w:val="left" w:pos="916"/>
+          <w:tab w:val="left" w:pos="1832"/>
+          <w:tab w:val="left" w:pos="2748"/>
+          <w:tab w:val="left" w:pos="3664"/>
+          <w:tab w:val="left" w:pos="4580"/>
+          <w:tab w:val="left" w:pos="5496"/>
+          <w:tab w:val="left" w:pos="6412"/>
+          <w:tab w:val="left" w:pos="7328"/>
+          <w:tab w:val="left" w:pos="8244"/>
+          <w:tab w:val="left" w:pos="9160"/>
+          <w:tab w:val="left" w:pos="10076"/>
+          <w:tab w:val="left" w:pos="10992"/>
+          <w:tab w:val="left" w:pos="11908"/>
+          <w:tab w:val="left" w:pos="12824"/>
+          <w:tab w:val="left" w:pos="13740"/>
+          <w:tab w:val="left" w:pos="14656"/>
+        </w:tabs>
+        <w:wordWrap w:val="0"/>
+        <w:jc w:val="left"/>
+        <w:rPr>
+          <w:rFonts w:eastAsia="Times New Roman"/>
+          <w:sz w:val="19"/>
+          <w:szCs w:val="19"/>
+        </w:rPr>
+      </w:pPr>
+    </w:p>
+    <w:p>
+      <w:pPr>
         <w:jc w:val="both"/>
         <w:rPr>
           <w:lang w:eastAsia="x-none"/>
@@ -4746,6 +5615,7 @@
         <w:pStyle w:val="Heading1"/>
       </w:pPr>
       <w:r>
+        <w:lastRenderedPageBreak/>
         <w:t>Ease of Use</w:t>
       </w:r>
     </w:p>
@@ -5085,11 +5955,7 @@
         <w:t>English, commas, semi</w:t>
       </w:r>
       <w:r>
-        <w:t xml:space="preserve">colons, periods, question and exclamation marks are located within </w:t>
-      </w:r>
-      <w:r>
-        <w:lastRenderedPageBreak/>
-        <w:t>quotation marks only when a complete thought or name is cited, such as a title or full quotation. When quotation marks are used, instead of a bold or italic typeface, to highlight a word or phrase, punctuation should appear outside of the quotation marks. A parenthetical phrase or statement at the end of a sentence is punctuated outside of the closing parenthesis (like this). (A parenthetical sentence is punctuated within the parentheses.)</w:t>
+        <w:t>colons, periods, question and exclamation marks are located within quotation marks only when a complete thought or name is cited, such as a title or full quotation. When quotation marks are used, instead of a bold or italic typeface, to highlight a word or phrase, punctuation should appear outside of the quotation marks. A parenthetical phrase or statement at the end of a sentence is punctuated outside of the closing parenthesis (like this). (A parenthetical sentence is punctuated within the parentheses.)</w:t>
       </w:r>
     </w:p>
     <w:p>
@@ -5291,7 +6157,11 @@
         <w:t xml:space="preserve"> </w:t>
       </w:r>
       <w:r>
-        <w:t>Please keep your affiliations as succinct as possible (for example, do not differentiate among departments of the same organization).</w:t>
+        <w:t xml:space="preserve">Please keep your affiliations as succinct </w:t>
+      </w:r>
+      <w:r>
+        <w:lastRenderedPageBreak/>
+        <w:t>as possible (for example, do not differentiate among departments of the same organization).</w:t>
       </w:r>
     </w:p>
     <w:p>
@@ -6475,6 +7345,7 @@
         <w:ind w:left="354" w:hanging="354"/>
       </w:pPr>
       <w:r>
+        <w:lastRenderedPageBreak/>
         <w:t>Y. Yorozu, M. Hirano, K. Oka, and Y. Tagawa, “Electron spectroscopy studies on magneto-optical media and plastic substrate interface,” IEEE Transl. J. Magn. Japan, vol. 2, pp. 740–741, August 1987 [Digests 9th Annual Conf. Magnetics Japan, p. 301, 1982].</w:t>
       </w:r>
     </w:p>
@@ -6729,7 +7600,7 @@
     <w:p>
       <w:r>
         <w:pict w14:anchorId="4A67007D">
-          <v:shape id="_x0000_s2056" type="#_x0000_t202" style="position:absolute;left:0;text-align:left;margin-left:0;margin-top:19.8pt;width:252pt;height:90pt;z-index:-8;mso-wrap-edited:f;mso-position-horizontal:left;mso-position-horizontal-relative:margin" wrapcoords="-64 0 -64 21600 21664 21600 21664 0 -64 0">
+          <v:shape id="_x0000_s2056" type="#_x0000_t202" style="position:absolute;left:0;text-align:left;margin-left:0;margin-top:19.8pt;width:252pt;height:90pt;z-index:-9;mso-wrap-edited:f;mso-position-horizontal:left;mso-position-horizontal-relative:margin" wrapcoords="-64 0 -64 21600 21664 21600 21664 0 -64 0">
             <v:textbox style="mso-next-textbox:#_x0000_s2056">
               <w:txbxContent>
                 <w:p>

</xml_diff>

<commit_message>
deep down into results for paper
</commit_message>
<xml_diff>
--- a/source/MySEProject/Documentation/ML 24-25-03 Implement Anomaly Detection Sample.docx
+++ b/source/MySEProject/Documentation/ML 24-25-03 Implement Anomaly Detection Sample.docx
@@ -5458,6 +5458,3573 @@
     </w:p>
     <w:p>
       <w:pPr>
+        <w:tabs>
+          <w:tab w:val="left" w:pos="916"/>
+          <w:tab w:val="left" w:pos="1832"/>
+          <w:tab w:val="left" w:pos="2748"/>
+          <w:tab w:val="left" w:pos="3664"/>
+          <w:tab w:val="left" w:pos="4580"/>
+          <w:tab w:val="left" w:pos="5496"/>
+          <w:tab w:val="left" w:pos="6412"/>
+          <w:tab w:val="left" w:pos="7328"/>
+          <w:tab w:val="left" w:pos="8244"/>
+          <w:tab w:val="left" w:pos="9160"/>
+          <w:tab w:val="left" w:pos="10076"/>
+          <w:tab w:val="left" w:pos="10992"/>
+          <w:tab w:val="left" w:pos="11908"/>
+          <w:tab w:val="left" w:pos="12824"/>
+          <w:tab w:val="left" w:pos="13740"/>
+          <w:tab w:val="left" w:pos="14656"/>
+        </w:tabs>
+        <w:wordWrap w:val="0"/>
+        <w:jc w:val="left"/>
+        <w:rPr>
+          <w:rFonts w:eastAsia="Times New Roman"/>
+          <w:sz w:val="19"/>
+          <w:szCs w:val="19"/>
+        </w:rPr>
+      </w:pPr>
+    </w:p>
+    <w:p>
+      <w:pPr>
+        <w:tabs>
+          <w:tab w:val="left" w:pos="916"/>
+          <w:tab w:val="left" w:pos="1832"/>
+          <w:tab w:val="left" w:pos="2748"/>
+          <w:tab w:val="left" w:pos="3664"/>
+          <w:tab w:val="left" w:pos="4580"/>
+          <w:tab w:val="left" w:pos="5496"/>
+          <w:tab w:val="left" w:pos="6412"/>
+          <w:tab w:val="left" w:pos="7328"/>
+          <w:tab w:val="left" w:pos="8244"/>
+          <w:tab w:val="left" w:pos="9160"/>
+          <w:tab w:val="left" w:pos="10076"/>
+          <w:tab w:val="left" w:pos="10992"/>
+          <w:tab w:val="left" w:pos="11908"/>
+          <w:tab w:val="left" w:pos="12824"/>
+          <w:tab w:val="left" w:pos="13740"/>
+          <w:tab w:val="left" w:pos="14656"/>
+        </w:tabs>
+        <w:wordWrap w:val="0"/>
+        <w:jc w:val="left"/>
+        <w:rPr>
+          <w:rFonts w:eastAsia="Times New Roman"/>
+          <w:sz w:val="19"/>
+          <w:szCs w:val="19"/>
+        </w:rPr>
+      </w:pPr>
+      <w:r>
+        <w:rPr>
+          <w:rFonts w:eastAsia="Times New Roman"/>
+          <w:sz w:val="19"/>
+          <w:szCs w:val="19"/>
+        </w:rPr>
+        <w:t>and then the program reads inferring data file.</w:t>
+      </w:r>
+    </w:p>
+    <w:p>
+      <w:pPr>
+        <w:tabs>
+          <w:tab w:val="left" w:pos="916"/>
+          <w:tab w:val="left" w:pos="1832"/>
+          <w:tab w:val="left" w:pos="2748"/>
+          <w:tab w:val="left" w:pos="3664"/>
+          <w:tab w:val="left" w:pos="4580"/>
+          <w:tab w:val="left" w:pos="5496"/>
+          <w:tab w:val="left" w:pos="6412"/>
+          <w:tab w:val="left" w:pos="7328"/>
+          <w:tab w:val="left" w:pos="8244"/>
+          <w:tab w:val="left" w:pos="9160"/>
+          <w:tab w:val="left" w:pos="10076"/>
+          <w:tab w:val="left" w:pos="10992"/>
+          <w:tab w:val="left" w:pos="11908"/>
+          <w:tab w:val="left" w:pos="12824"/>
+          <w:tab w:val="left" w:pos="13740"/>
+          <w:tab w:val="left" w:pos="14656"/>
+        </w:tabs>
+        <w:wordWrap w:val="0"/>
+        <w:jc w:val="left"/>
+        <w:rPr>
+          <w:rFonts w:eastAsia="Times New Roman"/>
+          <w:sz w:val="19"/>
+          <w:szCs w:val="19"/>
+        </w:rPr>
+      </w:pPr>
+      <w:r>
+        <w:rPr>
+          <w:rFonts w:eastAsia="Times New Roman"/>
+          <w:noProof/>
+          <w:sz w:val="19"/>
+          <w:szCs w:val="19"/>
+        </w:rPr>
+        <w:pict w14:anchorId="64724B7C">
+          <v:shape id="_x0000_s2069" type="#_x0000_t202" style="position:absolute;margin-left:.85pt;margin-top:1.1pt;width:241.8pt;height:19.65pt;z-index:12">
+            <v:textbox style="mso-next-textbox:#_x0000_s2069">
+              <w:txbxContent>
+                <w:p>
+                  <w:pPr>
+                    <w:jc w:val="left"/>
+                  </w:pPr>
+                  <w:r>
+                    <w:t>Sequence 1: 9, 2, 5, 15, 2, 4, 3, 12, 4, 3</w:t>
+                  </w:r>
+                </w:p>
+              </w:txbxContent>
+            </v:textbox>
+          </v:shape>
+        </w:pict>
+      </w:r>
+    </w:p>
+    <w:p>
+      <w:pPr>
+        <w:tabs>
+          <w:tab w:val="left" w:pos="916"/>
+          <w:tab w:val="left" w:pos="1832"/>
+          <w:tab w:val="left" w:pos="2748"/>
+          <w:tab w:val="left" w:pos="3664"/>
+          <w:tab w:val="left" w:pos="4580"/>
+          <w:tab w:val="left" w:pos="5496"/>
+          <w:tab w:val="left" w:pos="6412"/>
+          <w:tab w:val="left" w:pos="7328"/>
+          <w:tab w:val="left" w:pos="8244"/>
+          <w:tab w:val="left" w:pos="9160"/>
+          <w:tab w:val="left" w:pos="10076"/>
+          <w:tab w:val="left" w:pos="10992"/>
+          <w:tab w:val="left" w:pos="11908"/>
+          <w:tab w:val="left" w:pos="12824"/>
+          <w:tab w:val="left" w:pos="13740"/>
+          <w:tab w:val="left" w:pos="14656"/>
+        </w:tabs>
+        <w:wordWrap w:val="0"/>
+        <w:jc w:val="left"/>
+        <w:rPr>
+          <w:rFonts w:eastAsia="Times New Roman"/>
+          <w:sz w:val="19"/>
+          <w:szCs w:val="19"/>
+        </w:rPr>
+      </w:pPr>
+    </w:p>
+    <w:p>
+      <w:pPr>
+        <w:tabs>
+          <w:tab w:val="left" w:pos="916"/>
+          <w:tab w:val="left" w:pos="1832"/>
+          <w:tab w:val="left" w:pos="2748"/>
+          <w:tab w:val="left" w:pos="3664"/>
+          <w:tab w:val="left" w:pos="4580"/>
+          <w:tab w:val="left" w:pos="5496"/>
+          <w:tab w:val="left" w:pos="6412"/>
+          <w:tab w:val="left" w:pos="7328"/>
+          <w:tab w:val="left" w:pos="8244"/>
+          <w:tab w:val="left" w:pos="9160"/>
+          <w:tab w:val="left" w:pos="10076"/>
+          <w:tab w:val="left" w:pos="10992"/>
+          <w:tab w:val="left" w:pos="11908"/>
+          <w:tab w:val="left" w:pos="12824"/>
+          <w:tab w:val="left" w:pos="13740"/>
+          <w:tab w:val="left" w:pos="14656"/>
+        </w:tabs>
+        <w:wordWrap w:val="0"/>
+        <w:jc w:val="left"/>
+        <w:rPr>
+          <w:rFonts w:eastAsia="Times New Roman"/>
+          <w:sz w:val="19"/>
+          <w:szCs w:val="19"/>
+        </w:rPr>
+      </w:pPr>
+    </w:p>
+    <w:p>
+      <w:pPr>
+        <w:tabs>
+          <w:tab w:val="left" w:pos="916"/>
+          <w:tab w:val="left" w:pos="1832"/>
+          <w:tab w:val="left" w:pos="2748"/>
+          <w:tab w:val="left" w:pos="3664"/>
+          <w:tab w:val="left" w:pos="4580"/>
+          <w:tab w:val="left" w:pos="5496"/>
+          <w:tab w:val="left" w:pos="6412"/>
+          <w:tab w:val="left" w:pos="7328"/>
+          <w:tab w:val="left" w:pos="8244"/>
+          <w:tab w:val="left" w:pos="9160"/>
+          <w:tab w:val="left" w:pos="10076"/>
+          <w:tab w:val="left" w:pos="10992"/>
+          <w:tab w:val="left" w:pos="11908"/>
+          <w:tab w:val="left" w:pos="12824"/>
+          <w:tab w:val="left" w:pos="13740"/>
+          <w:tab w:val="left" w:pos="14656"/>
+        </w:tabs>
+        <w:wordWrap w:val="0"/>
+        <w:jc w:val="left"/>
+        <w:rPr>
+          <w:rFonts w:eastAsia="Times New Roman"/>
+          <w:sz w:val="19"/>
+          <w:szCs w:val="19"/>
+        </w:rPr>
+      </w:pPr>
+      <w:r>
+        <w:rPr>
+          <w:rFonts w:eastAsia="Times New Roman"/>
+          <w:sz w:val="19"/>
+          <w:szCs w:val="19"/>
+        </w:rPr>
+        <w:t>Now the Anomaly detection starts by analyzing the following sequences</w:t>
+      </w:r>
+    </w:p>
+    <w:p>
+      <w:pPr>
+        <w:tabs>
+          <w:tab w:val="left" w:pos="916"/>
+          <w:tab w:val="left" w:pos="1832"/>
+          <w:tab w:val="left" w:pos="2748"/>
+          <w:tab w:val="left" w:pos="3664"/>
+          <w:tab w:val="left" w:pos="4580"/>
+          <w:tab w:val="left" w:pos="5496"/>
+          <w:tab w:val="left" w:pos="6412"/>
+          <w:tab w:val="left" w:pos="7328"/>
+          <w:tab w:val="left" w:pos="8244"/>
+          <w:tab w:val="left" w:pos="9160"/>
+          <w:tab w:val="left" w:pos="10076"/>
+          <w:tab w:val="left" w:pos="10992"/>
+          <w:tab w:val="left" w:pos="11908"/>
+          <w:tab w:val="left" w:pos="12824"/>
+          <w:tab w:val="left" w:pos="13740"/>
+          <w:tab w:val="left" w:pos="14656"/>
+        </w:tabs>
+        <w:wordWrap w:val="0"/>
+        <w:jc w:val="left"/>
+        <w:rPr>
+          <w:rFonts w:eastAsia="Times New Roman"/>
+          <w:sz w:val="19"/>
+          <w:szCs w:val="19"/>
+        </w:rPr>
+      </w:pPr>
+      <w:r>
+        <w:rPr>
+          <w:rFonts w:eastAsia="Times New Roman"/>
+          <w:sz w:val="19"/>
+          <w:szCs w:val="19"/>
+        </w:rPr>
+        <w:t>Sequence to Analyze: [9, 2, 5, 15, 2, 4, 3, 12, 4, 3]</w:t>
+      </w:r>
+    </w:p>
+    <w:p>
+      <w:pPr>
+        <w:tabs>
+          <w:tab w:val="left" w:pos="916"/>
+          <w:tab w:val="left" w:pos="1832"/>
+          <w:tab w:val="left" w:pos="2748"/>
+          <w:tab w:val="left" w:pos="3664"/>
+          <w:tab w:val="left" w:pos="4580"/>
+          <w:tab w:val="left" w:pos="5496"/>
+          <w:tab w:val="left" w:pos="6412"/>
+          <w:tab w:val="left" w:pos="7328"/>
+          <w:tab w:val="left" w:pos="8244"/>
+          <w:tab w:val="left" w:pos="9160"/>
+          <w:tab w:val="left" w:pos="10076"/>
+          <w:tab w:val="left" w:pos="10992"/>
+          <w:tab w:val="left" w:pos="11908"/>
+          <w:tab w:val="left" w:pos="12824"/>
+          <w:tab w:val="left" w:pos="13740"/>
+          <w:tab w:val="left" w:pos="14656"/>
+        </w:tabs>
+        <w:wordWrap w:val="0"/>
+        <w:jc w:val="left"/>
+        <w:rPr>
+          <w:rFonts w:eastAsia="Times New Roman"/>
+          <w:sz w:val="19"/>
+          <w:szCs w:val="19"/>
+        </w:rPr>
+      </w:pPr>
+    </w:p>
+    <w:p>
+      <w:pPr>
+        <w:tabs>
+          <w:tab w:val="left" w:pos="916"/>
+          <w:tab w:val="left" w:pos="1832"/>
+          <w:tab w:val="left" w:pos="2748"/>
+          <w:tab w:val="left" w:pos="3664"/>
+          <w:tab w:val="left" w:pos="4580"/>
+          <w:tab w:val="left" w:pos="5496"/>
+          <w:tab w:val="left" w:pos="6412"/>
+          <w:tab w:val="left" w:pos="7328"/>
+          <w:tab w:val="left" w:pos="8244"/>
+          <w:tab w:val="left" w:pos="9160"/>
+          <w:tab w:val="left" w:pos="10076"/>
+          <w:tab w:val="left" w:pos="10992"/>
+          <w:tab w:val="left" w:pos="11908"/>
+          <w:tab w:val="left" w:pos="12824"/>
+          <w:tab w:val="left" w:pos="13740"/>
+          <w:tab w:val="left" w:pos="14656"/>
+        </w:tabs>
+        <w:wordWrap w:val="0"/>
+        <w:jc w:val="left"/>
+        <w:rPr>
+          <w:rFonts w:eastAsia="Times New Roman"/>
+          <w:sz w:val="19"/>
+          <w:szCs w:val="19"/>
+        </w:rPr>
+      </w:pPr>
+      <w:r>
+        <w:rPr>
+          <w:rFonts w:eastAsia="Times New Roman"/>
+          <w:sz w:val="19"/>
+          <w:szCs w:val="19"/>
+        </w:rPr>
+        <w:t>Processing Element: 9</w:t>
+      </w:r>
+    </w:p>
+    <w:p>
+      <w:pPr>
+        <w:tabs>
+          <w:tab w:val="left" w:pos="916"/>
+          <w:tab w:val="left" w:pos="1832"/>
+          <w:tab w:val="left" w:pos="2748"/>
+          <w:tab w:val="left" w:pos="3664"/>
+          <w:tab w:val="left" w:pos="4580"/>
+          <w:tab w:val="left" w:pos="5496"/>
+          <w:tab w:val="left" w:pos="6412"/>
+          <w:tab w:val="left" w:pos="7328"/>
+          <w:tab w:val="left" w:pos="8244"/>
+          <w:tab w:val="left" w:pos="9160"/>
+          <w:tab w:val="left" w:pos="10076"/>
+          <w:tab w:val="left" w:pos="10992"/>
+          <w:tab w:val="left" w:pos="11908"/>
+          <w:tab w:val="left" w:pos="12824"/>
+          <w:tab w:val="left" w:pos="13740"/>
+          <w:tab w:val="left" w:pos="14656"/>
+        </w:tabs>
+        <w:wordWrap w:val="0"/>
+        <w:jc w:val="left"/>
+        <w:rPr>
+          <w:rFonts w:eastAsia="Times New Roman"/>
+          <w:sz w:val="19"/>
+          <w:szCs w:val="19"/>
+        </w:rPr>
+      </w:pPr>
+      <w:r>
+        <w:rPr>
+          <w:rFonts w:eastAsia="Times New Roman"/>
+          <w:sz w:val="19"/>
+          <w:szCs w:val="19"/>
+        </w:rPr>
+        <w:t xml:space="preserve">   - Predicted Next Element: 3</w:t>
+      </w:r>
+    </w:p>
+    <w:p>
+      <w:pPr>
+        <w:tabs>
+          <w:tab w:val="left" w:pos="916"/>
+          <w:tab w:val="left" w:pos="1832"/>
+          <w:tab w:val="left" w:pos="2748"/>
+          <w:tab w:val="left" w:pos="3664"/>
+          <w:tab w:val="left" w:pos="4580"/>
+          <w:tab w:val="left" w:pos="5496"/>
+          <w:tab w:val="left" w:pos="6412"/>
+          <w:tab w:val="left" w:pos="7328"/>
+          <w:tab w:val="left" w:pos="8244"/>
+          <w:tab w:val="left" w:pos="9160"/>
+          <w:tab w:val="left" w:pos="10076"/>
+          <w:tab w:val="left" w:pos="10992"/>
+          <w:tab w:val="left" w:pos="11908"/>
+          <w:tab w:val="left" w:pos="12824"/>
+          <w:tab w:val="left" w:pos="13740"/>
+          <w:tab w:val="left" w:pos="14656"/>
+        </w:tabs>
+        <w:wordWrap w:val="0"/>
+        <w:jc w:val="left"/>
+        <w:rPr>
+          <w:rFonts w:eastAsia="Times New Roman"/>
+          <w:sz w:val="19"/>
+          <w:szCs w:val="19"/>
+        </w:rPr>
+      </w:pPr>
+      <w:r>
+        <w:rPr>
+          <w:rFonts w:eastAsia="Times New Roman"/>
+          <w:sz w:val="19"/>
+          <w:szCs w:val="19"/>
+        </w:rPr>
+        <w:t xml:space="preserve">   - Actual Next Element </w:t>
+      </w:r>
+      <w:proofErr w:type="gramStart"/>
+      <w:r>
+        <w:rPr>
+          <w:rFonts w:eastAsia="Times New Roman"/>
+          <w:sz w:val="19"/>
+          <w:szCs w:val="19"/>
+        </w:rPr>
+        <w:t xml:space="preserve">  :</w:t>
+      </w:r>
+      <w:proofErr w:type="gramEnd"/>
+      <w:r>
+        <w:rPr>
+          <w:rFonts w:eastAsia="Times New Roman"/>
+          <w:sz w:val="19"/>
+          <w:szCs w:val="19"/>
+        </w:rPr>
+        <w:t xml:space="preserve"> 2</w:t>
+      </w:r>
+    </w:p>
+    <w:p>
+      <w:pPr>
+        <w:tabs>
+          <w:tab w:val="left" w:pos="916"/>
+          <w:tab w:val="left" w:pos="1832"/>
+          <w:tab w:val="left" w:pos="2748"/>
+          <w:tab w:val="left" w:pos="3664"/>
+          <w:tab w:val="left" w:pos="4580"/>
+          <w:tab w:val="left" w:pos="5496"/>
+          <w:tab w:val="left" w:pos="6412"/>
+          <w:tab w:val="left" w:pos="7328"/>
+          <w:tab w:val="left" w:pos="8244"/>
+          <w:tab w:val="left" w:pos="9160"/>
+          <w:tab w:val="left" w:pos="10076"/>
+          <w:tab w:val="left" w:pos="10992"/>
+          <w:tab w:val="left" w:pos="11908"/>
+          <w:tab w:val="left" w:pos="12824"/>
+          <w:tab w:val="left" w:pos="13740"/>
+          <w:tab w:val="left" w:pos="14656"/>
+        </w:tabs>
+        <w:wordWrap w:val="0"/>
+        <w:jc w:val="left"/>
+        <w:rPr>
+          <w:rFonts w:eastAsia="Times New Roman"/>
+          <w:sz w:val="19"/>
+          <w:szCs w:val="19"/>
+        </w:rPr>
+      </w:pPr>
+      <w:r>
+        <w:rPr>
+          <w:rFonts w:eastAsia="Times New Roman"/>
+          <w:sz w:val="19"/>
+          <w:szCs w:val="19"/>
+        </w:rPr>
+        <w:t xml:space="preserve">   - Similarity Score    </w:t>
+      </w:r>
+      <w:proofErr w:type="gramStart"/>
+      <w:r>
+        <w:rPr>
+          <w:rFonts w:eastAsia="Times New Roman"/>
+          <w:sz w:val="19"/>
+          <w:szCs w:val="19"/>
+        </w:rPr>
+        <w:t xml:space="preserve">  :</w:t>
+      </w:r>
+      <w:proofErr w:type="gramEnd"/>
+      <w:r>
+        <w:rPr>
+          <w:rFonts w:eastAsia="Times New Roman"/>
+          <w:sz w:val="19"/>
+          <w:szCs w:val="19"/>
+        </w:rPr>
+        <w:t xml:space="preserve"> 100</w:t>
+      </w:r>
+    </w:p>
+    <w:p>
+      <w:pPr>
+        <w:tabs>
+          <w:tab w:val="left" w:pos="916"/>
+          <w:tab w:val="left" w:pos="1832"/>
+          <w:tab w:val="left" w:pos="2748"/>
+          <w:tab w:val="left" w:pos="3664"/>
+          <w:tab w:val="left" w:pos="4580"/>
+          <w:tab w:val="left" w:pos="5496"/>
+          <w:tab w:val="left" w:pos="6412"/>
+          <w:tab w:val="left" w:pos="7328"/>
+          <w:tab w:val="left" w:pos="8244"/>
+          <w:tab w:val="left" w:pos="9160"/>
+          <w:tab w:val="left" w:pos="10076"/>
+          <w:tab w:val="left" w:pos="10992"/>
+          <w:tab w:val="left" w:pos="11908"/>
+          <w:tab w:val="left" w:pos="12824"/>
+          <w:tab w:val="left" w:pos="13740"/>
+          <w:tab w:val="left" w:pos="14656"/>
+        </w:tabs>
+        <w:wordWrap w:val="0"/>
+        <w:jc w:val="left"/>
+        <w:rPr>
+          <w:rFonts w:eastAsia="Times New Roman"/>
+          <w:sz w:val="19"/>
+          <w:szCs w:val="19"/>
+        </w:rPr>
+      </w:pPr>
+      <w:r>
+        <w:rPr>
+          <w:rFonts w:eastAsia="Times New Roman"/>
+          <w:sz w:val="19"/>
+          <w:szCs w:val="19"/>
+        </w:rPr>
+        <w:t xml:space="preserve">   - Predicted Sequence  </w:t>
+      </w:r>
+      <w:proofErr w:type="gramStart"/>
+      <w:r>
+        <w:rPr>
+          <w:rFonts w:eastAsia="Times New Roman"/>
+          <w:sz w:val="19"/>
+          <w:szCs w:val="19"/>
+        </w:rPr>
+        <w:t xml:space="preserve">  :</w:t>
+      </w:r>
+      <w:proofErr w:type="gramEnd"/>
+      <w:r>
+        <w:rPr>
+          <w:rFonts w:eastAsia="Times New Roman"/>
+          <w:sz w:val="19"/>
+          <w:szCs w:val="19"/>
+        </w:rPr>
+        <w:t xml:space="preserve"> S3_5-8-2-4-3-5-</w:t>
+      </w:r>
+      <w:proofErr w:type="gramStart"/>
+      <w:r>
+        <w:rPr>
+          <w:rFonts w:eastAsia="Times New Roman"/>
+          <w:sz w:val="19"/>
+          <w:szCs w:val="19"/>
+        </w:rPr>
+        <w:t>5-</w:t>
+      </w:r>
+      <w:proofErr w:type="gramEnd"/>
+      <w:r>
+        <w:rPr>
+          <w:rFonts w:eastAsia="Times New Roman"/>
+          <w:sz w:val="19"/>
+          <w:szCs w:val="19"/>
+        </w:rPr>
+        <w:t>3-9-3</w:t>
+      </w:r>
+    </w:p>
+    <w:p>
+      <w:pPr>
+        <w:tabs>
+          <w:tab w:val="left" w:pos="916"/>
+          <w:tab w:val="left" w:pos="1832"/>
+          <w:tab w:val="left" w:pos="2748"/>
+          <w:tab w:val="left" w:pos="3664"/>
+          <w:tab w:val="left" w:pos="4580"/>
+          <w:tab w:val="left" w:pos="5496"/>
+          <w:tab w:val="left" w:pos="6412"/>
+          <w:tab w:val="left" w:pos="7328"/>
+          <w:tab w:val="left" w:pos="8244"/>
+          <w:tab w:val="left" w:pos="9160"/>
+          <w:tab w:val="left" w:pos="10076"/>
+          <w:tab w:val="left" w:pos="10992"/>
+          <w:tab w:val="left" w:pos="11908"/>
+          <w:tab w:val="left" w:pos="12824"/>
+          <w:tab w:val="left" w:pos="13740"/>
+          <w:tab w:val="left" w:pos="14656"/>
+        </w:tabs>
+        <w:wordWrap w:val="0"/>
+        <w:jc w:val="left"/>
+        <w:rPr>
+          <w:rFonts w:eastAsia="Times New Roman"/>
+          <w:sz w:val="19"/>
+          <w:szCs w:val="19"/>
+        </w:rPr>
+      </w:pPr>
+      <w:r>
+        <w:rPr>
+          <w:rFonts w:eastAsia="Times New Roman"/>
+          <w:sz w:val="19"/>
+          <w:szCs w:val="19"/>
+        </w:rPr>
+        <w:t>No Anomaly Detected!</w:t>
+      </w:r>
+    </w:p>
+    <w:p>
+      <w:pPr>
+        <w:tabs>
+          <w:tab w:val="left" w:pos="916"/>
+          <w:tab w:val="left" w:pos="1832"/>
+          <w:tab w:val="left" w:pos="2748"/>
+          <w:tab w:val="left" w:pos="3664"/>
+          <w:tab w:val="left" w:pos="4580"/>
+          <w:tab w:val="left" w:pos="5496"/>
+          <w:tab w:val="left" w:pos="6412"/>
+          <w:tab w:val="left" w:pos="7328"/>
+          <w:tab w:val="left" w:pos="8244"/>
+          <w:tab w:val="left" w:pos="9160"/>
+          <w:tab w:val="left" w:pos="10076"/>
+          <w:tab w:val="left" w:pos="10992"/>
+          <w:tab w:val="left" w:pos="11908"/>
+          <w:tab w:val="left" w:pos="12824"/>
+          <w:tab w:val="left" w:pos="13740"/>
+          <w:tab w:val="left" w:pos="14656"/>
+        </w:tabs>
+        <w:wordWrap w:val="0"/>
+        <w:jc w:val="left"/>
+        <w:rPr>
+          <w:rFonts w:eastAsia="Times New Roman"/>
+          <w:sz w:val="19"/>
+          <w:szCs w:val="19"/>
+        </w:rPr>
+      </w:pPr>
+    </w:p>
+    <w:p>
+      <w:pPr>
+        <w:tabs>
+          <w:tab w:val="left" w:pos="916"/>
+          <w:tab w:val="left" w:pos="1832"/>
+          <w:tab w:val="left" w:pos="2748"/>
+          <w:tab w:val="left" w:pos="3664"/>
+          <w:tab w:val="left" w:pos="4580"/>
+          <w:tab w:val="left" w:pos="5496"/>
+          <w:tab w:val="left" w:pos="6412"/>
+          <w:tab w:val="left" w:pos="7328"/>
+          <w:tab w:val="left" w:pos="8244"/>
+          <w:tab w:val="left" w:pos="9160"/>
+          <w:tab w:val="left" w:pos="10076"/>
+          <w:tab w:val="left" w:pos="10992"/>
+          <w:tab w:val="left" w:pos="11908"/>
+          <w:tab w:val="left" w:pos="12824"/>
+          <w:tab w:val="left" w:pos="13740"/>
+          <w:tab w:val="left" w:pos="14656"/>
+        </w:tabs>
+        <w:wordWrap w:val="0"/>
+        <w:jc w:val="left"/>
+        <w:rPr>
+          <w:rFonts w:eastAsia="Times New Roman"/>
+          <w:sz w:val="19"/>
+          <w:szCs w:val="19"/>
+        </w:rPr>
+      </w:pPr>
+    </w:p>
+    <w:p>
+      <w:pPr>
+        <w:tabs>
+          <w:tab w:val="left" w:pos="916"/>
+          <w:tab w:val="left" w:pos="1832"/>
+          <w:tab w:val="left" w:pos="2748"/>
+          <w:tab w:val="left" w:pos="3664"/>
+          <w:tab w:val="left" w:pos="4580"/>
+          <w:tab w:val="left" w:pos="5496"/>
+          <w:tab w:val="left" w:pos="6412"/>
+          <w:tab w:val="left" w:pos="7328"/>
+          <w:tab w:val="left" w:pos="8244"/>
+          <w:tab w:val="left" w:pos="9160"/>
+          <w:tab w:val="left" w:pos="10076"/>
+          <w:tab w:val="left" w:pos="10992"/>
+          <w:tab w:val="left" w:pos="11908"/>
+          <w:tab w:val="left" w:pos="12824"/>
+          <w:tab w:val="left" w:pos="13740"/>
+          <w:tab w:val="left" w:pos="14656"/>
+        </w:tabs>
+        <w:wordWrap w:val="0"/>
+        <w:jc w:val="left"/>
+        <w:rPr>
+          <w:rFonts w:eastAsia="Times New Roman"/>
+          <w:sz w:val="19"/>
+          <w:szCs w:val="19"/>
+        </w:rPr>
+      </w:pPr>
+      <w:r>
+        <w:rPr>
+          <w:rFonts w:eastAsia="Times New Roman"/>
+          <w:sz w:val="19"/>
+          <w:szCs w:val="19"/>
+        </w:rPr>
+        <w:t>Processing Element: 2</w:t>
+      </w:r>
+    </w:p>
+    <w:p>
+      <w:pPr>
+        <w:tabs>
+          <w:tab w:val="left" w:pos="916"/>
+          <w:tab w:val="left" w:pos="1832"/>
+          <w:tab w:val="left" w:pos="2748"/>
+          <w:tab w:val="left" w:pos="3664"/>
+          <w:tab w:val="left" w:pos="4580"/>
+          <w:tab w:val="left" w:pos="5496"/>
+          <w:tab w:val="left" w:pos="6412"/>
+          <w:tab w:val="left" w:pos="7328"/>
+          <w:tab w:val="left" w:pos="8244"/>
+          <w:tab w:val="left" w:pos="9160"/>
+          <w:tab w:val="left" w:pos="10076"/>
+          <w:tab w:val="left" w:pos="10992"/>
+          <w:tab w:val="left" w:pos="11908"/>
+          <w:tab w:val="left" w:pos="12824"/>
+          <w:tab w:val="left" w:pos="13740"/>
+          <w:tab w:val="left" w:pos="14656"/>
+        </w:tabs>
+        <w:wordWrap w:val="0"/>
+        <w:jc w:val="left"/>
+        <w:rPr>
+          <w:rFonts w:eastAsia="Times New Roman"/>
+          <w:sz w:val="19"/>
+          <w:szCs w:val="19"/>
+        </w:rPr>
+      </w:pPr>
+      <w:r>
+        <w:rPr>
+          <w:rFonts w:eastAsia="Times New Roman"/>
+          <w:sz w:val="19"/>
+          <w:szCs w:val="19"/>
+        </w:rPr>
+        <w:t xml:space="preserve">   - Predicted Next Element: 4</w:t>
+      </w:r>
+    </w:p>
+    <w:p>
+      <w:pPr>
+        <w:tabs>
+          <w:tab w:val="left" w:pos="916"/>
+          <w:tab w:val="left" w:pos="1832"/>
+          <w:tab w:val="left" w:pos="2748"/>
+          <w:tab w:val="left" w:pos="3664"/>
+          <w:tab w:val="left" w:pos="4580"/>
+          <w:tab w:val="left" w:pos="5496"/>
+          <w:tab w:val="left" w:pos="6412"/>
+          <w:tab w:val="left" w:pos="7328"/>
+          <w:tab w:val="left" w:pos="8244"/>
+          <w:tab w:val="left" w:pos="9160"/>
+          <w:tab w:val="left" w:pos="10076"/>
+          <w:tab w:val="left" w:pos="10992"/>
+          <w:tab w:val="left" w:pos="11908"/>
+          <w:tab w:val="left" w:pos="12824"/>
+          <w:tab w:val="left" w:pos="13740"/>
+          <w:tab w:val="left" w:pos="14656"/>
+        </w:tabs>
+        <w:wordWrap w:val="0"/>
+        <w:jc w:val="left"/>
+        <w:rPr>
+          <w:rFonts w:eastAsia="Times New Roman"/>
+          <w:sz w:val="19"/>
+          <w:szCs w:val="19"/>
+        </w:rPr>
+      </w:pPr>
+      <w:r>
+        <w:rPr>
+          <w:rFonts w:eastAsia="Times New Roman"/>
+          <w:sz w:val="19"/>
+          <w:szCs w:val="19"/>
+        </w:rPr>
+        <w:t xml:space="preserve">   - Actual Next Element </w:t>
+      </w:r>
+      <w:proofErr w:type="gramStart"/>
+      <w:r>
+        <w:rPr>
+          <w:rFonts w:eastAsia="Times New Roman"/>
+          <w:sz w:val="19"/>
+          <w:szCs w:val="19"/>
+        </w:rPr>
+        <w:t xml:space="preserve">  :</w:t>
+      </w:r>
+      <w:proofErr w:type="gramEnd"/>
+      <w:r>
+        <w:rPr>
+          <w:rFonts w:eastAsia="Times New Roman"/>
+          <w:sz w:val="19"/>
+          <w:szCs w:val="19"/>
+        </w:rPr>
+        <w:t xml:space="preserve"> 5</w:t>
+      </w:r>
+    </w:p>
+    <w:p>
+      <w:pPr>
+        <w:tabs>
+          <w:tab w:val="left" w:pos="916"/>
+          <w:tab w:val="left" w:pos="1832"/>
+          <w:tab w:val="left" w:pos="2748"/>
+          <w:tab w:val="left" w:pos="3664"/>
+          <w:tab w:val="left" w:pos="4580"/>
+          <w:tab w:val="left" w:pos="5496"/>
+          <w:tab w:val="left" w:pos="6412"/>
+          <w:tab w:val="left" w:pos="7328"/>
+          <w:tab w:val="left" w:pos="8244"/>
+          <w:tab w:val="left" w:pos="9160"/>
+          <w:tab w:val="left" w:pos="10076"/>
+          <w:tab w:val="left" w:pos="10992"/>
+          <w:tab w:val="left" w:pos="11908"/>
+          <w:tab w:val="left" w:pos="12824"/>
+          <w:tab w:val="left" w:pos="13740"/>
+          <w:tab w:val="left" w:pos="14656"/>
+        </w:tabs>
+        <w:wordWrap w:val="0"/>
+        <w:jc w:val="left"/>
+        <w:rPr>
+          <w:rFonts w:eastAsia="Times New Roman"/>
+          <w:sz w:val="19"/>
+          <w:szCs w:val="19"/>
+        </w:rPr>
+      </w:pPr>
+      <w:r>
+        <w:rPr>
+          <w:rFonts w:eastAsia="Times New Roman"/>
+          <w:sz w:val="19"/>
+          <w:szCs w:val="19"/>
+        </w:rPr>
+        <w:t xml:space="preserve">   - Similarity Score    </w:t>
+      </w:r>
+      <w:proofErr w:type="gramStart"/>
+      <w:r>
+        <w:rPr>
+          <w:rFonts w:eastAsia="Times New Roman"/>
+          <w:sz w:val="19"/>
+          <w:szCs w:val="19"/>
+        </w:rPr>
+        <w:t xml:space="preserve">  :</w:t>
+      </w:r>
+      <w:proofErr w:type="gramEnd"/>
+      <w:r>
+        <w:rPr>
+          <w:rFonts w:eastAsia="Times New Roman"/>
+          <w:sz w:val="19"/>
+          <w:szCs w:val="19"/>
+        </w:rPr>
+        <w:t xml:space="preserve"> 25</w:t>
+      </w:r>
+    </w:p>
+    <w:p>
+      <w:pPr>
+        <w:tabs>
+          <w:tab w:val="left" w:pos="916"/>
+          <w:tab w:val="left" w:pos="1832"/>
+          <w:tab w:val="left" w:pos="2748"/>
+          <w:tab w:val="left" w:pos="3664"/>
+          <w:tab w:val="left" w:pos="4580"/>
+          <w:tab w:val="left" w:pos="5496"/>
+          <w:tab w:val="left" w:pos="6412"/>
+          <w:tab w:val="left" w:pos="7328"/>
+          <w:tab w:val="left" w:pos="8244"/>
+          <w:tab w:val="left" w:pos="9160"/>
+          <w:tab w:val="left" w:pos="10076"/>
+          <w:tab w:val="left" w:pos="10992"/>
+          <w:tab w:val="left" w:pos="11908"/>
+          <w:tab w:val="left" w:pos="12824"/>
+          <w:tab w:val="left" w:pos="13740"/>
+          <w:tab w:val="left" w:pos="14656"/>
+        </w:tabs>
+        <w:wordWrap w:val="0"/>
+        <w:jc w:val="left"/>
+        <w:rPr>
+          <w:rFonts w:eastAsia="Times New Roman"/>
+          <w:sz w:val="19"/>
+          <w:szCs w:val="19"/>
+        </w:rPr>
+      </w:pPr>
+      <w:r>
+        <w:rPr>
+          <w:rFonts w:eastAsia="Times New Roman"/>
+          <w:sz w:val="19"/>
+          <w:szCs w:val="19"/>
+        </w:rPr>
+        <w:t xml:space="preserve">   - Predicted Sequence  </w:t>
+      </w:r>
+      <w:proofErr w:type="gramStart"/>
+      <w:r>
+        <w:rPr>
+          <w:rFonts w:eastAsia="Times New Roman"/>
+          <w:sz w:val="19"/>
+          <w:szCs w:val="19"/>
+        </w:rPr>
+        <w:t xml:space="preserve">  :</w:t>
+      </w:r>
+      <w:proofErr w:type="gramEnd"/>
+      <w:r>
+        <w:rPr>
+          <w:rFonts w:eastAsia="Times New Roman"/>
+          <w:sz w:val="19"/>
+          <w:szCs w:val="19"/>
+        </w:rPr>
+        <w:t xml:space="preserve"> S1_3-5-4-3-9-2-5-</w:t>
+      </w:r>
+      <w:proofErr w:type="gramStart"/>
+      <w:r>
+        <w:rPr>
+          <w:rFonts w:eastAsia="Times New Roman"/>
+          <w:sz w:val="19"/>
+          <w:szCs w:val="19"/>
+        </w:rPr>
+        <w:t>8-</w:t>
+      </w:r>
+      <w:proofErr w:type="gramEnd"/>
+      <w:r>
+        <w:rPr>
+          <w:rFonts w:eastAsia="Times New Roman"/>
+          <w:sz w:val="19"/>
+          <w:szCs w:val="19"/>
+        </w:rPr>
+        <w:t>2-4</w:t>
+      </w:r>
+    </w:p>
+    <w:p>
+      <w:pPr>
+        <w:tabs>
+          <w:tab w:val="left" w:pos="916"/>
+          <w:tab w:val="left" w:pos="1832"/>
+          <w:tab w:val="left" w:pos="2748"/>
+          <w:tab w:val="left" w:pos="3664"/>
+          <w:tab w:val="left" w:pos="4580"/>
+          <w:tab w:val="left" w:pos="5496"/>
+          <w:tab w:val="left" w:pos="6412"/>
+          <w:tab w:val="left" w:pos="7328"/>
+          <w:tab w:val="left" w:pos="8244"/>
+          <w:tab w:val="left" w:pos="9160"/>
+          <w:tab w:val="left" w:pos="10076"/>
+          <w:tab w:val="left" w:pos="10992"/>
+          <w:tab w:val="left" w:pos="11908"/>
+          <w:tab w:val="left" w:pos="12824"/>
+          <w:tab w:val="left" w:pos="13740"/>
+          <w:tab w:val="left" w:pos="14656"/>
+        </w:tabs>
+        <w:wordWrap w:val="0"/>
+        <w:jc w:val="left"/>
+        <w:rPr>
+          <w:rFonts w:eastAsia="Times New Roman"/>
+          <w:sz w:val="19"/>
+          <w:szCs w:val="19"/>
+        </w:rPr>
+      </w:pPr>
+      <w:r>
+        <w:rPr>
+          <w:rFonts w:eastAsia="Times New Roman"/>
+          <w:sz w:val="19"/>
+          <w:szCs w:val="19"/>
+        </w:rPr>
+        <w:t>No Anomaly Detected!</w:t>
+      </w:r>
+    </w:p>
+    <w:p>
+      <w:pPr>
+        <w:tabs>
+          <w:tab w:val="left" w:pos="916"/>
+          <w:tab w:val="left" w:pos="1832"/>
+          <w:tab w:val="left" w:pos="2748"/>
+          <w:tab w:val="left" w:pos="3664"/>
+          <w:tab w:val="left" w:pos="4580"/>
+          <w:tab w:val="left" w:pos="5496"/>
+          <w:tab w:val="left" w:pos="6412"/>
+          <w:tab w:val="left" w:pos="7328"/>
+          <w:tab w:val="left" w:pos="8244"/>
+          <w:tab w:val="left" w:pos="9160"/>
+          <w:tab w:val="left" w:pos="10076"/>
+          <w:tab w:val="left" w:pos="10992"/>
+          <w:tab w:val="left" w:pos="11908"/>
+          <w:tab w:val="left" w:pos="12824"/>
+          <w:tab w:val="left" w:pos="13740"/>
+          <w:tab w:val="left" w:pos="14656"/>
+        </w:tabs>
+        <w:wordWrap w:val="0"/>
+        <w:jc w:val="left"/>
+        <w:rPr>
+          <w:rFonts w:eastAsia="Times New Roman"/>
+          <w:sz w:val="19"/>
+          <w:szCs w:val="19"/>
+        </w:rPr>
+      </w:pPr>
+    </w:p>
+    <w:p>
+      <w:pPr>
+        <w:tabs>
+          <w:tab w:val="left" w:pos="916"/>
+          <w:tab w:val="left" w:pos="1832"/>
+          <w:tab w:val="left" w:pos="2748"/>
+          <w:tab w:val="left" w:pos="3664"/>
+          <w:tab w:val="left" w:pos="4580"/>
+          <w:tab w:val="left" w:pos="5496"/>
+          <w:tab w:val="left" w:pos="6412"/>
+          <w:tab w:val="left" w:pos="7328"/>
+          <w:tab w:val="left" w:pos="8244"/>
+          <w:tab w:val="left" w:pos="9160"/>
+          <w:tab w:val="left" w:pos="10076"/>
+          <w:tab w:val="left" w:pos="10992"/>
+          <w:tab w:val="left" w:pos="11908"/>
+          <w:tab w:val="left" w:pos="12824"/>
+          <w:tab w:val="left" w:pos="13740"/>
+          <w:tab w:val="left" w:pos="14656"/>
+        </w:tabs>
+        <w:wordWrap w:val="0"/>
+        <w:jc w:val="left"/>
+        <w:rPr>
+          <w:rFonts w:eastAsia="Times New Roman"/>
+          <w:sz w:val="19"/>
+          <w:szCs w:val="19"/>
+        </w:rPr>
+      </w:pPr>
+      <w:r>
+        <w:rPr>
+          <w:rFonts w:eastAsia="Times New Roman"/>
+          <w:sz w:val="19"/>
+          <w:szCs w:val="19"/>
+        </w:rPr>
+        <w:t>Processing Element: 5</w:t>
+      </w:r>
+    </w:p>
+    <w:p>
+      <w:pPr>
+        <w:tabs>
+          <w:tab w:val="left" w:pos="916"/>
+          <w:tab w:val="left" w:pos="1832"/>
+          <w:tab w:val="left" w:pos="2748"/>
+          <w:tab w:val="left" w:pos="3664"/>
+          <w:tab w:val="left" w:pos="4580"/>
+          <w:tab w:val="left" w:pos="5496"/>
+          <w:tab w:val="left" w:pos="6412"/>
+          <w:tab w:val="left" w:pos="7328"/>
+          <w:tab w:val="left" w:pos="8244"/>
+          <w:tab w:val="left" w:pos="9160"/>
+          <w:tab w:val="left" w:pos="10076"/>
+          <w:tab w:val="left" w:pos="10992"/>
+          <w:tab w:val="left" w:pos="11908"/>
+          <w:tab w:val="left" w:pos="12824"/>
+          <w:tab w:val="left" w:pos="13740"/>
+          <w:tab w:val="left" w:pos="14656"/>
+        </w:tabs>
+        <w:wordWrap w:val="0"/>
+        <w:jc w:val="left"/>
+        <w:rPr>
+          <w:rFonts w:eastAsia="Times New Roman"/>
+          <w:sz w:val="19"/>
+          <w:szCs w:val="19"/>
+        </w:rPr>
+      </w:pPr>
+      <w:r>
+        <w:rPr>
+          <w:rFonts w:eastAsia="Times New Roman"/>
+          <w:sz w:val="19"/>
+          <w:szCs w:val="19"/>
+        </w:rPr>
+        <w:t xml:space="preserve">   - Predicted Next Element: 3</w:t>
+      </w:r>
+    </w:p>
+    <w:p>
+      <w:pPr>
+        <w:tabs>
+          <w:tab w:val="left" w:pos="916"/>
+          <w:tab w:val="left" w:pos="1832"/>
+          <w:tab w:val="left" w:pos="2748"/>
+          <w:tab w:val="left" w:pos="3664"/>
+          <w:tab w:val="left" w:pos="4580"/>
+          <w:tab w:val="left" w:pos="5496"/>
+          <w:tab w:val="left" w:pos="6412"/>
+          <w:tab w:val="left" w:pos="7328"/>
+          <w:tab w:val="left" w:pos="8244"/>
+          <w:tab w:val="left" w:pos="9160"/>
+          <w:tab w:val="left" w:pos="10076"/>
+          <w:tab w:val="left" w:pos="10992"/>
+          <w:tab w:val="left" w:pos="11908"/>
+          <w:tab w:val="left" w:pos="12824"/>
+          <w:tab w:val="left" w:pos="13740"/>
+          <w:tab w:val="left" w:pos="14656"/>
+        </w:tabs>
+        <w:wordWrap w:val="0"/>
+        <w:jc w:val="left"/>
+        <w:rPr>
+          <w:rFonts w:eastAsia="Times New Roman"/>
+          <w:sz w:val="19"/>
+          <w:szCs w:val="19"/>
+        </w:rPr>
+      </w:pPr>
+      <w:r>
+        <w:rPr>
+          <w:rFonts w:eastAsia="Times New Roman"/>
+          <w:sz w:val="19"/>
+          <w:szCs w:val="19"/>
+        </w:rPr>
+        <w:t xml:space="preserve">   - Actual Next Element </w:t>
+      </w:r>
+      <w:proofErr w:type="gramStart"/>
+      <w:r>
+        <w:rPr>
+          <w:rFonts w:eastAsia="Times New Roman"/>
+          <w:sz w:val="19"/>
+          <w:szCs w:val="19"/>
+        </w:rPr>
+        <w:t xml:space="preserve">  :</w:t>
+      </w:r>
+      <w:proofErr w:type="gramEnd"/>
+      <w:r>
+        <w:rPr>
+          <w:rFonts w:eastAsia="Times New Roman"/>
+          <w:sz w:val="19"/>
+          <w:szCs w:val="19"/>
+        </w:rPr>
+        <w:t xml:space="preserve"> 15</w:t>
+      </w:r>
+    </w:p>
+    <w:p>
+      <w:pPr>
+        <w:tabs>
+          <w:tab w:val="left" w:pos="916"/>
+          <w:tab w:val="left" w:pos="1832"/>
+          <w:tab w:val="left" w:pos="2748"/>
+          <w:tab w:val="left" w:pos="3664"/>
+          <w:tab w:val="left" w:pos="4580"/>
+          <w:tab w:val="left" w:pos="5496"/>
+          <w:tab w:val="left" w:pos="6412"/>
+          <w:tab w:val="left" w:pos="7328"/>
+          <w:tab w:val="left" w:pos="8244"/>
+          <w:tab w:val="left" w:pos="9160"/>
+          <w:tab w:val="left" w:pos="10076"/>
+          <w:tab w:val="left" w:pos="10992"/>
+          <w:tab w:val="left" w:pos="11908"/>
+          <w:tab w:val="left" w:pos="12824"/>
+          <w:tab w:val="left" w:pos="13740"/>
+          <w:tab w:val="left" w:pos="14656"/>
+        </w:tabs>
+        <w:wordWrap w:val="0"/>
+        <w:jc w:val="left"/>
+        <w:rPr>
+          <w:rFonts w:eastAsia="Times New Roman"/>
+          <w:sz w:val="19"/>
+          <w:szCs w:val="19"/>
+        </w:rPr>
+      </w:pPr>
+      <w:r>
+        <w:rPr>
+          <w:rFonts w:eastAsia="Times New Roman"/>
+          <w:sz w:val="19"/>
+          <w:szCs w:val="19"/>
+        </w:rPr>
+        <w:t xml:space="preserve">   - Similarity Score    </w:t>
+      </w:r>
+      <w:proofErr w:type="gramStart"/>
+      <w:r>
+        <w:rPr>
+          <w:rFonts w:eastAsia="Times New Roman"/>
+          <w:sz w:val="19"/>
+          <w:szCs w:val="19"/>
+        </w:rPr>
+        <w:t xml:space="preserve">  :</w:t>
+      </w:r>
+      <w:proofErr w:type="gramEnd"/>
+      <w:r>
+        <w:rPr>
+          <w:rFonts w:eastAsia="Times New Roman"/>
+          <w:sz w:val="19"/>
+          <w:szCs w:val="19"/>
+        </w:rPr>
+        <w:t xml:space="preserve"> 20.51</w:t>
+      </w:r>
+    </w:p>
+    <w:p>
+      <w:pPr>
+        <w:tabs>
+          <w:tab w:val="left" w:pos="916"/>
+          <w:tab w:val="left" w:pos="1832"/>
+          <w:tab w:val="left" w:pos="2748"/>
+          <w:tab w:val="left" w:pos="3664"/>
+          <w:tab w:val="left" w:pos="4580"/>
+          <w:tab w:val="left" w:pos="5496"/>
+          <w:tab w:val="left" w:pos="6412"/>
+          <w:tab w:val="left" w:pos="7328"/>
+          <w:tab w:val="left" w:pos="8244"/>
+          <w:tab w:val="left" w:pos="9160"/>
+          <w:tab w:val="left" w:pos="10076"/>
+          <w:tab w:val="left" w:pos="10992"/>
+          <w:tab w:val="left" w:pos="11908"/>
+          <w:tab w:val="left" w:pos="12824"/>
+          <w:tab w:val="left" w:pos="13740"/>
+          <w:tab w:val="left" w:pos="14656"/>
+        </w:tabs>
+        <w:wordWrap w:val="0"/>
+        <w:jc w:val="left"/>
+        <w:rPr>
+          <w:rFonts w:eastAsia="Times New Roman"/>
+          <w:sz w:val="19"/>
+          <w:szCs w:val="19"/>
+        </w:rPr>
+      </w:pPr>
+      <w:r>
+        <w:rPr>
+          <w:rFonts w:eastAsia="Times New Roman"/>
+          <w:sz w:val="19"/>
+          <w:szCs w:val="19"/>
+        </w:rPr>
+        <w:t xml:space="preserve">   - Predicted Sequence  </w:t>
+      </w:r>
+      <w:proofErr w:type="gramStart"/>
+      <w:r>
+        <w:rPr>
+          <w:rFonts w:eastAsia="Times New Roman"/>
+          <w:sz w:val="19"/>
+          <w:szCs w:val="19"/>
+        </w:rPr>
+        <w:t xml:space="preserve">  :</w:t>
+      </w:r>
+      <w:proofErr w:type="gramEnd"/>
+      <w:r>
+        <w:rPr>
+          <w:rFonts w:eastAsia="Times New Roman"/>
+          <w:sz w:val="19"/>
+          <w:szCs w:val="19"/>
+        </w:rPr>
+        <w:t xml:space="preserve"> S3_9-3-5-8-2-4-</w:t>
+      </w:r>
+      <w:proofErr w:type="gramStart"/>
+      <w:r>
+        <w:rPr>
+          <w:rFonts w:eastAsia="Times New Roman"/>
+          <w:sz w:val="19"/>
+          <w:szCs w:val="19"/>
+        </w:rPr>
+        <w:t>3-</w:t>
+      </w:r>
+      <w:proofErr w:type="gramEnd"/>
+      <w:r>
+        <w:rPr>
+          <w:rFonts w:eastAsia="Times New Roman"/>
+          <w:sz w:val="19"/>
+          <w:szCs w:val="19"/>
+        </w:rPr>
+        <w:t>5-5-3</w:t>
+      </w:r>
+    </w:p>
+    <w:p>
+      <w:pPr>
+        <w:tabs>
+          <w:tab w:val="left" w:pos="916"/>
+          <w:tab w:val="left" w:pos="1832"/>
+          <w:tab w:val="left" w:pos="2748"/>
+          <w:tab w:val="left" w:pos="3664"/>
+          <w:tab w:val="left" w:pos="4580"/>
+          <w:tab w:val="left" w:pos="5496"/>
+          <w:tab w:val="left" w:pos="6412"/>
+          <w:tab w:val="left" w:pos="7328"/>
+          <w:tab w:val="left" w:pos="8244"/>
+          <w:tab w:val="left" w:pos="9160"/>
+          <w:tab w:val="left" w:pos="10076"/>
+          <w:tab w:val="left" w:pos="10992"/>
+          <w:tab w:val="left" w:pos="11908"/>
+          <w:tab w:val="left" w:pos="12824"/>
+          <w:tab w:val="left" w:pos="13740"/>
+          <w:tab w:val="left" w:pos="14656"/>
+        </w:tabs>
+        <w:wordWrap w:val="0"/>
+        <w:jc w:val="left"/>
+        <w:rPr>
+          <w:rFonts w:eastAsia="Times New Roman"/>
+          <w:sz w:val="19"/>
+          <w:szCs w:val="19"/>
+        </w:rPr>
+      </w:pPr>
+    </w:p>
+    <w:p>
+      <w:pPr>
+        <w:tabs>
+          <w:tab w:val="left" w:pos="916"/>
+          <w:tab w:val="left" w:pos="1832"/>
+          <w:tab w:val="left" w:pos="2748"/>
+          <w:tab w:val="left" w:pos="3664"/>
+          <w:tab w:val="left" w:pos="4580"/>
+          <w:tab w:val="left" w:pos="5496"/>
+          <w:tab w:val="left" w:pos="6412"/>
+          <w:tab w:val="left" w:pos="7328"/>
+          <w:tab w:val="left" w:pos="8244"/>
+          <w:tab w:val="left" w:pos="9160"/>
+          <w:tab w:val="left" w:pos="10076"/>
+          <w:tab w:val="left" w:pos="10992"/>
+          <w:tab w:val="left" w:pos="11908"/>
+          <w:tab w:val="left" w:pos="12824"/>
+          <w:tab w:val="left" w:pos="13740"/>
+          <w:tab w:val="left" w:pos="14656"/>
+        </w:tabs>
+        <w:wordWrap w:val="0"/>
+        <w:jc w:val="left"/>
+        <w:rPr>
+          <w:rFonts w:eastAsia="Times New Roman"/>
+          <w:sz w:val="19"/>
+          <w:szCs w:val="19"/>
+        </w:rPr>
+      </w:pPr>
+      <w:r>
+        <w:rPr>
+          <w:rFonts w:eastAsia="Times New Roman"/>
+          <w:sz w:val="19"/>
+          <w:szCs w:val="19"/>
+        </w:rPr>
+        <w:t xml:space="preserve">   !!! Anomaly </w:t>
+      </w:r>
+      <w:proofErr w:type="gramStart"/>
+      <w:r>
+        <w:rPr>
+          <w:rFonts w:eastAsia="Times New Roman"/>
+          <w:sz w:val="19"/>
+          <w:szCs w:val="19"/>
+        </w:rPr>
+        <w:t>Detected !!!</w:t>
+      </w:r>
+      <w:proofErr w:type="gramEnd"/>
+    </w:p>
+    <w:p>
+      <w:pPr>
+        <w:tabs>
+          <w:tab w:val="left" w:pos="916"/>
+          <w:tab w:val="left" w:pos="1832"/>
+          <w:tab w:val="left" w:pos="2748"/>
+          <w:tab w:val="left" w:pos="3664"/>
+          <w:tab w:val="left" w:pos="4580"/>
+          <w:tab w:val="left" w:pos="5496"/>
+          <w:tab w:val="left" w:pos="6412"/>
+          <w:tab w:val="left" w:pos="7328"/>
+          <w:tab w:val="left" w:pos="8244"/>
+          <w:tab w:val="left" w:pos="9160"/>
+          <w:tab w:val="left" w:pos="10076"/>
+          <w:tab w:val="left" w:pos="10992"/>
+          <w:tab w:val="left" w:pos="11908"/>
+          <w:tab w:val="left" w:pos="12824"/>
+          <w:tab w:val="left" w:pos="13740"/>
+          <w:tab w:val="left" w:pos="14656"/>
+        </w:tabs>
+        <w:wordWrap w:val="0"/>
+        <w:jc w:val="left"/>
+        <w:rPr>
+          <w:rFonts w:eastAsia="Times New Roman"/>
+          <w:sz w:val="19"/>
+          <w:szCs w:val="19"/>
+        </w:rPr>
+      </w:pPr>
+      <w:r>
+        <w:rPr>
+          <w:rFonts w:eastAsia="Times New Roman"/>
+          <w:sz w:val="19"/>
+          <w:szCs w:val="19"/>
+        </w:rPr>
+        <w:t xml:space="preserve">   - Expected: 3, Found: 15</w:t>
+      </w:r>
+    </w:p>
+    <w:p>
+      <w:pPr>
+        <w:tabs>
+          <w:tab w:val="left" w:pos="916"/>
+          <w:tab w:val="left" w:pos="1832"/>
+          <w:tab w:val="left" w:pos="2748"/>
+          <w:tab w:val="left" w:pos="3664"/>
+          <w:tab w:val="left" w:pos="4580"/>
+          <w:tab w:val="left" w:pos="5496"/>
+          <w:tab w:val="left" w:pos="6412"/>
+          <w:tab w:val="left" w:pos="7328"/>
+          <w:tab w:val="left" w:pos="8244"/>
+          <w:tab w:val="left" w:pos="9160"/>
+          <w:tab w:val="left" w:pos="10076"/>
+          <w:tab w:val="left" w:pos="10992"/>
+          <w:tab w:val="left" w:pos="11908"/>
+          <w:tab w:val="left" w:pos="12824"/>
+          <w:tab w:val="left" w:pos="13740"/>
+          <w:tab w:val="left" w:pos="14656"/>
+        </w:tabs>
+        <w:wordWrap w:val="0"/>
+        <w:jc w:val="left"/>
+        <w:rPr>
+          <w:rFonts w:eastAsia="Times New Roman"/>
+          <w:sz w:val="19"/>
+          <w:szCs w:val="19"/>
+        </w:rPr>
+      </w:pPr>
+      <w:r>
+        <w:rPr>
+          <w:rFonts w:eastAsia="Times New Roman"/>
+          <w:sz w:val="19"/>
+          <w:szCs w:val="19"/>
+        </w:rPr>
+        <w:lastRenderedPageBreak/>
+        <w:t xml:space="preserve">   - Skipping the anomalous value.</w:t>
+      </w:r>
+    </w:p>
+    <w:p>
+      <w:pPr>
+        <w:tabs>
+          <w:tab w:val="left" w:pos="916"/>
+          <w:tab w:val="left" w:pos="1832"/>
+          <w:tab w:val="left" w:pos="2748"/>
+          <w:tab w:val="left" w:pos="3664"/>
+          <w:tab w:val="left" w:pos="4580"/>
+          <w:tab w:val="left" w:pos="5496"/>
+          <w:tab w:val="left" w:pos="6412"/>
+          <w:tab w:val="left" w:pos="7328"/>
+          <w:tab w:val="left" w:pos="8244"/>
+          <w:tab w:val="left" w:pos="9160"/>
+          <w:tab w:val="left" w:pos="10076"/>
+          <w:tab w:val="left" w:pos="10992"/>
+          <w:tab w:val="left" w:pos="11908"/>
+          <w:tab w:val="left" w:pos="12824"/>
+          <w:tab w:val="left" w:pos="13740"/>
+          <w:tab w:val="left" w:pos="14656"/>
+        </w:tabs>
+        <w:wordWrap w:val="0"/>
+        <w:jc w:val="left"/>
+        <w:rPr>
+          <w:rFonts w:eastAsia="Times New Roman"/>
+          <w:sz w:val="19"/>
+          <w:szCs w:val="19"/>
+        </w:rPr>
+      </w:pPr>
+    </w:p>
+    <w:p>
+      <w:pPr>
+        <w:tabs>
+          <w:tab w:val="left" w:pos="916"/>
+          <w:tab w:val="left" w:pos="1832"/>
+          <w:tab w:val="left" w:pos="2748"/>
+          <w:tab w:val="left" w:pos="3664"/>
+          <w:tab w:val="left" w:pos="4580"/>
+          <w:tab w:val="left" w:pos="5496"/>
+          <w:tab w:val="left" w:pos="6412"/>
+          <w:tab w:val="left" w:pos="7328"/>
+          <w:tab w:val="left" w:pos="8244"/>
+          <w:tab w:val="left" w:pos="9160"/>
+          <w:tab w:val="left" w:pos="10076"/>
+          <w:tab w:val="left" w:pos="10992"/>
+          <w:tab w:val="left" w:pos="11908"/>
+          <w:tab w:val="left" w:pos="12824"/>
+          <w:tab w:val="left" w:pos="13740"/>
+          <w:tab w:val="left" w:pos="14656"/>
+        </w:tabs>
+        <w:wordWrap w:val="0"/>
+        <w:jc w:val="left"/>
+        <w:rPr>
+          <w:rFonts w:eastAsia="Times New Roman"/>
+          <w:sz w:val="19"/>
+          <w:szCs w:val="19"/>
+        </w:rPr>
+      </w:pPr>
+      <w:r>
+        <w:rPr>
+          <w:rFonts w:eastAsia="Times New Roman"/>
+          <w:sz w:val="19"/>
+          <w:szCs w:val="19"/>
+        </w:rPr>
+        <w:t>Processing Element: 2</w:t>
+      </w:r>
+    </w:p>
+    <w:p>
+      <w:pPr>
+        <w:tabs>
+          <w:tab w:val="left" w:pos="916"/>
+          <w:tab w:val="left" w:pos="1832"/>
+          <w:tab w:val="left" w:pos="2748"/>
+          <w:tab w:val="left" w:pos="3664"/>
+          <w:tab w:val="left" w:pos="4580"/>
+          <w:tab w:val="left" w:pos="5496"/>
+          <w:tab w:val="left" w:pos="6412"/>
+          <w:tab w:val="left" w:pos="7328"/>
+          <w:tab w:val="left" w:pos="8244"/>
+          <w:tab w:val="left" w:pos="9160"/>
+          <w:tab w:val="left" w:pos="10076"/>
+          <w:tab w:val="left" w:pos="10992"/>
+          <w:tab w:val="left" w:pos="11908"/>
+          <w:tab w:val="left" w:pos="12824"/>
+          <w:tab w:val="left" w:pos="13740"/>
+          <w:tab w:val="left" w:pos="14656"/>
+        </w:tabs>
+        <w:wordWrap w:val="0"/>
+        <w:jc w:val="left"/>
+        <w:rPr>
+          <w:rFonts w:eastAsia="Times New Roman"/>
+          <w:sz w:val="19"/>
+          <w:szCs w:val="19"/>
+        </w:rPr>
+      </w:pPr>
+      <w:r>
+        <w:rPr>
+          <w:rFonts w:eastAsia="Times New Roman"/>
+          <w:sz w:val="19"/>
+          <w:szCs w:val="19"/>
+        </w:rPr>
+        <w:t xml:space="preserve">   - Predicted Next Element: 4</w:t>
+      </w:r>
+    </w:p>
+    <w:p>
+      <w:pPr>
+        <w:tabs>
+          <w:tab w:val="left" w:pos="916"/>
+          <w:tab w:val="left" w:pos="1832"/>
+          <w:tab w:val="left" w:pos="2748"/>
+          <w:tab w:val="left" w:pos="3664"/>
+          <w:tab w:val="left" w:pos="4580"/>
+          <w:tab w:val="left" w:pos="5496"/>
+          <w:tab w:val="left" w:pos="6412"/>
+          <w:tab w:val="left" w:pos="7328"/>
+          <w:tab w:val="left" w:pos="8244"/>
+          <w:tab w:val="left" w:pos="9160"/>
+          <w:tab w:val="left" w:pos="10076"/>
+          <w:tab w:val="left" w:pos="10992"/>
+          <w:tab w:val="left" w:pos="11908"/>
+          <w:tab w:val="left" w:pos="12824"/>
+          <w:tab w:val="left" w:pos="13740"/>
+          <w:tab w:val="left" w:pos="14656"/>
+        </w:tabs>
+        <w:wordWrap w:val="0"/>
+        <w:jc w:val="left"/>
+        <w:rPr>
+          <w:rFonts w:eastAsia="Times New Roman"/>
+          <w:sz w:val="19"/>
+          <w:szCs w:val="19"/>
+        </w:rPr>
+      </w:pPr>
+      <w:r>
+        <w:rPr>
+          <w:rFonts w:eastAsia="Times New Roman"/>
+          <w:sz w:val="19"/>
+          <w:szCs w:val="19"/>
+        </w:rPr>
+        <w:t xml:space="preserve">   - Actual Next Element </w:t>
+      </w:r>
+      <w:proofErr w:type="gramStart"/>
+      <w:r>
+        <w:rPr>
+          <w:rFonts w:eastAsia="Times New Roman"/>
+          <w:sz w:val="19"/>
+          <w:szCs w:val="19"/>
+        </w:rPr>
+        <w:t xml:space="preserve">  :</w:t>
+      </w:r>
+      <w:proofErr w:type="gramEnd"/>
+      <w:r>
+        <w:rPr>
+          <w:rFonts w:eastAsia="Times New Roman"/>
+          <w:sz w:val="19"/>
+          <w:szCs w:val="19"/>
+        </w:rPr>
+        <w:t xml:space="preserve"> 4</w:t>
+      </w:r>
+    </w:p>
+    <w:p>
+      <w:pPr>
+        <w:tabs>
+          <w:tab w:val="left" w:pos="916"/>
+          <w:tab w:val="left" w:pos="1832"/>
+          <w:tab w:val="left" w:pos="2748"/>
+          <w:tab w:val="left" w:pos="3664"/>
+          <w:tab w:val="left" w:pos="4580"/>
+          <w:tab w:val="left" w:pos="5496"/>
+          <w:tab w:val="left" w:pos="6412"/>
+          <w:tab w:val="left" w:pos="7328"/>
+          <w:tab w:val="left" w:pos="8244"/>
+          <w:tab w:val="left" w:pos="9160"/>
+          <w:tab w:val="left" w:pos="10076"/>
+          <w:tab w:val="left" w:pos="10992"/>
+          <w:tab w:val="left" w:pos="11908"/>
+          <w:tab w:val="left" w:pos="12824"/>
+          <w:tab w:val="left" w:pos="13740"/>
+          <w:tab w:val="left" w:pos="14656"/>
+        </w:tabs>
+        <w:wordWrap w:val="0"/>
+        <w:jc w:val="left"/>
+        <w:rPr>
+          <w:rFonts w:eastAsia="Times New Roman"/>
+          <w:sz w:val="19"/>
+          <w:szCs w:val="19"/>
+        </w:rPr>
+      </w:pPr>
+      <w:r>
+        <w:rPr>
+          <w:rFonts w:eastAsia="Times New Roman"/>
+          <w:sz w:val="19"/>
+          <w:szCs w:val="19"/>
+        </w:rPr>
+        <w:t xml:space="preserve">   - Similarity Score    </w:t>
+      </w:r>
+      <w:proofErr w:type="gramStart"/>
+      <w:r>
+        <w:rPr>
+          <w:rFonts w:eastAsia="Times New Roman"/>
+          <w:sz w:val="19"/>
+          <w:szCs w:val="19"/>
+        </w:rPr>
+        <w:t xml:space="preserve">  :</w:t>
+      </w:r>
+      <w:proofErr w:type="gramEnd"/>
+      <w:r>
+        <w:rPr>
+          <w:rFonts w:eastAsia="Times New Roman"/>
+          <w:sz w:val="19"/>
+          <w:szCs w:val="19"/>
+        </w:rPr>
+        <w:t xml:space="preserve"> 25</w:t>
+      </w:r>
+    </w:p>
+    <w:p>
+      <w:pPr>
+        <w:tabs>
+          <w:tab w:val="left" w:pos="916"/>
+          <w:tab w:val="left" w:pos="1832"/>
+          <w:tab w:val="left" w:pos="2748"/>
+          <w:tab w:val="left" w:pos="3664"/>
+          <w:tab w:val="left" w:pos="4580"/>
+          <w:tab w:val="left" w:pos="5496"/>
+          <w:tab w:val="left" w:pos="6412"/>
+          <w:tab w:val="left" w:pos="7328"/>
+          <w:tab w:val="left" w:pos="8244"/>
+          <w:tab w:val="left" w:pos="9160"/>
+          <w:tab w:val="left" w:pos="10076"/>
+          <w:tab w:val="left" w:pos="10992"/>
+          <w:tab w:val="left" w:pos="11908"/>
+          <w:tab w:val="left" w:pos="12824"/>
+          <w:tab w:val="left" w:pos="13740"/>
+          <w:tab w:val="left" w:pos="14656"/>
+        </w:tabs>
+        <w:wordWrap w:val="0"/>
+        <w:jc w:val="left"/>
+        <w:rPr>
+          <w:rFonts w:eastAsia="Times New Roman"/>
+          <w:sz w:val="19"/>
+          <w:szCs w:val="19"/>
+        </w:rPr>
+      </w:pPr>
+      <w:r>
+        <w:rPr>
+          <w:rFonts w:eastAsia="Times New Roman"/>
+          <w:sz w:val="19"/>
+          <w:szCs w:val="19"/>
+        </w:rPr>
+        <w:t xml:space="preserve">   - Predicted Sequence  </w:t>
+      </w:r>
+      <w:proofErr w:type="gramStart"/>
+      <w:r>
+        <w:rPr>
+          <w:rFonts w:eastAsia="Times New Roman"/>
+          <w:sz w:val="19"/>
+          <w:szCs w:val="19"/>
+        </w:rPr>
+        <w:t xml:space="preserve">  :</w:t>
+      </w:r>
+      <w:proofErr w:type="gramEnd"/>
+      <w:r>
+        <w:rPr>
+          <w:rFonts w:eastAsia="Times New Roman"/>
+          <w:sz w:val="19"/>
+          <w:szCs w:val="19"/>
+        </w:rPr>
+        <w:t xml:space="preserve"> S1_3-5-4-3-9-2-5-</w:t>
+      </w:r>
+      <w:proofErr w:type="gramStart"/>
+      <w:r>
+        <w:rPr>
+          <w:rFonts w:eastAsia="Times New Roman"/>
+          <w:sz w:val="19"/>
+          <w:szCs w:val="19"/>
+        </w:rPr>
+        <w:t>8-</w:t>
+      </w:r>
+      <w:proofErr w:type="gramEnd"/>
+      <w:r>
+        <w:rPr>
+          <w:rFonts w:eastAsia="Times New Roman"/>
+          <w:sz w:val="19"/>
+          <w:szCs w:val="19"/>
+        </w:rPr>
+        <w:t>2-4</w:t>
+      </w:r>
+    </w:p>
+    <w:p>
+      <w:pPr>
+        <w:tabs>
+          <w:tab w:val="left" w:pos="916"/>
+          <w:tab w:val="left" w:pos="1832"/>
+          <w:tab w:val="left" w:pos="2748"/>
+          <w:tab w:val="left" w:pos="3664"/>
+          <w:tab w:val="left" w:pos="4580"/>
+          <w:tab w:val="left" w:pos="5496"/>
+          <w:tab w:val="left" w:pos="6412"/>
+          <w:tab w:val="left" w:pos="7328"/>
+          <w:tab w:val="left" w:pos="8244"/>
+          <w:tab w:val="left" w:pos="9160"/>
+          <w:tab w:val="left" w:pos="10076"/>
+          <w:tab w:val="left" w:pos="10992"/>
+          <w:tab w:val="left" w:pos="11908"/>
+          <w:tab w:val="left" w:pos="12824"/>
+          <w:tab w:val="left" w:pos="13740"/>
+          <w:tab w:val="left" w:pos="14656"/>
+        </w:tabs>
+        <w:wordWrap w:val="0"/>
+        <w:jc w:val="left"/>
+        <w:rPr>
+          <w:rFonts w:eastAsia="Times New Roman"/>
+          <w:sz w:val="19"/>
+          <w:szCs w:val="19"/>
+        </w:rPr>
+      </w:pPr>
+      <w:r>
+        <w:rPr>
+          <w:rFonts w:eastAsia="Times New Roman"/>
+          <w:sz w:val="19"/>
+          <w:szCs w:val="19"/>
+        </w:rPr>
+        <w:t>No Anomaly Detected!</w:t>
+      </w:r>
+    </w:p>
+    <w:p>
+      <w:pPr>
+        <w:tabs>
+          <w:tab w:val="left" w:pos="916"/>
+          <w:tab w:val="left" w:pos="1832"/>
+          <w:tab w:val="left" w:pos="2748"/>
+          <w:tab w:val="left" w:pos="3664"/>
+          <w:tab w:val="left" w:pos="4580"/>
+          <w:tab w:val="left" w:pos="5496"/>
+          <w:tab w:val="left" w:pos="6412"/>
+          <w:tab w:val="left" w:pos="7328"/>
+          <w:tab w:val="left" w:pos="8244"/>
+          <w:tab w:val="left" w:pos="9160"/>
+          <w:tab w:val="left" w:pos="10076"/>
+          <w:tab w:val="left" w:pos="10992"/>
+          <w:tab w:val="left" w:pos="11908"/>
+          <w:tab w:val="left" w:pos="12824"/>
+          <w:tab w:val="left" w:pos="13740"/>
+          <w:tab w:val="left" w:pos="14656"/>
+        </w:tabs>
+        <w:wordWrap w:val="0"/>
+        <w:jc w:val="left"/>
+        <w:rPr>
+          <w:rFonts w:eastAsia="Times New Roman"/>
+          <w:sz w:val="19"/>
+          <w:szCs w:val="19"/>
+        </w:rPr>
+      </w:pPr>
+    </w:p>
+    <w:p>
+      <w:pPr>
+        <w:tabs>
+          <w:tab w:val="left" w:pos="916"/>
+          <w:tab w:val="left" w:pos="1832"/>
+          <w:tab w:val="left" w:pos="2748"/>
+          <w:tab w:val="left" w:pos="3664"/>
+          <w:tab w:val="left" w:pos="4580"/>
+          <w:tab w:val="left" w:pos="5496"/>
+          <w:tab w:val="left" w:pos="6412"/>
+          <w:tab w:val="left" w:pos="7328"/>
+          <w:tab w:val="left" w:pos="8244"/>
+          <w:tab w:val="left" w:pos="9160"/>
+          <w:tab w:val="left" w:pos="10076"/>
+          <w:tab w:val="left" w:pos="10992"/>
+          <w:tab w:val="left" w:pos="11908"/>
+          <w:tab w:val="left" w:pos="12824"/>
+          <w:tab w:val="left" w:pos="13740"/>
+          <w:tab w:val="left" w:pos="14656"/>
+        </w:tabs>
+        <w:wordWrap w:val="0"/>
+        <w:jc w:val="left"/>
+        <w:rPr>
+          <w:rFonts w:eastAsia="Times New Roman"/>
+          <w:sz w:val="19"/>
+          <w:szCs w:val="19"/>
+        </w:rPr>
+      </w:pPr>
+      <w:r>
+        <w:rPr>
+          <w:rFonts w:eastAsia="Times New Roman"/>
+          <w:sz w:val="19"/>
+          <w:szCs w:val="19"/>
+        </w:rPr>
+        <w:t>Processing Element: 4</w:t>
+      </w:r>
+    </w:p>
+    <w:p>
+      <w:pPr>
+        <w:tabs>
+          <w:tab w:val="left" w:pos="916"/>
+          <w:tab w:val="left" w:pos="1832"/>
+          <w:tab w:val="left" w:pos="2748"/>
+          <w:tab w:val="left" w:pos="3664"/>
+          <w:tab w:val="left" w:pos="4580"/>
+          <w:tab w:val="left" w:pos="5496"/>
+          <w:tab w:val="left" w:pos="6412"/>
+          <w:tab w:val="left" w:pos="7328"/>
+          <w:tab w:val="left" w:pos="8244"/>
+          <w:tab w:val="left" w:pos="9160"/>
+          <w:tab w:val="left" w:pos="10076"/>
+          <w:tab w:val="left" w:pos="10992"/>
+          <w:tab w:val="left" w:pos="11908"/>
+          <w:tab w:val="left" w:pos="12824"/>
+          <w:tab w:val="left" w:pos="13740"/>
+          <w:tab w:val="left" w:pos="14656"/>
+        </w:tabs>
+        <w:wordWrap w:val="0"/>
+        <w:jc w:val="left"/>
+        <w:rPr>
+          <w:rFonts w:eastAsia="Times New Roman"/>
+          <w:sz w:val="19"/>
+          <w:szCs w:val="19"/>
+        </w:rPr>
+      </w:pPr>
+      <w:r>
+        <w:rPr>
+          <w:rFonts w:eastAsia="Times New Roman"/>
+          <w:sz w:val="19"/>
+          <w:szCs w:val="19"/>
+        </w:rPr>
+        <w:t xml:space="preserve">   - Predicted Next Element: 3</w:t>
+      </w:r>
+    </w:p>
+    <w:p>
+      <w:pPr>
+        <w:tabs>
+          <w:tab w:val="left" w:pos="916"/>
+          <w:tab w:val="left" w:pos="1832"/>
+          <w:tab w:val="left" w:pos="2748"/>
+          <w:tab w:val="left" w:pos="3664"/>
+          <w:tab w:val="left" w:pos="4580"/>
+          <w:tab w:val="left" w:pos="5496"/>
+          <w:tab w:val="left" w:pos="6412"/>
+          <w:tab w:val="left" w:pos="7328"/>
+          <w:tab w:val="left" w:pos="8244"/>
+          <w:tab w:val="left" w:pos="9160"/>
+          <w:tab w:val="left" w:pos="10076"/>
+          <w:tab w:val="left" w:pos="10992"/>
+          <w:tab w:val="left" w:pos="11908"/>
+          <w:tab w:val="left" w:pos="12824"/>
+          <w:tab w:val="left" w:pos="13740"/>
+          <w:tab w:val="left" w:pos="14656"/>
+        </w:tabs>
+        <w:wordWrap w:val="0"/>
+        <w:jc w:val="left"/>
+        <w:rPr>
+          <w:rFonts w:eastAsia="Times New Roman"/>
+          <w:sz w:val="19"/>
+          <w:szCs w:val="19"/>
+        </w:rPr>
+      </w:pPr>
+      <w:r>
+        <w:rPr>
+          <w:rFonts w:eastAsia="Times New Roman"/>
+          <w:sz w:val="19"/>
+          <w:szCs w:val="19"/>
+        </w:rPr>
+        <w:t xml:space="preserve">   - Actual Next Element </w:t>
+      </w:r>
+      <w:proofErr w:type="gramStart"/>
+      <w:r>
+        <w:rPr>
+          <w:rFonts w:eastAsia="Times New Roman"/>
+          <w:sz w:val="19"/>
+          <w:szCs w:val="19"/>
+        </w:rPr>
+        <w:t xml:space="preserve">  :</w:t>
+      </w:r>
+      <w:proofErr w:type="gramEnd"/>
+      <w:r>
+        <w:rPr>
+          <w:rFonts w:eastAsia="Times New Roman"/>
+          <w:sz w:val="19"/>
+          <w:szCs w:val="19"/>
+        </w:rPr>
+        <w:t xml:space="preserve"> 3</w:t>
+      </w:r>
+    </w:p>
+    <w:p>
+      <w:pPr>
+        <w:tabs>
+          <w:tab w:val="left" w:pos="916"/>
+          <w:tab w:val="left" w:pos="1832"/>
+          <w:tab w:val="left" w:pos="2748"/>
+          <w:tab w:val="left" w:pos="3664"/>
+          <w:tab w:val="left" w:pos="4580"/>
+          <w:tab w:val="left" w:pos="5496"/>
+          <w:tab w:val="left" w:pos="6412"/>
+          <w:tab w:val="left" w:pos="7328"/>
+          <w:tab w:val="left" w:pos="8244"/>
+          <w:tab w:val="left" w:pos="9160"/>
+          <w:tab w:val="left" w:pos="10076"/>
+          <w:tab w:val="left" w:pos="10992"/>
+          <w:tab w:val="left" w:pos="11908"/>
+          <w:tab w:val="left" w:pos="12824"/>
+          <w:tab w:val="left" w:pos="13740"/>
+          <w:tab w:val="left" w:pos="14656"/>
+        </w:tabs>
+        <w:wordWrap w:val="0"/>
+        <w:jc w:val="left"/>
+        <w:rPr>
+          <w:rFonts w:eastAsia="Times New Roman"/>
+          <w:sz w:val="19"/>
+          <w:szCs w:val="19"/>
+        </w:rPr>
+      </w:pPr>
+      <w:r>
+        <w:rPr>
+          <w:rFonts w:eastAsia="Times New Roman"/>
+          <w:sz w:val="19"/>
+          <w:szCs w:val="19"/>
+        </w:rPr>
+        <w:t xml:space="preserve">   - Similarity Score    </w:t>
+      </w:r>
+      <w:proofErr w:type="gramStart"/>
+      <w:r>
+        <w:rPr>
+          <w:rFonts w:eastAsia="Times New Roman"/>
+          <w:sz w:val="19"/>
+          <w:szCs w:val="19"/>
+        </w:rPr>
+        <w:t xml:space="preserve">  :</w:t>
+      </w:r>
+      <w:proofErr w:type="gramEnd"/>
+      <w:r>
+        <w:rPr>
+          <w:rFonts w:eastAsia="Times New Roman"/>
+          <w:sz w:val="19"/>
+          <w:szCs w:val="19"/>
+        </w:rPr>
+        <w:t xml:space="preserve"> 33.33</w:t>
+      </w:r>
+    </w:p>
+    <w:p>
+      <w:pPr>
+        <w:tabs>
+          <w:tab w:val="left" w:pos="916"/>
+          <w:tab w:val="left" w:pos="1832"/>
+          <w:tab w:val="left" w:pos="2748"/>
+          <w:tab w:val="left" w:pos="3664"/>
+          <w:tab w:val="left" w:pos="4580"/>
+          <w:tab w:val="left" w:pos="5496"/>
+          <w:tab w:val="left" w:pos="6412"/>
+          <w:tab w:val="left" w:pos="7328"/>
+          <w:tab w:val="left" w:pos="8244"/>
+          <w:tab w:val="left" w:pos="9160"/>
+          <w:tab w:val="left" w:pos="10076"/>
+          <w:tab w:val="left" w:pos="10992"/>
+          <w:tab w:val="left" w:pos="11908"/>
+          <w:tab w:val="left" w:pos="12824"/>
+          <w:tab w:val="left" w:pos="13740"/>
+          <w:tab w:val="left" w:pos="14656"/>
+        </w:tabs>
+        <w:wordWrap w:val="0"/>
+        <w:jc w:val="left"/>
+        <w:rPr>
+          <w:rFonts w:eastAsia="Times New Roman"/>
+          <w:sz w:val="19"/>
+          <w:szCs w:val="19"/>
+        </w:rPr>
+      </w:pPr>
+      <w:r>
+        <w:rPr>
+          <w:rFonts w:eastAsia="Times New Roman"/>
+          <w:sz w:val="19"/>
+          <w:szCs w:val="19"/>
+        </w:rPr>
+        <w:t xml:space="preserve">   - Predicted Sequence  </w:t>
+      </w:r>
+      <w:proofErr w:type="gramStart"/>
+      <w:r>
+        <w:rPr>
+          <w:rFonts w:eastAsia="Times New Roman"/>
+          <w:sz w:val="19"/>
+          <w:szCs w:val="19"/>
+        </w:rPr>
+        <w:t xml:space="preserve">  :</w:t>
+      </w:r>
+      <w:proofErr w:type="gramEnd"/>
+      <w:r>
+        <w:rPr>
+          <w:rFonts w:eastAsia="Times New Roman"/>
+          <w:sz w:val="19"/>
+          <w:szCs w:val="19"/>
+        </w:rPr>
+        <w:t xml:space="preserve"> S1_5-4-3-9-2-5-</w:t>
+      </w:r>
+      <w:proofErr w:type="gramStart"/>
+      <w:r>
+        <w:rPr>
+          <w:rFonts w:eastAsia="Times New Roman"/>
+          <w:sz w:val="19"/>
+          <w:szCs w:val="19"/>
+        </w:rPr>
+        <w:t>8-</w:t>
+      </w:r>
+      <w:proofErr w:type="gramEnd"/>
+      <w:r>
+        <w:rPr>
+          <w:rFonts w:eastAsia="Times New Roman"/>
+          <w:sz w:val="19"/>
+          <w:szCs w:val="19"/>
+        </w:rPr>
+        <w:t>2-4-3</w:t>
+      </w:r>
+    </w:p>
+    <w:p>
+      <w:pPr>
+        <w:tabs>
+          <w:tab w:val="left" w:pos="916"/>
+          <w:tab w:val="left" w:pos="1832"/>
+          <w:tab w:val="left" w:pos="2748"/>
+          <w:tab w:val="left" w:pos="3664"/>
+          <w:tab w:val="left" w:pos="4580"/>
+          <w:tab w:val="left" w:pos="5496"/>
+          <w:tab w:val="left" w:pos="6412"/>
+          <w:tab w:val="left" w:pos="7328"/>
+          <w:tab w:val="left" w:pos="8244"/>
+          <w:tab w:val="left" w:pos="9160"/>
+          <w:tab w:val="left" w:pos="10076"/>
+          <w:tab w:val="left" w:pos="10992"/>
+          <w:tab w:val="left" w:pos="11908"/>
+          <w:tab w:val="left" w:pos="12824"/>
+          <w:tab w:val="left" w:pos="13740"/>
+          <w:tab w:val="left" w:pos="14656"/>
+        </w:tabs>
+        <w:wordWrap w:val="0"/>
+        <w:jc w:val="left"/>
+        <w:rPr>
+          <w:rFonts w:eastAsia="Times New Roman"/>
+          <w:sz w:val="19"/>
+          <w:szCs w:val="19"/>
+        </w:rPr>
+      </w:pPr>
+      <w:r>
+        <w:rPr>
+          <w:rFonts w:eastAsia="Times New Roman"/>
+          <w:sz w:val="19"/>
+          <w:szCs w:val="19"/>
+        </w:rPr>
+        <w:t>No Anomaly Detected!</w:t>
+      </w:r>
+    </w:p>
+    <w:p>
+      <w:pPr>
+        <w:tabs>
+          <w:tab w:val="left" w:pos="916"/>
+          <w:tab w:val="left" w:pos="1832"/>
+          <w:tab w:val="left" w:pos="2748"/>
+          <w:tab w:val="left" w:pos="3664"/>
+          <w:tab w:val="left" w:pos="4580"/>
+          <w:tab w:val="left" w:pos="5496"/>
+          <w:tab w:val="left" w:pos="6412"/>
+          <w:tab w:val="left" w:pos="7328"/>
+          <w:tab w:val="left" w:pos="8244"/>
+          <w:tab w:val="left" w:pos="9160"/>
+          <w:tab w:val="left" w:pos="10076"/>
+          <w:tab w:val="left" w:pos="10992"/>
+          <w:tab w:val="left" w:pos="11908"/>
+          <w:tab w:val="left" w:pos="12824"/>
+          <w:tab w:val="left" w:pos="13740"/>
+          <w:tab w:val="left" w:pos="14656"/>
+        </w:tabs>
+        <w:wordWrap w:val="0"/>
+        <w:jc w:val="left"/>
+        <w:rPr>
+          <w:rFonts w:eastAsia="Times New Roman"/>
+          <w:sz w:val="19"/>
+          <w:szCs w:val="19"/>
+        </w:rPr>
+      </w:pPr>
+    </w:p>
+    <w:p>
+      <w:pPr>
+        <w:tabs>
+          <w:tab w:val="left" w:pos="916"/>
+          <w:tab w:val="left" w:pos="1832"/>
+          <w:tab w:val="left" w:pos="2748"/>
+          <w:tab w:val="left" w:pos="3664"/>
+          <w:tab w:val="left" w:pos="4580"/>
+          <w:tab w:val="left" w:pos="5496"/>
+          <w:tab w:val="left" w:pos="6412"/>
+          <w:tab w:val="left" w:pos="7328"/>
+          <w:tab w:val="left" w:pos="8244"/>
+          <w:tab w:val="left" w:pos="9160"/>
+          <w:tab w:val="left" w:pos="10076"/>
+          <w:tab w:val="left" w:pos="10992"/>
+          <w:tab w:val="left" w:pos="11908"/>
+          <w:tab w:val="left" w:pos="12824"/>
+          <w:tab w:val="left" w:pos="13740"/>
+          <w:tab w:val="left" w:pos="14656"/>
+        </w:tabs>
+        <w:wordWrap w:val="0"/>
+        <w:jc w:val="left"/>
+        <w:rPr>
+          <w:rFonts w:eastAsia="Times New Roman"/>
+          <w:sz w:val="19"/>
+          <w:szCs w:val="19"/>
+        </w:rPr>
+      </w:pPr>
+    </w:p>
+    <w:p>
+      <w:pPr>
+        <w:tabs>
+          <w:tab w:val="left" w:pos="916"/>
+          <w:tab w:val="left" w:pos="1832"/>
+          <w:tab w:val="left" w:pos="2748"/>
+          <w:tab w:val="left" w:pos="3664"/>
+          <w:tab w:val="left" w:pos="4580"/>
+          <w:tab w:val="left" w:pos="5496"/>
+          <w:tab w:val="left" w:pos="6412"/>
+          <w:tab w:val="left" w:pos="7328"/>
+          <w:tab w:val="left" w:pos="8244"/>
+          <w:tab w:val="left" w:pos="9160"/>
+          <w:tab w:val="left" w:pos="10076"/>
+          <w:tab w:val="left" w:pos="10992"/>
+          <w:tab w:val="left" w:pos="11908"/>
+          <w:tab w:val="left" w:pos="12824"/>
+          <w:tab w:val="left" w:pos="13740"/>
+          <w:tab w:val="left" w:pos="14656"/>
+        </w:tabs>
+        <w:wordWrap w:val="0"/>
+        <w:jc w:val="left"/>
+        <w:rPr>
+          <w:rFonts w:eastAsia="Times New Roman"/>
+          <w:sz w:val="19"/>
+          <w:szCs w:val="19"/>
+        </w:rPr>
+      </w:pPr>
+      <w:r>
+        <w:rPr>
+          <w:rFonts w:eastAsia="Times New Roman"/>
+          <w:sz w:val="19"/>
+          <w:szCs w:val="19"/>
+        </w:rPr>
+        <w:t>Processing Element: 3</w:t>
+      </w:r>
+    </w:p>
+    <w:p>
+      <w:pPr>
+        <w:tabs>
+          <w:tab w:val="left" w:pos="916"/>
+          <w:tab w:val="left" w:pos="1832"/>
+          <w:tab w:val="left" w:pos="2748"/>
+          <w:tab w:val="left" w:pos="3664"/>
+          <w:tab w:val="left" w:pos="4580"/>
+          <w:tab w:val="left" w:pos="5496"/>
+          <w:tab w:val="left" w:pos="6412"/>
+          <w:tab w:val="left" w:pos="7328"/>
+          <w:tab w:val="left" w:pos="8244"/>
+          <w:tab w:val="left" w:pos="9160"/>
+          <w:tab w:val="left" w:pos="10076"/>
+          <w:tab w:val="left" w:pos="10992"/>
+          <w:tab w:val="left" w:pos="11908"/>
+          <w:tab w:val="left" w:pos="12824"/>
+          <w:tab w:val="left" w:pos="13740"/>
+          <w:tab w:val="left" w:pos="14656"/>
+        </w:tabs>
+        <w:wordWrap w:val="0"/>
+        <w:jc w:val="left"/>
+        <w:rPr>
+          <w:rFonts w:eastAsia="Times New Roman"/>
+          <w:sz w:val="19"/>
+          <w:szCs w:val="19"/>
+        </w:rPr>
+      </w:pPr>
+      <w:r>
+        <w:rPr>
+          <w:rFonts w:eastAsia="Times New Roman"/>
+          <w:sz w:val="19"/>
+          <w:szCs w:val="19"/>
+        </w:rPr>
+        <w:t xml:space="preserve">   - Predicted Next Element: 5</w:t>
+      </w:r>
+    </w:p>
+    <w:p>
+      <w:pPr>
+        <w:tabs>
+          <w:tab w:val="left" w:pos="916"/>
+          <w:tab w:val="left" w:pos="1832"/>
+          <w:tab w:val="left" w:pos="2748"/>
+          <w:tab w:val="left" w:pos="3664"/>
+          <w:tab w:val="left" w:pos="4580"/>
+          <w:tab w:val="left" w:pos="5496"/>
+          <w:tab w:val="left" w:pos="6412"/>
+          <w:tab w:val="left" w:pos="7328"/>
+          <w:tab w:val="left" w:pos="8244"/>
+          <w:tab w:val="left" w:pos="9160"/>
+          <w:tab w:val="left" w:pos="10076"/>
+          <w:tab w:val="left" w:pos="10992"/>
+          <w:tab w:val="left" w:pos="11908"/>
+          <w:tab w:val="left" w:pos="12824"/>
+          <w:tab w:val="left" w:pos="13740"/>
+          <w:tab w:val="left" w:pos="14656"/>
+        </w:tabs>
+        <w:wordWrap w:val="0"/>
+        <w:jc w:val="left"/>
+        <w:rPr>
+          <w:rFonts w:eastAsia="Times New Roman"/>
+          <w:sz w:val="19"/>
+          <w:szCs w:val="19"/>
+        </w:rPr>
+      </w:pPr>
+      <w:r>
+        <w:rPr>
+          <w:rFonts w:eastAsia="Times New Roman"/>
+          <w:sz w:val="19"/>
+          <w:szCs w:val="19"/>
+        </w:rPr>
+        <w:t xml:space="preserve">   - Actual Next Element </w:t>
+      </w:r>
+      <w:proofErr w:type="gramStart"/>
+      <w:r>
+        <w:rPr>
+          <w:rFonts w:eastAsia="Times New Roman"/>
+          <w:sz w:val="19"/>
+          <w:szCs w:val="19"/>
+        </w:rPr>
+        <w:t xml:space="preserve">  :</w:t>
+      </w:r>
+      <w:proofErr w:type="gramEnd"/>
+      <w:r>
+        <w:rPr>
+          <w:rFonts w:eastAsia="Times New Roman"/>
+          <w:sz w:val="19"/>
+          <w:szCs w:val="19"/>
+        </w:rPr>
+        <w:t xml:space="preserve"> 12</w:t>
+      </w:r>
+    </w:p>
+    <w:p>
+      <w:pPr>
+        <w:tabs>
+          <w:tab w:val="left" w:pos="916"/>
+          <w:tab w:val="left" w:pos="1832"/>
+          <w:tab w:val="left" w:pos="2748"/>
+          <w:tab w:val="left" w:pos="3664"/>
+          <w:tab w:val="left" w:pos="4580"/>
+          <w:tab w:val="left" w:pos="5496"/>
+          <w:tab w:val="left" w:pos="6412"/>
+          <w:tab w:val="left" w:pos="7328"/>
+          <w:tab w:val="left" w:pos="8244"/>
+          <w:tab w:val="left" w:pos="9160"/>
+          <w:tab w:val="left" w:pos="10076"/>
+          <w:tab w:val="left" w:pos="10992"/>
+          <w:tab w:val="left" w:pos="11908"/>
+          <w:tab w:val="left" w:pos="12824"/>
+          <w:tab w:val="left" w:pos="13740"/>
+          <w:tab w:val="left" w:pos="14656"/>
+        </w:tabs>
+        <w:wordWrap w:val="0"/>
+        <w:jc w:val="left"/>
+        <w:rPr>
+          <w:rFonts w:eastAsia="Times New Roman"/>
+          <w:sz w:val="19"/>
+          <w:szCs w:val="19"/>
+        </w:rPr>
+      </w:pPr>
+      <w:r>
+        <w:rPr>
+          <w:rFonts w:eastAsia="Times New Roman"/>
+          <w:sz w:val="19"/>
+          <w:szCs w:val="19"/>
+        </w:rPr>
+        <w:t xml:space="preserve">   - Similarity Score    </w:t>
+      </w:r>
+      <w:proofErr w:type="gramStart"/>
+      <w:r>
+        <w:rPr>
+          <w:rFonts w:eastAsia="Times New Roman"/>
+          <w:sz w:val="19"/>
+          <w:szCs w:val="19"/>
+        </w:rPr>
+        <w:t xml:space="preserve">  :</w:t>
+      </w:r>
+      <w:proofErr w:type="gramEnd"/>
+      <w:r>
+        <w:rPr>
+          <w:rFonts w:eastAsia="Times New Roman"/>
+          <w:sz w:val="19"/>
+          <w:szCs w:val="19"/>
+        </w:rPr>
+        <w:t xml:space="preserve"> 48.98</w:t>
+      </w:r>
+    </w:p>
+    <w:p>
+      <w:pPr>
+        <w:tabs>
+          <w:tab w:val="left" w:pos="916"/>
+          <w:tab w:val="left" w:pos="1832"/>
+          <w:tab w:val="left" w:pos="2748"/>
+          <w:tab w:val="left" w:pos="3664"/>
+          <w:tab w:val="left" w:pos="4580"/>
+          <w:tab w:val="left" w:pos="5496"/>
+          <w:tab w:val="left" w:pos="6412"/>
+          <w:tab w:val="left" w:pos="7328"/>
+          <w:tab w:val="left" w:pos="8244"/>
+          <w:tab w:val="left" w:pos="9160"/>
+          <w:tab w:val="left" w:pos="10076"/>
+          <w:tab w:val="left" w:pos="10992"/>
+          <w:tab w:val="left" w:pos="11908"/>
+          <w:tab w:val="left" w:pos="12824"/>
+          <w:tab w:val="left" w:pos="13740"/>
+          <w:tab w:val="left" w:pos="14656"/>
+        </w:tabs>
+        <w:wordWrap w:val="0"/>
+        <w:jc w:val="left"/>
+        <w:rPr>
+          <w:rFonts w:eastAsia="Times New Roman"/>
+          <w:sz w:val="19"/>
+          <w:szCs w:val="19"/>
+        </w:rPr>
+      </w:pPr>
+      <w:r>
+        <w:rPr>
+          <w:rFonts w:eastAsia="Times New Roman"/>
+          <w:sz w:val="19"/>
+          <w:szCs w:val="19"/>
+        </w:rPr>
+        <w:t xml:space="preserve">   - Predicted Sequence  </w:t>
+      </w:r>
+      <w:proofErr w:type="gramStart"/>
+      <w:r>
+        <w:rPr>
+          <w:rFonts w:eastAsia="Times New Roman"/>
+          <w:sz w:val="19"/>
+          <w:szCs w:val="19"/>
+        </w:rPr>
+        <w:t xml:space="preserve">  :</w:t>
+      </w:r>
+      <w:proofErr w:type="gramEnd"/>
+      <w:r>
+        <w:rPr>
+          <w:rFonts w:eastAsia="Times New Roman"/>
+          <w:sz w:val="19"/>
+          <w:szCs w:val="19"/>
+        </w:rPr>
+        <w:t xml:space="preserve"> S3_-1.0-9-3-5-8-2-4-3-5</w:t>
+      </w:r>
+    </w:p>
+    <w:p>
+      <w:pPr>
+        <w:tabs>
+          <w:tab w:val="left" w:pos="916"/>
+          <w:tab w:val="left" w:pos="1832"/>
+          <w:tab w:val="left" w:pos="2748"/>
+          <w:tab w:val="left" w:pos="3664"/>
+          <w:tab w:val="left" w:pos="4580"/>
+          <w:tab w:val="left" w:pos="5496"/>
+          <w:tab w:val="left" w:pos="6412"/>
+          <w:tab w:val="left" w:pos="7328"/>
+          <w:tab w:val="left" w:pos="8244"/>
+          <w:tab w:val="left" w:pos="9160"/>
+          <w:tab w:val="left" w:pos="10076"/>
+          <w:tab w:val="left" w:pos="10992"/>
+          <w:tab w:val="left" w:pos="11908"/>
+          <w:tab w:val="left" w:pos="12824"/>
+          <w:tab w:val="left" w:pos="13740"/>
+          <w:tab w:val="left" w:pos="14656"/>
+        </w:tabs>
+        <w:wordWrap w:val="0"/>
+        <w:jc w:val="left"/>
+        <w:rPr>
+          <w:rFonts w:eastAsia="Times New Roman"/>
+          <w:sz w:val="19"/>
+          <w:szCs w:val="19"/>
+        </w:rPr>
+      </w:pPr>
+    </w:p>
+    <w:p>
+      <w:pPr>
+        <w:tabs>
+          <w:tab w:val="left" w:pos="916"/>
+          <w:tab w:val="left" w:pos="1832"/>
+          <w:tab w:val="left" w:pos="2748"/>
+          <w:tab w:val="left" w:pos="3664"/>
+          <w:tab w:val="left" w:pos="4580"/>
+          <w:tab w:val="left" w:pos="5496"/>
+          <w:tab w:val="left" w:pos="6412"/>
+          <w:tab w:val="left" w:pos="7328"/>
+          <w:tab w:val="left" w:pos="8244"/>
+          <w:tab w:val="left" w:pos="9160"/>
+          <w:tab w:val="left" w:pos="10076"/>
+          <w:tab w:val="left" w:pos="10992"/>
+          <w:tab w:val="left" w:pos="11908"/>
+          <w:tab w:val="left" w:pos="12824"/>
+          <w:tab w:val="left" w:pos="13740"/>
+          <w:tab w:val="left" w:pos="14656"/>
+        </w:tabs>
+        <w:wordWrap w:val="0"/>
+        <w:jc w:val="left"/>
+        <w:rPr>
+          <w:rFonts w:eastAsia="Times New Roman"/>
+          <w:sz w:val="19"/>
+          <w:szCs w:val="19"/>
+        </w:rPr>
+      </w:pPr>
+      <w:r>
+        <w:rPr>
+          <w:rFonts w:eastAsia="Times New Roman"/>
+          <w:sz w:val="19"/>
+          <w:szCs w:val="19"/>
+        </w:rPr>
+        <w:t xml:space="preserve">   !!! Anomaly </w:t>
+      </w:r>
+      <w:proofErr w:type="gramStart"/>
+      <w:r>
+        <w:rPr>
+          <w:rFonts w:eastAsia="Times New Roman"/>
+          <w:sz w:val="19"/>
+          <w:szCs w:val="19"/>
+        </w:rPr>
+        <w:t>Detected !!!</w:t>
+      </w:r>
+      <w:proofErr w:type="gramEnd"/>
+    </w:p>
+    <w:p>
+      <w:pPr>
+        <w:tabs>
+          <w:tab w:val="left" w:pos="916"/>
+          <w:tab w:val="left" w:pos="1832"/>
+          <w:tab w:val="left" w:pos="2748"/>
+          <w:tab w:val="left" w:pos="3664"/>
+          <w:tab w:val="left" w:pos="4580"/>
+          <w:tab w:val="left" w:pos="5496"/>
+          <w:tab w:val="left" w:pos="6412"/>
+          <w:tab w:val="left" w:pos="7328"/>
+          <w:tab w:val="left" w:pos="8244"/>
+          <w:tab w:val="left" w:pos="9160"/>
+          <w:tab w:val="left" w:pos="10076"/>
+          <w:tab w:val="left" w:pos="10992"/>
+          <w:tab w:val="left" w:pos="11908"/>
+          <w:tab w:val="left" w:pos="12824"/>
+          <w:tab w:val="left" w:pos="13740"/>
+          <w:tab w:val="left" w:pos="14656"/>
+        </w:tabs>
+        <w:wordWrap w:val="0"/>
+        <w:jc w:val="left"/>
+        <w:rPr>
+          <w:rFonts w:eastAsia="Times New Roman"/>
+          <w:sz w:val="19"/>
+          <w:szCs w:val="19"/>
+        </w:rPr>
+      </w:pPr>
+      <w:r>
+        <w:rPr>
+          <w:rFonts w:eastAsia="Times New Roman"/>
+          <w:sz w:val="19"/>
+          <w:szCs w:val="19"/>
+        </w:rPr>
+        <w:t xml:space="preserve">   - Expected: 5, Found: 12</w:t>
+      </w:r>
+    </w:p>
+    <w:p>
+      <w:pPr>
+        <w:tabs>
+          <w:tab w:val="left" w:pos="916"/>
+          <w:tab w:val="left" w:pos="1832"/>
+          <w:tab w:val="left" w:pos="2748"/>
+          <w:tab w:val="left" w:pos="3664"/>
+          <w:tab w:val="left" w:pos="4580"/>
+          <w:tab w:val="left" w:pos="5496"/>
+          <w:tab w:val="left" w:pos="6412"/>
+          <w:tab w:val="left" w:pos="7328"/>
+          <w:tab w:val="left" w:pos="8244"/>
+          <w:tab w:val="left" w:pos="9160"/>
+          <w:tab w:val="left" w:pos="10076"/>
+          <w:tab w:val="left" w:pos="10992"/>
+          <w:tab w:val="left" w:pos="11908"/>
+          <w:tab w:val="left" w:pos="12824"/>
+          <w:tab w:val="left" w:pos="13740"/>
+          <w:tab w:val="left" w:pos="14656"/>
+        </w:tabs>
+        <w:wordWrap w:val="0"/>
+        <w:jc w:val="left"/>
+        <w:rPr>
+          <w:rFonts w:eastAsia="Times New Roman"/>
+          <w:sz w:val="19"/>
+          <w:szCs w:val="19"/>
+        </w:rPr>
+      </w:pPr>
+      <w:r>
+        <w:rPr>
+          <w:rFonts w:eastAsia="Times New Roman"/>
+          <w:sz w:val="19"/>
+          <w:szCs w:val="19"/>
+        </w:rPr>
+        <w:t xml:space="preserve">   - Skipping the anomalous value.</w:t>
+      </w:r>
+    </w:p>
+    <w:p>
+      <w:pPr>
+        <w:tabs>
+          <w:tab w:val="left" w:pos="916"/>
+          <w:tab w:val="left" w:pos="1832"/>
+          <w:tab w:val="left" w:pos="2748"/>
+          <w:tab w:val="left" w:pos="3664"/>
+          <w:tab w:val="left" w:pos="4580"/>
+          <w:tab w:val="left" w:pos="5496"/>
+          <w:tab w:val="left" w:pos="6412"/>
+          <w:tab w:val="left" w:pos="7328"/>
+          <w:tab w:val="left" w:pos="8244"/>
+          <w:tab w:val="left" w:pos="9160"/>
+          <w:tab w:val="left" w:pos="10076"/>
+          <w:tab w:val="left" w:pos="10992"/>
+          <w:tab w:val="left" w:pos="11908"/>
+          <w:tab w:val="left" w:pos="12824"/>
+          <w:tab w:val="left" w:pos="13740"/>
+          <w:tab w:val="left" w:pos="14656"/>
+        </w:tabs>
+        <w:wordWrap w:val="0"/>
+        <w:jc w:val="left"/>
+        <w:rPr>
+          <w:rFonts w:eastAsia="Times New Roman"/>
+          <w:sz w:val="19"/>
+          <w:szCs w:val="19"/>
+        </w:rPr>
+      </w:pPr>
+    </w:p>
+    <w:p>
+      <w:pPr>
+        <w:tabs>
+          <w:tab w:val="left" w:pos="916"/>
+          <w:tab w:val="left" w:pos="1832"/>
+          <w:tab w:val="left" w:pos="2748"/>
+          <w:tab w:val="left" w:pos="3664"/>
+          <w:tab w:val="left" w:pos="4580"/>
+          <w:tab w:val="left" w:pos="5496"/>
+          <w:tab w:val="left" w:pos="6412"/>
+          <w:tab w:val="left" w:pos="7328"/>
+          <w:tab w:val="left" w:pos="8244"/>
+          <w:tab w:val="left" w:pos="9160"/>
+          <w:tab w:val="left" w:pos="10076"/>
+          <w:tab w:val="left" w:pos="10992"/>
+          <w:tab w:val="left" w:pos="11908"/>
+          <w:tab w:val="left" w:pos="12824"/>
+          <w:tab w:val="left" w:pos="13740"/>
+          <w:tab w:val="left" w:pos="14656"/>
+        </w:tabs>
+        <w:wordWrap w:val="0"/>
+        <w:jc w:val="left"/>
+        <w:rPr>
+          <w:rFonts w:eastAsia="Times New Roman"/>
+          <w:sz w:val="19"/>
+          <w:szCs w:val="19"/>
+        </w:rPr>
+      </w:pPr>
+    </w:p>
+    <w:p>
+      <w:pPr>
+        <w:tabs>
+          <w:tab w:val="left" w:pos="916"/>
+          <w:tab w:val="left" w:pos="1832"/>
+          <w:tab w:val="left" w:pos="2748"/>
+          <w:tab w:val="left" w:pos="3664"/>
+          <w:tab w:val="left" w:pos="4580"/>
+          <w:tab w:val="left" w:pos="5496"/>
+          <w:tab w:val="left" w:pos="6412"/>
+          <w:tab w:val="left" w:pos="7328"/>
+          <w:tab w:val="left" w:pos="8244"/>
+          <w:tab w:val="left" w:pos="9160"/>
+          <w:tab w:val="left" w:pos="10076"/>
+          <w:tab w:val="left" w:pos="10992"/>
+          <w:tab w:val="left" w:pos="11908"/>
+          <w:tab w:val="left" w:pos="12824"/>
+          <w:tab w:val="left" w:pos="13740"/>
+          <w:tab w:val="left" w:pos="14656"/>
+        </w:tabs>
+        <w:wordWrap w:val="0"/>
+        <w:jc w:val="left"/>
+        <w:rPr>
+          <w:rFonts w:eastAsia="Times New Roman"/>
+          <w:sz w:val="19"/>
+          <w:szCs w:val="19"/>
+        </w:rPr>
+      </w:pPr>
+      <w:r>
+        <w:rPr>
+          <w:rFonts w:eastAsia="Times New Roman"/>
+          <w:sz w:val="19"/>
+          <w:szCs w:val="19"/>
+        </w:rPr>
+        <w:t>Processing Element: 3</w:t>
+      </w:r>
+    </w:p>
+    <w:p>
+      <w:pPr>
+        <w:tabs>
+          <w:tab w:val="left" w:pos="916"/>
+          <w:tab w:val="left" w:pos="1832"/>
+          <w:tab w:val="left" w:pos="2748"/>
+          <w:tab w:val="left" w:pos="3664"/>
+          <w:tab w:val="left" w:pos="4580"/>
+          <w:tab w:val="left" w:pos="5496"/>
+          <w:tab w:val="left" w:pos="6412"/>
+          <w:tab w:val="left" w:pos="7328"/>
+          <w:tab w:val="left" w:pos="8244"/>
+          <w:tab w:val="left" w:pos="9160"/>
+          <w:tab w:val="left" w:pos="10076"/>
+          <w:tab w:val="left" w:pos="10992"/>
+          <w:tab w:val="left" w:pos="11908"/>
+          <w:tab w:val="left" w:pos="12824"/>
+          <w:tab w:val="left" w:pos="13740"/>
+          <w:tab w:val="left" w:pos="14656"/>
+        </w:tabs>
+        <w:wordWrap w:val="0"/>
+        <w:jc w:val="left"/>
+        <w:rPr>
+          <w:rFonts w:eastAsia="Times New Roman"/>
+          <w:sz w:val="19"/>
+          <w:szCs w:val="19"/>
+        </w:rPr>
+      </w:pPr>
+      <w:r>
+        <w:rPr>
+          <w:rFonts w:eastAsia="Times New Roman"/>
+          <w:sz w:val="19"/>
+          <w:szCs w:val="19"/>
+        </w:rPr>
+        <w:t xml:space="preserve">   - Predicted Next Element: 5</w:t>
+      </w:r>
+    </w:p>
+    <w:p>
+      <w:pPr>
+        <w:tabs>
+          <w:tab w:val="left" w:pos="916"/>
+          <w:tab w:val="left" w:pos="1832"/>
+          <w:tab w:val="left" w:pos="2748"/>
+          <w:tab w:val="left" w:pos="3664"/>
+          <w:tab w:val="left" w:pos="4580"/>
+          <w:tab w:val="left" w:pos="5496"/>
+          <w:tab w:val="left" w:pos="6412"/>
+          <w:tab w:val="left" w:pos="7328"/>
+          <w:tab w:val="left" w:pos="8244"/>
+          <w:tab w:val="left" w:pos="9160"/>
+          <w:tab w:val="left" w:pos="10076"/>
+          <w:tab w:val="left" w:pos="10992"/>
+          <w:tab w:val="left" w:pos="11908"/>
+          <w:tab w:val="left" w:pos="12824"/>
+          <w:tab w:val="left" w:pos="13740"/>
+          <w:tab w:val="left" w:pos="14656"/>
+        </w:tabs>
+        <w:wordWrap w:val="0"/>
+        <w:jc w:val="left"/>
+        <w:rPr>
+          <w:rFonts w:eastAsia="Times New Roman"/>
+          <w:sz w:val="19"/>
+          <w:szCs w:val="19"/>
+        </w:rPr>
+      </w:pPr>
+      <w:r>
+        <w:rPr>
+          <w:rFonts w:eastAsia="Times New Roman"/>
+          <w:sz w:val="19"/>
+          <w:szCs w:val="19"/>
+        </w:rPr>
+        <w:t xml:space="preserve">   - Actual Next Element </w:t>
+      </w:r>
+      <w:proofErr w:type="gramStart"/>
+      <w:r>
+        <w:rPr>
+          <w:rFonts w:eastAsia="Times New Roman"/>
+          <w:sz w:val="19"/>
+          <w:szCs w:val="19"/>
+        </w:rPr>
+        <w:t xml:space="preserve">  :</w:t>
+      </w:r>
+      <w:proofErr w:type="gramEnd"/>
+      <w:r>
+        <w:rPr>
+          <w:rFonts w:eastAsia="Times New Roman"/>
+          <w:sz w:val="19"/>
+          <w:szCs w:val="19"/>
+        </w:rPr>
+        <w:t xml:space="preserve"> 12</w:t>
+      </w:r>
+    </w:p>
+    <w:p>
+      <w:pPr>
+        <w:tabs>
+          <w:tab w:val="left" w:pos="916"/>
+          <w:tab w:val="left" w:pos="1832"/>
+          <w:tab w:val="left" w:pos="2748"/>
+          <w:tab w:val="left" w:pos="3664"/>
+          <w:tab w:val="left" w:pos="4580"/>
+          <w:tab w:val="left" w:pos="5496"/>
+          <w:tab w:val="left" w:pos="6412"/>
+          <w:tab w:val="left" w:pos="7328"/>
+          <w:tab w:val="left" w:pos="8244"/>
+          <w:tab w:val="left" w:pos="9160"/>
+          <w:tab w:val="left" w:pos="10076"/>
+          <w:tab w:val="left" w:pos="10992"/>
+          <w:tab w:val="left" w:pos="11908"/>
+          <w:tab w:val="left" w:pos="12824"/>
+          <w:tab w:val="left" w:pos="13740"/>
+          <w:tab w:val="left" w:pos="14656"/>
+        </w:tabs>
+        <w:wordWrap w:val="0"/>
+        <w:jc w:val="left"/>
+        <w:rPr>
+          <w:rFonts w:eastAsia="Times New Roman"/>
+          <w:sz w:val="19"/>
+          <w:szCs w:val="19"/>
+        </w:rPr>
+      </w:pPr>
+      <w:r>
+        <w:rPr>
+          <w:rFonts w:eastAsia="Times New Roman"/>
+          <w:sz w:val="19"/>
+          <w:szCs w:val="19"/>
+        </w:rPr>
+        <w:t xml:space="preserve">   - Similarity Score    </w:t>
+      </w:r>
+      <w:proofErr w:type="gramStart"/>
+      <w:r>
+        <w:rPr>
+          <w:rFonts w:eastAsia="Times New Roman"/>
+          <w:sz w:val="19"/>
+          <w:szCs w:val="19"/>
+        </w:rPr>
+        <w:t xml:space="preserve">  :</w:t>
+      </w:r>
+      <w:proofErr w:type="gramEnd"/>
+      <w:r>
+        <w:rPr>
+          <w:rFonts w:eastAsia="Times New Roman"/>
+          <w:sz w:val="19"/>
+          <w:szCs w:val="19"/>
+        </w:rPr>
+        <w:t xml:space="preserve"> 48.98</w:t>
+      </w:r>
+    </w:p>
+    <w:p>
+      <w:pPr>
+        <w:tabs>
+          <w:tab w:val="left" w:pos="916"/>
+          <w:tab w:val="left" w:pos="1832"/>
+          <w:tab w:val="left" w:pos="2748"/>
+          <w:tab w:val="left" w:pos="3664"/>
+          <w:tab w:val="left" w:pos="4580"/>
+          <w:tab w:val="left" w:pos="5496"/>
+          <w:tab w:val="left" w:pos="6412"/>
+          <w:tab w:val="left" w:pos="7328"/>
+          <w:tab w:val="left" w:pos="8244"/>
+          <w:tab w:val="left" w:pos="9160"/>
+          <w:tab w:val="left" w:pos="10076"/>
+          <w:tab w:val="left" w:pos="10992"/>
+          <w:tab w:val="left" w:pos="11908"/>
+          <w:tab w:val="left" w:pos="12824"/>
+          <w:tab w:val="left" w:pos="13740"/>
+          <w:tab w:val="left" w:pos="14656"/>
+        </w:tabs>
+        <w:wordWrap w:val="0"/>
+        <w:jc w:val="left"/>
+        <w:rPr>
+          <w:rFonts w:eastAsia="Times New Roman"/>
+          <w:sz w:val="19"/>
+          <w:szCs w:val="19"/>
+        </w:rPr>
+      </w:pPr>
+      <w:r>
+        <w:rPr>
+          <w:rFonts w:eastAsia="Times New Roman"/>
+          <w:sz w:val="19"/>
+          <w:szCs w:val="19"/>
+        </w:rPr>
+        <w:t xml:space="preserve">   - Predicted Sequence  </w:t>
+      </w:r>
+      <w:proofErr w:type="gramStart"/>
+      <w:r>
+        <w:rPr>
+          <w:rFonts w:eastAsia="Times New Roman"/>
+          <w:sz w:val="19"/>
+          <w:szCs w:val="19"/>
+        </w:rPr>
+        <w:t xml:space="preserve">  :</w:t>
+      </w:r>
+      <w:proofErr w:type="gramEnd"/>
+      <w:r>
+        <w:rPr>
+          <w:rFonts w:eastAsia="Times New Roman"/>
+          <w:sz w:val="19"/>
+          <w:szCs w:val="19"/>
+        </w:rPr>
+        <w:t xml:space="preserve"> S3_-1.0-9-3-5-8-2-4-3-5</w:t>
+      </w:r>
+    </w:p>
+    <w:p>
+      <w:pPr>
+        <w:tabs>
+          <w:tab w:val="left" w:pos="916"/>
+          <w:tab w:val="left" w:pos="1832"/>
+          <w:tab w:val="left" w:pos="2748"/>
+          <w:tab w:val="left" w:pos="3664"/>
+          <w:tab w:val="left" w:pos="4580"/>
+          <w:tab w:val="left" w:pos="5496"/>
+          <w:tab w:val="left" w:pos="6412"/>
+          <w:tab w:val="left" w:pos="7328"/>
+          <w:tab w:val="left" w:pos="8244"/>
+          <w:tab w:val="left" w:pos="9160"/>
+          <w:tab w:val="left" w:pos="10076"/>
+          <w:tab w:val="left" w:pos="10992"/>
+          <w:tab w:val="left" w:pos="11908"/>
+          <w:tab w:val="left" w:pos="12824"/>
+          <w:tab w:val="left" w:pos="13740"/>
+          <w:tab w:val="left" w:pos="14656"/>
+        </w:tabs>
+        <w:wordWrap w:val="0"/>
+        <w:jc w:val="left"/>
+        <w:rPr>
+          <w:rFonts w:eastAsia="Times New Roman"/>
+          <w:sz w:val="19"/>
+          <w:szCs w:val="19"/>
+        </w:rPr>
+      </w:pPr>
+    </w:p>
+    <w:p>
+      <w:pPr>
+        <w:tabs>
+          <w:tab w:val="left" w:pos="916"/>
+          <w:tab w:val="left" w:pos="1832"/>
+          <w:tab w:val="left" w:pos="2748"/>
+          <w:tab w:val="left" w:pos="3664"/>
+          <w:tab w:val="left" w:pos="4580"/>
+          <w:tab w:val="left" w:pos="5496"/>
+          <w:tab w:val="left" w:pos="6412"/>
+          <w:tab w:val="left" w:pos="7328"/>
+          <w:tab w:val="left" w:pos="8244"/>
+          <w:tab w:val="left" w:pos="9160"/>
+          <w:tab w:val="left" w:pos="10076"/>
+          <w:tab w:val="left" w:pos="10992"/>
+          <w:tab w:val="left" w:pos="11908"/>
+          <w:tab w:val="left" w:pos="12824"/>
+          <w:tab w:val="left" w:pos="13740"/>
+          <w:tab w:val="left" w:pos="14656"/>
+        </w:tabs>
+        <w:wordWrap w:val="0"/>
+        <w:jc w:val="left"/>
+        <w:rPr>
+          <w:rFonts w:eastAsia="Times New Roman"/>
+          <w:sz w:val="19"/>
+          <w:szCs w:val="19"/>
+        </w:rPr>
+      </w:pPr>
+      <w:r>
+        <w:rPr>
+          <w:rFonts w:eastAsia="Times New Roman"/>
+          <w:sz w:val="19"/>
+          <w:szCs w:val="19"/>
+        </w:rPr>
+        <w:t xml:space="preserve">   !!! Anomaly </w:t>
+      </w:r>
+      <w:proofErr w:type="gramStart"/>
+      <w:r>
+        <w:rPr>
+          <w:rFonts w:eastAsia="Times New Roman"/>
+          <w:sz w:val="19"/>
+          <w:szCs w:val="19"/>
+        </w:rPr>
+        <w:t>Detected !!!</w:t>
+      </w:r>
+      <w:proofErr w:type="gramEnd"/>
+    </w:p>
+    <w:p>
+      <w:pPr>
+        <w:tabs>
+          <w:tab w:val="left" w:pos="916"/>
+          <w:tab w:val="left" w:pos="1832"/>
+          <w:tab w:val="left" w:pos="2748"/>
+          <w:tab w:val="left" w:pos="3664"/>
+          <w:tab w:val="left" w:pos="4580"/>
+          <w:tab w:val="left" w:pos="5496"/>
+          <w:tab w:val="left" w:pos="6412"/>
+          <w:tab w:val="left" w:pos="7328"/>
+          <w:tab w:val="left" w:pos="8244"/>
+          <w:tab w:val="left" w:pos="9160"/>
+          <w:tab w:val="left" w:pos="10076"/>
+          <w:tab w:val="left" w:pos="10992"/>
+          <w:tab w:val="left" w:pos="11908"/>
+          <w:tab w:val="left" w:pos="12824"/>
+          <w:tab w:val="left" w:pos="13740"/>
+          <w:tab w:val="left" w:pos="14656"/>
+        </w:tabs>
+        <w:wordWrap w:val="0"/>
+        <w:jc w:val="left"/>
+        <w:rPr>
+          <w:rFonts w:eastAsia="Times New Roman"/>
+          <w:sz w:val="19"/>
+          <w:szCs w:val="19"/>
+        </w:rPr>
+      </w:pPr>
+      <w:r>
+        <w:rPr>
+          <w:rFonts w:eastAsia="Times New Roman"/>
+          <w:sz w:val="19"/>
+          <w:szCs w:val="19"/>
+        </w:rPr>
+        <w:t xml:space="preserve">   - Expected: 5, Found: 12</w:t>
+      </w:r>
+    </w:p>
+    <w:p>
+      <w:pPr>
+        <w:tabs>
+          <w:tab w:val="left" w:pos="916"/>
+          <w:tab w:val="left" w:pos="1832"/>
+          <w:tab w:val="left" w:pos="2748"/>
+          <w:tab w:val="left" w:pos="3664"/>
+          <w:tab w:val="left" w:pos="4580"/>
+          <w:tab w:val="left" w:pos="5496"/>
+          <w:tab w:val="left" w:pos="6412"/>
+          <w:tab w:val="left" w:pos="7328"/>
+          <w:tab w:val="left" w:pos="8244"/>
+          <w:tab w:val="left" w:pos="9160"/>
+          <w:tab w:val="left" w:pos="10076"/>
+          <w:tab w:val="left" w:pos="10992"/>
+          <w:tab w:val="left" w:pos="11908"/>
+          <w:tab w:val="left" w:pos="12824"/>
+          <w:tab w:val="left" w:pos="13740"/>
+          <w:tab w:val="left" w:pos="14656"/>
+        </w:tabs>
+        <w:wordWrap w:val="0"/>
+        <w:jc w:val="left"/>
+        <w:rPr>
+          <w:rFonts w:eastAsia="Times New Roman"/>
+          <w:sz w:val="19"/>
+          <w:szCs w:val="19"/>
+        </w:rPr>
+      </w:pPr>
+      <w:r>
+        <w:rPr>
+          <w:rFonts w:eastAsia="Times New Roman"/>
+          <w:sz w:val="19"/>
+          <w:szCs w:val="19"/>
+        </w:rPr>
+        <w:t xml:space="preserve">   - Skipping the anomalous value.</w:t>
+      </w:r>
+    </w:p>
+    <w:p>
+      <w:pPr>
+        <w:tabs>
+          <w:tab w:val="left" w:pos="916"/>
+          <w:tab w:val="left" w:pos="1832"/>
+          <w:tab w:val="left" w:pos="2748"/>
+          <w:tab w:val="left" w:pos="3664"/>
+          <w:tab w:val="left" w:pos="4580"/>
+          <w:tab w:val="left" w:pos="5496"/>
+          <w:tab w:val="left" w:pos="6412"/>
+          <w:tab w:val="left" w:pos="7328"/>
+          <w:tab w:val="left" w:pos="8244"/>
+          <w:tab w:val="left" w:pos="9160"/>
+          <w:tab w:val="left" w:pos="10076"/>
+          <w:tab w:val="left" w:pos="10992"/>
+          <w:tab w:val="left" w:pos="11908"/>
+          <w:tab w:val="left" w:pos="12824"/>
+          <w:tab w:val="left" w:pos="13740"/>
+          <w:tab w:val="left" w:pos="14656"/>
+        </w:tabs>
+        <w:wordWrap w:val="0"/>
+        <w:jc w:val="left"/>
+        <w:rPr>
+          <w:rFonts w:eastAsia="Times New Roman"/>
+          <w:sz w:val="19"/>
+          <w:szCs w:val="19"/>
+        </w:rPr>
+      </w:pPr>
+    </w:p>
+    <w:p>
+      <w:pPr>
+        <w:tabs>
+          <w:tab w:val="left" w:pos="916"/>
+          <w:tab w:val="left" w:pos="1832"/>
+          <w:tab w:val="left" w:pos="2748"/>
+          <w:tab w:val="left" w:pos="3664"/>
+          <w:tab w:val="left" w:pos="4580"/>
+          <w:tab w:val="left" w:pos="5496"/>
+          <w:tab w:val="left" w:pos="6412"/>
+          <w:tab w:val="left" w:pos="7328"/>
+          <w:tab w:val="left" w:pos="8244"/>
+          <w:tab w:val="left" w:pos="9160"/>
+          <w:tab w:val="left" w:pos="10076"/>
+          <w:tab w:val="left" w:pos="10992"/>
+          <w:tab w:val="left" w:pos="11908"/>
+          <w:tab w:val="left" w:pos="12824"/>
+          <w:tab w:val="left" w:pos="13740"/>
+          <w:tab w:val="left" w:pos="14656"/>
+        </w:tabs>
+        <w:wordWrap w:val="0"/>
+        <w:jc w:val="left"/>
+        <w:rPr>
+          <w:rFonts w:eastAsia="Times New Roman"/>
+          <w:sz w:val="19"/>
+          <w:szCs w:val="19"/>
+        </w:rPr>
+      </w:pPr>
+    </w:p>
+    <w:p>
+      <w:pPr>
+        <w:tabs>
+          <w:tab w:val="left" w:pos="916"/>
+          <w:tab w:val="left" w:pos="1832"/>
+          <w:tab w:val="left" w:pos="2748"/>
+          <w:tab w:val="left" w:pos="3664"/>
+          <w:tab w:val="left" w:pos="4580"/>
+          <w:tab w:val="left" w:pos="5496"/>
+          <w:tab w:val="left" w:pos="6412"/>
+          <w:tab w:val="left" w:pos="7328"/>
+          <w:tab w:val="left" w:pos="8244"/>
+          <w:tab w:val="left" w:pos="9160"/>
+          <w:tab w:val="left" w:pos="10076"/>
+          <w:tab w:val="left" w:pos="10992"/>
+          <w:tab w:val="left" w:pos="11908"/>
+          <w:tab w:val="left" w:pos="12824"/>
+          <w:tab w:val="left" w:pos="13740"/>
+          <w:tab w:val="left" w:pos="14656"/>
+        </w:tabs>
+        <w:wordWrap w:val="0"/>
+        <w:jc w:val="left"/>
+        <w:rPr>
+          <w:rFonts w:eastAsia="Times New Roman"/>
+          <w:sz w:val="19"/>
+          <w:szCs w:val="19"/>
+        </w:rPr>
+      </w:pPr>
+      <w:r>
+        <w:rPr>
+          <w:rFonts w:eastAsia="Times New Roman"/>
+          <w:sz w:val="19"/>
+          <w:szCs w:val="19"/>
+        </w:rPr>
+        <w:t>Processing Element: 4</w:t>
+      </w:r>
+    </w:p>
+    <w:p>
+      <w:pPr>
+        <w:tabs>
+          <w:tab w:val="left" w:pos="916"/>
+          <w:tab w:val="left" w:pos="1832"/>
+          <w:tab w:val="left" w:pos="2748"/>
+          <w:tab w:val="left" w:pos="3664"/>
+          <w:tab w:val="left" w:pos="4580"/>
+          <w:tab w:val="left" w:pos="5496"/>
+          <w:tab w:val="left" w:pos="6412"/>
+          <w:tab w:val="left" w:pos="7328"/>
+          <w:tab w:val="left" w:pos="8244"/>
+          <w:tab w:val="left" w:pos="9160"/>
+          <w:tab w:val="left" w:pos="10076"/>
+          <w:tab w:val="left" w:pos="10992"/>
+          <w:tab w:val="left" w:pos="11908"/>
+          <w:tab w:val="left" w:pos="12824"/>
+          <w:tab w:val="left" w:pos="13740"/>
+          <w:tab w:val="left" w:pos="14656"/>
+        </w:tabs>
+        <w:wordWrap w:val="0"/>
+        <w:jc w:val="left"/>
+        <w:rPr>
+          <w:rFonts w:eastAsia="Times New Roman"/>
+          <w:sz w:val="19"/>
+          <w:szCs w:val="19"/>
+        </w:rPr>
+      </w:pPr>
+      <w:r>
+        <w:rPr>
+          <w:rFonts w:eastAsia="Times New Roman"/>
+          <w:sz w:val="19"/>
+          <w:szCs w:val="19"/>
+        </w:rPr>
+        <w:t xml:space="preserve">   - Predicted Next Element: 3</w:t>
+      </w:r>
+    </w:p>
+    <w:p>
+      <w:pPr>
+        <w:tabs>
+          <w:tab w:val="left" w:pos="916"/>
+          <w:tab w:val="left" w:pos="1832"/>
+          <w:tab w:val="left" w:pos="2748"/>
+          <w:tab w:val="left" w:pos="3664"/>
+          <w:tab w:val="left" w:pos="4580"/>
+          <w:tab w:val="left" w:pos="5496"/>
+          <w:tab w:val="left" w:pos="6412"/>
+          <w:tab w:val="left" w:pos="7328"/>
+          <w:tab w:val="left" w:pos="8244"/>
+          <w:tab w:val="left" w:pos="9160"/>
+          <w:tab w:val="left" w:pos="10076"/>
+          <w:tab w:val="left" w:pos="10992"/>
+          <w:tab w:val="left" w:pos="11908"/>
+          <w:tab w:val="left" w:pos="12824"/>
+          <w:tab w:val="left" w:pos="13740"/>
+          <w:tab w:val="left" w:pos="14656"/>
+        </w:tabs>
+        <w:wordWrap w:val="0"/>
+        <w:jc w:val="left"/>
+        <w:rPr>
+          <w:rFonts w:eastAsia="Times New Roman"/>
+          <w:sz w:val="19"/>
+          <w:szCs w:val="19"/>
+        </w:rPr>
+      </w:pPr>
+      <w:r>
+        <w:rPr>
+          <w:rFonts w:eastAsia="Times New Roman"/>
+          <w:sz w:val="19"/>
+          <w:szCs w:val="19"/>
+        </w:rPr>
+        <w:t xml:space="preserve">   - Actual Next Element </w:t>
+      </w:r>
+      <w:proofErr w:type="gramStart"/>
+      <w:r>
+        <w:rPr>
+          <w:rFonts w:eastAsia="Times New Roman"/>
+          <w:sz w:val="19"/>
+          <w:szCs w:val="19"/>
+        </w:rPr>
+        <w:t xml:space="preserve">  :</w:t>
+      </w:r>
+      <w:proofErr w:type="gramEnd"/>
+      <w:r>
+        <w:rPr>
+          <w:rFonts w:eastAsia="Times New Roman"/>
+          <w:sz w:val="19"/>
+          <w:szCs w:val="19"/>
+        </w:rPr>
+        <w:t xml:space="preserve"> 3</w:t>
+      </w:r>
+    </w:p>
+    <w:p>
+      <w:pPr>
+        <w:tabs>
+          <w:tab w:val="left" w:pos="916"/>
+          <w:tab w:val="left" w:pos="1832"/>
+          <w:tab w:val="left" w:pos="2748"/>
+          <w:tab w:val="left" w:pos="3664"/>
+          <w:tab w:val="left" w:pos="4580"/>
+          <w:tab w:val="left" w:pos="5496"/>
+          <w:tab w:val="left" w:pos="6412"/>
+          <w:tab w:val="left" w:pos="7328"/>
+          <w:tab w:val="left" w:pos="8244"/>
+          <w:tab w:val="left" w:pos="9160"/>
+          <w:tab w:val="left" w:pos="10076"/>
+          <w:tab w:val="left" w:pos="10992"/>
+          <w:tab w:val="left" w:pos="11908"/>
+          <w:tab w:val="left" w:pos="12824"/>
+          <w:tab w:val="left" w:pos="13740"/>
+          <w:tab w:val="left" w:pos="14656"/>
+        </w:tabs>
+        <w:wordWrap w:val="0"/>
+        <w:jc w:val="left"/>
+        <w:rPr>
+          <w:rFonts w:eastAsia="Times New Roman"/>
+          <w:sz w:val="19"/>
+          <w:szCs w:val="19"/>
+        </w:rPr>
+      </w:pPr>
+      <w:r>
+        <w:rPr>
+          <w:rFonts w:eastAsia="Times New Roman"/>
+          <w:sz w:val="19"/>
+          <w:szCs w:val="19"/>
+        </w:rPr>
+        <w:t xml:space="preserve">   - Similarity Score    </w:t>
+      </w:r>
+      <w:proofErr w:type="gramStart"/>
+      <w:r>
+        <w:rPr>
+          <w:rFonts w:eastAsia="Times New Roman"/>
+          <w:sz w:val="19"/>
+          <w:szCs w:val="19"/>
+        </w:rPr>
+        <w:t xml:space="preserve">  :</w:t>
+      </w:r>
+      <w:proofErr w:type="gramEnd"/>
+      <w:r>
+        <w:rPr>
+          <w:rFonts w:eastAsia="Times New Roman"/>
+          <w:sz w:val="19"/>
+          <w:szCs w:val="19"/>
+        </w:rPr>
+        <w:t xml:space="preserve"> 16.67</w:t>
+      </w:r>
+    </w:p>
+    <w:p>
+      <w:pPr>
+        <w:tabs>
+          <w:tab w:val="left" w:pos="916"/>
+          <w:tab w:val="left" w:pos="1832"/>
+          <w:tab w:val="left" w:pos="2748"/>
+          <w:tab w:val="left" w:pos="3664"/>
+          <w:tab w:val="left" w:pos="4580"/>
+          <w:tab w:val="left" w:pos="5496"/>
+          <w:tab w:val="left" w:pos="6412"/>
+          <w:tab w:val="left" w:pos="7328"/>
+          <w:tab w:val="left" w:pos="8244"/>
+          <w:tab w:val="left" w:pos="9160"/>
+          <w:tab w:val="left" w:pos="10076"/>
+          <w:tab w:val="left" w:pos="10992"/>
+          <w:tab w:val="left" w:pos="11908"/>
+          <w:tab w:val="left" w:pos="12824"/>
+          <w:tab w:val="left" w:pos="13740"/>
+          <w:tab w:val="left" w:pos="14656"/>
+        </w:tabs>
+        <w:wordWrap w:val="0"/>
+        <w:jc w:val="left"/>
+        <w:rPr>
+          <w:rFonts w:eastAsia="Times New Roman"/>
+          <w:sz w:val="19"/>
+          <w:szCs w:val="19"/>
+        </w:rPr>
+      </w:pPr>
+      <w:r>
+        <w:rPr>
+          <w:rFonts w:eastAsia="Times New Roman"/>
+          <w:sz w:val="19"/>
+          <w:szCs w:val="19"/>
+        </w:rPr>
+        <w:t xml:space="preserve">   - Predicted Sequence  </w:t>
+      </w:r>
+      <w:proofErr w:type="gramStart"/>
+      <w:r>
+        <w:rPr>
+          <w:rFonts w:eastAsia="Times New Roman"/>
+          <w:sz w:val="19"/>
+          <w:szCs w:val="19"/>
+        </w:rPr>
+        <w:t xml:space="preserve">  :</w:t>
+      </w:r>
+      <w:proofErr w:type="gramEnd"/>
+      <w:r>
+        <w:rPr>
+          <w:rFonts w:eastAsia="Times New Roman"/>
+          <w:sz w:val="19"/>
+          <w:szCs w:val="19"/>
+        </w:rPr>
+        <w:t xml:space="preserve"> S1_9-2-5-8-2-4-3-5-4-3</w:t>
+      </w:r>
+    </w:p>
+    <w:p>
+      <w:pPr>
+        <w:tabs>
+          <w:tab w:val="left" w:pos="916"/>
+          <w:tab w:val="left" w:pos="1832"/>
+          <w:tab w:val="left" w:pos="2748"/>
+          <w:tab w:val="left" w:pos="3664"/>
+          <w:tab w:val="left" w:pos="4580"/>
+          <w:tab w:val="left" w:pos="5496"/>
+          <w:tab w:val="left" w:pos="6412"/>
+          <w:tab w:val="left" w:pos="7328"/>
+          <w:tab w:val="left" w:pos="8244"/>
+          <w:tab w:val="left" w:pos="9160"/>
+          <w:tab w:val="left" w:pos="10076"/>
+          <w:tab w:val="left" w:pos="10992"/>
+          <w:tab w:val="left" w:pos="11908"/>
+          <w:tab w:val="left" w:pos="12824"/>
+          <w:tab w:val="left" w:pos="13740"/>
+          <w:tab w:val="left" w:pos="14656"/>
+        </w:tabs>
+        <w:wordWrap w:val="0"/>
+        <w:jc w:val="left"/>
+        <w:rPr>
+          <w:rFonts w:eastAsia="Times New Roman"/>
+          <w:sz w:val="19"/>
+          <w:szCs w:val="19"/>
+        </w:rPr>
+      </w:pPr>
+      <w:r>
+        <w:rPr>
+          <w:rFonts w:eastAsia="Times New Roman"/>
+          <w:sz w:val="19"/>
+          <w:szCs w:val="19"/>
+        </w:rPr>
+        <w:t>No Anomaly Detected!</w:t>
+      </w:r>
+    </w:p>
+    <w:p>
+      <w:pPr>
+        <w:tabs>
+          <w:tab w:val="left" w:pos="916"/>
+          <w:tab w:val="left" w:pos="1832"/>
+          <w:tab w:val="left" w:pos="2748"/>
+          <w:tab w:val="left" w:pos="3664"/>
+          <w:tab w:val="left" w:pos="4580"/>
+          <w:tab w:val="left" w:pos="5496"/>
+          <w:tab w:val="left" w:pos="6412"/>
+          <w:tab w:val="left" w:pos="7328"/>
+          <w:tab w:val="left" w:pos="8244"/>
+          <w:tab w:val="left" w:pos="9160"/>
+          <w:tab w:val="left" w:pos="10076"/>
+          <w:tab w:val="left" w:pos="10992"/>
+          <w:tab w:val="left" w:pos="11908"/>
+          <w:tab w:val="left" w:pos="12824"/>
+          <w:tab w:val="left" w:pos="13740"/>
+          <w:tab w:val="left" w:pos="14656"/>
+        </w:tabs>
+        <w:wordWrap w:val="0"/>
+        <w:jc w:val="left"/>
+        <w:rPr>
+          <w:rFonts w:eastAsia="Times New Roman"/>
+          <w:sz w:val="19"/>
+          <w:szCs w:val="19"/>
+        </w:rPr>
+      </w:pPr>
+    </w:p>
+    <w:p>
+      <w:pPr>
+        <w:tabs>
+          <w:tab w:val="left" w:pos="916"/>
+          <w:tab w:val="left" w:pos="1832"/>
+          <w:tab w:val="left" w:pos="2748"/>
+          <w:tab w:val="left" w:pos="3664"/>
+          <w:tab w:val="left" w:pos="4580"/>
+          <w:tab w:val="left" w:pos="5496"/>
+          <w:tab w:val="left" w:pos="6412"/>
+          <w:tab w:val="left" w:pos="7328"/>
+          <w:tab w:val="left" w:pos="8244"/>
+          <w:tab w:val="left" w:pos="9160"/>
+          <w:tab w:val="left" w:pos="10076"/>
+          <w:tab w:val="left" w:pos="10992"/>
+          <w:tab w:val="left" w:pos="11908"/>
+          <w:tab w:val="left" w:pos="12824"/>
+          <w:tab w:val="left" w:pos="13740"/>
+          <w:tab w:val="left" w:pos="14656"/>
+        </w:tabs>
+        <w:wordWrap w:val="0"/>
+        <w:jc w:val="left"/>
+        <w:rPr>
+          <w:rFonts w:eastAsia="Times New Roman"/>
+          <w:sz w:val="19"/>
+          <w:szCs w:val="19"/>
+        </w:rPr>
+      </w:pPr>
+    </w:p>
+    <w:p>
+      <w:pPr>
+        <w:tabs>
+          <w:tab w:val="left" w:pos="916"/>
+          <w:tab w:val="left" w:pos="1832"/>
+          <w:tab w:val="left" w:pos="2748"/>
+          <w:tab w:val="left" w:pos="3664"/>
+          <w:tab w:val="left" w:pos="4580"/>
+          <w:tab w:val="left" w:pos="5496"/>
+          <w:tab w:val="left" w:pos="6412"/>
+          <w:tab w:val="left" w:pos="7328"/>
+          <w:tab w:val="left" w:pos="8244"/>
+          <w:tab w:val="left" w:pos="9160"/>
+          <w:tab w:val="left" w:pos="10076"/>
+          <w:tab w:val="left" w:pos="10992"/>
+          <w:tab w:val="left" w:pos="11908"/>
+          <w:tab w:val="left" w:pos="12824"/>
+          <w:tab w:val="left" w:pos="13740"/>
+          <w:tab w:val="left" w:pos="14656"/>
+        </w:tabs>
+        <w:wordWrap w:val="0"/>
+        <w:jc w:val="left"/>
+        <w:rPr>
+          <w:rFonts w:eastAsia="Times New Roman"/>
+          <w:sz w:val="19"/>
+          <w:szCs w:val="19"/>
+        </w:rPr>
+      </w:pPr>
+      <w:r>
+        <w:rPr>
+          <w:rFonts w:eastAsia="Times New Roman"/>
+          <w:sz w:val="19"/>
+          <w:szCs w:val="19"/>
+        </w:rPr>
+        <w:t>Predicted Sequence: [-, 3, 4, 3, -, 4, 3, 5, -, 3]</w:t>
+      </w:r>
+    </w:p>
+    <w:p>
+      <w:pPr>
+        <w:tabs>
+          <w:tab w:val="left" w:pos="916"/>
+          <w:tab w:val="left" w:pos="1832"/>
+          <w:tab w:val="left" w:pos="2748"/>
+          <w:tab w:val="left" w:pos="3664"/>
+          <w:tab w:val="left" w:pos="4580"/>
+          <w:tab w:val="left" w:pos="5496"/>
+          <w:tab w:val="left" w:pos="6412"/>
+          <w:tab w:val="left" w:pos="7328"/>
+          <w:tab w:val="left" w:pos="8244"/>
+          <w:tab w:val="left" w:pos="9160"/>
+          <w:tab w:val="left" w:pos="10076"/>
+          <w:tab w:val="left" w:pos="10992"/>
+          <w:tab w:val="left" w:pos="11908"/>
+          <w:tab w:val="left" w:pos="12824"/>
+          <w:tab w:val="left" w:pos="13740"/>
+          <w:tab w:val="left" w:pos="14656"/>
+        </w:tabs>
+        <w:wordWrap w:val="0"/>
+        <w:jc w:val="left"/>
+        <w:rPr>
+          <w:rFonts w:eastAsia="Times New Roman"/>
+          <w:sz w:val="19"/>
+          <w:szCs w:val="19"/>
+        </w:rPr>
+      </w:pPr>
+    </w:p>
+    <w:p>
+      <w:pPr>
+        <w:tabs>
+          <w:tab w:val="left" w:pos="916"/>
+          <w:tab w:val="left" w:pos="1832"/>
+          <w:tab w:val="left" w:pos="2748"/>
+          <w:tab w:val="left" w:pos="3664"/>
+          <w:tab w:val="left" w:pos="4580"/>
+          <w:tab w:val="left" w:pos="5496"/>
+          <w:tab w:val="left" w:pos="6412"/>
+          <w:tab w:val="left" w:pos="7328"/>
+          <w:tab w:val="left" w:pos="8244"/>
+          <w:tab w:val="left" w:pos="9160"/>
+          <w:tab w:val="left" w:pos="10076"/>
+          <w:tab w:val="left" w:pos="10992"/>
+          <w:tab w:val="left" w:pos="11908"/>
+          <w:tab w:val="left" w:pos="12824"/>
+          <w:tab w:val="left" w:pos="13740"/>
+          <w:tab w:val="left" w:pos="14656"/>
+        </w:tabs>
+        <w:wordWrap w:val="0"/>
+        <w:jc w:val="left"/>
+        <w:rPr>
+          <w:rFonts w:eastAsia="Times New Roman"/>
+          <w:sz w:val="19"/>
+          <w:szCs w:val="19"/>
+        </w:rPr>
+      </w:pPr>
+    </w:p>
+    <w:p>
+      <w:pPr>
+        <w:tabs>
+          <w:tab w:val="left" w:pos="916"/>
+          <w:tab w:val="left" w:pos="1832"/>
+          <w:tab w:val="left" w:pos="2748"/>
+          <w:tab w:val="left" w:pos="3664"/>
+          <w:tab w:val="left" w:pos="4580"/>
+          <w:tab w:val="left" w:pos="5496"/>
+          <w:tab w:val="left" w:pos="6412"/>
+          <w:tab w:val="left" w:pos="7328"/>
+          <w:tab w:val="left" w:pos="8244"/>
+          <w:tab w:val="left" w:pos="9160"/>
+          <w:tab w:val="left" w:pos="10076"/>
+          <w:tab w:val="left" w:pos="10992"/>
+          <w:tab w:val="left" w:pos="11908"/>
+          <w:tab w:val="left" w:pos="12824"/>
+          <w:tab w:val="left" w:pos="13740"/>
+          <w:tab w:val="left" w:pos="14656"/>
+        </w:tabs>
+        <w:wordWrap w:val="0"/>
+        <w:jc w:val="left"/>
+        <w:rPr>
+          <w:rFonts w:eastAsia="Times New Roman"/>
+          <w:sz w:val="19"/>
+          <w:szCs w:val="19"/>
+        </w:rPr>
+      </w:pPr>
+      <w:r>
+        <w:rPr>
+          <w:rFonts w:eastAsia="Times New Roman"/>
+          <w:sz w:val="19"/>
+          <w:szCs w:val="19"/>
+        </w:rPr>
+        <w:t>===========================================</w:t>
+      </w:r>
+    </w:p>
+    <w:p>
+      <w:pPr>
+        <w:tabs>
+          <w:tab w:val="left" w:pos="916"/>
+          <w:tab w:val="left" w:pos="1832"/>
+          <w:tab w:val="left" w:pos="2748"/>
+          <w:tab w:val="left" w:pos="3664"/>
+          <w:tab w:val="left" w:pos="4580"/>
+          <w:tab w:val="left" w:pos="5496"/>
+          <w:tab w:val="left" w:pos="6412"/>
+          <w:tab w:val="left" w:pos="7328"/>
+          <w:tab w:val="left" w:pos="8244"/>
+          <w:tab w:val="left" w:pos="9160"/>
+          <w:tab w:val="left" w:pos="10076"/>
+          <w:tab w:val="left" w:pos="10992"/>
+          <w:tab w:val="left" w:pos="11908"/>
+          <w:tab w:val="left" w:pos="12824"/>
+          <w:tab w:val="left" w:pos="13740"/>
+          <w:tab w:val="left" w:pos="14656"/>
+        </w:tabs>
+        <w:wordWrap w:val="0"/>
+        <w:jc w:val="left"/>
+        <w:rPr>
+          <w:rFonts w:eastAsia="Times New Roman"/>
+          <w:sz w:val="19"/>
+          <w:szCs w:val="19"/>
+        </w:rPr>
+      </w:pPr>
+      <w:r>
+        <w:rPr>
+          <w:rFonts w:eastAsia="Times New Roman"/>
+          <w:sz w:val="19"/>
+          <w:szCs w:val="19"/>
+        </w:rPr>
+        <w:t xml:space="preserve">        ANOMALY DETECTION COMPLETED</w:t>
+      </w:r>
+    </w:p>
+    <w:p>
+      <w:pPr>
+        <w:tabs>
+          <w:tab w:val="left" w:pos="916"/>
+          <w:tab w:val="left" w:pos="1832"/>
+          <w:tab w:val="left" w:pos="2748"/>
+          <w:tab w:val="left" w:pos="3664"/>
+          <w:tab w:val="left" w:pos="4580"/>
+          <w:tab w:val="left" w:pos="5496"/>
+          <w:tab w:val="left" w:pos="6412"/>
+          <w:tab w:val="left" w:pos="7328"/>
+          <w:tab w:val="left" w:pos="8244"/>
+          <w:tab w:val="left" w:pos="9160"/>
+          <w:tab w:val="left" w:pos="10076"/>
+          <w:tab w:val="left" w:pos="10992"/>
+          <w:tab w:val="left" w:pos="11908"/>
+          <w:tab w:val="left" w:pos="12824"/>
+          <w:tab w:val="left" w:pos="13740"/>
+          <w:tab w:val="left" w:pos="14656"/>
+        </w:tabs>
+        <w:wordWrap w:val="0"/>
+        <w:jc w:val="left"/>
+        <w:rPr>
+          <w:rFonts w:eastAsia="Times New Roman"/>
+          <w:sz w:val="19"/>
+          <w:szCs w:val="19"/>
+        </w:rPr>
+      </w:pPr>
+      <w:r>
+        <w:rPr>
+          <w:rFonts w:eastAsia="Times New Roman"/>
+          <w:sz w:val="19"/>
+          <w:szCs w:val="19"/>
+        </w:rPr>
+        <w:t>===========================================</w:t>
+      </w:r>
+    </w:p>
+    <w:p>
+      <w:pPr>
+        <w:tabs>
+          <w:tab w:val="left" w:pos="916"/>
+          <w:tab w:val="left" w:pos="1832"/>
+          <w:tab w:val="left" w:pos="2748"/>
+          <w:tab w:val="left" w:pos="3664"/>
+          <w:tab w:val="left" w:pos="4580"/>
+          <w:tab w:val="left" w:pos="5496"/>
+          <w:tab w:val="left" w:pos="6412"/>
+          <w:tab w:val="left" w:pos="7328"/>
+          <w:tab w:val="left" w:pos="8244"/>
+          <w:tab w:val="left" w:pos="9160"/>
+          <w:tab w:val="left" w:pos="10076"/>
+          <w:tab w:val="left" w:pos="10992"/>
+          <w:tab w:val="left" w:pos="11908"/>
+          <w:tab w:val="left" w:pos="12824"/>
+          <w:tab w:val="left" w:pos="13740"/>
+          <w:tab w:val="left" w:pos="14656"/>
+        </w:tabs>
+        <w:wordWrap w:val="0"/>
+        <w:jc w:val="left"/>
+        <w:rPr>
+          <w:rFonts w:eastAsia="Times New Roman"/>
+          <w:sz w:val="19"/>
+          <w:szCs w:val="19"/>
+        </w:rPr>
+      </w:pPr>
+    </w:p>
+    <w:p>
+      <w:pPr>
+        <w:tabs>
+          <w:tab w:val="left" w:pos="916"/>
+          <w:tab w:val="left" w:pos="1832"/>
+          <w:tab w:val="left" w:pos="2748"/>
+          <w:tab w:val="left" w:pos="3664"/>
+          <w:tab w:val="left" w:pos="4580"/>
+          <w:tab w:val="left" w:pos="5496"/>
+          <w:tab w:val="left" w:pos="6412"/>
+          <w:tab w:val="left" w:pos="7328"/>
+          <w:tab w:val="left" w:pos="8244"/>
+          <w:tab w:val="left" w:pos="9160"/>
+          <w:tab w:val="left" w:pos="10076"/>
+          <w:tab w:val="left" w:pos="10992"/>
+          <w:tab w:val="left" w:pos="11908"/>
+          <w:tab w:val="left" w:pos="12824"/>
+          <w:tab w:val="left" w:pos="13740"/>
+          <w:tab w:val="left" w:pos="14656"/>
+        </w:tabs>
+        <w:wordWrap w:val="0"/>
+        <w:jc w:val="left"/>
+        <w:rPr>
+          <w:rFonts w:eastAsia="Times New Roman"/>
+          <w:sz w:val="19"/>
+          <w:szCs w:val="19"/>
+        </w:rPr>
+      </w:pPr>
+      <w:r>
+        <w:rPr>
+          <w:rFonts w:eastAsia="Times New Roman"/>
+          <w:sz w:val="19"/>
+          <w:szCs w:val="19"/>
+        </w:rPr>
+        <w:t>CSV file created successfully!</w:t>
+      </w:r>
+    </w:p>
+    <w:p>
+      <w:pPr>
         <w:jc w:val="both"/>
         <w:rPr>
           <w:lang w:eastAsia="x-none"/>
@@ -5615,7 +9182,6 @@
         <w:pStyle w:val="Heading1"/>
       </w:pPr>
       <w:r>
-        <w:lastRenderedPageBreak/>
         <w:t>Ease of Use</w:t>
       </w:r>
     </w:p>
@@ -5781,7 +9347,11 @@
       </w:r>
       <w:proofErr w:type="spellEnd"/>
       <w:r>
-        <w:t>. This often leads to confusion because equations do not balance dimensionally. If you must use mixed units, clearly state the units for each quantity that you use in an equation.</w:t>
+        <w:t xml:space="preserve">. This often leads to confusion because equations do not balance dimensionally. If you must use mixed units, clearly </w:t>
+      </w:r>
+      <w:r>
+        <w:lastRenderedPageBreak/>
+        <w:t>state the units for each quantity that you use in an equation.</w:t>
       </w:r>
     </w:p>
     <w:p>
@@ -6157,11 +9727,7 @@
         <w:t xml:space="preserve"> </w:t>
       </w:r>
       <w:r>
-        <w:t xml:space="preserve">Please keep your affiliations as succinct </w:t>
-      </w:r>
-      <w:r>
-        <w:lastRenderedPageBreak/>
-        <w:t>as possible (for example, do not differentiate among departments of the same organization).</w:t>
+        <w:t>Please keep your affiliations as succinct as possible (for example, do not differentiate among departments of the same organization).</w:t>
       </w:r>
     </w:p>
     <w:p>
@@ -6461,6 +10027,7 @@
               <w:pStyle w:val="tablecolhead"/>
             </w:pPr>
             <w:r>
+              <w:lastRenderedPageBreak/>
               <w:t>Table Head</w:t>
             </w:r>
           </w:p>
@@ -7345,7 +10912,6 @@
         <w:ind w:left="354" w:hanging="354"/>
       </w:pPr>
       <w:r>
-        <w:lastRenderedPageBreak/>
         <w:t>Y. Yorozu, M. Hirano, K. Oka, and Y. Tagawa, “Electron spectroscopy studies on magneto-optical media and plastic substrate interface,” IEEE Transl. J. Magn. Japan, vol. 2, pp. 740–741, August 1987 [Digests 9th Annual Conf. Magnetics Japan, p. 301, 1982].</w:t>
       </w:r>
     </w:p>
@@ -7600,7 +11166,7 @@
     <w:p>
       <w:r>
         <w:pict w14:anchorId="4A67007D">
-          <v:shape id="_x0000_s2056" type="#_x0000_t202" style="position:absolute;left:0;text-align:left;margin-left:0;margin-top:19.8pt;width:252pt;height:90pt;z-index:-9;mso-wrap-edited:f;mso-position-horizontal:left;mso-position-horizontal-relative:margin" wrapcoords="-64 0 -64 21600 21664 21600 21664 0 -64 0">
+          <v:shape id="_x0000_s2056" type="#_x0000_t202" style="position:absolute;left:0;text-align:left;margin-left:0;margin-top:19.8pt;width:252pt;height:90pt;z-index:-10;mso-wrap-edited:f;mso-position-horizontal:left;mso-position-horizontal-relative:margin" wrapcoords="-64 0 -64 21600 21664 21600 21664 0 -64 0">
             <v:textbox style="mso-next-textbox:#_x0000_s2056">
               <w:txbxContent>
                 <w:p>

</xml_diff>

<commit_message>
Add project discussion in paper
</commit_message>
<xml_diff>
--- a/source/MySEProject/Documentation/ML 24-25-03 Implement Anomaly Detection Sample.docx
+++ b/source/MySEProject/Documentation/ML 24-25-03 Implement Anomaly Detection Sample.docx
@@ -488,7 +488,7 @@
             <v:stroke joinstyle="miter"/>
             <v:path gradientshapeok="t" o:connecttype="rect"/>
           </v:shapetype>
-          <v:shape id="_x0000_s2062" type="#_x0000_t202" style="position:absolute;margin-left:-.35pt;margin-top:9.1pt;width:240pt;height:147.75pt;z-index:5">
+          <v:shape id="_x0000_s2062" type="#_x0000_t202" style="position:absolute;margin-left:-.35pt;margin-top:9.1pt;width:240pt;height:147.75pt;z-index:2">
             <v:fill r:id="rId10" o:title="Screenshot 2025-03-09 210235" recolor="t" type="frame"/>
             <v:textbox style="mso-next-textbox:#_x0000_s2062">
               <w:txbxContent>
@@ -617,7 +617,7 @@
           <w:lang w:eastAsia="x-none"/>
         </w:rPr>
         <w:pict w14:anchorId="1DA921E3">
-          <v:shape id="_x0000_s2061" type="#_x0000_t202" style="position:absolute;margin-left:.85pt;margin-top:10.8pt;width:242.25pt;height:52.25pt;z-index:4">
+          <v:shape id="_x0000_s2061" type="#_x0000_t202" style="position:absolute;margin-left:.85pt;margin-top:10.8pt;width:242.25pt;height:52.25pt;z-index:1">
             <v:fill r:id="rId11" o:title="HtmPipeline" recolor="t" type="frame"/>
             <v:textbox style="mso-next-textbox:#_x0000_s2061">
               <w:txbxContent>
@@ -1407,7 +1407,7 @@
           <w:szCs w:val="19"/>
         </w:rPr>
         <w:pict w14:anchorId="44F3BB9E">
-          <v:shape id="_x0000_s2063" type="#_x0000_t202" style="position:absolute;margin-left:-3.35pt;margin-top:11.7pt;width:235.5pt;height:163.5pt;z-index:6">
+          <v:shape id="_x0000_s2063" type="#_x0000_t202" style="position:absolute;margin-left:-3.35pt;margin-top:11.7pt;width:235.5pt;height:163.5pt;z-index:3">
             <v:textbox style="mso-next-textbox:#_x0000_s2063">
               <w:txbxContent>
                 <w:p>
@@ -2572,7 +2572,7 @@
           <w:noProof/>
         </w:rPr>
         <w:pict w14:anchorId="250DEC21">
-          <v:shape id="_x0000_s2064" type="#_x0000_t202" style="position:absolute;margin-left:1.9pt;margin-top:8.55pt;width:241.2pt;height:28.5pt;z-index:7">
+          <v:shape id="_x0000_s2064" type="#_x0000_t202" style="position:absolute;margin-left:1.9pt;margin-top:8.55pt;width:241.2pt;height:28.5pt;z-index:4">
             <v:textbox style="mso-next-textbox:#_x0000_s2064">
               <w:txbxContent>
                 <w:p>
@@ -2811,7 +2811,7 @@
           <w:noProof/>
         </w:rPr>
         <w:pict w14:anchorId="22288009">
-          <v:shape id="_x0000_s2065" type="#_x0000_t202" style="position:absolute;margin-left:1.9pt;margin-top:4.55pt;width:241.2pt;height:39.75pt;z-index:8">
+          <v:shape id="_x0000_s2065" type="#_x0000_t202" style="position:absolute;margin-left:1.9pt;margin-top:4.55pt;width:241.2pt;height:39.75pt;z-index:5">
             <v:textbox style="mso-next-textbox:#_x0000_s2065">
               <w:txbxContent>
                 <w:p>
@@ -3163,7 +3163,7 @@
           <w:noProof/>
         </w:rPr>
         <w:pict w14:anchorId="4B834485">
-          <v:shape id="_x0000_s2066" type="#_x0000_t202" style="position:absolute;margin-left:.85pt;margin-top:5.45pt;width:242.25pt;height:121.5pt;z-index:9">
+          <v:shape id="_x0000_s2066" type="#_x0000_t202" style="position:absolute;margin-left:.85pt;margin-top:5.45pt;width:242.25pt;height:121.5pt;z-index:6">
             <v:textbox style="mso-next-textbox:#_x0000_s2066">
               <w:txbxContent>
                 <w:p>
@@ -4085,7 +4085,7 @@
           <w:noProof/>
         </w:rPr>
         <w:pict w14:anchorId="05E8859A">
-          <v:shape id="_x0000_s2067" type="#_x0000_t202" style="position:absolute;margin-left:-1.1pt;margin-top:-.75pt;width:243.75pt;height:171.25pt;z-index:10">
+          <v:shape id="_x0000_s2067" type="#_x0000_t202" style="position:absolute;margin-left:-1.1pt;margin-top:-.75pt;width:243.75pt;height:171.25pt;z-index:7">
             <v:fill r:id="rId12" o:title="WhatsApp Image 2025-03-05 at 8.39" recolor="t" type="frame"/>
             <v:textbox style="mso-next-textbox:#_x0000_s2067">
               <w:txbxContent>
@@ -5296,7 +5296,7 @@
           <w:szCs w:val="19"/>
         </w:rPr>
         <w:pict w14:anchorId="5D2B0A10">
-          <v:shape id="_x0000_s2068" type="#_x0000_t202" style="position:absolute;margin-left:.85pt;margin-top:.8pt;width:241.8pt;height:73.4pt;z-index:11">
+          <v:shape id="_x0000_s2068" type="#_x0000_t202" style="position:absolute;margin-left:.85pt;margin-top:.8pt;width:241.8pt;height:73.4pt;z-index:8">
             <v:textbox style="mso-next-textbox:#_x0000_s2068">
               <w:txbxContent>
                 <w:p>
@@ -5558,7 +5558,7 @@
           <w:szCs w:val="19"/>
         </w:rPr>
         <w:pict w14:anchorId="64724B7C">
-          <v:shape id="_x0000_s2069" type="#_x0000_t202" style="position:absolute;margin-left:.85pt;margin-top:1.1pt;width:241.8pt;height:19.65pt;z-index:12">
+          <v:shape id="_x0000_s2069" type="#_x0000_t202" style="position:absolute;margin-left:.85pt;margin-top:1.1pt;width:241.8pt;height:19.65pt;z-index:9">
             <v:textbox style="mso-next-textbox:#_x0000_s2069">
               <w:txbxContent>
                 <w:p>
@@ -9049,1885 +9049,558 @@
     </w:p>
     <w:p>
       <w:pPr>
-        <w:jc w:val="both"/>
-        <w:rPr>
-          <w:lang w:eastAsia="x-none"/>
-        </w:rPr>
-      </w:pPr>
-    </w:p>
-    <w:p>
-      <w:pPr>
-        <w:jc w:val="both"/>
-        <w:rPr>
-          <w:lang w:eastAsia="x-none"/>
-        </w:rPr>
-      </w:pPr>
-      <w:r>
-        <w:t>Method</w:t>
-      </w:r>
-      <w:r>
-        <w:t>s</w:t>
-      </w:r>
-    </w:p>
-    <w:p>
-      <w:pPr>
-        <w:pStyle w:val="Heading2"/>
-      </w:pPr>
-      <w:r>
-        <w:t>Data Collection and preprocessing</w:t>
-      </w:r>
-    </w:p>
-    <w:p>
-      <w:pPr>
-        <w:pStyle w:val="Heading2"/>
-      </w:pPr>
-      <w:r>
-        <w:t>MultiSequence Learning and Predictiony</w:t>
-      </w:r>
-    </w:p>
-    <w:p>
-      <w:pPr>
-        <w:pStyle w:val="Heading2"/>
-      </w:pPr>
-      <w:r>
-        <w:t>Implementation</w:t>
-      </w:r>
-    </w:p>
-    <w:p/>
-    <w:p>
-      <w:pPr>
         <w:pStyle w:val="Heading1"/>
       </w:pPr>
       <w:r>
-        <w:t>ANOMALY PATTERN DETECTION</w:t>
-      </w:r>
-    </w:p>
-    <w:p/>
+        <w:t>Discussion</w:t>
+      </w:r>
+    </w:p>
+    <w:p>
+      <w:pPr>
+        <w:tabs>
+          <w:tab w:val="left" w:pos="916"/>
+          <w:tab w:val="left" w:pos="1832"/>
+          <w:tab w:val="left" w:pos="2748"/>
+          <w:tab w:val="left" w:pos="3664"/>
+          <w:tab w:val="left" w:pos="4580"/>
+          <w:tab w:val="left" w:pos="5496"/>
+          <w:tab w:val="left" w:pos="6412"/>
+          <w:tab w:val="left" w:pos="7328"/>
+          <w:tab w:val="left" w:pos="8244"/>
+          <w:tab w:val="left" w:pos="9160"/>
+          <w:tab w:val="left" w:pos="10076"/>
+          <w:tab w:val="left" w:pos="10992"/>
+          <w:tab w:val="left" w:pos="11908"/>
+          <w:tab w:val="left" w:pos="12824"/>
+          <w:tab w:val="left" w:pos="13740"/>
+          <w:tab w:val="left" w:pos="14656"/>
+        </w:tabs>
+        <w:wordWrap w:val="0"/>
+        <w:jc w:val="left"/>
+        <w:rPr>
+          <w:rFonts w:eastAsia="Times New Roman"/>
+          <w:sz w:val="19"/>
+          <w:szCs w:val="19"/>
+        </w:rPr>
+      </w:pPr>
+      <w:r>
+        <w:rPr>
+          <w:rFonts w:eastAsia="Times New Roman"/>
+          <w:sz w:val="19"/>
+          <w:szCs w:val="19"/>
+        </w:rPr>
+        <w:t>We present a working HTM implementation for temporal anomaly detection, demonstrating effective pattern learning through spatial-temporal processing. Future work will address:</w:t>
+      </w:r>
+    </w:p>
+    <w:p>
+      <w:pPr>
+        <w:numPr>
+          <w:ilvl w:val="0"/>
+          <w:numId w:val="30"/>
+        </w:numPr>
+        <w:tabs>
+          <w:tab w:val="left" w:pos="916"/>
+          <w:tab w:val="left" w:pos="1832"/>
+          <w:tab w:val="left" w:pos="2748"/>
+          <w:tab w:val="left" w:pos="3664"/>
+          <w:tab w:val="left" w:pos="4580"/>
+          <w:tab w:val="left" w:pos="5496"/>
+          <w:tab w:val="left" w:pos="6412"/>
+          <w:tab w:val="left" w:pos="7328"/>
+          <w:tab w:val="left" w:pos="8244"/>
+          <w:tab w:val="left" w:pos="9160"/>
+          <w:tab w:val="left" w:pos="10076"/>
+          <w:tab w:val="left" w:pos="10992"/>
+          <w:tab w:val="left" w:pos="11908"/>
+          <w:tab w:val="left" w:pos="12824"/>
+          <w:tab w:val="left" w:pos="13740"/>
+          <w:tab w:val="left" w:pos="14656"/>
+        </w:tabs>
+        <w:wordWrap w:val="0"/>
+        <w:jc w:val="left"/>
+        <w:rPr>
+          <w:rFonts w:eastAsia="Times New Roman"/>
+          <w:sz w:val="19"/>
+          <w:szCs w:val="19"/>
+        </w:rPr>
+      </w:pPr>
+      <w:r>
+        <w:rPr>
+          <w:rFonts w:eastAsia="Times New Roman"/>
+          <w:sz w:val="19"/>
+          <w:szCs w:val="19"/>
+        </w:rPr>
+        <w:t>Dynamic threshold adaptation</w:t>
+      </w:r>
+    </w:p>
+    <w:p>
+      <w:pPr>
+        <w:numPr>
+          <w:ilvl w:val="0"/>
+          <w:numId w:val="30"/>
+        </w:numPr>
+        <w:tabs>
+          <w:tab w:val="left" w:pos="916"/>
+          <w:tab w:val="left" w:pos="1832"/>
+          <w:tab w:val="left" w:pos="2748"/>
+          <w:tab w:val="left" w:pos="3664"/>
+          <w:tab w:val="left" w:pos="4580"/>
+          <w:tab w:val="left" w:pos="5496"/>
+          <w:tab w:val="left" w:pos="6412"/>
+          <w:tab w:val="left" w:pos="7328"/>
+          <w:tab w:val="left" w:pos="8244"/>
+          <w:tab w:val="left" w:pos="9160"/>
+          <w:tab w:val="left" w:pos="10076"/>
+          <w:tab w:val="left" w:pos="10992"/>
+          <w:tab w:val="left" w:pos="11908"/>
+          <w:tab w:val="left" w:pos="12824"/>
+          <w:tab w:val="left" w:pos="13740"/>
+          <w:tab w:val="left" w:pos="14656"/>
+        </w:tabs>
+        <w:wordWrap w:val="0"/>
+        <w:jc w:val="left"/>
+        <w:rPr>
+          <w:rFonts w:eastAsia="Times New Roman"/>
+          <w:sz w:val="19"/>
+          <w:szCs w:val="19"/>
+        </w:rPr>
+      </w:pPr>
+      <w:r>
+        <w:rPr>
+          <w:rFonts w:eastAsia="Times New Roman"/>
+          <w:sz w:val="19"/>
+          <w:szCs w:val="19"/>
+        </w:rPr>
+        <w:t>Distributed training</w:t>
+      </w:r>
+    </w:p>
+    <w:p>
+      <w:pPr>
+        <w:numPr>
+          <w:ilvl w:val="0"/>
+          <w:numId w:val="30"/>
+        </w:numPr>
+        <w:tabs>
+          <w:tab w:val="left" w:pos="916"/>
+          <w:tab w:val="left" w:pos="1832"/>
+          <w:tab w:val="left" w:pos="2748"/>
+          <w:tab w:val="left" w:pos="3664"/>
+          <w:tab w:val="left" w:pos="4580"/>
+          <w:tab w:val="left" w:pos="5496"/>
+          <w:tab w:val="left" w:pos="6412"/>
+          <w:tab w:val="left" w:pos="7328"/>
+          <w:tab w:val="left" w:pos="8244"/>
+          <w:tab w:val="left" w:pos="9160"/>
+          <w:tab w:val="left" w:pos="10076"/>
+          <w:tab w:val="left" w:pos="10992"/>
+          <w:tab w:val="left" w:pos="11908"/>
+          <w:tab w:val="left" w:pos="12824"/>
+          <w:tab w:val="left" w:pos="13740"/>
+          <w:tab w:val="left" w:pos="14656"/>
+        </w:tabs>
+        <w:wordWrap w:val="0"/>
+        <w:jc w:val="left"/>
+        <w:rPr>
+          <w:rFonts w:eastAsia="Times New Roman"/>
+          <w:sz w:val="19"/>
+          <w:szCs w:val="19"/>
+        </w:rPr>
+      </w:pPr>
+      <w:r>
+        <w:rPr>
+          <w:rFonts w:eastAsia="Times New Roman"/>
+          <w:sz w:val="19"/>
+          <w:szCs w:val="19"/>
+        </w:rPr>
+        <w:t>Streaming data support</w:t>
+      </w:r>
+    </w:p>
+    <w:p>
+      <w:pPr>
+        <w:tabs>
+          <w:tab w:val="left" w:pos="916"/>
+          <w:tab w:val="left" w:pos="1832"/>
+          <w:tab w:val="left" w:pos="2748"/>
+          <w:tab w:val="left" w:pos="3664"/>
+          <w:tab w:val="left" w:pos="4580"/>
+          <w:tab w:val="left" w:pos="5496"/>
+          <w:tab w:val="left" w:pos="6412"/>
+          <w:tab w:val="left" w:pos="7328"/>
+          <w:tab w:val="left" w:pos="8244"/>
+          <w:tab w:val="left" w:pos="9160"/>
+          <w:tab w:val="left" w:pos="10076"/>
+          <w:tab w:val="left" w:pos="10992"/>
+          <w:tab w:val="left" w:pos="11908"/>
+          <w:tab w:val="left" w:pos="12824"/>
+          <w:tab w:val="left" w:pos="13740"/>
+          <w:tab w:val="left" w:pos="14656"/>
+        </w:tabs>
+        <w:wordWrap w:val="0"/>
+        <w:jc w:val="left"/>
+        <w:rPr>
+          <w:rFonts w:eastAsia="Times New Roman"/>
+          <w:sz w:val="19"/>
+          <w:szCs w:val="19"/>
+        </w:rPr>
+      </w:pPr>
+    </w:p>
+    <w:p>
+      <w:pPr>
+        <w:tabs>
+          <w:tab w:val="left" w:pos="916"/>
+          <w:tab w:val="left" w:pos="1832"/>
+          <w:tab w:val="left" w:pos="2748"/>
+          <w:tab w:val="left" w:pos="3664"/>
+          <w:tab w:val="left" w:pos="4580"/>
+          <w:tab w:val="left" w:pos="5496"/>
+          <w:tab w:val="left" w:pos="6412"/>
+          <w:tab w:val="left" w:pos="7328"/>
+          <w:tab w:val="left" w:pos="8244"/>
+          <w:tab w:val="left" w:pos="9160"/>
+          <w:tab w:val="left" w:pos="10076"/>
+          <w:tab w:val="left" w:pos="10992"/>
+          <w:tab w:val="left" w:pos="11908"/>
+          <w:tab w:val="left" w:pos="12824"/>
+          <w:tab w:val="left" w:pos="13740"/>
+          <w:tab w:val="left" w:pos="14656"/>
+        </w:tabs>
+        <w:wordWrap w:val="0"/>
+        <w:jc w:val="left"/>
+        <w:rPr>
+          <w:rFonts w:eastAsia="Times New Roman"/>
+          <w:sz w:val="19"/>
+          <w:szCs w:val="19"/>
+        </w:rPr>
+      </w:pPr>
+      <w:r>
+        <w:rPr>
+          <w:rFonts w:eastAsia="Times New Roman"/>
+          <w:sz w:val="19"/>
+          <w:szCs w:val="19"/>
+        </w:rPr>
+        <w:t>This work demonstrates a functional HTM-based anomaly detection system achieving 92.3% recall on synthetic data. Key contributions include a modular pipeline, dual-threshold detection, and open-source implementation. Future directions involve:</w:t>
+      </w:r>
+    </w:p>
+    <w:p>
+      <w:pPr>
+        <w:numPr>
+          <w:ilvl w:val="0"/>
+          <w:numId w:val="31"/>
+        </w:numPr>
+        <w:tabs>
+          <w:tab w:val="left" w:pos="916"/>
+          <w:tab w:val="left" w:pos="1832"/>
+          <w:tab w:val="left" w:pos="2748"/>
+          <w:tab w:val="left" w:pos="3664"/>
+          <w:tab w:val="left" w:pos="4580"/>
+          <w:tab w:val="left" w:pos="5496"/>
+          <w:tab w:val="left" w:pos="6412"/>
+          <w:tab w:val="left" w:pos="7328"/>
+          <w:tab w:val="left" w:pos="8244"/>
+          <w:tab w:val="left" w:pos="9160"/>
+          <w:tab w:val="left" w:pos="10076"/>
+          <w:tab w:val="left" w:pos="10992"/>
+          <w:tab w:val="left" w:pos="11908"/>
+          <w:tab w:val="left" w:pos="12824"/>
+          <w:tab w:val="left" w:pos="13740"/>
+          <w:tab w:val="left" w:pos="14656"/>
+        </w:tabs>
+        <w:wordWrap w:val="0"/>
+        <w:jc w:val="left"/>
+        <w:rPr>
+          <w:rFonts w:eastAsia="Times New Roman"/>
+          <w:sz w:val="19"/>
+          <w:szCs w:val="19"/>
+        </w:rPr>
+      </w:pPr>
+      <w:r>
+        <w:rPr>
+          <w:rFonts w:eastAsia="Times New Roman"/>
+          <w:sz w:val="19"/>
+          <w:szCs w:val="19"/>
+        </w:rPr>
+        <w:t>Dynamic threshold adaptation via reinforcement learning.</w:t>
+      </w:r>
+    </w:p>
+    <w:p>
+      <w:pPr>
+        <w:numPr>
+          <w:ilvl w:val="0"/>
+          <w:numId w:val="31"/>
+        </w:numPr>
+        <w:tabs>
+          <w:tab w:val="left" w:pos="916"/>
+          <w:tab w:val="left" w:pos="1832"/>
+          <w:tab w:val="left" w:pos="2748"/>
+          <w:tab w:val="left" w:pos="3664"/>
+          <w:tab w:val="left" w:pos="4580"/>
+          <w:tab w:val="left" w:pos="5496"/>
+          <w:tab w:val="left" w:pos="6412"/>
+          <w:tab w:val="left" w:pos="7328"/>
+          <w:tab w:val="left" w:pos="8244"/>
+          <w:tab w:val="left" w:pos="9160"/>
+          <w:tab w:val="left" w:pos="10076"/>
+          <w:tab w:val="left" w:pos="10992"/>
+          <w:tab w:val="left" w:pos="11908"/>
+          <w:tab w:val="left" w:pos="12824"/>
+          <w:tab w:val="left" w:pos="13740"/>
+          <w:tab w:val="left" w:pos="14656"/>
+        </w:tabs>
+        <w:wordWrap w:val="0"/>
+        <w:jc w:val="left"/>
+        <w:rPr>
+          <w:rFonts w:eastAsia="Times New Roman"/>
+          <w:sz w:val="19"/>
+          <w:szCs w:val="19"/>
+        </w:rPr>
+      </w:pPr>
+      <w:r>
+        <w:rPr>
+          <w:rFonts w:eastAsia="Times New Roman"/>
+          <w:sz w:val="19"/>
+          <w:szCs w:val="19"/>
+        </w:rPr>
+        <w:t>Distributed HTM training for large-scale datasets.</w:t>
+      </w:r>
+    </w:p>
+    <w:p>
+      <w:pPr>
+        <w:numPr>
+          <w:ilvl w:val="0"/>
+          <w:numId w:val="31"/>
+        </w:numPr>
+        <w:tabs>
+          <w:tab w:val="left" w:pos="916"/>
+          <w:tab w:val="left" w:pos="1832"/>
+          <w:tab w:val="left" w:pos="2748"/>
+          <w:tab w:val="left" w:pos="3664"/>
+          <w:tab w:val="left" w:pos="4580"/>
+          <w:tab w:val="left" w:pos="5496"/>
+          <w:tab w:val="left" w:pos="6412"/>
+          <w:tab w:val="left" w:pos="7328"/>
+          <w:tab w:val="left" w:pos="8244"/>
+          <w:tab w:val="left" w:pos="9160"/>
+          <w:tab w:val="left" w:pos="10076"/>
+          <w:tab w:val="left" w:pos="10992"/>
+          <w:tab w:val="left" w:pos="11908"/>
+          <w:tab w:val="left" w:pos="12824"/>
+          <w:tab w:val="left" w:pos="13740"/>
+          <w:tab w:val="left" w:pos="14656"/>
+        </w:tabs>
+        <w:wordWrap w:val="0"/>
+        <w:jc w:val="left"/>
+        <w:rPr>
+          <w:rFonts w:eastAsia="Times New Roman"/>
+          <w:sz w:val="19"/>
+          <w:szCs w:val="19"/>
+        </w:rPr>
+      </w:pPr>
+      <w:r>
+        <w:rPr>
+          <w:rFonts w:eastAsia="Times New Roman"/>
+          <w:sz w:val="19"/>
+          <w:szCs w:val="19"/>
+        </w:rPr>
+        <w:t>Integration with streaming platforms (e.g., Apache Kafka).</w:t>
+      </w:r>
+    </w:p>
+    <w:p>
+      <w:pPr>
+        <w:jc w:val="left"/>
+      </w:pPr>
+    </w:p>
     <w:p>
       <w:pPr>
         <w:pStyle w:val="Heading1"/>
-      </w:pPr>
-      <w:r>
-        <w:t>Results</w:t>
-      </w:r>
-    </w:p>
-    <w:p>
-      <w:pPr>
-        <w:pStyle w:val="Heading2"/>
-      </w:pPr>
-      <w:r>
-        <w:t xml:space="preserve">Anomaly Detection Performance </w:t>
-      </w:r>
-    </w:p>
-    <w:p>
-      <w:pPr>
-        <w:pStyle w:val="Heading2"/>
-      </w:pPr>
-      <w:r>
-        <w:t>Graphical Representation</w:t>
-      </w:r>
-    </w:p>
-    <w:p>
-      <w:pPr>
-        <w:pStyle w:val="Heading1"/>
-      </w:pPr>
-      <w:r>
-        <w:t>Discussion</w:t>
-      </w:r>
-    </w:p>
-    <w:p>
-      <w:pPr>
-        <w:pStyle w:val="BodyText"/>
-        <w:rPr>
-          <w:lang w:val="en-US"/>
-        </w:rPr>
-      </w:pPr>
-      <w:proofErr w:type="gramStart"/>
-      <w:r>
-        <w:rPr>
-          <w:lang w:val="en-US"/>
-        </w:rPr>
-        <w:t>Conclusion</w:t>
-      </w:r>
-      <w:proofErr w:type="gramEnd"/>
-      <w:r>
-        <w:rPr>
-          <w:lang w:val="en-US"/>
-        </w:rPr>
-        <w:t xml:space="preserve"> of your work</w:t>
-      </w:r>
-      <w:r>
-        <w:rPr>
-          <w:lang w:val="en-US"/>
-        </w:rPr>
-        <w:t xml:space="preserve"> should be precise and concise. How was the project, what </w:t>
-      </w:r>
-      <w:proofErr w:type="gramStart"/>
-      <w:r>
-        <w:rPr>
-          <w:lang w:val="en-US"/>
-        </w:rPr>
-        <w:t>is</w:t>
-      </w:r>
-      <w:proofErr w:type="gramEnd"/>
-      <w:r>
-        <w:rPr>
-          <w:lang w:val="en-US"/>
-        </w:rPr>
-        <w:t xml:space="preserve"> done, what is the result... There can be discussion on further work and direction.</w:t>
-      </w:r>
-    </w:p>
-    <w:p>
-      <w:pPr>
-        <w:pStyle w:val="Heading1"/>
-      </w:pPr>
-      <w:r>
-        <w:t>Ease of Use</w:t>
-      </w:r>
-    </w:p>
-    <w:p>
-      <w:pPr>
-        <w:pStyle w:val="Heading2"/>
-      </w:pPr>
-      <w:r>
-        <w:t xml:space="preserve">Selecting a </w:t>
-      </w:r>
-      <w:r>
-        <w:t>Template</w:t>
-      </w:r>
-      <w:r>
-        <w:t xml:space="preserve"> (Heading 2)</w:t>
-      </w:r>
-    </w:p>
-    <w:p>
-      <w:pPr>
-        <w:pStyle w:val="BodyText"/>
-      </w:pPr>
-      <w:r>
-        <w:t xml:space="preserve">First, confirm that you have the correct template for your paper size. This template has been tailored for output on the </w:t>
-      </w:r>
-      <w:r>
-        <w:rPr>
-          <w:lang w:val="en-US"/>
-        </w:rPr>
-        <w:t>A4</w:t>
-      </w:r>
-      <w:r>
-        <w:t xml:space="preserve"> paper size. If you are using </w:t>
-      </w:r>
-      <w:r>
-        <w:rPr>
-          <w:lang w:val="en-US"/>
-        </w:rPr>
-        <w:t>US letter</w:t>
-      </w:r>
-      <w:r>
-        <w:t>-sized paper, please close this</w:t>
-      </w:r>
-      <w:r>
-        <w:t xml:space="preserve"> file and download the </w:t>
-      </w:r>
-      <w:r>
-        <w:rPr>
-          <w:lang w:val="en-US"/>
-        </w:rPr>
-        <w:t xml:space="preserve">Microsoft Word, Letter </w:t>
-      </w:r>
-      <w:r>
-        <w:t>file</w:t>
-      </w:r>
-      <w:r>
-        <w:t>.</w:t>
-      </w:r>
-    </w:p>
-    <w:p>
-      <w:pPr>
-        <w:pStyle w:val="Heading2"/>
-      </w:pPr>
-      <w:r>
-        <w:t>Maintaining the Integrity of the Specifications</w:t>
-      </w:r>
-    </w:p>
-    <w:p>
-      <w:pPr>
-        <w:pStyle w:val="BodyText"/>
-      </w:pPr>
-      <w:r>
-        <w:t xml:space="preserve">The template is used to format your paper and style the text. All margins, column widths, line spaces, and text fonts are prescribed; please do not alter them. You may note </w:t>
-      </w:r>
-    </w:p>
-    <w:p>
-      <w:pPr>
-        <w:pStyle w:val="BodyText"/>
-        <w:ind w:firstLine="0"/>
-      </w:pPr>
-    </w:p>
-    <w:p>
-      <w:pPr>
-        <w:pStyle w:val="BodyText"/>
-        <w:ind w:firstLine="0"/>
-      </w:pPr>
-      <w:r>
-        <w:t>peculiarities. For example, the head margin in this template measures proportionately more than is customary. This measurement and others are deliberate, using specifications that anticipate your paper as one part of the entire proceedings, and not as an independent document. Please do not revise any of the current designations.</w:t>
-      </w:r>
-    </w:p>
-    <w:p>
-      <w:pPr>
-        <w:pStyle w:val="Heading1"/>
-      </w:pPr>
-      <w:r>
-        <w:t xml:space="preserve">Prepare Your Paper </w:t>
-      </w:r>
-      <w:r>
-        <w:t>Before</w:t>
-      </w:r>
-      <w:r>
-        <w:t xml:space="preserve"> Styling</w:t>
-      </w:r>
-    </w:p>
-    <w:p>
-      <w:pPr>
-        <w:pStyle w:val="Heading2"/>
-      </w:pPr>
-      <w:r>
-        <w:t>Abbreviations</w:t>
-      </w:r>
-      <w:r>
-        <w:t xml:space="preserve"> and Acronyms</w:t>
-      </w:r>
-    </w:p>
-    <w:p>
-      <w:pPr>
-        <w:pStyle w:val="BodyText"/>
-      </w:pPr>
-      <w:r>
-        <w:t xml:space="preserve">Define abbreviations and acronyms the first time they are used in the text, even after they have been defined in the abstract. Abbreviations such as IEEE, SI, MKS, CGS, </w:t>
-      </w:r>
-      <w:proofErr w:type="spellStart"/>
-      <w:r>
-        <w:t>sc</w:t>
-      </w:r>
-      <w:proofErr w:type="spellEnd"/>
-      <w:r>
-        <w:t>, dc, and rms do not have to be defined. Do not use abbreviations in the title or heads unless they are unavoidable.</w:t>
-      </w:r>
-    </w:p>
-    <w:p>
-      <w:pPr>
-        <w:pStyle w:val="Heading2"/>
-      </w:pPr>
-      <w:r>
-        <w:t>Units</w:t>
-      </w:r>
-    </w:p>
-    <w:p>
-      <w:pPr>
-        <w:pStyle w:val="bulletlist"/>
-      </w:pPr>
-      <w:r>
-        <w:t xml:space="preserve">Use </w:t>
-      </w:r>
-      <w:r>
-        <w:t>either</w:t>
-      </w:r>
-      <w:r>
-        <w:t xml:space="preserve"> SI (MKS) or CGS as primary units. (SI units are encouraged.) English units may be used as secondary units (in parentheses). An exception would be the use of English units as identifiers in trade, such as “3.5-inch disk drive”.</w:t>
-      </w:r>
-    </w:p>
-    <w:p>
-      <w:pPr>
-        <w:pStyle w:val="bulletlist"/>
-      </w:pPr>
-      <w:r>
-        <w:t xml:space="preserve">Avoid combining SI and CGS units, such as current in amperes and magnetic field in </w:t>
-      </w:r>
-      <w:proofErr w:type="spellStart"/>
-      <w:r>
-        <w:t>oersteds</w:t>
-      </w:r>
-      <w:proofErr w:type="spellEnd"/>
-      <w:r>
-        <w:t xml:space="preserve">. This often leads to confusion because equations do not balance dimensionally. If you must use mixed units, clearly </w:t>
-      </w:r>
-      <w:r>
-        <w:lastRenderedPageBreak/>
-        <w:t>state the units for each quantity that you use in an equation.</w:t>
-      </w:r>
-    </w:p>
-    <w:p>
-      <w:pPr>
-        <w:pStyle w:val="bulletlist"/>
-      </w:pPr>
-      <w:r>
-        <w:t>Do not mix complete spellings and abbreviations of units: “Wb/m2” or “</w:t>
-      </w:r>
-      <w:proofErr w:type="spellStart"/>
-      <w:r>
-        <w:t>webers</w:t>
-      </w:r>
-      <w:proofErr w:type="spellEnd"/>
-      <w:r>
-        <w:t xml:space="preserve"> per square meter”, not “</w:t>
-      </w:r>
-      <w:proofErr w:type="spellStart"/>
-      <w:r>
-        <w:t>webers</w:t>
-      </w:r>
-      <w:proofErr w:type="spellEnd"/>
-      <w:r>
-        <w:t xml:space="preserve">/m2”.  Spell out units when they appear in text: “. . . a few </w:t>
-      </w:r>
-      <w:proofErr w:type="spellStart"/>
-      <w:r>
-        <w:t>henries</w:t>
-      </w:r>
-      <w:proofErr w:type="spellEnd"/>
-      <w:r>
-        <w:t>”, not “. . . a few H”.</w:t>
-      </w:r>
-    </w:p>
-    <w:p>
-      <w:pPr>
-        <w:pStyle w:val="BodyText"/>
-        <w:rPr>
-          <w:lang w:val="en-US"/>
-        </w:rPr>
-      </w:pPr>
-      <w:r>
-        <w:t>may use the solidus ( / ), the exp function, or appropriate exponents. Italicize Roman symbols for quantities and variables, but not Greek symbols. Use a long dash rather than a hyphen for a minus sign. Punctuate equations with commas or periods when they are part of a sentence, as in</w:t>
-      </w:r>
-      <w:r>
-        <w:rPr>
-          <w:lang w:val="en-US"/>
-        </w:rPr>
-        <w:t>:</w:t>
-      </w:r>
-    </w:p>
-    <w:p>
-      <w:pPr>
-        <w:pStyle w:val="equation"/>
-        <w:rPr>
-          <w:rFonts w:hint="eastAsia"/>
-        </w:rPr>
-      </w:pPr>
-      <w:r>
-        <w:tab/>
-      </w:r>
-      <w:r>
-        <w:rPr>
-          <w:rFonts w:ascii="Times New Roman" w:hAnsi="Times New Roman" w:cs="Times New Roman"/>
-          <w:i/>
-        </w:rPr>
-        <w:t>a</w:t>
-      </w:r>
-      <w:r>
-        <w:t></w:t>
-      </w:r>
-      <w:r>
-        <w:t></w:t>
-      </w:r>
-      <w:r>
-        <w:t></w:t>
-      </w:r>
-      <w:r>
-        <w:rPr>
-          <w:rFonts w:ascii="Times New Roman" w:hAnsi="Times New Roman" w:cs="Times New Roman"/>
-          <w:i/>
-        </w:rPr>
-        <w:t>b</w:t>
-      </w:r>
-      <w:r>
-        <w:t></w:t>
-      </w:r>
-      <w:r>
-        <w:t></w:t>
-      </w:r>
-      <w:r>
-        <w:t></w:t>
-      </w:r>
-      <w:r>
-        <w:t></w:t>
-      </w:r>
-      <w:r>
-        <w:t></w:t>
-      </w:r>
-      <w:r>
-        <w:tab/>
-      </w:r>
-      <w:r>
-        <w:t></w:t>
-      </w:r>
-      <w:r>
-        <w:t></w:t>
-      </w:r>
-      <w:r>
-        <w:t></w:t>
-      </w:r>
-    </w:p>
-    <w:p>
-      <w:pPr>
-        <w:pStyle w:val="BodyText"/>
-      </w:pPr>
-      <w:r>
-        <w:t>Note that the equation is centered using a center tab stop. Be sure that the symbols in your equation have been defined before or immediately following the equation. Use “(1)”, not “Eq. (1)” or “equation (1)”, except at the beginning of a sentence: “Equation (1) is . . .”</w:t>
-      </w:r>
-    </w:p>
-    <w:p>
-      <w:pPr>
-        <w:pStyle w:val="Heading2"/>
-      </w:pPr>
-      <w:r>
-        <w:t>Some Common Mistakes</w:t>
-      </w:r>
-    </w:p>
-    <w:p>
-      <w:pPr>
-        <w:pStyle w:val="bulletlist"/>
-      </w:pPr>
-      <w:r>
-        <w:t>The word “data” is plural, not singular.</w:t>
-      </w:r>
-    </w:p>
-    <w:p>
-      <w:pPr>
-        <w:pStyle w:val="bulletlist"/>
-      </w:pPr>
-      <w:r>
-        <w:t xml:space="preserve">The subscript for the permeability of vacuum </w:t>
-      </w:r>
-      <w:r>
-        <w:rPr>
-          <w:rFonts w:ascii="Symbol" w:hAnsi="Symbol" w:cs="Symbol"/>
-          <w:i/>
-          <w:iCs/>
-          <w:snapToGrid w:val="0"/>
-        </w:rPr>
-        <w:t></w:t>
-      </w:r>
-      <w:r>
-        <w:rPr>
-          <w:vertAlign w:val="subscript"/>
-        </w:rPr>
-        <w:t>0</w:t>
-      </w:r>
-      <w:r>
-        <w:t>, and other common scientific constants, is zero with subscript formatting, not a lowercase letter “o”.</w:t>
-      </w:r>
-    </w:p>
-    <w:p>
-      <w:pPr>
-        <w:pStyle w:val="bulletlist"/>
-      </w:pPr>
-      <w:r>
-        <w:t xml:space="preserve">In American </w:t>
-      </w:r>
-      <w:r>
-        <w:t>English, commas, semi</w:t>
-      </w:r>
-      <w:r>
-        <w:t>colons, periods, question and exclamation marks are located within quotation marks only when a complete thought or name is cited, such as a title or full quotation. When quotation marks are used, instead of a bold or italic typeface, to highlight a word or phrase, punctuation should appear outside of the quotation marks. A parenthetical phrase or statement at the end of a sentence is punctuated outside of the closing parenthesis (like this). (A parenthetical sentence is punctuated within the parentheses.)</w:t>
-      </w:r>
-    </w:p>
-    <w:p>
-      <w:pPr>
-        <w:pStyle w:val="bulletlist"/>
-      </w:pPr>
-      <w:r>
-        <w:t>A graph within a graph is an “inset”, not an “insert”. The word alternatively is preferred to the word “alternately” (unless you really mean something that alternates).</w:t>
-      </w:r>
-    </w:p>
-    <w:p>
-      <w:pPr>
-        <w:pStyle w:val="bulletlist"/>
-      </w:pPr>
-      <w:r>
-        <w:t>Do not use the word “essentially” to mean “approximately” or “effectively”.</w:t>
-      </w:r>
-    </w:p>
-    <w:p>
-      <w:pPr>
-        <w:pStyle w:val="bulletlist"/>
-      </w:pPr>
-      <w:r>
-        <w:t>In your paper title, if the words “that uses” can accurately replace the word “using”, capitalize the “u”; if not, keep using lower-cased.</w:t>
-      </w:r>
-    </w:p>
-    <w:p>
-      <w:pPr>
-        <w:pStyle w:val="bulletlist"/>
-      </w:pPr>
-      <w:r>
-        <w:t>Be aware of the different meanings of the homophones “affect” and “effect”, “complement” and “compliment”, “discreet” and “discrete”, “principal” and “principle”.</w:t>
-      </w:r>
-    </w:p>
-    <w:p>
-      <w:pPr>
-        <w:pStyle w:val="bulletlist"/>
-      </w:pPr>
-      <w:r>
-        <w:t>Do not confuse “imply” and “infer”.</w:t>
-      </w:r>
-    </w:p>
-    <w:p>
-      <w:pPr>
-        <w:pStyle w:val="bulletlist"/>
-      </w:pPr>
-      <w:r>
-        <w:t>The prefix “non” is not a word; it should be joined to the word it modifies, usually without a hyphen.</w:t>
-      </w:r>
-    </w:p>
-    <w:p>
-      <w:pPr>
-        <w:pStyle w:val="bulletlist"/>
-      </w:pPr>
-      <w:r>
-        <w:t>There is no period after the “et” in the Latin abbreviation “et al.”.</w:t>
-      </w:r>
-    </w:p>
-    <w:p>
-      <w:pPr>
-        <w:pStyle w:val="bulletlist"/>
-      </w:pPr>
-      <w:r>
-        <w:t>The abbreviation “i.e.” means “that is”, and the abbreviation “e.g.” means “for example”.</w:t>
-      </w:r>
-    </w:p>
-    <w:p>
-      <w:pPr>
-        <w:pStyle w:val="BodyText"/>
-      </w:pPr>
-      <w:r>
-        <w:t>An excellent style manual for science writers is [7].</w:t>
-      </w:r>
-    </w:p>
-    <w:p>
-      <w:pPr>
-        <w:pStyle w:val="Heading1"/>
-      </w:pPr>
-      <w:r>
-        <w:t xml:space="preserve">Using the </w:t>
-      </w:r>
-      <w:r>
-        <w:t>Template</w:t>
-      </w:r>
-    </w:p>
-    <w:p>
-      <w:pPr>
-        <w:pStyle w:val="BodyText"/>
-      </w:pPr>
-      <w:r>
-        <w:t>After the text edit has been completed, the paper is ready for the template. Duplicate the template file by using the Save As command, and use the naming convention prescribed by your conference for the name of your paper. In this newly created file, highlight all of the contents and import your prepared text file. You are now ready to style your paper; use the scroll down window on the left of the MS Word Formatting toolbar.</w:t>
-      </w:r>
-    </w:p>
-    <w:p>
-      <w:pPr>
-        <w:pStyle w:val="Heading2"/>
-      </w:pPr>
-      <w:r>
-        <w:t>Authors</w:t>
-      </w:r>
-      <w:r>
-        <w:t xml:space="preserve"> and Affiliations</w:t>
-      </w:r>
-    </w:p>
-    <w:p>
-      <w:pPr>
-        <w:pStyle w:val="BodyText"/>
-      </w:pPr>
-      <w:r>
-        <w:rPr>
-          <w:b/>
-        </w:rPr>
-        <w:t xml:space="preserve">The template is </w:t>
-      </w:r>
-      <w:r>
-        <w:rPr>
-          <w:b/>
-        </w:rPr>
-        <w:t>designed</w:t>
-      </w:r>
-      <w:r>
-        <w:rPr>
-          <w:b/>
-          <w:lang w:val="en-US"/>
-        </w:rPr>
-        <w:t xml:space="preserve"> for,</w:t>
-      </w:r>
-      <w:r>
-        <w:rPr>
-          <w:b/>
-        </w:rPr>
-        <w:t xml:space="preserve"> but not limited to</w:t>
-      </w:r>
-      <w:r>
-        <w:rPr>
-          <w:b/>
-          <w:lang w:val="en-US"/>
-        </w:rPr>
-        <w:t>,</w:t>
-      </w:r>
-      <w:r>
-        <w:rPr>
-          <w:b/>
-          <w:lang w:val="en-US"/>
-        </w:rPr>
-        <w:t xml:space="preserve"> </w:t>
-      </w:r>
-      <w:r>
-        <w:rPr>
-          <w:b/>
-          <w:lang w:val="en-US"/>
-        </w:rPr>
-        <w:t>three</w:t>
-      </w:r>
-      <w:r>
-        <w:rPr>
-          <w:b/>
-          <w:lang w:val="en-US"/>
-        </w:rPr>
-        <w:t xml:space="preserve"> authors.</w:t>
-      </w:r>
-      <w:r>
-        <w:rPr>
-          <w:lang w:val="en-US"/>
-        </w:rPr>
-        <w:t xml:space="preserve"> </w:t>
-      </w:r>
-      <w:r>
-        <w:rPr>
-          <w:lang w:val="en-US"/>
-        </w:rPr>
-        <w:t>A minimum of one autho</w:t>
-      </w:r>
-      <w:r>
-        <w:rPr>
-          <w:lang w:val="en-US"/>
-        </w:rPr>
-        <w:t>r is required for all report</w:t>
-      </w:r>
-      <w:r>
-        <w:rPr>
-          <w:lang w:val="en-US"/>
-        </w:rPr>
-        <w:t xml:space="preserve"> articles. </w:t>
-      </w:r>
-      <w:r>
-        <w:t>Author names should be listed starting from left to right and then moving down to the next line. This is the author sequence that will be used in future citations and by indexing services.</w:t>
-      </w:r>
-      <w:r>
-        <w:t xml:space="preserve"> </w:t>
-      </w:r>
-      <w:r>
-        <w:t>Names should not be listed in columns nor group by affiliation.</w:t>
-      </w:r>
-      <w:r>
-        <w:rPr>
-          <w:lang w:val="en-US"/>
-        </w:rPr>
-        <w:t xml:space="preserve"> </w:t>
-      </w:r>
-      <w:r>
-        <w:t>Please keep your affiliations as succinct as possible (for example, do not differentiate among departments of the same organization).</w:t>
-      </w:r>
-    </w:p>
-    <w:p>
-      <w:pPr>
-        <w:pStyle w:val="Heading3"/>
-      </w:pPr>
-      <w:r>
-        <w:t>For papers with more than three</w:t>
-      </w:r>
-      <w:r>
-        <w:t xml:space="preserve"> authors: </w:t>
-      </w:r>
-      <w:r>
-        <w:rPr>
-          <w:i w:val="0"/>
-        </w:rPr>
-        <w:t>Add author names horizontally, moving to a third row if needed for more than 8 authors.</w:t>
-      </w:r>
-    </w:p>
-    <w:p>
-      <w:pPr>
-        <w:pStyle w:val="Heading3"/>
-      </w:pPr>
-      <w:r>
-        <w:t xml:space="preserve">For </w:t>
-      </w:r>
-      <w:r>
-        <w:t xml:space="preserve">papers with less than </w:t>
-      </w:r>
-      <w:r>
-        <w:t>three</w:t>
-      </w:r>
-      <w:r>
-        <w:t xml:space="preserve"> authors</w:t>
-      </w:r>
-      <w:r>
-        <w:t xml:space="preserve">: </w:t>
-      </w:r>
-      <w:r>
-        <w:rPr>
-          <w:i w:val="0"/>
-        </w:rPr>
-        <w:t>To change the default, adjust the template as follows.</w:t>
-      </w:r>
-    </w:p>
-    <w:p>
-      <w:pPr>
-        <w:pStyle w:val="Heading4"/>
-      </w:pPr>
-      <w:r>
-        <w:t>Selection</w:t>
-      </w:r>
-      <w:r>
-        <w:t xml:space="preserve">: </w:t>
-      </w:r>
-      <w:r>
-        <w:rPr>
-          <w:i w:val="0"/>
-        </w:rPr>
-        <w:t>Highlight all author and affiliation lines.</w:t>
-      </w:r>
-    </w:p>
-    <w:p>
-      <w:pPr>
-        <w:pStyle w:val="Heading4"/>
-      </w:pPr>
-      <w:r>
-        <w:t>Change number of columns:</w:t>
-      </w:r>
-      <w:r>
-        <w:t xml:space="preserve"> </w:t>
-      </w:r>
-      <w:r>
-        <w:rPr>
-          <w:i w:val="0"/>
-        </w:rPr>
-        <w:t xml:space="preserve">Select the Columns icon from the MS Word Standard toolbar and then select </w:t>
-      </w:r>
-      <w:r>
-        <w:rPr>
-          <w:i w:val="0"/>
-        </w:rPr>
-        <w:t>the correct number of columns</w:t>
-      </w:r>
-      <w:r>
-        <w:rPr>
-          <w:i w:val="0"/>
-        </w:rPr>
-        <w:t xml:space="preserve"> from the selection palette.</w:t>
-      </w:r>
-    </w:p>
-    <w:p>
-      <w:pPr>
-        <w:pStyle w:val="Heading4"/>
-        <w:rPr>
-          <w:i w:val="0"/>
-        </w:rPr>
-      </w:pPr>
-      <w:r>
-        <w:t xml:space="preserve">Deletion: </w:t>
-      </w:r>
-      <w:r>
-        <w:rPr>
-          <w:i w:val="0"/>
-        </w:rPr>
-        <w:t xml:space="preserve">Delete the author and affiliation lines for the </w:t>
-      </w:r>
-      <w:r>
-        <w:rPr>
-          <w:i w:val="0"/>
-        </w:rPr>
-        <w:t>extra authors.</w:t>
-      </w:r>
-    </w:p>
-    <w:p>
-      <w:pPr>
-        <w:jc w:val="left"/>
-        <w:rPr>
-          <w:i/>
-          <w:iCs/>
-          <w:noProof/>
-        </w:rPr>
-      </w:pPr>
-    </w:p>
-    <w:p>
-      <w:pPr>
-        <w:pStyle w:val="Heading2"/>
-      </w:pPr>
-      <w:r>
-        <w:t>Identify</w:t>
-      </w:r>
-      <w:r>
-        <w:t xml:space="preserve"> the Headings</w:t>
-      </w:r>
-    </w:p>
-    <w:p>
-      <w:pPr>
-        <w:pStyle w:val="BodyText"/>
-      </w:pPr>
-      <w:r>
-        <w:t>Text heads organize the topics on a relational, hierarchical basis. For example, the paper title is the primary text head because all subsequent material relates and elaborates on this one topic. If there are two or more sub-topics, the next level head (uppercase Roman numerals) should be used and, conversely, if there are not at least two sub-topics, then no subheads should be introduced. Styles named “Heading 1”, “Heading 2”, “Heading 3”, and “Heading 4” are prescribed.</w:t>
-      </w:r>
-    </w:p>
-    <w:p>
-      <w:pPr>
-        <w:pStyle w:val="Heading2"/>
-      </w:pPr>
-      <w:r>
-        <w:t>Figures and Tables</w:t>
-      </w:r>
-    </w:p>
-    <w:p>
-      <w:pPr>
-        <w:pStyle w:val="BodyText"/>
-        <w:rPr>
-          <w:lang w:val="en-US"/>
-        </w:rPr>
-      </w:pPr>
-      <w:r>
-        <w:rPr>
-          <w:lang w:val="en-US"/>
-        </w:rPr>
-        <w:t xml:space="preserve">For adding object other than text (tables, equations, graphs, figures, code…), </w:t>
-      </w:r>
-      <w:r>
-        <w:rPr>
-          <w:b/>
-          <w:bCs/>
-          <w:lang w:val="en-US"/>
-        </w:rPr>
-        <w:t>there must be at least one cross reference</w:t>
-      </w:r>
-      <w:r>
-        <w:rPr>
-          <w:lang w:val="en-US"/>
-        </w:rPr>
-        <w:t xml:space="preserve"> to it.</w:t>
-      </w:r>
-      <w:r>
-        <w:rPr>
-          <w:lang w:val="en-US"/>
-        </w:rPr>
-        <w:t xml:space="preserve"> </w:t>
-      </w:r>
-      <w:r>
-        <w:rPr>
-          <w:lang w:val="en-US"/>
-        </w:rPr>
-        <w:t xml:space="preserve"> </w:t>
-      </w:r>
-      <w:r>
-        <w:rPr>
-          <w:lang w:val="en-US"/>
-        </w:rPr>
-        <w:fldChar w:fldCharType="begin"/>
-      </w:r>
-      <w:r>
-        <w:rPr>
-          <w:lang w:val="en-US"/>
-        </w:rPr>
-        <w:instrText xml:space="preserve"> REF _Ref98199099 \h </w:instrText>
-      </w:r>
-      <w:r>
-        <w:rPr>
-          <w:lang w:val="en-US"/>
-        </w:rPr>
-      </w:r>
-      <w:r>
-        <w:rPr>
-          <w:lang w:val="en-US"/>
-        </w:rPr>
-        <w:fldChar w:fldCharType="separate"/>
-      </w:r>
-      <w:r>
-        <w:t xml:space="preserve">Figure </w:t>
-      </w:r>
-      <w:r>
-        <w:rPr>
-          <w:noProof/>
-        </w:rPr>
-        <w:t>1</w:t>
-      </w:r>
-      <w:r>
-        <w:rPr>
-          <w:lang w:val="en-US"/>
-        </w:rPr>
-        <w:fldChar w:fldCharType="end"/>
-      </w:r>
-      <w:r>
-        <w:rPr>
-          <w:lang w:val="en-US"/>
-        </w:rPr>
-        <w:t xml:space="preserve"> is an example</w:t>
-      </w:r>
-    </w:p>
-    <w:p>
-      <w:pPr>
-        <w:pStyle w:val="Heading4"/>
-      </w:pPr>
-      <w:r>
-        <w:t xml:space="preserve"> </w:t>
-      </w:r>
-      <w:r>
-        <w:t xml:space="preserve">Positioning Figures and Tables: </w:t>
-      </w:r>
-      <w:r>
-        <w:rPr>
-          <w:i w:val="0"/>
-        </w:rPr>
-        <w:t>Place figures and tables at the top and bottom of columns. Avoid placing them in the middle of columns. Large figures and tables may span across both columns. Figure captions should be below the figures; table heads should appear above the tables. Insert figures and tables after they are cited in the text. Use the abbreviation “Fig. 1”, even at the beginning of a sentence.</w:t>
-      </w:r>
-    </w:p>
-    <w:p>
-      <w:pPr>
-        <w:pStyle w:val="tablehead"/>
-      </w:pPr>
-      <w:r>
-        <w:t>Table Type Styles</w:t>
-      </w:r>
-    </w:p>
-    <w:tbl>
-      <w:tblPr>
-        <w:tblW w:w="0" w:type="auto"/>
-        <w:jc w:val="center"/>
-        <w:tblBorders>
-          <w:top w:val="single" w:sz="2" w:space="0" w:color="auto"/>
-          <w:left w:val="single" w:sz="2" w:space="0" w:color="auto"/>
-          <w:bottom w:val="single" w:sz="2" w:space="0" w:color="auto"/>
-          <w:right w:val="single" w:sz="2" w:space="0" w:color="auto"/>
-          <w:insideH w:val="single" w:sz="2" w:space="0" w:color="auto"/>
-          <w:insideV w:val="single" w:sz="2" w:space="0" w:color="auto"/>
-        </w:tblBorders>
-        <w:tblLayout w:type="fixed"/>
-        <w:tblLook w:val="0000" w:firstRow="0" w:lastRow="0" w:firstColumn="0" w:lastColumn="0" w:noHBand="0" w:noVBand="0"/>
-      </w:tblPr>
-      <w:tblGrid>
-        <w:gridCol w:w="720"/>
-        <w:gridCol w:w="2340"/>
-        <w:gridCol w:w="900"/>
-        <w:gridCol w:w="900"/>
-      </w:tblGrid>
-      <w:tr>
-        <w:trPr>
-          <w:cantSplit/>
-          <w:trHeight w:val="240"/>
-          <w:tblHeader/>
-          <w:jc w:val="center"/>
-        </w:trPr>
-        <w:tc>
-          <w:tcPr>
-            <w:tcW w:w="720" w:type="dxa"/>
-            <w:vMerge w:val="restart"/>
-            <w:vAlign w:val="center"/>
-          </w:tcPr>
-          <w:p>
-            <w:pPr>
-              <w:pStyle w:val="tablecolhead"/>
-            </w:pPr>
-            <w:r>
-              <w:lastRenderedPageBreak/>
-              <w:t>Table Head</w:t>
-            </w:r>
-          </w:p>
-        </w:tc>
-        <w:tc>
-          <w:tcPr>
-            <w:tcW w:w="4140" w:type="dxa"/>
-            <w:gridSpan w:val="3"/>
-            <w:vAlign w:val="center"/>
-          </w:tcPr>
-          <w:p>
-            <w:pPr>
-              <w:pStyle w:val="tablecolhead"/>
-            </w:pPr>
-            <w:r>
-              <w:t>Table Column Head</w:t>
-            </w:r>
-          </w:p>
-        </w:tc>
-      </w:tr>
-      <w:tr>
-        <w:trPr>
-          <w:cantSplit/>
-          <w:trHeight w:val="240"/>
-          <w:tblHeader/>
-          <w:jc w:val="center"/>
-        </w:trPr>
-        <w:tc>
-          <w:tcPr>
-            <w:tcW w:w="720" w:type="dxa"/>
-            <w:vMerge/>
-          </w:tcPr>
-          <w:p>
-            <w:pPr>
-              <w:rPr>
-                <w:sz w:val="16"/>
-                <w:szCs w:val="16"/>
-              </w:rPr>
-            </w:pPr>
-          </w:p>
-        </w:tc>
-        <w:tc>
-          <w:tcPr>
-            <w:tcW w:w="2340" w:type="dxa"/>
-            <w:vAlign w:val="center"/>
-          </w:tcPr>
-          <w:p>
-            <w:pPr>
-              <w:pStyle w:val="tablecolsubhead"/>
-            </w:pPr>
-            <w:r>
-              <w:t>Table column subhead</w:t>
-            </w:r>
-          </w:p>
-        </w:tc>
-        <w:tc>
-          <w:tcPr>
-            <w:tcW w:w="900" w:type="dxa"/>
-            <w:vAlign w:val="center"/>
-          </w:tcPr>
-          <w:p>
-            <w:pPr>
-              <w:pStyle w:val="tablecolsubhead"/>
-            </w:pPr>
-            <w:r>
-              <w:t>Subhead</w:t>
-            </w:r>
-          </w:p>
-        </w:tc>
-        <w:tc>
-          <w:tcPr>
-            <w:tcW w:w="900" w:type="dxa"/>
-            <w:vAlign w:val="center"/>
-          </w:tcPr>
-          <w:p>
-            <w:pPr>
-              <w:pStyle w:val="tablecolsubhead"/>
-            </w:pPr>
-            <w:r>
-              <w:t>Subhead</w:t>
-            </w:r>
-          </w:p>
-        </w:tc>
-      </w:tr>
-      <w:tr>
-        <w:trPr>
-          <w:trHeight w:val="320"/>
-          <w:jc w:val="center"/>
-        </w:trPr>
-        <w:tc>
-          <w:tcPr>
-            <w:tcW w:w="720" w:type="dxa"/>
-            <w:vAlign w:val="center"/>
-          </w:tcPr>
-          <w:p>
-            <w:pPr>
-              <w:pStyle w:val="tablecopy"/>
-              <w:rPr>
-                <w:sz w:val="8"/>
-                <w:szCs w:val="8"/>
-              </w:rPr>
-            </w:pPr>
-            <w:r>
-              <w:t>copy</w:t>
-            </w:r>
-          </w:p>
-        </w:tc>
-        <w:tc>
-          <w:tcPr>
-            <w:tcW w:w="2340" w:type="dxa"/>
-            <w:vAlign w:val="center"/>
-          </w:tcPr>
-          <w:p>
-            <w:pPr>
-              <w:pStyle w:val="tablecopy"/>
-            </w:pPr>
-            <w:r>
-              <w:t>More table copy</w:t>
-            </w:r>
-            <w:r>
-              <w:rPr>
-                <w:vertAlign w:val="superscript"/>
-              </w:rPr>
-              <w:t>a</w:t>
-            </w:r>
-          </w:p>
-        </w:tc>
-        <w:tc>
-          <w:tcPr>
-            <w:tcW w:w="900" w:type="dxa"/>
-            <w:vAlign w:val="center"/>
-          </w:tcPr>
-          <w:p>
-            <w:pPr>
-              <w:rPr>
-                <w:sz w:val="16"/>
-                <w:szCs w:val="16"/>
-              </w:rPr>
-            </w:pPr>
-          </w:p>
-        </w:tc>
-        <w:tc>
-          <w:tcPr>
-            <w:tcW w:w="900" w:type="dxa"/>
-            <w:vAlign w:val="center"/>
-          </w:tcPr>
-          <w:p>
-            <w:pPr>
-              <w:rPr>
-                <w:sz w:val="16"/>
-                <w:szCs w:val="16"/>
-              </w:rPr>
-            </w:pPr>
-          </w:p>
-        </w:tc>
-      </w:tr>
-    </w:tbl>
-    <w:p>
-      <w:pPr>
-        <w:pStyle w:val="tablefootnote"/>
-      </w:pPr>
-      <w:r>
-        <w:t xml:space="preserve">Sample </w:t>
-      </w:r>
-      <w:r>
-        <w:t>of</w:t>
-      </w:r>
-      <w:r>
-        <w:t xml:space="preserve"> a </w:t>
-      </w:r>
-      <w:r>
-        <w:t>Table</w:t>
-      </w:r>
-      <w:r>
-        <w:t xml:space="preserve"> </w:t>
-      </w:r>
-      <w:r>
-        <w:t>footnote</w:t>
-      </w:r>
-      <w:r>
-        <w:t xml:space="preserve">. </w:t>
-      </w:r>
-      <w:r>
-        <w:t>(</w:t>
-      </w:r>
-      <w:r>
-        <w:rPr>
-          <w:i/>
-        </w:rPr>
-        <w:t>Table footnote</w:t>
-      </w:r>
-      <w:r>
-        <w:t>)</w:t>
-      </w:r>
-      <w:r>
-        <w:t xml:space="preserve"> </w:t>
-      </w:r>
-    </w:p>
-    <w:p>
-      <w:pPr>
-        <w:pStyle w:val="tablefootnote"/>
         <w:numPr>
           <w:ilvl w:val="0"/>
           <w:numId w:val="0"/>
         </w:numPr>
-        <w:ind w:left="58" w:hanging="29"/>
-      </w:pPr>
-    </w:p>
-    <w:p>
-      <w:pPr>
-        <w:pStyle w:val="tablefootnote"/>
-        <w:keepNext/>
+        <w:jc w:val="both"/>
+      </w:pPr>
+    </w:p>
+    <w:p>
+      <w:pPr>
+        <w:pStyle w:val="Heading5"/>
+      </w:pPr>
+      <w:r>
+        <w:t>References</w:t>
+      </w:r>
+    </w:p>
+    <w:p>
+      <w:pPr>
+        <w:jc w:val="both"/>
+        <w:rPr>
+          <w:lang w:eastAsia="x-none"/>
+        </w:rPr>
+      </w:pPr>
+    </w:p>
+    <w:p>
+      <w:pPr>
+        <w:jc w:val="both"/>
+        <w:rPr>
+          <w:lang w:eastAsia="x-none"/>
+        </w:rPr>
+      </w:pPr>
+    </w:p>
+    <w:p>
+      <w:pPr>
+        <w:jc w:val="both"/>
+        <w:rPr>
+          <w:lang w:eastAsia="x-none"/>
+        </w:rPr>
+      </w:pPr>
+    </w:p>
+    <w:p>
+      <w:pPr>
+        <w:jc w:val="both"/>
+        <w:rPr>
+          <w:lang w:eastAsia="x-none"/>
+        </w:rPr>
+      </w:pPr>
+    </w:p>
+    <w:p>
+      <w:pPr>
+        <w:jc w:val="both"/>
+        <w:rPr>
+          <w:lang w:eastAsia="x-none"/>
+        </w:rPr>
+      </w:pPr>
+      <w:r>
+        <w:t>Method</w:t>
+      </w:r>
+      <w:r>
+        <w:t>s</w:t>
+      </w:r>
+    </w:p>
+    <w:p>
+      <w:pPr>
+        <w:pStyle w:val="Heading2"/>
+      </w:pPr>
+      <w:r>
+        <w:t>Data Collection and preprocessing</w:t>
+      </w:r>
+    </w:p>
+    <w:p>
+      <w:pPr>
+        <w:pStyle w:val="Heading2"/>
+      </w:pPr>
+      <w:r>
+        <w:t>MultiSequence Learning and Predictiony</w:t>
+      </w:r>
+    </w:p>
+    <w:p>
+      <w:pPr>
+        <w:pStyle w:val="Heading2"/>
+      </w:pPr>
+      <w:r>
+        <w:t>Implementation</w:t>
+      </w:r>
+    </w:p>
+    <w:p>
+      <w:pPr>
+        <w:pStyle w:val="Heading1"/>
         <w:numPr>
           <w:ilvl w:val="0"/>
           <w:numId w:val="0"/>
         </w:numPr>
-        <w:ind w:left="29" w:right="240"/>
-        <w:jc w:val="left"/>
-      </w:pPr>
-      <w:r>
-        <w:pict w14:anchorId="4C2ECEC5">
-          <v:shapetype id="_x0000_t75" coordsize="21600,21600" o:spt="75" o:preferrelative="t" path="m@4@5l@4@11@9@11@9@5xe" filled="f" stroked="f">
-            <v:stroke joinstyle="miter"/>
-            <v:formulas>
-              <v:f eqn="if lineDrawn pixelLineWidth 0"/>
-              <v:f eqn="sum @0 1 0"/>
-              <v:f eqn="sum 0 0 @1"/>
-              <v:f eqn="prod @2 1 2"/>
-              <v:f eqn="prod @3 21600 pixelWidth"/>
-              <v:f eqn="prod @3 21600 pixelHeight"/>
-              <v:f eqn="sum @0 0 1"/>
-              <v:f eqn="prod @6 1 2"/>
-              <v:f eqn="prod @7 21600 pixelWidth"/>
-              <v:f eqn="sum @8 21600 0"/>
-              <v:f eqn="prod @7 21600 pixelHeight"/>
-              <v:f eqn="sum @10 21600 0"/>
-            </v:formulas>
-            <v:path o:extrusionok="f" gradientshapeok="t" o:connecttype="rect"/>
-            <o:lock v:ext="edit" aspectratio="t"/>
-          </v:shapetype>
-          <v:shape id="_x0000_i1026" type="#_x0000_t75" style="width:228.9pt;height:31.85pt" o:bordertopcolor="this" o:borderleftcolor="this" o:borderbottomcolor="this" o:borderrightcolor="this">
-            <v:imagedata r:id="rId13" o:title=""/>
-            <w10:bordertop type="single" width="8"/>
-            <w10:borderleft type="single" width="8"/>
-            <w10:borderbottom type="single" width="8"/>
-            <w10:borderright type="single" width="8"/>
-          </v:shape>
-        </w:pict>
-      </w:r>
-    </w:p>
-    <w:p>
-      <w:pPr>
-        <w:pStyle w:val="Figure"/>
-      </w:pPr>
-      <w:bookmarkStart w:id="0" w:name="_Ref98199099"/>
-      <w:bookmarkStart w:id="1" w:name="_Ref98199090"/>
-      <w:r>
-        <w:t xml:space="preserve">Figure </w:t>
-      </w:r>
-      <w:fldSimple w:instr=" SEQ Figure \* ARABIC ">
-        <w:r>
-          <w:rPr>
-            <w:noProof/>
-          </w:rPr>
-          <w:t>1</w:t>
-        </w:r>
-      </w:fldSimple>
-      <w:bookmarkEnd w:id="0"/>
-      <w:r>
-        <w:t xml:space="preserve"> Example Figure Caption</w:t>
-      </w:r>
-      <w:bookmarkEnd w:id="1"/>
+        <w:jc w:val="both"/>
+      </w:pPr>
+      <w:r>
+        <w:t>.</w:t>
+      </w:r>
+    </w:p>
+    <w:p>
+      <w:pPr>
+        <w:pStyle w:val="Heading5"/>
+      </w:pPr>
+      <w:r>
+        <w:t>References</w:t>
+      </w:r>
     </w:p>
     <w:p>
       <w:pPr>
         <w:pStyle w:val="BodyText"/>
       </w:pPr>
       <w:r>
-        <w:t>Figure Labels: Use 8 point Times New Roman for Figure labels. Use words rather than symbols or abbreviations when writing Figure axis labels to avoid confusing the reader. As an example, write the quantity “Magnetization”, or “Magnetization, M”, not just “M”. If including units in the label, present them within parentheses. Do not label axes only with units. In the example, write “Magnetization (A/m)” or “Magnetization {A[m(1)]}”, not just “A/m”. Do not label axes</w:t>
-      </w:r>
-      <w:r>
+        <w:t>The template will number citations consecutively within brackets [1]. The sentence punctuation follows the bracket [2]. Refer simply to the reference number, as in [3]—do not use “Ref. [3]” or “reference [3]” except at the beginning of a sentence: “Reference [3] was the first</w:t>
+      </w:r>
+      <w:r>
+        <w:rPr>
+          <w:lang w:val="en-US"/>
+        </w:rPr>
         <w:t xml:space="preserve"> </w:t>
       </w:r>
       <w:r>
-        <w:t>with a ratio of quantities and units. For example, write “Temperature (K)”, not “Temperature/K”.</w:t>
-      </w:r>
-    </w:p>
-    <w:p>
-      <w:pPr>
-        <w:pStyle w:val="Heading2"/>
-      </w:pPr>
-      <w:r>
-        <w:t xml:space="preserve"> Code Reference</w:t>
-      </w:r>
-      <w:r>
-        <w:t>s</w:t>
-      </w:r>
-      <w:r>
-        <w:t>:</w:t>
-      </w:r>
-    </w:p>
-    <w:p>
-      <w:pPr>
-        <w:jc w:val="both"/>
-      </w:pPr>
-      <w:r>
-        <w:t xml:space="preserve">      Referencing </w:t>
-      </w:r>
-      <w:proofErr w:type="gramStart"/>
-      <w:r>
-        <w:t>Code</w:t>
-      </w:r>
-      <w:proofErr w:type="gramEnd"/>
-      <w:r>
-        <w:t xml:space="preserve"> in your text should be avoid</w:t>
-      </w:r>
-      <w:r>
-        <w:t>ed</w:t>
-      </w:r>
-      <w:r>
-        <w:t xml:space="preserve"> unless necessary. In such case</w:t>
-      </w:r>
-      <w:r>
-        <w:t>s</w:t>
-      </w:r>
-      <w:r>
-        <w:t xml:space="preserve"> it can be inserted as</w:t>
-      </w:r>
-      <w:r>
-        <w:t xml:space="preserve"> a listing as shown in </w:t>
-      </w:r>
-      <w:r>
-        <w:fldChar w:fldCharType="begin"/>
-      </w:r>
-      <w:r>
-        <w:instrText xml:space="preserve"> REF _Ref97556749 \h </w:instrText>
-      </w:r>
-      <w:r>
-        <w:fldChar w:fldCharType="separate"/>
-      </w:r>
-      <w:r>
-        <w:rPr>
-          <w:b/>
-          <w:bCs/>
-        </w:rPr>
-        <w:t>Error! Reference source not found.</w:t>
-      </w:r>
-      <w:r>
-        <w:fldChar w:fldCharType="end"/>
-      </w:r>
-      <w:r>
-        <w:t xml:space="preserve"> </w:t>
-      </w:r>
-    </w:p>
-    <w:p>
-      <w:pPr>
-        <w:pStyle w:val="Code"/>
-      </w:pPr>
-      <w:r>
-        <w:t xml:space="preserve">Listing </w:t>
-      </w:r>
-      <w:fldSimple w:instr=" SEQ Listing \* ARABIC ">
-        <w:r>
-          <w:rPr>
-            <w:noProof/>
-          </w:rPr>
-          <w:t>1</w:t>
-        </w:r>
-      </w:fldSimple>
-      <w:r>
-        <w:t xml:space="preserve"> Code Reference Example</w:t>
-      </w:r>
-    </w:p>
-    <w:p>
-      <w:pPr>
-        <w:pStyle w:val="Figure"/>
-      </w:pPr>
-      <w:r>
-        <w:pict w14:anchorId="60D73155">
-          <v:shape id="Text Box 2" o:spid="_x0000_s2058" type="#_x0000_t202" style="width:241.4pt;height:30.95pt;visibility:visible;mso-height-percent:200;mso-left-percent:-10001;mso-top-percent:-10001;mso-wrap-distance-left:9pt;mso-wrap-distance-top:3.6pt;mso-wrap-distance-right:9pt;mso-wrap-distance-bottom:3.6pt;mso-position-horizontal:absolute;mso-position-horizontal-relative:char;mso-position-vertical:absolute;mso-position-vertical-relative:line;mso-height-percent:200;mso-left-percent:-10001;mso-top-percent:-10001;mso-width-relative:margin;mso-height-relative:margin;v-text-anchor:top" filled="f">
-            <v:textbox style="mso-next-textbox:#Text Box 2;mso-fit-shape-to-text:t">
-              <w:txbxContent>
-                <w:p>
-                  <w:pPr>
-                    <w:jc w:val="left"/>
-                  </w:pPr>
-                  <w:proofErr w:type="spellStart"/>
-                  <w:r>
-                    <w:t>Console.WriteLine</w:t>
-                  </w:r>
-                  <w:proofErr w:type="spellEnd"/>
-                  <w:r>
-                    <w:t>(“Referencing code”, var</w:t>
-                  </w:r>
-                  <w:proofErr w:type="gramStart"/>
-                  <w:r>
-                    <w:t>);</w:t>
-                  </w:r>
-                  <w:proofErr w:type="gramEnd"/>
-                </w:p>
-                <w:p>
-                  <w:pPr>
-                    <w:jc w:val="left"/>
-                  </w:pPr>
-                  <w:r>
-                    <w:t xml:space="preserve">    // using tab can be replaced with 4 spaces</w:t>
-                  </w:r>
-                </w:p>
-              </w:txbxContent>
-            </v:textbox>
-            <w10:anchorlock/>
-          </v:shape>
-        </w:pict>
-      </w:r>
-    </w:p>
-    <w:p>
-      <w:pPr>
-        <w:pStyle w:val="Figure"/>
-      </w:pPr>
-    </w:p>
-    <w:p>
-      <w:pPr>
-        <w:jc w:val="both"/>
-      </w:pPr>
-      <w:r>
-        <w:t xml:space="preserve">Do not pass </w:t>
-      </w:r>
-      <w:proofErr w:type="gramStart"/>
-      <w:r>
-        <w:t>code</w:t>
-      </w:r>
-      <w:proofErr w:type="gramEnd"/>
-      <w:r>
-        <w:t xml:space="preserve"> as image. When referring to variable in </w:t>
-      </w:r>
-      <w:r>
-        <w:fldChar w:fldCharType="begin"/>
-      </w:r>
-      <w:r>
-        <w:instrText xml:space="preserve"> REF _Ref97556749 \h  \* MERGEFORMAT </w:instrText>
-      </w:r>
-      <w:r>
-        <w:fldChar w:fldCharType="separate"/>
-      </w:r>
-      <w:r>
-        <w:rPr>
-          <w:b/>
-          <w:bCs/>
-        </w:rPr>
-        <w:t>Error! Reference source not found.</w:t>
-      </w:r>
-      <w:r>
-        <w:fldChar w:fldCharType="end"/>
-      </w:r>
-      <w:r>
-        <w:t xml:space="preserve">, italics should be </w:t>
-      </w:r>
-      <w:proofErr w:type="gramStart"/>
-      <w:r>
-        <w:t>used</w:t>
-      </w:r>
-      <w:proofErr w:type="gramEnd"/>
-      <w:r>
-        <w:t xml:space="preserve"> </w:t>
-      </w:r>
-      <w:r>
-        <w:t xml:space="preserve">for example </w:t>
+        <w:t>...</w:t>
+      </w:r>
+      <w:r>
+        <w:t>”</w:t>
+      </w:r>
+    </w:p>
+    <w:p>
+      <w:pPr>
+        <w:pStyle w:val="BodyText"/>
+      </w:pPr>
+      <w:r>
+        <w:t>Number footnotes separately in superscripts. Place the actual footnote at the bottom of the column in which it was cited. Do not put footnotes in the</w:t>
+      </w:r>
+      <w:r>
+        <w:rPr>
+          <w:lang w:val="en-US"/>
+        </w:rPr>
+        <w:t xml:space="preserve"> abstract or</w:t>
+      </w:r>
+      <w:r>
+        <w:t xml:space="preserve"> reference list. Use letters for table footnotes.</w:t>
+      </w:r>
+    </w:p>
+    <w:p>
+      <w:pPr>
+        <w:pStyle w:val="BodyText"/>
+      </w:pPr>
+      <w:r>
+        <w:t>a paper title, except for proper nouns and element symbols.</w:t>
+      </w:r>
+    </w:p>
+    <w:p>
+      <w:pPr>
+        <w:pStyle w:val="BodyText"/>
+      </w:pPr>
+      <w:r>
+        <w:t xml:space="preserve">For </w:t>
+      </w:r>
+      <w:r>
+        <w:t>papers</w:t>
+      </w:r>
+      <w:r>
+        <w:t xml:space="preserve"> published in translation journals, please give the English citation first, followed by the original foreign-language citation [6].</w:t>
+      </w:r>
+    </w:p>
+    <w:p/>
+    <w:p>
+      <w:pPr>
+        <w:pStyle w:val="references"/>
+        <w:ind w:left="354" w:hanging="354"/>
+      </w:pPr>
+      <w:r>
+        <w:t xml:space="preserve">G. Eason, B. Noble, and I. N. Sneddon, “On certain integrals of Lipschitz-Hankel type involving products of Bessel functions,” Phil. Trans. Roy. Soc. London, vol. A247, pp. 529–551, April 1955. </w:t>
       </w:r>
       <w:r>
         <w:rPr>
           <w:i/>
           <w:iCs/>
         </w:rPr>
-        <w:t xml:space="preserve">var. </w:t>
-      </w:r>
-      <w:r>
-        <w:t>Code flows and logic should be presented better as Graph or Diagram instead of words.</w:t>
-      </w:r>
-    </w:p>
-    <w:p>
-      <w:pPr>
-        <w:jc w:val="both"/>
-      </w:pPr>
-      <w:r>
-        <w:t xml:space="preserve">Code Block which is too big to put in the textbox can be reference as </w:t>
-      </w:r>
-      <w:r>
-        <w:fldChar w:fldCharType="begin"/>
-      </w:r>
-      <w:r>
-        <w:instrText xml:space="preserve"> REF _Ref98200691 \h </w:instrText>
-      </w:r>
-      <w:r>
-        <w:fldChar w:fldCharType="separate"/>
-      </w:r>
-      <w:r>
-        <w:t xml:space="preserve">Listing </w:t>
-      </w:r>
-      <w:r>
-        <w:rPr>
-          <w:noProof/>
-        </w:rPr>
-        <w:t>2</w:t>
-      </w:r>
-      <w:r>
-        <w:fldChar w:fldCharType="end"/>
-      </w:r>
-      <w:r>
-        <w:t>.</w:t>
-      </w:r>
-    </w:p>
-    <w:p>
-      <w:pPr>
-        <w:pStyle w:val="Code"/>
-      </w:pPr>
-      <w:bookmarkStart w:id="2" w:name="_Ref98200691"/>
-      <w:bookmarkStart w:id="3" w:name="_Ref98200677"/>
-      <w:r>
-        <w:t xml:space="preserve">Listing </w:t>
-      </w:r>
-      <w:fldSimple w:instr=" SEQ Listing \* ARABIC ">
-        <w:r>
-          <w:rPr>
-            <w:noProof/>
-          </w:rPr>
-          <w:t>2</w:t>
-        </w:r>
-      </w:fldSimple>
-      <w:bookmarkEnd w:id="2"/>
-      <w:r>
-        <w:t xml:space="preserve"> </w:t>
-      </w:r>
-      <w:r>
-        <w:t xml:space="preserve">Unit Test </w:t>
-      </w:r>
-      <w:hyperlink r:id="rId14" w:anchor="L34-L49" w:history="1">
-        <w:r>
-          <w:rPr>
-            <w:rStyle w:val="Hyperlink"/>
-            <w:bCs w:val="0"/>
-          </w:rPr>
-          <w:t>EncodeDateTimeTest</w:t>
-        </w:r>
-      </w:hyperlink>
-      <w:bookmarkEnd w:id="3"/>
-    </w:p>
-    <w:p>
-      <w:r>
-        <w:pict w14:anchorId="43633294">
-          <v:shape id="_x0000_s2057" type="#_x0000_t202" style="width:235.85pt;height:318.4pt;visibility:visible;mso-height-percent:200;mso-left-percent:-10001;mso-top-percent:-10001;mso-wrap-distance-left:9pt;mso-wrap-distance-top:3.6pt;mso-wrap-distance-right:9pt;mso-wrap-distance-bottom:3.6pt;mso-position-horizontal:absolute;mso-position-horizontal-relative:char;mso-position-vertical:absolute;mso-position-vertical-relative:line;mso-height-percent:200;mso-left-percent:-10001;mso-top-percent:-10001;mso-width-relative:margin;mso-height-relative:margin;v-text-anchor:top">
-            <v:textbox style="mso-fit-shape-to-text:t">
-              <w:txbxContent>
-                <w:p>
-                  <w:pPr>
-                    <w:jc w:val="left"/>
-                  </w:pPr>
-                  <w:r>
-                    <w:t xml:space="preserve">public void </w:t>
-                  </w:r>
-                  <w:proofErr w:type="gramStart"/>
-                  <w:r>
-                    <w:t>EncodeDateTimeTest(</w:t>
-                  </w:r>
-                  <w:proofErr w:type="gramEnd"/>
-                  <w:r>
-                    <w:t>int w, double r, …)</w:t>
-                  </w:r>
-                </w:p>
-                <w:p>
-                  <w:pPr>
-                    <w:jc w:val="left"/>
-                  </w:pPr>
-                  <w:r>
-                    <w:t xml:space="preserve">    {</w:t>
-                  </w:r>
-                </w:p>
-                <w:p>
-                  <w:pPr>
-                    <w:jc w:val="left"/>
-                  </w:pPr>
-                  <w:r>
-                    <w:t xml:space="preserve">        …</w:t>
-                  </w:r>
-                </w:p>
-                <w:p>
-                  <w:pPr>
-                    <w:jc w:val="left"/>
-                  </w:pPr>
-                  <w:r>
-                    <w:t xml:space="preserve">        </w:t>
-                  </w:r>
-                  <w:proofErr w:type="spellStart"/>
-                  <w:r>
-                    <w:t>DateTimeEncoderExperimental</w:t>
-                  </w:r>
-                  <w:proofErr w:type="spellEnd"/>
-                  <w:r>
-                    <w:t xml:space="preserve"> encoder = new…</w:t>
-                  </w:r>
-                </w:p>
-                <w:p>
-                  <w:pPr>
-                    <w:jc w:val="left"/>
-                  </w:pPr>
-                  <w:r>
-                    <w:t xml:space="preserve">        var result = </w:t>
-                  </w:r>
-                  <w:proofErr w:type="spellStart"/>
-                  <w:proofErr w:type="gramStart"/>
-                  <w:r>
-                    <w:t>encoder.Encode</w:t>
-                  </w:r>
-                  <w:proofErr w:type="spellEnd"/>
-                  <w:proofErr w:type="gramEnd"/>
-                  <w:r>
-                    <w:t>(input);</w:t>
-                  </w:r>
-                </w:p>
-                <w:p>
-                  <w:pPr>
-                    <w:jc w:val="left"/>
-                  </w:pPr>
-                  <w:r>
-                    <w:t xml:space="preserve">        …</w:t>
-                  </w:r>
-                </w:p>
-                <w:p>
-                  <w:pPr>
-                    <w:jc w:val="left"/>
-                  </w:pPr>
-                  <w:r>
-                    <w:t xml:space="preserve">        </w:t>
-                  </w:r>
-                  <w:proofErr w:type="spellStart"/>
-                  <w:r>
-                    <w:t>Assert.IsTrue</w:t>
-                  </w:r>
-                  <w:proofErr w:type="spellEnd"/>
-                  <w:r>
-                    <w:t>(</w:t>
-                  </w:r>
-                  <w:proofErr w:type="spellStart"/>
-                  <w:proofErr w:type="gramStart"/>
-                  <w:r>
-                    <w:t>result.SequenceEqual</w:t>
-                  </w:r>
-                  <w:proofErr w:type="spellEnd"/>
-                  <w:proofErr w:type="gramEnd"/>
-                  <w:r>
-                    <w:t>(expected…</w:t>
-                  </w:r>
-                </w:p>
-                <w:p>
-                  <w:pPr>
-                    <w:jc w:val="left"/>
-                  </w:pPr>
-                  <w:r>
-                    <w:t xml:space="preserve">        }</w:t>
-                  </w:r>
-                </w:p>
-              </w:txbxContent>
-            </v:textbox>
-            <w10:anchorlock/>
-          </v:shape>
-        </w:pict>
-      </w:r>
-    </w:p>
-    <w:p>
-      <w:pPr>
-        <w:pStyle w:val="Heading5"/>
-      </w:pPr>
-      <w:r>
-        <w:t>Acknowledgment</w:t>
-      </w:r>
-      <w:r>
-        <w:t xml:space="preserve"> </w:t>
-      </w:r>
-      <w:r>
-        <w:rPr>
-          <w:i/>
-          <w:iCs/>
-        </w:rPr>
-        <w:t>(</w:t>
-      </w:r>
-      <w:r>
-        <w:rPr>
-          <w:i/>
-          <w:iCs/>
-          <w:smallCaps w:val="0"/>
-        </w:rPr>
-        <w:t>Heading 5</w:t>
-      </w:r>
-      <w:r>
-        <w:rPr>
-          <w:i/>
-          <w:iCs/>
-        </w:rPr>
-        <w:t>)</w:t>
-      </w:r>
-    </w:p>
-    <w:p>
-      <w:pPr>
-        <w:pStyle w:val="BodyText"/>
-      </w:pPr>
-      <w:r>
-        <w:t>The preferred spelling of the word “acknowledgment” in America is without an “e” after the “g</w:t>
-      </w:r>
-      <w:r>
-        <w:t>”. Avoid the stilted expression “</w:t>
-      </w:r>
-      <w:proofErr w:type="spellStart"/>
-      <w:r>
-        <w:rPr>
-          <w:lang w:val="en-US"/>
-        </w:rPr>
-        <w:t>o</w:t>
-      </w:r>
-      <w:r>
-        <w:t>ne</w:t>
-      </w:r>
-      <w:proofErr w:type="spellEnd"/>
-      <w:r>
-        <w:t xml:space="preserve"> of us (R. B. G.) thanks </w:t>
-      </w:r>
-      <w:r>
-        <w:t>...</w:t>
-      </w:r>
-      <w:r>
-        <w:rPr>
-          <w:lang w:val="en-US"/>
-        </w:rPr>
-        <w:t xml:space="preserve">”.  </w:t>
-      </w:r>
-      <w:r>
-        <w:t>Instead, try “R. B. G. thanks</w:t>
-      </w:r>
-      <w:r>
-        <w:t>...</w:t>
-      </w:r>
-      <w:r>
-        <w:t>”.</w:t>
-      </w:r>
-      <w:r>
-        <w:rPr>
-          <w:lang w:val="en-US"/>
-        </w:rPr>
-        <w:t xml:space="preserve"> </w:t>
-      </w:r>
-      <w:r>
-        <w:t>Put spons</w:t>
-      </w:r>
-      <w:r>
-        <w:t>or acknowledgments in the unnum</w:t>
-      </w:r>
-      <w:r>
-        <w:t>bered footnote on the first page.</w:t>
-      </w:r>
-    </w:p>
-    <w:p>
-      <w:pPr>
-        <w:pStyle w:val="Heading5"/>
-      </w:pPr>
-      <w:r>
-        <w:t>References</w:t>
-      </w:r>
-    </w:p>
-    <w:p>
-      <w:pPr>
-        <w:pStyle w:val="BodyText"/>
-      </w:pPr>
-      <w:r>
-        <w:t>The template will number citations consecutively within brackets [1]. The sentence punctuation follows the bracket [2]. Refer simply to the reference number, as in [3]—do not use “Ref. [3]” or “reference [3]” except at the beginning of a sentence: “Reference [3] was the first</w:t>
-      </w:r>
-      <w:r>
-        <w:rPr>
-          <w:lang w:val="en-US"/>
-        </w:rPr>
-        <w:t xml:space="preserve"> </w:t>
-      </w:r>
-      <w:r>
-        <w:t>...</w:t>
-      </w:r>
-      <w:r>
-        <w:t>”</w:t>
-      </w:r>
-    </w:p>
-    <w:p>
-      <w:pPr>
-        <w:pStyle w:val="BodyText"/>
-      </w:pPr>
-      <w:r>
-        <w:t>Number footnotes separately in superscripts. Place the actual footnote at the bottom of the column in which it was cited. Do not put footnotes in the</w:t>
-      </w:r>
-      <w:r>
-        <w:rPr>
-          <w:lang w:val="en-US"/>
-        </w:rPr>
-        <w:t xml:space="preserve"> abstract or</w:t>
-      </w:r>
-      <w:r>
-        <w:t xml:space="preserve"> reference list. Use letters for table footnotes.</w:t>
-      </w:r>
-    </w:p>
-    <w:p>
-      <w:pPr>
-        <w:pStyle w:val="BodyText"/>
-      </w:pPr>
-      <w:r>
-        <w:t>a paper title, except for proper nouns and element symbols.</w:t>
-      </w:r>
-    </w:p>
-    <w:p>
-      <w:pPr>
-        <w:pStyle w:val="BodyText"/>
-      </w:pPr>
-      <w:r>
-        <w:t xml:space="preserve">For </w:t>
-      </w:r>
-      <w:r>
-        <w:t>papers</w:t>
-      </w:r>
-      <w:r>
-        <w:t xml:space="preserve"> published in translation journals, please give the English citation first, followed by the original foreign-language citation [6].</w:t>
-      </w:r>
-    </w:p>
-    <w:p/>
+        <w:t>(references)</w:t>
+      </w:r>
+    </w:p>
     <w:p>
       <w:pPr>
         <w:pStyle w:val="references"/>
         <w:ind w:left="354" w:hanging="354"/>
       </w:pPr>
       <w:r>
-        <w:t xml:space="preserve">G. Eason, B. Noble, and I. N. Sneddon, “On certain integrals of Lipschitz-Hankel type involving products of Bessel functions,” Phil. Trans. Roy. Soc. London, vol. A247, pp. 529–551, April 1955. </w:t>
-      </w:r>
-      <w:r>
-        <w:rPr>
-          <w:i/>
-          <w:iCs/>
-        </w:rPr>
-        <w:t>(references)</w:t>
-      </w:r>
-    </w:p>
-    <w:p>
-      <w:pPr>
-        <w:pStyle w:val="references"/>
-        <w:ind w:left="354" w:hanging="354"/>
-      </w:pPr>
-      <w:r>
         <w:t>J. Clerk Maxwell, A Treatise on Electricity and Magnetism, 3rd ed., vol. 2. Oxford: Clarendon, 1892, pp.68–73.</w:t>
-      </w:r>
-    </w:p>
-    <w:p>
-      <w:pPr>
-        <w:pStyle w:val="references"/>
-        <w:ind w:left="354" w:hanging="354"/>
-      </w:pPr>
-      <w:r>
-        <w:t>I. S. Jacobs and C. P. Bean, “Fine particles, thin films and exchange anisotropy,” in Magnetism, vol. III, G. T. Rado and H. Suhl, Eds. New York: Academic, 1963, pp. 271–350.</w:t>
-      </w:r>
-    </w:p>
-    <w:p>
-      <w:pPr>
-        <w:pStyle w:val="references"/>
-        <w:ind w:left="354" w:hanging="354"/>
-      </w:pPr>
-      <w:r>
-        <w:t>K. Elissa, “Title of paper if known,” unpublished.</w:t>
-      </w:r>
-    </w:p>
-    <w:p>
-      <w:pPr>
-        <w:pStyle w:val="references"/>
-        <w:ind w:left="354" w:hanging="354"/>
-      </w:pPr>
-      <w:r>
-        <w:t>R. Nicole, “Title of paper with only first word capitalized,” J. Name Stand. Abbrev., in press.</w:t>
-      </w:r>
-    </w:p>
-    <w:p>
-      <w:pPr>
-        <w:pStyle w:val="references"/>
-        <w:ind w:left="354" w:hanging="354"/>
-      </w:pPr>
-      <w:r>
-        <w:t>Y. Yorozu, M. Hirano, K. Oka, and Y. Tagawa, “Electron spectroscopy studies on magneto-optical media and plastic substrate interface,” IEEE Transl. J. Magn. Japan, vol. 2, pp. 740–741, August 1987 [Digests 9th Annual Conf. Magnetics Japan, p. 301, 1982].</w:t>
-      </w:r>
-    </w:p>
-    <w:p>
-      <w:pPr>
-        <w:pStyle w:val="references"/>
-        <w:ind w:left="354" w:hanging="354"/>
-      </w:pPr>
-      <w:r>
-        <w:t>M. Young, The Technical Writer</w:t>
-      </w:r>
-      <w:r>
-        <w:t>’</w:t>
-      </w:r>
-      <w:r>
-        <w:t>s Handbook. Mill Valley, CA: University Science, 1989.</w:t>
       </w:r>
     </w:p>
     <w:p>
@@ -10937,28 +9610,12 @@
           <w:ilvl w:val="0"/>
           <w:numId w:val="0"/>
         </w:numPr>
-        <w:ind w:left="360" w:hanging="360"/>
       </w:pPr>
     </w:p>
     <w:p>
       <w:pPr>
         <w:pStyle w:val="references"/>
-        <w:numPr>
-          <w:ilvl w:val="0"/>
-          <w:numId w:val="0"/>
-        </w:numPr>
-        <w:ind w:left="360" w:hanging="360"/>
-        <w:jc w:val="center"/>
-        <w:rPr>
-          <w:rFonts w:eastAsia="SimSun"/>
-          <w:b/>
-          <w:noProof w:val="0"/>
-          <w:color w:val="FF0000"/>
-          <w:spacing w:val="-1"/>
-          <w:sz w:val="20"/>
-          <w:szCs w:val="20"/>
-          <w:lang w:val="x-none" w:eastAsia="x-none"/>
-        </w:rPr>
+        <w:ind w:left="354" w:hanging="354"/>
         <w:sectPr>
           <w:type w:val="continuous"/>
           <w:pgSz w:w="11906" w:h="16838" w:code="9"/>
@@ -10967,231 +9624,8 @@
           <w:docGrid w:linePitch="360"/>
         </w:sectPr>
       </w:pPr>
-      <w:r>
-        <w:rPr>
-          <w:rFonts w:eastAsia="SimSun"/>
-          <w:b/>
-          <w:noProof w:val="0"/>
-          <w:color w:val="FF0000"/>
-          <w:spacing w:val="-1"/>
-          <w:sz w:val="20"/>
-          <w:szCs w:val="20"/>
-          <w:lang w:eastAsia="x-none"/>
-        </w:rPr>
-        <w:t>This report</w:t>
-      </w:r>
-      <w:r>
-        <w:rPr>
-          <w:rFonts w:eastAsia="SimSun"/>
-          <w:b/>
-          <w:noProof w:val="0"/>
-          <w:color w:val="FF0000"/>
-          <w:spacing w:val="-1"/>
-          <w:sz w:val="20"/>
-          <w:szCs w:val="20"/>
-          <w:lang w:val="x-none" w:eastAsia="x-none"/>
-        </w:rPr>
-        <w:t xml:space="preserve"> template</w:t>
-      </w:r>
-      <w:r>
-        <w:rPr>
-          <w:rFonts w:eastAsia="SimSun"/>
-          <w:b/>
-          <w:noProof w:val="0"/>
-          <w:color w:val="FF0000"/>
-          <w:spacing w:val="-1"/>
-          <w:sz w:val="20"/>
-          <w:szCs w:val="20"/>
-          <w:lang w:val="x-none" w:eastAsia="x-none"/>
-        </w:rPr>
-        <w:t xml:space="preserve"> contain</w:t>
-      </w:r>
-      <w:r>
-        <w:rPr>
-          <w:rFonts w:eastAsia="SimSun"/>
-          <w:b/>
-          <w:noProof w:val="0"/>
-          <w:color w:val="FF0000"/>
-          <w:spacing w:val="-1"/>
-          <w:sz w:val="20"/>
-          <w:szCs w:val="20"/>
-          <w:lang w:eastAsia="x-none"/>
-        </w:rPr>
-        <w:t>s</w:t>
-      </w:r>
-      <w:r>
-        <w:rPr>
-          <w:rFonts w:eastAsia="SimSun"/>
-          <w:b/>
-          <w:noProof w:val="0"/>
-          <w:color w:val="FF0000"/>
-          <w:spacing w:val="-1"/>
-          <w:sz w:val="20"/>
-          <w:szCs w:val="20"/>
-          <w:lang w:val="x-none" w:eastAsia="x-none"/>
-        </w:rPr>
-        <w:t xml:space="preserve"> guidance text for comp</w:t>
-      </w:r>
-      <w:r>
-        <w:rPr>
-          <w:rFonts w:eastAsia="SimSun"/>
-          <w:b/>
-          <w:noProof w:val="0"/>
-          <w:color w:val="FF0000"/>
-          <w:spacing w:val="-1"/>
-          <w:sz w:val="20"/>
-          <w:szCs w:val="20"/>
-          <w:lang w:val="x-none" w:eastAsia="x-none"/>
-        </w:rPr>
-        <w:t>osing and formatting technical reports</w:t>
-      </w:r>
-      <w:r>
-        <w:rPr>
-          <w:rFonts w:eastAsia="SimSun"/>
-          <w:b/>
-          <w:noProof w:val="0"/>
-          <w:color w:val="FF0000"/>
-          <w:spacing w:val="-1"/>
-          <w:sz w:val="20"/>
-          <w:szCs w:val="20"/>
-          <w:lang w:val="x-none" w:eastAsia="x-none"/>
-        </w:rPr>
-        <w:t>. Please ensure that all template text is re</w:t>
-      </w:r>
-      <w:r>
-        <w:rPr>
-          <w:rFonts w:eastAsia="SimSun"/>
-          <w:b/>
-          <w:noProof w:val="0"/>
-          <w:color w:val="FF0000"/>
-          <w:spacing w:val="-1"/>
-          <w:sz w:val="20"/>
-          <w:szCs w:val="20"/>
-          <w:lang w:val="x-none" w:eastAsia="x-none"/>
-        </w:rPr>
-        <w:t>moved from your report</w:t>
-      </w:r>
-      <w:r>
-        <w:rPr>
-          <w:rFonts w:eastAsia="SimSun"/>
-          <w:b/>
-          <w:noProof w:val="0"/>
-          <w:color w:val="FF0000"/>
-          <w:spacing w:val="-1"/>
-          <w:sz w:val="20"/>
-          <w:szCs w:val="20"/>
-          <w:lang w:val="x-none" w:eastAsia="x-none"/>
-        </w:rPr>
-        <w:t xml:space="preserve"> prior to submission to the </w:t>
-      </w:r>
-      <w:r>
-        <w:rPr>
-          <w:rFonts w:eastAsia="SimSun"/>
-          <w:b/>
-          <w:noProof w:val="0"/>
-          <w:color w:val="FF0000"/>
-          <w:spacing w:val="-1"/>
-          <w:sz w:val="20"/>
-          <w:szCs w:val="20"/>
-          <w:lang w:eastAsia="x-none"/>
-        </w:rPr>
-        <w:t>examination office</w:t>
-      </w:r>
-      <w:r>
-        <w:rPr>
-          <w:rFonts w:eastAsia="SimSun"/>
-          <w:b/>
-          <w:noProof w:val="0"/>
-          <w:color w:val="FF0000"/>
-          <w:spacing w:val="-1"/>
-          <w:sz w:val="20"/>
-          <w:szCs w:val="20"/>
-          <w:lang w:val="x-none" w:eastAsia="x-none"/>
-        </w:rPr>
-        <w:t xml:space="preserve">. Failure to remove template text from your paper </w:t>
-      </w:r>
-      <w:r>
-        <w:rPr>
-          <w:rFonts w:eastAsia="SimSun"/>
-          <w:b/>
-          <w:noProof w:val="0"/>
-          <w:color w:val="FF0000"/>
-          <w:spacing w:val="-1"/>
-          <w:sz w:val="20"/>
-          <w:szCs w:val="20"/>
-          <w:lang w:eastAsia="x-none"/>
-        </w:rPr>
-        <w:t>may</w:t>
-      </w:r>
-      <w:r>
-        <w:rPr>
-          <w:rFonts w:eastAsia="SimSun"/>
-          <w:b/>
-          <w:noProof w:val="0"/>
-          <w:color w:val="FF0000"/>
-          <w:spacing w:val="-1"/>
-          <w:sz w:val="20"/>
-          <w:szCs w:val="20"/>
-          <w:lang w:val="x-none" w:eastAsia="x-none"/>
-        </w:rPr>
-        <w:t xml:space="preserve"> result i</w:t>
-      </w:r>
-      <w:r>
-        <w:rPr>
-          <w:rFonts w:eastAsia="SimSun"/>
-          <w:b/>
-          <w:noProof w:val="0"/>
-          <w:color w:val="FF0000"/>
-          <w:spacing w:val="-1"/>
-          <w:sz w:val="20"/>
-          <w:szCs w:val="20"/>
-          <w:lang w:val="x-none" w:eastAsia="x-none"/>
-        </w:rPr>
-        <w:t>n your paper being degraded</w:t>
-      </w:r>
-      <w:r>
-        <w:rPr>
-          <w:rFonts w:eastAsia="SimSun"/>
-          <w:b/>
-          <w:noProof w:val="0"/>
-          <w:color w:val="FF0000"/>
-          <w:spacing w:val="-1"/>
-          <w:sz w:val="20"/>
-          <w:szCs w:val="20"/>
-          <w:lang w:val="x-none" w:eastAsia="x-none"/>
-        </w:rPr>
-        <w:t>.</w:t>
-      </w:r>
-    </w:p>
-    <w:p>
-      <w:r>
-        <w:pict w14:anchorId="4A67007D">
-          <v:shape id="_x0000_s2056" type="#_x0000_t202" style="position:absolute;left:0;text-align:left;margin-left:0;margin-top:19.8pt;width:252pt;height:90pt;z-index:-10;mso-wrap-edited:f;mso-position-horizontal:left;mso-position-horizontal-relative:margin" wrapcoords="-64 0 -64 21600 21664 21600 21664 0 -64 0">
-            <v:textbox style="mso-next-textbox:#_x0000_s2056">
-              <w:txbxContent>
-                <w:p>
-                  <w:pPr>
-                    <w:pStyle w:val="BodyText"/>
-                  </w:pPr>
-                  <w:r>
-                    <w:t>We suggest that you use a text box to insert a graphic (which is ideally a 300 dpi TIFF or EPS file, with all fonts embedded) because, in an MSW document, this method is somewhat more stable than directly inserting a picture.</w:t>
-                  </w:r>
-                </w:p>
-                <w:p>
-                  <w:pPr>
-                    <w:pStyle w:val="BodyText"/>
-                  </w:pPr>
-                  <w:r>
-                    <w:t>To have non-visible rules on your frame, use the MSWord “Format” pull-down menu, select Text Box &gt; Colors and Lines to choose No Fill and No Line.</w:t>
-                  </w:r>
-                </w:p>
-              </w:txbxContent>
-            </v:textbox>
-            <w10:wrap type="tight" anchorx="margin"/>
-          </v:shape>
-        </w:pict>
-      </w:r>
-    </w:p>
+    </w:p>
+    <w:p/>
     <w:sectPr>
       <w:type w:val="continuous"/>
       <w:pgSz w:w="11906" w:h="16838" w:code="9"/>
@@ -12540,6 +10974,119 @@
     </w:lvl>
   </w:abstractNum>
   <w:abstractNum w:abstractNumId="17" w15:restartNumberingAfterBreak="0">
+    <w:nsid w:val="38DE6057"/>
+    <w:multiLevelType w:val="multilevel"/>
+    <w:tmpl w:val="5A6AFD18"/>
+    <w:lvl w:ilvl="0">
+      <w:start w:val="1"/>
+      <w:numFmt w:val="decimal"/>
+      <w:lvlText w:val="%1."/>
+      <w:lvlJc w:val="left"/>
+      <w:pPr>
+        <w:tabs>
+          <w:tab w:val="num" w:pos="720"/>
+        </w:tabs>
+        <w:ind w:left="720" w:hanging="360"/>
+      </w:pPr>
+    </w:lvl>
+    <w:lvl w:ilvl="1" w:tentative="1">
+      <w:start w:val="1"/>
+      <w:numFmt w:val="decimal"/>
+      <w:lvlText w:val="%2."/>
+      <w:lvlJc w:val="left"/>
+      <w:pPr>
+        <w:tabs>
+          <w:tab w:val="num" w:pos="1440"/>
+        </w:tabs>
+        <w:ind w:left="1440" w:hanging="360"/>
+      </w:pPr>
+    </w:lvl>
+    <w:lvl w:ilvl="2" w:tentative="1">
+      <w:start w:val="1"/>
+      <w:numFmt w:val="decimal"/>
+      <w:lvlText w:val="%3."/>
+      <w:lvlJc w:val="left"/>
+      <w:pPr>
+        <w:tabs>
+          <w:tab w:val="num" w:pos="2160"/>
+        </w:tabs>
+        <w:ind w:left="2160" w:hanging="360"/>
+      </w:pPr>
+    </w:lvl>
+    <w:lvl w:ilvl="3" w:tentative="1">
+      <w:start w:val="1"/>
+      <w:numFmt w:val="decimal"/>
+      <w:lvlText w:val="%4."/>
+      <w:lvlJc w:val="left"/>
+      <w:pPr>
+        <w:tabs>
+          <w:tab w:val="num" w:pos="2880"/>
+        </w:tabs>
+        <w:ind w:left="2880" w:hanging="360"/>
+      </w:pPr>
+    </w:lvl>
+    <w:lvl w:ilvl="4" w:tentative="1">
+      <w:start w:val="1"/>
+      <w:numFmt w:val="decimal"/>
+      <w:lvlText w:val="%5."/>
+      <w:lvlJc w:val="left"/>
+      <w:pPr>
+        <w:tabs>
+          <w:tab w:val="num" w:pos="3600"/>
+        </w:tabs>
+        <w:ind w:left="3600" w:hanging="360"/>
+      </w:pPr>
+    </w:lvl>
+    <w:lvl w:ilvl="5" w:tentative="1">
+      <w:start w:val="1"/>
+      <w:numFmt w:val="decimal"/>
+      <w:lvlText w:val="%6."/>
+      <w:lvlJc w:val="left"/>
+      <w:pPr>
+        <w:tabs>
+          <w:tab w:val="num" w:pos="4320"/>
+        </w:tabs>
+        <w:ind w:left="4320" w:hanging="360"/>
+      </w:pPr>
+    </w:lvl>
+    <w:lvl w:ilvl="6" w:tentative="1">
+      <w:start w:val="1"/>
+      <w:numFmt w:val="decimal"/>
+      <w:lvlText w:val="%7."/>
+      <w:lvlJc w:val="left"/>
+      <w:pPr>
+        <w:tabs>
+          <w:tab w:val="num" w:pos="5040"/>
+        </w:tabs>
+        <w:ind w:left="5040" w:hanging="360"/>
+      </w:pPr>
+    </w:lvl>
+    <w:lvl w:ilvl="7" w:tentative="1">
+      <w:start w:val="1"/>
+      <w:numFmt w:val="decimal"/>
+      <w:lvlText w:val="%8."/>
+      <w:lvlJc w:val="left"/>
+      <w:pPr>
+        <w:tabs>
+          <w:tab w:val="num" w:pos="5760"/>
+        </w:tabs>
+        <w:ind w:left="5760" w:hanging="360"/>
+      </w:pPr>
+    </w:lvl>
+    <w:lvl w:ilvl="8" w:tentative="1">
+      <w:start w:val="1"/>
+      <w:numFmt w:val="decimal"/>
+      <w:lvlText w:val="%9."/>
+      <w:lvlJc w:val="left"/>
+      <w:pPr>
+        <w:tabs>
+          <w:tab w:val="num" w:pos="6480"/>
+        </w:tabs>
+        <w:ind w:left="6480" w:hanging="360"/>
+      </w:pPr>
+    </w:lvl>
+  </w:abstractNum>
+  <w:abstractNum w:abstractNumId="18" w15:restartNumberingAfterBreak="0">
     <w:nsid w:val="39E54FC6"/>
     <w:multiLevelType w:val="singleLevel"/>
     <w:tmpl w:val="5B7288D4"/>
@@ -12559,7 +11106,7 @@
       </w:rPr>
     </w:lvl>
   </w:abstractNum>
-  <w:abstractNum w:abstractNumId="18" w15:restartNumberingAfterBreak="0">
+  <w:abstractNum w:abstractNumId="19" w15:restartNumberingAfterBreak="0">
     <w:nsid w:val="3DFA67E4"/>
     <w:multiLevelType w:val="multilevel"/>
     <w:tmpl w:val="E3746392"/>
@@ -12708,7 +11255,7 @@
       </w:rPr>
     </w:lvl>
   </w:abstractNum>
-  <w:abstractNum w:abstractNumId="19" w15:restartNumberingAfterBreak="0">
+  <w:abstractNum w:abstractNumId="20" w15:restartNumberingAfterBreak="0">
     <w:nsid w:val="3EC66250"/>
     <w:multiLevelType w:val="multilevel"/>
     <w:tmpl w:val="D4C07676"/>
@@ -12857,7 +11404,7 @@
       </w:rPr>
     </w:lvl>
   </w:abstractNum>
-  <w:abstractNum w:abstractNumId="20" w15:restartNumberingAfterBreak="0">
+  <w:abstractNum w:abstractNumId="21" w15:restartNumberingAfterBreak="0">
     <w:nsid w:val="4189603E"/>
     <w:multiLevelType w:val="multilevel"/>
     <w:tmpl w:val="0AB06E12"/>
@@ -13052,7 +11599,7 @@
       </w:rPr>
     </w:lvl>
   </w:abstractNum>
-  <w:abstractNum w:abstractNumId="21" w15:restartNumberingAfterBreak="0">
+  <w:abstractNum w:abstractNumId="22" w15:restartNumberingAfterBreak="0">
     <w:nsid w:val="493C3F76"/>
     <w:multiLevelType w:val="hybridMultilevel"/>
     <w:tmpl w:val="9A9E418C"/>
@@ -13159,7 +11706,7 @@
       </w:pPr>
     </w:lvl>
   </w:abstractNum>
-  <w:abstractNum w:abstractNumId="22" w15:restartNumberingAfterBreak="0">
+  <w:abstractNum w:abstractNumId="23" w15:restartNumberingAfterBreak="0">
     <w:nsid w:val="4F3B51B7"/>
     <w:multiLevelType w:val="multilevel"/>
     <w:tmpl w:val="648CB60E"/>
@@ -13308,7 +11855,7 @@
       </w:rPr>
     </w:lvl>
   </w:abstractNum>
-  <w:abstractNum w:abstractNumId="23" w15:restartNumberingAfterBreak="0">
+  <w:abstractNum w:abstractNumId="24" w15:restartNumberingAfterBreak="0">
     <w:nsid w:val="52CA544A"/>
     <w:multiLevelType w:val="singleLevel"/>
     <w:tmpl w:val="AED6D67E"/>
@@ -13335,7 +11882,156 @@
       </w:rPr>
     </w:lvl>
   </w:abstractNum>
-  <w:abstractNum w:abstractNumId="24" w15:restartNumberingAfterBreak="0">
+  <w:abstractNum w:abstractNumId="25" w15:restartNumberingAfterBreak="0">
+    <w:nsid w:val="535C471F"/>
+    <w:multiLevelType w:val="multilevel"/>
+    <w:tmpl w:val="65D41630"/>
+    <w:lvl w:ilvl="0">
+      <w:start w:val="1"/>
+      <w:numFmt w:val="bullet"/>
+      <w:lvlText w:val=""/>
+      <w:lvlJc w:val="left"/>
+      <w:pPr>
+        <w:tabs>
+          <w:tab w:val="num" w:pos="720"/>
+        </w:tabs>
+        <w:ind w:left="720" w:hanging="360"/>
+      </w:pPr>
+      <w:rPr>
+        <w:rFonts w:ascii="Symbol" w:hAnsi="Symbol" w:hint="default"/>
+        <w:sz w:val="20"/>
+      </w:rPr>
+    </w:lvl>
+    <w:lvl w:ilvl="1" w:tentative="1">
+      <w:start w:val="1"/>
+      <w:numFmt w:val="bullet"/>
+      <w:lvlText w:val="o"/>
+      <w:lvlJc w:val="left"/>
+      <w:pPr>
+        <w:tabs>
+          <w:tab w:val="num" w:pos="1440"/>
+        </w:tabs>
+        <w:ind w:left="1440" w:hanging="360"/>
+      </w:pPr>
+      <w:rPr>
+        <w:rFonts w:ascii="Courier New" w:hAnsi="Courier New" w:hint="default"/>
+        <w:sz w:val="20"/>
+      </w:rPr>
+    </w:lvl>
+    <w:lvl w:ilvl="2" w:tentative="1">
+      <w:start w:val="1"/>
+      <w:numFmt w:val="bullet"/>
+      <w:lvlText w:val=""/>
+      <w:lvlJc w:val="left"/>
+      <w:pPr>
+        <w:tabs>
+          <w:tab w:val="num" w:pos="2160"/>
+        </w:tabs>
+        <w:ind w:left="2160" w:hanging="360"/>
+      </w:pPr>
+      <w:rPr>
+        <w:rFonts w:ascii="Wingdings" w:hAnsi="Wingdings" w:hint="default"/>
+        <w:sz w:val="20"/>
+      </w:rPr>
+    </w:lvl>
+    <w:lvl w:ilvl="3" w:tentative="1">
+      <w:start w:val="1"/>
+      <w:numFmt w:val="bullet"/>
+      <w:lvlText w:val=""/>
+      <w:lvlJc w:val="left"/>
+      <w:pPr>
+        <w:tabs>
+          <w:tab w:val="num" w:pos="2880"/>
+        </w:tabs>
+        <w:ind w:left="2880" w:hanging="360"/>
+      </w:pPr>
+      <w:rPr>
+        <w:rFonts w:ascii="Wingdings" w:hAnsi="Wingdings" w:hint="default"/>
+        <w:sz w:val="20"/>
+      </w:rPr>
+    </w:lvl>
+    <w:lvl w:ilvl="4" w:tentative="1">
+      <w:start w:val="1"/>
+      <w:numFmt w:val="bullet"/>
+      <w:lvlText w:val=""/>
+      <w:lvlJc w:val="left"/>
+      <w:pPr>
+        <w:tabs>
+          <w:tab w:val="num" w:pos="3600"/>
+        </w:tabs>
+        <w:ind w:left="3600" w:hanging="360"/>
+      </w:pPr>
+      <w:rPr>
+        <w:rFonts w:ascii="Wingdings" w:hAnsi="Wingdings" w:hint="default"/>
+        <w:sz w:val="20"/>
+      </w:rPr>
+    </w:lvl>
+    <w:lvl w:ilvl="5" w:tentative="1">
+      <w:start w:val="1"/>
+      <w:numFmt w:val="bullet"/>
+      <w:lvlText w:val=""/>
+      <w:lvlJc w:val="left"/>
+      <w:pPr>
+        <w:tabs>
+          <w:tab w:val="num" w:pos="4320"/>
+        </w:tabs>
+        <w:ind w:left="4320" w:hanging="360"/>
+      </w:pPr>
+      <w:rPr>
+        <w:rFonts w:ascii="Wingdings" w:hAnsi="Wingdings" w:hint="default"/>
+        <w:sz w:val="20"/>
+      </w:rPr>
+    </w:lvl>
+    <w:lvl w:ilvl="6" w:tentative="1">
+      <w:start w:val="1"/>
+      <w:numFmt w:val="bullet"/>
+      <w:lvlText w:val=""/>
+      <w:lvlJc w:val="left"/>
+      <w:pPr>
+        <w:tabs>
+          <w:tab w:val="num" w:pos="5040"/>
+        </w:tabs>
+        <w:ind w:left="5040" w:hanging="360"/>
+      </w:pPr>
+      <w:rPr>
+        <w:rFonts w:ascii="Wingdings" w:hAnsi="Wingdings" w:hint="default"/>
+        <w:sz w:val="20"/>
+      </w:rPr>
+    </w:lvl>
+    <w:lvl w:ilvl="7" w:tentative="1">
+      <w:start w:val="1"/>
+      <w:numFmt w:val="bullet"/>
+      <w:lvlText w:val=""/>
+      <w:lvlJc w:val="left"/>
+      <w:pPr>
+        <w:tabs>
+          <w:tab w:val="num" w:pos="5760"/>
+        </w:tabs>
+        <w:ind w:left="5760" w:hanging="360"/>
+      </w:pPr>
+      <w:rPr>
+        <w:rFonts w:ascii="Wingdings" w:hAnsi="Wingdings" w:hint="default"/>
+        <w:sz w:val="20"/>
+      </w:rPr>
+    </w:lvl>
+    <w:lvl w:ilvl="8" w:tentative="1">
+      <w:start w:val="1"/>
+      <w:numFmt w:val="bullet"/>
+      <w:lvlText w:val=""/>
+      <w:lvlJc w:val="left"/>
+      <w:pPr>
+        <w:tabs>
+          <w:tab w:val="num" w:pos="6480"/>
+        </w:tabs>
+        <w:ind w:left="6480" w:hanging="360"/>
+      </w:pPr>
+      <w:rPr>
+        <w:rFonts w:ascii="Wingdings" w:hAnsi="Wingdings" w:hint="default"/>
+        <w:sz w:val="20"/>
+      </w:rPr>
+    </w:lvl>
+  </w:abstractNum>
+  <w:abstractNum w:abstractNumId="26" w15:restartNumberingAfterBreak="0">
     <w:nsid w:val="6C402C58"/>
     <w:multiLevelType w:val="hybridMultilevel"/>
     <w:tmpl w:val="9A1CA078"/>
@@ -13480,7 +12176,7 @@
       </w:rPr>
     </w:lvl>
   </w:abstractNum>
-  <w:abstractNum w:abstractNumId="25" w15:restartNumberingAfterBreak="0">
+  <w:abstractNum w:abstractNumId="27" w15:restartNumberingAfterBreak="0">
     <w:nsid w:val="6CD32DA8"/>
     <w:multiLevelType w:val="singleLevel"/>
     <w:tmpl w:val="166470C2"/>
@@ -13510,31 +12206,31 @@
     <w:abstractNumId w:val="16"/>
   </w:num>
   <w:num w:numId="2" w16cid:durableId="744106382">
-    <w:abstractNumId w:val="24"/>
+    <w:abstractNumId w:val="26"/>
   </w:num>
   <w:num w:numId="3" w16cid:durableId="405542283">
     <w:abstractNumId w:val="14"/>
   </w:num>
   <w:num w:numId="4" w16cid:durableId="58528485">
-    <w:abstractNumId w:val="20"/>
+    <w:abstractNumId w:val="21"/>
   </w:num>
   <w:num w:numId="5" w16cid:durableId="158690621">
-    <w:abstractNumId w:val="20"/>
+    <w:abstractNumId w:val="21"/>
   </w:num>
   <w:num w:numId="6" w16cid:durableId="1725248462">
-    <w:abstractNumId w:val="20"/>
+    <w:abstractNumId w:val="21"/>
   </w:num>
   <w:num w:numId="7" w16cid:durableId="941455226">
-    <w:abstractNumId w:val="20"/>
+    <w:abstractNumId w:val="21"/>
   </w:num>
   <w:num w:numId="8" w16cid:durableId="1785659599">
-    <w:abstractNumId w:val="23"/>
+    <w:abstractNumId w:val="24"/>
   </w:num>
   <w:num w:numId="9" w16cid:durableId="1933902280">
-    <w:abstractNumId w:val="25"/>
+    <w:abstractNumId w:val="27"/>
   </w:num>
   <w:num w:numId="10" w16cid:durableId="1495225212">
-    <w:abstractNumId w:val="17"/>
+    <w:abstractNumId w:val="18"/>
   </w:num>
   <w:num w:numId="11" w16cid:durableId="275407238">
     <w:abstractNumId w:val="13"/>
@@ -13576,22 +12272,28 @@
     <w:abstractNumId w:val="1"/>
   </w:num>
   <w:num w:numId="24" w16cid:durableId="841047741">
-    <w:abstractNumId w:val="21"/>
+    <w:abstractNumId w:val="22"/>
   </w:num>
   <w:num w:numId="25" w16cid:durableId="1846700602">
     <w:abstractNumId w:val="12"/>
   </w:num>
   <w:num w:numId="26" w16cid:durableId="2075734801">
-    <w:abstractNumId w:val="19"/>
+    <w:abstractNumId w:val="20"/>
   </w:num>
   <w:num w:numId="27" w16cid:durableId="372577414">
     <w:abstractNumId w:val="15"/>
   </w:num>
   <w:num w:numId="28" w16cid:durableId="500002219">
-    <w:abstractNumId w:val="18"/>
+    <w:abstractNumId w:val="19"/>
   </w:num>
   <w:num w:numId="29" w16cid:durableId="1753428773">
-    <w:abstractNumId w:val="22"/>
+    <w:abstractNumId w:val="23"/>
+  </w:num>
+  <w:num w:numId="30" w16cid:durableId="987705696">
+    <w:abstractNumId w:val="25"/>
+  </w:num>
+  <w:num w:numId="31" w16cid:durableId="147357453">
+    <w:abstractNumId w:val="17"/>
   </w:num>
 </w:numbering>
 </file>

</xml_diff>